<commit_message>
Added table for the strong and weak points of each team member.
</commit_message>
<xml_diff>
--- a/ZKOO3_PvA.docx
+++ b/ZKOO3_PvA.docx
@@ -495,7 +495,27 @@
           <w:sz w:val="24"/>
           <w:szCs w:val="24"/>
         </w:rPr>
-        <w:t>Module Data Protection Leerjaar 2 blok 1</w:t>
+        <w:t xml:space="preserve">Module Data </w:t>
+      </w:r>
+      <w:proofErr w:type="spellStart"/>
+      <w:r>
+        <w:rPr>
+          <w:b/>
+          <w:bCs/>
+          <w:sz w:val="24"/>
+          <w:szCs w:val="24"/>
+        </w:rPr>
+        <w:t>Protection</w:t>
+      </w:r>
+      <w:proofErr w:type="spellEnd"/>
+      <w:r>
+        <w:rPr>
+          <w:b/>
+          <w:bCs/>
+          <w:sz w:val="24"/>
+          <w:szCs w:val="24"/>
+        </w:rPr>
+        <w:t xml:space="preserve"> Leerjaar 2 blok 1</w:t>
       </w:r>
     </w:p>
     <w:p>
@@ -1648,18 +1668,28 @@
       <w:r>
         <w:t xml:space="preserve">De opdrachtgever </w:t>
       </w:r>
+      <w:proofErr w:type="spellStart"/>
       <w:r>
         <w:t>Aan</w:t>
       </w:r>
       <w:r>
-        <w:t>ZKOO (Zorg</w:t>
+        <w:t>ZKOO</w:t>
+      </w:r>
+      <w:proofErr w:type="spellEnd"/>
+      <w:r>
+        <w:t xml:space="preserve"> (Zorg</w:t>
       </w:r>
       <w:r>
         <w:t xml:space="preserve"> </w:t>
       </w:r>
       <w:r>
-        <w:t>Kwaliteit Ondersteunings</w:t>
-      </w:r>
+        <w:t xml:space="preserve">Kwaliteit </w:t>
+      </w:r>
+      <w:proofErr w:type="spellStart"/>
+      <w:r>
+        <w:t>Ondersteunings</w:t>
+      </w:r>
+      <w:proofErr w:type="spellEnd"/>
       <w:r>
         <w:t xml:space="preserve"> </w:t>
       </w:r>
@@ -1909,8 +1939,16 @@
         <w:rPr>
           <w:rFonts w:ascii="Avenir Next LT Pro" w:hAnsi="Avenir Next LT Pro"/>
         </w:rPr>
-        <w:t>Toegangsbeheer en logging</w:t>
-      </w:r>
+        <w:t xml:space="preserve">Toegangsbeheer en </w:t>
+      </w:r>
+      <w:proofErr w:type="spellStart"/>
+      <w:r>
+        <w:rPr>
+          <w:rFonts w:ascii="Avenir Next LT Pro" w:hAnsi="Avenir Next LT Pro"/>
+        </w:rPr>
+        <w:t>logging</w:t>
+      </w:r>
+      <w:proofErr w:type="spellEnd"/>
     </w:p>
     <w:p>
       <w:pPr>
@@ -1932,7 +1970,23 @@
     </w:p>
     <w:p>
       <w:r>
-        <w:t>ZKOO werkt met moderne cloudomgevingen (Microsoft Azure) om schaalbaarheid, beschikbaarheid en beveiliging te garanderen.</w:t>
+        <w:t xml:space="preserve">ZKOO werkt met moderne </w:t>
+      </w:r>
+      <w:proofErr w:type="spellStart"/>
+      <w:r>
+        <w:t>cloudomgevingen</w:t>
+      </w:r>
+      <w:proofErr w:type="spellEnd"/>
+      <w:r>
+        <w:t xml:space="preserve"> (Microsoft </w:t>
+      </w:r>
+      <w:proofErr w:type="spellStart"/>
+      <w:r>
+        <w:t>Azure</w:t>
+      </w:r>
+      <w:proofErr w:type="spellEnd"/>
+      <w:r>
+        <w:t>) om schaalbaarheid, beschikbaarheid en beveiliging te garanderen.</w:t>
       </w:r>
     </w:p>
     <w:p>
@@ -2003,7 +2057,15 @@
         <w:t xml:space="preserve"> d</w:t>
       </w:r>
       <w:r>
-        <w:t xml:space="preserve">oor een versneld traject naar Microsoft Azure kritieke ICT-componenten onvoldoende beveiligd. Een databeveiligingsbeleid ontbreekt, toegangscontroles zijn niet duidelijk ingericht, en wetgeving zoals de AVG wordt mogelijk geschonden. </w:t>
+        <w:t xml:space="preserve">oor een versneld traject naar Microsoft </w:t>
+      </w:r>
+      <w:proofErr w:type="spellStart"/>
+      <w:r>
+        <w:t>Azure</w:t>
+      </w:r>
+      <w:proofErr w:type="spellEnd"/>
+      <w:r>
+        <w:t xml:space="preserve"> kritieke ICT-componenten onvoldoende beveiligd. Een databeveiligingsbeleid ontbreekt, toegangscontroles zijn niet duidelijk ingericht, en wetgeving zoals de AVG wordt mogelijk geschonden. </w:t>
       </w:r>
     </w:p>
     <w:p>
@@ -2069,7 +2131,15 @@
         <w:t>de</w:t>
       </w:r>
       <w:r>
-        <w:t xml:space="preserve"> cloudomgeving </w:t>
+        <w:t xml:space="preserve"> </w:t>
+      </w:r>
+      <w:proofErr w:type="spellStart"/>
+      <w:r>
+        <w:t>cloudomgeving</w:t>
+      </w:r>
+      <w:proofErr w:type="spellEnd"/>
+      <w:r>
+        <w:t xml:space="preserve"> </w:t>
       </w:r>
       <w:r>
         <w:t xml:space="preserve">van de klant van ZKOO </w:t>
@@ -2101,7 +2171,21 @@
         <w:rPr>
           <w:rFonts w:ascii="Avenir Next LT Pro" w:hAnsi="Avenir Next LT Pro"/>
         </w:rPr>
-        <w:t xml:space="preserve">De bestaande cloudomgeving (IST) </w:t>
+        <w:t xml:space="preserve">De bestaande </w:t>
+      </w:r>
+      <w:proofErr w:type="spellStart"/>
+      <w:r>
+        <w:rPr>
+          <w:rFonts w:ascii="Avenir Next LT Pro" w:hAnsi="Avenir Next LT Pro"/>
+        </w:rPr>
+        <w:t>cloudomgeving</w:t>
+      </w:r>
+      <w:proofErr w:type="spellEnd"/>
+      <w:r>
+        <w:rPr>
+          <w:rFonts w:ascii="Avenir Next LT Pro" w:hAnsi="Avenir Next LT Pro"/>
+        </w:rPr>
+        <w:t xml:space="preserve"> (IST) </w:t>
       </w:r>
       <w:r>
         <w:rPr>
@@ -2197,7 +2281,21 @@
         <w:rPr>
           <w:rFonts w:ascii="Avenir Next LT Pro" w:hAnsi="Avenir Next LT Pro"/>
         </w:rPr>
-        <w:t xml:space="preserve"> binnen Microsoft Azure.</w:t>
+        <w:t xml:space="preserve"> binnen Microsoft </w:t>
+      </w:r>
+      <w:proofErr w:type="spellStart"/>
+      <w:r>
+        <w:rPr>
+          <w:rFonts w:ascii="Avenir Next LT Pro" w:hAnsi="Avenir Next LT Pro"/>
+        </w:rPr>
+        <w:t>Azure</w:t>
+      </w:r>
+      <w:proofErr w:type="spellEnd"/>
+      <w:r>
+        <w:rPr>
+          <w:rFonts w:ascii="Avenir Next LT Pro" w:hAnsi="Avenir Next LT Pro"/>
+        </w:rPr>
+        <w:t>.</w:t>
       </w:r>
     </w:p>
     <w:p>
@@ -2369,9 +2467,11 @@
             <w:hideMark/>
           </w:tcPr>
           <w:p>
+            <w:proofErr w:type="spellStart"/>
             <w:r>
               <w:t>PvA</w:t>
             </w:r>
+            <w:proofErr w:type="spellEnd"/>
           </w:p>
         </w:tc>
         <w:tc>
@@ -2413,12 +2513,14 @@
             <w:hideMark/>
           </w:tcPr>
           <w:p>
+            <w:proofErr w:type="spellStart"/>
             <w:r>
               <w:t>Advies</w:t>
             </w:r>
             <w:r>
               <w:t>+ontwerp</w:t>
             </w:r>
+            <w:proofErr w:type="spellEnd"/>
           </w:p>
         </w:tc>
         <w:tc>
@@ -2486,8 +2588,13 @@
               <w:t>individuele CGI-toets</w:t>
             </w:r>
             <w:r>
-              <w:t xml:space="preserve"> in Azure</w:t>
-            </w:r>
+              <w:t xml:space="preserve"> in </w:t>
+            </w:r>
+            <w:proofErr w:type="spellStart"/>
+            <w:r>
+              <w:t>Azure</w:t>
+            </w:r>
+            <w:proofErr w:type="spellEnd"/>
           </w:p>
         </w:tc>
       </w:tr>
@@ -2554,7 +2661,21 @@
         <w:rPr>
           <w:rFonts w:ascii="Avenir Next LT Pro" w:hAnsi="Avenir Next LT Pro"/>
         </w:rPr>
-        <w:t>Analyse van bestaande (gesimuleerde) cloudomgeving.</w:t>
+        <w:t xml:space="preserve">Analyse van bestaande (gesimuleerde) </w:t>
+      </w:r>
+      <w:proofErr w:type="spellStart"/>
+      <w:r>
+        <w:rPr>
+          <w:rFonts w:ascii="Avenir Next LT Pro" w:hAnsi="Avenir Next LT Pro"/>
+        </w:rPr>
+        <w:t>cloudomgeving</w:t>
+      </w:r>
+      <w:proofErr w:type="spellEnd"/>
+      <w:r>
+        <w:rPr>
+          <w:rFonts w:ascii="Avenir Next LT Pro" w:hAnsi="Avenir Next LT Pro"/>
+        </w:rPr>
+        <w:t>.</w:t>
       </w:r>
     </w:p>
     <w:p>
@@ -2590,7 +2711,21 @@
         <w:rPr>
           <w:rFonts w:ascii="Avenir Next LT Pro" w:hAnsi="Avenir Next LT Pro"/>
         </w:rPr>
-        <w:t>Beveiligingsontwerp m.b.t. netwerksegmentatie, toegangsbeheer, dataclassificatie, logging, en veilig beheer.</w:t>
+        <w:t xml:space="preserve">Beveiligingsontwerp m.b.t. netwerksegmentatie, toegangsbeheer, dataclassificatie, </w:t>
+      </w:r>
+      <w:proofErr w:type="spellStart"/>
+      <w:r>
+        <w:rPr>
+          <w:rFonts w:ascii="Avenir Next LT Pro" w:hAnsi="Avenir Next LT Pro"/>
+        </w:rPr>
+        <w:t>logging</w:t>
+      </w:r>
+      <w:proofErr w:type="spellEnd"/>
+      <w:r>
+        <w:rPr>
+          <w:rFonts w:ascii="Avenir Next LT Pro" w:hAnsi="Avenir Next LT Pro"/>
+        </w:rPr>
+        <w:t>, en veilig beheer.</w:t>
       </w:r>
     </w:p>
     <w:p>
@@ -2608,7 +2743,21 @@
         <w:rPr>
           <w:rFonts w:ascii="Avenir Next LT Pro" w:hAnsi="Avenir Next LT Pro"/>
         </w:rPr>
-        <w:t>Implementatie binnen Azure-resourcegroup.</w:t>
+        <w:t xml:space="preserve">Implementatie binnen </w:t>
+      </w:r>
+      <w:proofErr w:type="spellStart"/>
+      <w:r>
+        <w:rPr>
+          <w:rFonts w:ascii="Avenir Next LT Pro" w:hAnsi="Avenir Next LT Pro"/>
+        </w:rPr>
+        <w:t>Azure-resourcegroup</w:t>
+      </w:r>
+      <w:proofErr w:type="spellEnd"/>
+      <w:r>
+        <w:rPr>
+          <w:rFonts w:ascii="Avenir Next LT Pro" w:hAnsi="Avenir Next LT Pro"/>
+        </w:rPr>
+        <w:t>.</w:t>
       </w:r>
     </w:p>
     <w:p>
@@ -2634,7 +2783,21 @@
         <w:rPr>
           <w:rFonts w:ascii="Avenir Next LT Pro" w:hAnsi="Avenir Next LT Pro"/>
         </w:rPr>
-        <w:t>Migratie van legacy-systemen.</w:t>
+        <w:t xml:space="preserve">Migratie van </w:t>
+      </w:r>
+      <w:proofErr w:type="spellStart"/>
+      <w:r>
+        <w:rPr>
+          <w:rFonts w:ascii="Avenir Next LT Pro" w:hAnsi="Avenir Next LT Pro"/>
+        </w:rPr>
+        <w:t>legacy</w:t>
+      </w:r>
+      <w:proofErr w:type="spellEnd"/>
+      <w:r>
+        <w:rPr>
+          <w:rFonts w:ascii="Avenir Next LT Pro" w:hAnsi="Avenir Next LT Pro"/>
+        </w:rPr>
+        <w:t>-systemen.</w:t>
       </w:r>
     </w:p>
     <w:p>
@@ -2799,11 +2962,19 @@
           <w:rFonts w:ascii="Avenir Next LT Pro" w:hAnsi="Avenir Next LT Pro"/>
         </w:rPr>
       </w:pPr>
-      <w:r>
-        <w:rPr>
-          <w:rFonts w:ascii="Avenir Next LT Pro" w:hAnsi="Avenir Next LT Pro"/>
-        </w:rPr>
-        <w:t xml:space="preserve">PvA </w:t>
+      <w:proofErr w:type="spellStart"/>
+      <w:r>
+        <w:rPr>
+          <w:rFonts w:ascii="Avenir Next LT Pro" w:hAnsi="Avenir Next LT Pro"/>
+        </w:rPr>
+        <w:t>PvA</w:t>
+      </w:r>
+      <w:proofErr w:type="spellEnd"/>
+      <w:r>
+        <w:rPr>
+          <w:rFonts w:ascii="Avenir Next LT Pro" w:hAnsi="Avenir Next LT Pro"/>
+        </w:rPr>
+        <w:t xml:space="preserve"> </w:t>
       </w:r>
       <w:r>
         <w:rPr>
@@ -2945,8 +3116,30 @@
         <w:rPr>
           <w:rFonts w:ascii="Avenir Next LT Pro" w:hAnsi="Avenir Next LT Pro"/>
         </w:rPr>
-        <w:t>Inrichten beveiligde cloudomgeving in Azure</w:t>
-      </w:r>
+        <w:t xml:space="preserve">Inrichten beveiligde </w:t>
+      </w:r>
+      <w:proofErr w:type="spellStart"/>
+      <w:r>
+        <w:rPr>
+          <w:rFonts w:ascii="Avenir Next LT Pro" w:hAnsi="Avenir Next LT Pro"/>
+        </w:rPr>
+        <w:t>cloudomgeving</w:t>
+      </w:r>
+      <w:proofErr w:type="spellEnd"/>
+      <w:r>
+        <w:rPr>
+          <w:rFonts w:ascii="Avenir Next LT Pro" w:hAnsi="Avenir Next LT Pro"/>
+        </w:rPr>
+        <w:t xml:space="preserve"> in </w:t>
+      </w:r>
+      <w:proofErr w:type="spellStart"/>
+      <w:r>
+        <w:rPr>
+          <w:rFonts w:ascii="Avenir Next LT Pro" w:hAnsi="Avenir Next LT Pro"/>
+        </w:rPr>
+        <w:t>Azure</w:t>
+      </w:r>
+      <w:proofErr w:type="spellEnd"/>
     </w:p>
     <w:p>
       <w:pPr>
@@ -2963,7 +3156,21 @@
         <w:rPr>
           <w:rFonts w:ascii="Avenir Next LT Pro" w:hAnsi="Avenir Next LT Pro"/>
         </w:rPr>
-        <w:t>Configuratie van firewalls, IDS, VPN’s, toegangscontrole</w:t>
+        <w:t xml:space="preserve">Configuratie van firewalls, IDS, </w:t>
+      </w:r>
+      <w:proofErr w:type="spellStart"/>
+      <w:r>
+        <w:rPr>
+          <w:rFonts w:ascii="Avenir Next LT Pro" w:hAnsi="Avenir Next LT Pro"/>
+        </w:rPr>
+        <w:t>VPN’s</w:t>
+      </w:r>
+      <w:proofErr w:type="spellEnd"/>
+      <w:r>
+        <w:rPr>
+          <w:rFonts w:ascii="Avenir Next LT Pro" w:hAnsi="Avenir Next LT Pro"/>
+        </w:rPr>
+        <w:t>, toegangscontrole</w:t>
       </w:r>
     </w:p>
     <w:p>
@@ -2995,11 +3202,19 @@
           <w:rFonts w:ascii="Avenir Next LT Pro" w:hAnsi="Avenir Next LT Pro"/>
         </w:rPr>
       </w:pPr>
-      <w:r>
-        <w:rPr>
-          <w:rFonts w:ascii="Avenir Next LT Pro" w:hAnsi="Avenir Next LT Pro"/>
-        </w:rPr>
-        <w:t>Logging en monitoring activeren</w:t>
+      <w:proofErr w:type="spellStart"/>
+      <w:r>
+        <w:rPr>
+          <w:rFonts w:ascii="Avenir Next LT Pro" w:hAnsi="Avenir Next LT Pro"/>
+        </w:rPr>
+        <w:t>Logging</w:t>
+      </w:r>
+      <w:proofErr w:type="spellEnd"/>
+      <w:r>
+        <w:rPr>
+          <w:rFonts w:ascii="Avenir Next LT Pro" w:hAnsi="Avenir Next LT Pro"/>
+        </w:rPr>
+        <w:t xml:space="preserve"> en monitoring activeren</w:t>
       </w:r>
     </w:p>
     <w:p>
@@ -3149,7 +3364,15 @@
         <w:t xml:space="preserve">Onze missie is als team samen te werken aan het verbeteren </w:t>
       </w:r>
       <w:r>
-        <w:t xml:space="preserve">van gegevensbescherming binnen de Azure-omgeving van ZKOO. Hierbij staan een eerlijke taakverdeling, open communicatie en verantwoordelijkheid voor ieders eigen werk hoog in het vaandel. </w:t>
+        <w:t xml:space="preserve">van gegevensbescherming binnen de </w:t>
+      </w:r>
+      <w:proofErr w:type="spellStart"/>
+      <w:r>
+        <w:t>Azure</w:t>
+      </w:r>
+      <w:proofErr w:type="spellEnd"/>
+      <w:r>
+        <w:t xml:space="preserve">-omgeving van ZKOO. Hierbij staan een eerlijke taakverdeling, open communicatie en verantwoordelijkheid voor ieders eigen werk hoog in het vaandel. </w:t>
       </w:r>
     </w:p>
     <w:p>
@@ -3160,7 +3383,15 @@
         </w:rPr>
       </w:pPr>
       <w:r>
-        <w:t xml:space="preserve">De visie die wij als team dragen is het opleveren van een onderbouwd advies en een werkende Proof of Concept. Hiermee laten we zien hoe de onderzochte beveiligingsrisico’s beperkt kunnen worden. </w:t>
+        <w:t xml:space="preserve">De visie die wij als team dragen is het opleveren van een onderbouwd advies en een werkende </w:t>
+      </w:r>
+      <w:proofErr w:type="spellStart"/>
+      <w:r>
+        <w:t>Proof</w:t>
+      </w:r>
+      <w:proofErr w:type="spellEnd"/>
+      <w:r>
+        <w:t xml:space="preserve"> of Concept. Hiermee laten we zien hoe de onderzochte beveiligingsrisico’s beperkt kunnen worden. </w:t>
       </w:r>
     </w:p>
     <w:p>
@@ -3273,6 +3504,7 @@
                 <w:lang w:val="es-ES_tradnl"/>
               </w:rPr>
             </w:pPr>
+            <w:proofErr w:type="spellStart"/>
             <w:r>
               <w:rPr>
                 <w:rFonts w:cs="Arial"/>
@@ -3282,6 +3514,7 @@
               </w:rPr>
               <w:t>E-mail</w:t>
             </w:r>
+            <w:proofErr w:type="spellEnd"/>
           </w:p>
         </w:tc>
         <w:tc>
@@ -3300,6 +3533,7 @@
                 <w:lang w:val="de-DE"/>
               </w:rPr>
             </w:pPr>
+            <w:proofErr w:type="spellStart"/>
             <w:r>
               <w:rPr>
                 <w:rFonts w:cs="Arial"/>
@@ -3309,6 +3543,7 @@
               </w:rPr>
               <w:t>Beschikbaarheid</w:t>
             </w:r>
+            <w:proofErr w:type="spellEnd"/>
           </w:p>
         </w:tc>
       </w:tr>
@@ -3447,8 +3682,19 @@
                 <w:szCs w:val="20"/>
                 <w:lang w:val="en-US"/>
               </w:rPr>
-              <w:t>Ma t/m Vr</w:t>
-            </w:r>
+              <w:t xml:space="preserve">Ma t/m </w:t>
+            </w:r>
+            <w:proofErr w:type="spellStart"/>
+            <w:r>
+              <w:rPr>
+                <w:rFonts w:cs="Arial"/>
+                <w:sz w:val="20"/>
+                <w:szCs w:val="20"/>
+                <w:lang w:val="en-US"/>
+              </w:rPr>
+              <w:t>Vr</w:t>
+            </w:r>
+            <w:proofErr w:type="spellEnd"/>
             <w:r>
               <w:rPr>
                 <w:rFonts w:cs="Arial"/>
@@ -3611,8 +3857,19 @@
                 <w:szCs w:val="20"/>
                 <w:lang w:val="en-US"/>
               </w:rPr>
-              <w:t>Ma t/m Vr</w:t>
-            </w:r>
+              <w:t xml:space="preserve">Ma t/m </w:t>
+            </w:r>
+            <w:proofErr w:type="spellStart"/>
+            <w:r>
+              <w:rPr>
+                <w:rFonts w:cs="Arial"/>
+                <w:sz w:val="20"/>
+                <w:szCs w:val="20"/>
+                <w:lang w:val="en-US"/>
+              </w:rPr>
+              <w:t>Vr</w:t>
+            </w:r>
+            <w:proofErr w:type="spellEnd"/>
             <w:r>
               <w:rPr>
                 <w:rFonts w:cs="Arial"/>
@@ -3757,8 +4014,19 @@
                 <w:szCs w:val="20"/>
                 <w:lang w:val="en-US"/>
               </w:rPr>
-              <w:t>Ma t/m Vr</w:t>
-            </w:r>
+              <w:t xml:space="preserve">Ma t/m </w:t>
+            </w:r>
+            <w:proofErr w:type="spellStart"/>
+            <w:r>
+              <w:rPr>
+                <w:rFonts w:cs="Arial"/>
+                <w:sz w:val="20"/>
+                <w:szCs w:val="20"/>
+                <w:lang w:val="en-US"/>
+              </w:rPr>
+              <w:t>Vr</w:t>
+            </w:r>
+            <w:proofErr w:type="spellEnd"/>
             <w:r>
               <w:rPr>
                 <w:rFonts w:cs="Arial"/>
@@ -3926,8 +4194,9 @@
                 <w:szCs w:val="20"/>
                 <w:lang w:val="en-US"/>
               </w:rPr>
-              <w:t>Ma t/m Vr</w:t>
-            </w:r>
+              <w:t xml:space="preserve">Ma t/m </w:t>
+            </w:r>
+            <w:proofErr w:type="spellStart"/>
             <w:r>
               <w:rPr>
                 <w:rFonts w:cs="Arial"/>
@@ -3935,8 +4204,9 @@
                 <w:szCs w:val="20"/>
                 <w:lang w:val="en-US"/>
               </w:rPr>
-              <w:t>:</w:t>
-            </w:r>
+              <w:t>Vr</w:t>
+            </w:r>
+            <w:proofErr w:type="spellEnd"/>
             <w:r>
               <w:rPr>
                 <w:rFonts w:cs="Arial"/>
@@ -3944,7 +4214,7 @@
                 <w:szCs w:val="20"/>
                 <w:lang w:val="en-US"/>
               </w:rPr>
-              <w:t xml:space="preserve"> 9:00 – 1</w:t>
+              <w:t>:</w:t>
             </w:r>
             <w:r>
               <w:rPr>
@@ -3953,7 +4223,7 @@
                 <w:szCs w:val="20"/>
                 <w:lang w:val="en-US"/>
               </w:rPr>
-              <w:t>6</w:t>
+              <w:t xml:space="preserve"> 9:00 – 1</w:t>
             </w:r>
             <w:r>
               <w:rPr>
@@ -3962,6 +4232,15 @@
                 <w:szCs w:val="20"/>
                 <w:lang w:val="en-US"/>
               </w:rPr>
+              <w:t>6</w:t>
+            </w:r>
+            <w:r>
+              <w:rPr>
+                <w:rFonts w:cs="Arial"/>
+                <w:sz w:val="20"/>
+                <w:szCs w:val="20"/>
+                <w:lang w:val="en-US"/>
+              </w:rPr>
               <w:t>:00</w:t>
             </w:r>
           </w:p>
@@ -3982,7 +4261,15 @@
         <w:t>Tijdens s</w:t>
       </w:r>
       <w:r>
-        <w:t xml:space="preserve">chooluren zorgen de teamleden dat zij bereikbaar zijn, ook wanneer iemand vanuit huis werkt. Hiervoor gebruiken we communicatiekanalen Whatsapp, Github en Microsoft Teams. </w:t>
+        <w:t xml:space="preserve">chooluren zorgen de teamleden dat zij bereikbaar zijn, ook wanneer iemand vanuit huis werkt. Hiervoor gebruiken we communicatiekanalen Whatsapp, </w:t>
+      </w:r>
+      <w:proofErr w:type="spellStart"/>
+      <w:r>
+        <w:t>Github</w:t>
+      </w:r>
+      <w:proofErr w:type="spellEnd"/>
+      <w:r>
+        <w:t xml:space="preserve"> en Microsoft Teams. </w:t>
       </w:r>
     </w:p>
     <w:p>
@@ -4187,12 +4474,14 @@
           <w:i/>
         </w:rPr>
       </w:pPr>
+      <w:proofErr w:type="spellStart"/>
       <w:r>
         <w:rPr>
           <w:rStyle w:val="Emphasis"/>
         </w:rPr>
         <w:t>Maiwand</w:t>
       </w:r>
+      <w:proofErr w:type="spellEnd"/>
       <w:r>
         <w:rPr>
           <w:rStyle w:val="Emphasis"/>
@@ -4301,7 +4590,15 @@
     </w:p>
     <w:p>
       <w:r>
-        <w:t xml:space="preserve">Notulist — Maiwand: </w:t>
+        <w:t xml:space="preserve">Notulist — </w:t>
+      </w:r>
+      <w:proofErr w:type="spellStart"/>
+      <w:r>
+        <w:t>Maiwand</w:t>
+      </w:r>
+      <w:proofErr w:type="spellEnd"/>
+      <w:r>
+        <w:t xml:space="preserve">: </w:t>
       </w:r>
     </w:p>
     <w:p>
@@ -4348,9 +4645,506 @@
     </w:p>
     <w:p>
       <w:r>
-        <w:t xml:space="preserve">Bij vertrek van een projectlid worden de taken verdeeld over de resterende leden. Indien nodig wordt gestemd over wie de vrijgenomen rol overneemt. </w:t>
-      </w:r>
-    </w:p>
+        <w:t xml:space="preserve">Bij vertrek van een </w:t>
+      </w:r>
+      <w:proofErr w:type="spellStart"/>
+      <w:r>
+        <w:t>projectlid</w:t>
+      </w:r>
+      <w:proofErr w:type="spellEnd"/>
+      <w:r>
+        <w:t xml:space="preserve"> worden de taken verdeeld over de resterende leden. Indien nodig wordt gestemd over wie de vrijge</w:t>
+      </w:r>
+      <w:r>
+        <w:t>k</w:t>
+      </w:r>
+      <w:r>
+        <w:t>o</w:t>
+      </w:r>
+      <w:r>
+        <w:t>m</w:t>
+      </w:r>
+      <w:r>
+        <w:t xml:space="preserve">en rol overneemt. </w:t>
+      </w:r>
+    </w:p>
+    <w:p/>
+    <w:p>
+      <w:pPr>
+        <w:rPr>
+          <w:b/>
+          <w:bCs/>
+        </w:rPr>
+      </w:pPr>
+    </w:p>
+    <w:p>
+      <w:pPr>
+        <w:rPr>
+          <w:b/>
+          <w:bCs/>
+        </w:rPr>
+      </w:pPr>
+    </w:p>
+    <w:p>
+      <w:pPr>
+        <w:rPr>
+          <w:b/>
+          <w:bCs/>
+        </w:rPr>
+      </w:pPr>
+    </w:p>
+    <w:p>
+      <w:pPr>
+        <w:rPr>
+          <w:b/>
+          <w:bCs/>
+        </w:rPr>
+      </w:pPr>
+    </w:p>
+    <w:p>
+      <w:pPr>
+        <w:rPr>
+          <w:b/>
+          <w:bCs/>
+        </w:rPr>
+      </w:pPr>
+    </w:p>
+    <w:p>
+      <w:pPr>
+        <w:rPr>
+          <w:b/>
+          <w:bCs/>
+        </w:rPr>
+      </w:pPr>
+    </w:p>
+    <w:p>
+      <w:pPr>
+        <w:rPr>
+          <w:b/>
+          <w:bCs/>
+        </w:rPr>
+      </w:pPr>
+    </w:p>
+    <w:p>
+      <w:pPr>
+        <w:rPr>
+          <w:b/>
+          <w:bCs/>
+        </w:rPr>
+      </w:pPr>
+    </w:p>
+    <w:p>
+      <w:pPr>
+        <w:rPr>
+          <w:b/>
+          <w:bCs/>
+        </w:rPr>
+      </w:pPr>
+    </w:p>
+    <w:p>
+      <w:pPr>
+        <w:rPr>
+          <w:b/>
+          <w:bCs/>
+        </w:rPr>
+      </w:pPr>
+      <w:r>
+        <w:rPr>
+          <w:b/>
+          <w:bCs/>
+        </w:rPr>
+        <w:lastRenderedPageBreak/>
+        <w:t>Sterkte en zwakteanalyse van de teamleden.</w:t>
+      </w:r>
+    </w:p>
+    <w:tbl>
+      <w:tblPr>
+        <w:tblStyle w:val="TableGrid"/>
+        <w:tblW w:w="0" w:type="auto"/>
+        <w:tblLook w:val="04A0" w:firstRow="1" w:lastRow="0" w:firstColumn="1" w:lastColumn="0" w:noHBand="0" w:noVBand="1"/>
+      </w:tblPr>
+      <w:tblGrid>
+        <w:gridCol w:w="3005"/>
+        <w:gridCol w:w="3006"/>
+        <w:gridCol w:w="3006"/>
+      </w:tblGrid>
+      <w:tr>
+        <w:tc>
+          <w:tcPr>
+            <w:tcW w:w="3005" w:type="dxa"/>
+          </w:tcPr>
+          <w:p>
+            <w:pPr>
+              <w:rPr>
+                <w:b/>
+                <w:bCs/>
+              </w:rPr>
+            </w:pPr>
+            <w:r>
+              <w:rPr>
+                <w:b/>
+                <w:bCs/>
+              </w:rPr>
+              <w:t>Naam</w:t>
+            </w:r>
+          </w:p>
+        </w:tc>
+        <w:tc>
+          <w:tcPr>
+            <w:tcW w:w="3006" w:type="dxa"/>
+          </w:tcPr>
+          <w:p>
+            <w:pPr>
+              <w:rPr>
+                <w:b/>
+                <w:bCs/>
+              </w:rPr>
+            </w:pPr>
+            <w:r>
+              <w:rPr>
+                <w:b/>
+                <w:bCs/>
+              </w:rPr>
+              <w:t>Sterktes</w:t>
+            </w:r>
+          </w:p>
+        </w:tc>
+        <w:tc>
+          <w:tcPr>
+            <w:tcW w:w="3006" w:type="dxa"/>
+          </w:tcPr>
+          <w:p>
+            <w:pPr>
+              <w:rPr>
+                <w:b/>
+                <w:bCs/>
+              </w:rPr>
+            </w:pPr>
+            <w:r>
+              <w:rPr>
+                <w:b/>
+                <w:bCs/>
+              </w:rPr>
+              <w:t>Zwaktes</w:t>
+            </w:r>
+          </w:p>
+        </w:tc>
+      </w:tr>
+      <w:tr>
+        <w:tc>
+          <w:tcPr>
+            <w:tcW w:w="3005" w:type="dxa"/>
+          </w:tcPr>
+          <w:p>
+            <w:r>
+              <w:t>Chris</w:t>
+            </w:r>
+          </w:p>
+        </w:tc>
+        <w:tc>
+          <w:tcPr>
+            <w:tcW w:w="3006" w:type="dxa"/>
+          </w:tcPr>
+          <w:p>
+            <w:pPr>
+              <w:pStyle w:val="ListParagraph"/>
+              <w:numPr>
+                <w:ilvl w:val="0"/>
+                <w:numId w:val="18"/>
+              </w:numPr>
+              <w:spacing w:after="0" w:line="240" w:lineRule="auto"/>
+            </w:pPr>
+            <w:r>
+              <w:t>Communicatie.</w:t>
+            </w:r>
+          </w:p>
+          <w:p>
+            <w:pPr>
+              <w:pStyle w:val="ListParagraph"/>
+              <w:numPr>
+                <w:ilvl w:val="0"/>
+                <w:numId w:val="18"/>
+              </w:numPr>
+              <w:spacing w:after="0" w:line="240" w:lineRule="auto"/>
+            </w:pPr>
+            <w:r>
+              <w:t>Werk ethiek.</w:t>
+            </w:r>
+          </w:p>
+          <w:p>
+            <w:pPr>
+              <w:pStyle w:val="ListParagraph"/>
+              <w:numPr>
+                <w:ilvl w:val="0"/>
+                <w:numId w:val="18"/>
+              </w:numPr>
+              <w:spacing w:after="0" w:line="240" w:lineRule="auto"/>
+            </w:pPr>
+            <w:r>
+              <w:t>Organisatie.</w:t>
+            </w:r>
+          </w:p>
+          <w:p>
+            <w:pPr>
+              <w:pStyle w:val="ListParagraph"/>
+              <w:numPr>
+                <w:ilvl w:val="0"/>
+                <w:numId w:val="18"/>
+              </w:numPr>
+              <w:spacing w:after="0" w:line="240" w:lineRule="auto"/>
+            </w:pPr>
+            <w:r>
+              <w:t>Veel technische kennis.</w:t>
+            </w:r>
+          </w:p>
+          <w:p>
+            <w:pPr>
+              <w:pStyle w:val="ListParagraph"/>
+              <w:numPr>
+                <w:ilvl w:val="0"/>
+                <w:numId w:val="18"/>
+              </w:numPr>
+              <w:spacing w:after="0" w:line="240" w:lineRule="auto"/>
+            </w:pPr>
+            <w:r>
+              <w:t>Resultaatgericht.</w:t>
+            </w:r>
+          </w:p>
+        </w:tc>
+        <w:tc>
+          <w:tcPr>
+            <w:tcW w:w="3006" w:type="dxa"/>
+          </w:tcPr>
+          <w:p>
+            <w:pPr>
+              <w:pStyle w:val="ListParagraph"/>
+              <w:numPr>
+                <w:ilvl w:val="0"/>
+                <w:numId w:val="18"/>
+              </w:numPr>
+              <w:spacing w:after="0" w:line="240" w:lineRule="auto"/>
+            </w:pPr>
+            <w:r>
+              <w:t>Delegeren van werk.</w:t>
+            </w:r>
+          </w:p>
+          <w:p>
+            <w:pPr>
+              <w:pStyle w:val="ListParagraph"/>
+              <w:numPr>
+                <w:ilvl w:val="0"/>
+                <w:numId w:val="18"/>
+              </w:numPr>
+              <w:spacing w:after="0" w:line="240" w:lineRule="auto"/>
+            </w:pPr>
+            <w:r>
+              <w:t>Creativiteit.</w:t>
+            </w:r>
+          </w:p>
+          <w:p>
+            <w:pPr>
+              <w:pStyle w:val="ListParagraph"/>
+              <w:numPr>
+                <w:ilvl w:val="0"/>
+                <w:numId w:val="18"/>
+              </w:numPr>
+              <w:spacing w:after="0" w:line="240" w:lineRule="auto"/>
+            </w:pPr>
+            <w:r>
+              <w:t>Soms te veel gericht op de uitkomsten.</w:t>
+            </w:r>
+          </w:p>
+        </w:tc>
+      </w:tr>
+      <w:tr>
+        <w:tc>
+          <w:tcPr>
+            <w:tcW w:w="3005" w:type="dxa"/>
+          </w:tcPr>
+          <w:p>
+            <w:r>
+              <w:t>Nathalie</w:t>
+            </w:r>
+          </w:p>
+        </w:tc>
+        <w:tc>
+          <w:tcPr>
+            <w:tcW w:w="3006" w:type="dxa"/>
+          </w:tcPr>
+          <w:p>
+            <w:pPr>
+              <w:pStyle w:val="ListParagraph"/>
+              <w:numPr>
+                <w:ilvl w:val="0"/>
+                <w:numId w:val="18"/>
+              </w:numPr>
+              <w:spacing w:after="0" w:line="240" w:lineRule="auto"/>
+            </w:pPr>
+            <w:r>
+              <w:t>Communicatie.</w:t>
+            </w:r>
+          </w:p>
+          <w:p>
+            <w:pPr>
+              <w:pStyle w:val="ListParagraph"/>
+              <w:numPr>
+                <w:ilvl w:val="0"/>
+                <w:numId w:val="18"/>
+              </w:numPr>
+              <w:spacing w:after="0" w:line="240" w:lineRule="auto"/>
+            </w:pPr>
+            <w:r>
+              <w:t>Werk ethiek.</w:t>
+            </w:r>
+          </w:p>
+          <w:p>
+            <w:pPr>
+              <w:pStyle w:val="ListParagraph"/>
+              <w:numPr>
+                <w:ilvl w:val="0"/>
+                <w:numId w:val="18"/>
+              </w:numPr>
+              <w:spacing w:after="0" w:line="240" w:lineRule="auto"/>
+            </w:pPr>
+            <w:r>
+              <w:t>Organisatie.</w:t>
+            </w:r>
+          </w:p>
+          <w:p>
+            <w:pPr>
+              <w:pStyle w:val="ListParagraph"/>
+              <w:numPr>
+                <w:ilvl w:val="0"/>
+                <w:numId w:val="18"/>
+              </w:numPr>
+              <w:spacing w:after="0" w:line="240" w:lineRule="auto"/>
+            </w:pPr>
+            <w:r>
+              <w:t>Documentatie.</w:t>
+            </w:r>
+          </w:p>
+        </w:tc>
+        <w:tc>
+          <w:tcPr>
+            <w:tcW w:w="3006" w:type="dxa"/>
+          </w:tcPr>
+          <w:p/>
+        </w:tc>
+      </w:tr>
+      <w:tr>
+        <w:tc>
+          <w:tcPr>
+            <w:tcW w:w="3005" w:type="dxa"/>
+          </w:tcPr>
+          <w:p>
+            <w:r>
+              <w:t>Connor</w:t>
+            </w:r>
+          </w:p>
+        </w:tc>
+        <w:tc>
+          <w:tcPr>
+            <w:tcW w:w="3006" w:type="dxa"/>
+          </w:tcPr>
+          <w:p>
+            <w:pPr>
+              <w:pStyle w:val="ListParagraph"/>
+              <w:numPr>
+                <w:ilvl w:val="0"/>
+                <w:numId w:val="18"/>
+              </w:numPr>
+              <w:spacing w:after="0" w:line="240" w:lineRule="auto"/>
+            </w:pPr>
+            <w:r>
+              <w:t>Veel technische kennis.</w:t>
+            </w:r>
+          </w:p>
+        </w:tc>
+        <w:tc>
+          <w:tcPr>
+            <w:tcW w:w="3006" w:type="dxa"/>
+          </w:tcPr>
+          <w:p>
+            <w:pPr>
+              <w:pStyle w:val="ListParagraph"/>
+              <w:numPr>
+                <w:ilvl w:val="0"/>
+                <w:numId w:val="18"/>
+              </w:numPr>
+              <w:spacing w:after="0" w:line="240" w:lineRule="auto"/>
+            </w:pPr>
+            <w:r>
+              <w:t>Communicatie</w:t>
+            </w:r>
+          </w:p>
+        </w:tc>
+      </w:tr>
+      <w:tr>
+        <w:tc>
+          <w:tcPr>
+            <w:tcW w:w="3005" w:type="dxa"/>
+          </w:tcPr>
+          <w:p>
+            <w:proofErr w:type="spellStart"/>
+            <w:r>
+              <w:t>Maiwand</w:t>
+            </w:r>
+            <w:proofErr w:type="spellEnd"/>
+          </w:p>
+        </w:tc>
+        <w:tc>
+          <w:tcPr>
+            <w:tcW w:w="3006" w:type="dxa"/>
+          </w:tcPr>
+          <w:p>
+            <w:pPr>
+              <w:pStyle w:val="ListParagraph"/>
+              <w:numPr>
+                <w:ilvl w:val="0"/>
+                <w:numId w:val="18"/>
+              </w:numPr>
+              <w:spacing w:after="0" w:line="240" w:lineRule="auto"/>
+            </w:pPr>
+            <w:r>
+              <w:t>Oog voor detail.</w:t>
+            </w:r>
+          </w:p>
+          <w:p>
+            <w:pPr>
+              <w:pStyle w:val="ListParagraph"/>
+              <w:numPr>
+                <w:ilvl w:val="0"/>
+                <w:numId w:val="18"/>
+              </w:numPr>
+              <w:spacing w:after="0" w:line="240" w:lineRule="auto"/>
+            </w:pPr>
+            <w:r>
+              <w:t>Creatief.</w:t>
+            </w:r>
+          </w:p>
+        </w:tc>
+        <w:tc>
+          <w:tcPr>
+            <w:tcW w:w="3006" w:type="dxa"/>
+          </w:tcPr>
+          <w:p>
+            <w:pPr>
+              <w:pStyle w:val="ListParagraph"/>
+              <w:numPr>
+                <w:ilvl w:val="0"/>
+                <w:numId w:val="18"/>
+              </w:numPr>
+              <w:spacing w:after="0" w:line="240" w:lineRule="auto"/>
+            </w:pPr>
+            <w:r>
+              <w:t>Communicatie</w:t>
+            </w:r>
+          </w:p>
+        </w:tc>
+      </w:tr>
+    </w:tbl>
+    <w:p/>
+    <w:p/>
     <w:p>
       <w:bookmarkStart w:id="18" w:name="_Toc207703529"/>
       <w:bookmarkStart w:id="19" w:name="_Toc84325194"/>
@@ -4394,19 +5188,61 @@
         <w:rPr>
           <w:rFonts w:cs="Arial"/>
         </w:rPr>
-        <w:t>Binnen het team communiceren wij face-to-face tijdens lessen, via</w:t>
-      </w:r>
+        <w:t>Binnen het team communiceren wij face-</w:t>
+      </w:r>
+      <w:proofErr w:type="spellStart"/>
       <w:r>
         <w:rPr>
           <w:rFonts w:cs="Arial"/>
         </w:rPr>
-        <w:t xml:space="preserve"> Whatsapp, Github en indien er sprake is van digitaal overleg Microsoft Teams. Projectbestanden worden opgeslagen </w:t>
-      </w:r>
+        <w:t>to</w:t>
+      </w:r>
+      <w:proofErr w:type="spellEnd"/>
       <w:r>
         <w:rPr>
           <w:rFonts w:cs="Arial"/>
         </w:rPr>
-        <w:t>in Github. Tijdens een wekelijks overleg, gedurende of tussen de lessen in, bespreken wij de voortgang, mogelijke knelpunten en hoe de samenwerking verloopt.</w:t>
+        <w:t>-face tijdens lessen, via</w:t>
+      </w:r>
+      <w:r>
+        <w:rPr>
+          <w:rFonts w:cs="Arial"/>
+        </w:rPr>
+        <w:t xml:space="preserve"> Whatsapp, </w:t>
+      </w:r>
+      <w:proofErr w:type="spellStart"/>
+      <w:r>
+        <w:rPr>
+          <w:rFonts w:cs="Arial"/>
+        </w:rPr>
+        <w:t>Github</w:t>
+      </w:r>
+      <w:proofErr w:type="spellEnd"/>
+      <w:r>
+        <w:rPr>
+          <w:rFonts w:cs="Arial"/>
+        </w:rPr>
+        <w:t xml:space="preserve"> en indien er sprake is van digitaal overleg Microsoft Teams. Projectbestanden worden opgeslagen </w:t>
+      </w:r>
+      <w:r>
+        <w:rPr>
+          <w:rFonts w:cs="Arial"/>
+        </w:rPr>
+        <w:t xml:space="preserve">in </w:t>
+      </w:r>
+      <w:proofErr w:type="spellStart"/>
+      <w:r>
+        <w:rPr>
+          <w:rFonts w:cs="Arial"/>
+        </w:rPr>
+        <w:t>Github</w:t>
+      </w:r>
+      <w:proofErr w:type="spellEnd"/>
+      <w:r>
+        <w:rPr>
+          <w:rFonts w:cs="Arial"/>
+        </w:rPr>
+        <w:t>. Tijdens een wekelijks overleg, gedurende of tussen de lessen in, bespreken wij de voortgang, mogelijke knelpunten en hoe de samenwerking verloopt.</w:t>
       </w:r>
     </w:p>
     <w:p>
@@ -4546,8 +5382,17 @@
                 <w:b/>
                 <w:color w:val="000000" w:themeColor="text1"/>
               </w:rPr>
-              <w:t xml:space="preserve"> invoed</w:t>
-            </w:r>
+              <w:t xml:space="preserve"> </w:t>
+            </w:r>
+            <w:proofErr w:type="spellStart"/>
+            <w:r>
+              <w:rPr>
+                <w:b/>
+                <w:color w:val="000000" w:themeColor="text1"/>
+              </w:rPr>
+              <w:t>invoed</w:t>
+            </w:r>
+            <w:proofErr w:type="spellEnd"/>
           </w:p>
         </w:tc>
         <w:tc>
@@ -4730,6 +5575,7 @@
                 <w:b/>
                 <w:color w:val="000000" w:themeColor="text1"/>
               </w:rPr>
+              <w:lastRenderedPageBreak/>
               <w:t>Stakeholder</w:t>
             </w:r>
           </w:p>
@@ -4925,7 +5771,23 @@
                 <w:bCs/>
                 <w:color w:val="000000" w:themeColor="text1"/>
               </w:rPr>
-              <w:t>Ontwerpen en ontwikkelen het systeem. Hebben belang bij duidelijke requirements, feedback en een haalbare opdracht.</w:t>
+              <w:t xml:space="preserve">Ontwerpen en ontwikkelen het systeem. Hebben belang bij duidelijke </w:t>
+            </w:r>
+            <w:proofErr w:type="spellStart"/>
+            <w:r>
+              <w:rPr>
+                <w:bCs/>
+                <w:color w:val="000000" w:themeColor="text1"/>
+              </w:rPr>
+              <w:t>requirements</w:t>
+            </w:r>
+            <w:proofErr w:type="spellEnd"/>
+            <w:r>
+              <w:rPr>
+                <w:bCs/>
+                <w:color w:val="000000" w:themeColor="text1"/>
+              </w:rPr>
+              <w:t>, feedback en een haalbare opdracht.</w:t>
             </w:r>
           </w:p>
         </w:tc>
@@ -5015,7 +5877,23 @@
     </w:p>
     <w:p>
       <w:r>
-        <w:t xml:space="preserve">Overleg vindt plaats tijdens de lessen. Wij verwachten dat er dan voldoende tijd is om de voortgang, taakverdeling en knelpunten te bespreken. Als dit niet voldoende blijkt, plannen wij in overleg een extra vergadering. Ieder projectlid kan hiervoor een verzoek doen. Tijdens de vergaderingen legt Maiwand de notulen vast. </w:t>
+        <w:t xml:space="preserve">Overleg vindt plaats tijdens de lessen. Wij verwachten dat er dan voldoende tijd is om de voortgang, taakverdeling en knelpunten te bespreken. Als dit niet voldoende blijkt, plannen wij in overleg een extra vergadering. Ieder </w:t>
+      </w:r>
+      <w:proofErr w:type="spellStart"/>
+      <w:r>
+        <w:t>projectlid</w:t>
+      </w:r>
+      <w:proofErr w:type="spellEnd"/>
+      <w:r>
+        <w:t xml:space="preserve"> kan hiervoor een verzoek doen. Tijdens de vergaderingen legt </w:t>
+      </w:r>
+      <w:proofErr w:type="spellStart"/>
+      <w:r>
+        <w:t>Maiwand</w:t>
+      </w:r>
+      <w:proofErr w:type="spellEnd"/>
+      <w:r>
+        <w:t xml:space="preserve"> de notulen vast. </w:t>
       </w:r>
     </w:p>
     <w:p>
@@ -5053,7 +5931,19 @@
         </w:rPr>
       </w:pPr>
       <w:r>
-        <w:t>Bij meningsverschillen zoeken we naar een compromis. De projectleider zorgt dat dit besluit duidelijk wordt vastgelukt. Lukt het de projectgroep niet om tot een compomis te komen, vragen wij de docent om begeleiding.</w:t>
+        <w:t xml:space="preserve">Bij meningsverschillen zoeken we naar een compromis. De projectleider zorgt dat dit besluit duidelijk wordt </w:t>
+      </w:r>
+      <w:r>
+        <w:t>vastgelegd</w:t>
+      </w:r>
+      <w:r>
+        <w:t>. Lukt het de projectgroep niet om tot een comp</w:t>
+      </w:r>
+      <w:r>
+        <w:t>r</w:t>
+      </w:r>
+      <w:r>
+        <w:t>omis te komen, vragen wij de docent om begeleiding.</w:t>
       </w:r>
     </w:p>
     <w:p>
@@ -5076,7 +5966,6 @@
           <w:b/>
           <w:bCs/>
         </w:rPr>
-        <w:lastRenderedPageBreak/>
         <w:t>Werkplek</w:t>
       </w:r>
       <w:bookmarkEnd w:id="21"/>
@@ -5177,6 +6066,7 @@
                 <w:rFonts w:cs="Arial"/>
                 <w:i/>
               </w:rPr>
+              <w:lastRenderedPageBreak/>
               <w:t>Lettertype</w:t>
             </w:r>
           </w:p>
@@ -5201,6 +6091,7 @@
                 <w:i/>
               </w:rPr>
             </w:pPr>
+            <w:proofErr w:type="spellStart"/>
             <w:r>
               <w:rPr>
                 <w:rFonts w:cs="Arial"/>
@@ -5208,6 +6099,7 @@
               </w:rPr>
               <w:t>Verdana</w:t>
             </w:r>
+            <w:proofErr w:type="spellEnd"/>
           </w:p>
         </w:tc>
       </w:tr>
@@ -5762,7 +6654,15 @@
     </w:p>
     <w:p>
       <w:r>
-        <w:t>Documenten worden tijdens het project opgeslagen en bewerkt in Word (.docx). De definitieve versie wordt als PDF ingeleverd, tenzij de opdracht een ander bestandsformaat voorschrijft.</w:t>
+        <w:t>Documenten worden tijdens het project opgeslagen en bewerkt in Word (.</w:t>
+      </w:r>
+      <w:proofErr w:type="spellStart"/>
+      <w:r>
+        <w:t>docx</w:t>
+      </w:r>
+      <w:proofErr w:type="spellEnd"/>
+      <w:r>
+        <w:t>). De definitieve versie wordt als PDF ingeleverd, tenzij de opdracht een ander bestandsformaat voorschrijft.</w:t>
       </w:r>
     </w:p>
     <w:p/>
@@ -5783,7 +6683,23 @@
     </w:p>
     <w:p>
       <w:r>
-        <w:t>Voor versiebeheer van het project gebruikt de groep Github. Wijzigingen aan de technische uitwerking moeten volgens het samenwerkingscontract door een ander projectlid worden goedgekeurd voordat ze worden samengevoegd.</w:t>
+        <w:t xml:space="preserve">Voor versiebeheer van het project gebruikt de groep </w:t>
+      </w:r>
+      <w:proofErr w:type="spellStart"/>
+      <w:r>
+        <w:t>Github</w:t>
+      </w:r>
+      <w:proofErr w:type="spellEnd"/>
+      <w:r>
+        <w:t xml:space="preserve">. Wijzigingen aan de technische uitwerking moeten volgens het samenwerkingscontract door een ander </w:t>
+      </w:r>
+      <w:proofErr w:type="spellStart"/>
+      <w:r>
+        <w:t>projectlid</w:t>
+      </w:r>
+      <w:proofErr w:type="spellEnd"/>
+      <w:r>
+        <w:t xml:space="preserve"> worden goedgekeurd voordat ze worden samengevoegd.</w:t>
       </w:r>
     </w:p>
     <w:p>
@@ -5796,11 +6712,7 @@
         <w:t xml:space="preserve">Voor oplevering controleert </w:t>
       </w:r>
       <w:r>
-        <w:t xml:space="preserve">Connor de producten op inhoud, volledigheid en aansluiting op de opdracht. Nathalie controleert of dit wordt uitgevoerd en of de verbeterpunten zijn </w:t>
-      </w:r>
-      <w:r>
-        <w:lastRenderedPageBreak/>
-        <w:t xml:space="preserve">verwerkt. Vervolgens doet de volledige groep een check en bevestigt dat het product klaar voor oplevering. </w:t>
+        <w:t xml:space="preserve">Connor de producten op inhoud, volledigheid en aansluiting op de opdracht. Nathalie controleert of dit wordt uitgevoerd en of de verbeterpunten zijn verwerkt. Vervolgens doet de volledige groep een check en bevestigt dat het product klaar voor oplevering. </w:t>
       </w:r>
     </w:p>
     <w:p>
@@ -5841,7 +6753,15 @@
         </w:numPr>
       </w:pPr>
       <w:r>
-        <w:t>Analyse, advies en uitvoerbaar PoC-ontwerp: week 5, vrijdag om 15.00 uur.</w:t>
+        <w:t xml:space="preserve">Analyse, advies en uitvoerbaar </w:t>
+      </w:r>
+      <w:proofErr w:type="spellStart"/>
+      <w:r>
+        <w:t>PoC</w:t>
+      </w:r>
+      <w:proofErr w:type="spellEnd"/>
+      <w:r>
+        <w:t>-ontwerp: week 5, vrijdag om 15.00 uur.</w:t>
       </w:r>
     </w:p>
     <w:p>
@@ -5865,12 +6785,21 @@
         </w:numPr>
       </w:pPr>
       <w:r>
+        <w:lastRenderedPageBreak/>
         <w:t>Individueel CGI: week 10.</w:t>
       </w:r>
     </w:p>
     <w:p>
       <w:r>
-        <w:t xml:space="preserve">Ieder groepslid is zelf verantwoordelijk voor het tijdig inleveren van de opdrachten in diens persoonlijke Moodle omgeving. </w:t>
+        <w:t xml:space="preserve">Ieder groepslid is zelf verantwoordelijk voor het tijdig inleveren van de opdrachten in diens persoonlijke </w:t>
+      </w:r>
+      <w:proofErr w:type="spellStart"/>
+      <w:r>
+        <w:t>Moodle</w:t>
+      </w:r>
+      <w:proofErr w:type="spellEnd"/>
+      <w:r>
+        <w:t xml:space="preserve"> omgeving. </w:t>
       </w:r>
     </w:p>
     <w:p>
@@ -6352,7 +7281,15 @@
           </w:tcPr>
           <w:p>
             <w:r>
-              <w:t>Problemen met Azure-omgeving</w:t>
+              <w:t xml:space="preserve">Problemen met </w:t>
+            </w:r>
+            <w:proofErr w:type="spellStart"/>
+            <w:r>
+              <w:t>Azure</w:t>
+            </w:r>
+            <w:proofErr w:type="spellEnd"/>
+            <w:r>
+              <w:t>-omgeving</w:t>
             </w:r>
           </w:p>
         </w:tc>
@@ -6580,7 +7517,15 @@
           </w:tcPr>
           <w:p>
             <w:r>
-              <w:t>SQL-injectie tests, dataclassificatie, PvA inleveren</w:t>
+              <w:t xml:space="preserve">SQL-injectie tests, dataclassificatie, </w:t>
+            </w:r>
+            <w:proofErr w:type="spellStart"/>
+            <w:r>
+              <w:t>PvA</w:t>
+            </w:r>
+            <w:proofErr w:type="spellEnd"/>
+            <w:r>
+              <w:t xml:space="preserve"> inleveren</w:t>
             </w:r>
           </w:p>
         </w:tc>
@@ -6676,8 +7621,13 @@
           </w:tcPr>
           <w:p>
             <w:r>
-              <w:t>Implementatie SOLL in Azure</w:t>
-            </w:r>
+              <w:t xml:space="preserve">Implementatie SOLL in </w:t>
+            </w:r>
+            <w:proofErr w:type="spellStart"/>
+            <w:r>
+              <w:t>Azure</w:t>
+            </w:r>
+            <w:proofErr w:type="spellEnd"/>
           </w:p>
         </w:tc>
       </w:tr>
@@ -6707,7 +7657,15 @@
           </w:tcPr>
           <w:p>
             <w:r>
-              <w:t>Testen, logging controleren, verbeteringen doorvoeren</w:t>
+              <w:t xml:space="preserve">Testen, </w:t>
+            </w:r>
+            <w:proofErr w:type="spellStart"/>
+            <w:r>
+              <w:t>logging</w:t>
+            </w:r>
+            <w:proofErr w:type="spellEnd"/>
+            <w:r>
+              <w:t xml:space="preserve"> controleren, verbeteringen doorvoeren</w:t>
             </w:r>
           </w:p>
         </w:tc>
@@ -6842,7 +7800,63 @@
         <w:rPr>
           <w:rFonts w:ascii="Avenir Next LT Pro" w:hAnsi="Avenir Next LT Pro"/>
         </w:rPr>
-        <w:t>Gebruik van Microsoft Azure for Students (gratis credits)</w:t>
+        <w:t xml:space="preserve">Gebruik van Microsoft </w:t>
+      </w:r>
+      <w:proofErr w:type="spellStart"/>
+      <w:r>
+        <w:rPr>
+          <w:rFonts w:ascii="Avenir Next LT Pro" w:hAnsi="Avenir Next LT Pro"/>
+        </w:rPr>
+        <w:t>Azure</w:t>
+      </w:r>
+      <w:proofErr w:type="spellEnd"/>
+      <w:r>
+        <w:rPr>
+          <w:rFonts w:ascii="Avenir Next LT Pro" w:hAnsi="Avenir Next LT Pro"/>
+        </w:rPr>
+        <w:t xml:space="preserve"> </w:t>
+      </w:r>
+      <w:proofErr w:type="spellStart"/>
+      <w:r>
+        <w:rPr>
+          <w:rFonts w:ascii="Avenir Next LT Pro" w:hAnsi="Avenir Next LT Pro"/>
+        </w:rPr>
+        <w:t>for</w:t>
+      </w:r>
+      <w:proofErr w:type="spellEnd"/>
+      <w:r>
+        <w:rPr>
+          <w:rFonts w:ascii="Avenir Next LT Pro" w:hAnsi="Avenir Next LT Pro"/>
+        </w:rPr>
+        <w:t xml:space="preserve"> </w:t>
+      </w:r>
+      <w:proofErr w:type="spellStart"/>
+      <w:r>
+        <w:rPr>
+          <w:rFonts w:ascii="Avenir Next LT Pro" w:hAnsi="Avenir Next LT Pro"/>
+        </w:rPr>
+        <w:t>Students</w:t>
+      </w:r>
+      <w:proofErr w:type="spellEnd"/>
+      <w:r>
+        <w:rPr>
+          <w:rFonts w:ascii="Avenir Next LT Pro" w:hAnsi="Avenir Next LT Pro"/>
+        </w:rPr>
+        <w:t xml:space="preserve"> (gratis </w:t>
+      </w:r>
+      <w:proofErr w:type="spellStart"/>
+      <w:r>
+        <w:rPr>
+          <w:rFonts w:ascii="Avenir Next LT Pro" w:hAnsi="Avenir Next LT Pro"/>
+        </w:rPr>
+        <w:t>credits</w:t>
+      </w:r>
+      <w:proofErr w:type="spellEnd"/>
+      <w:r>
+        <w:rPr>
+          <w:rFonts w:ascii="Avenir Next LT Pro" w:hAnsi="Avenir Next LT Pro"/>
+        </w:rPr>
+        <w:t>)</w:t>
       </w:r>
     </w:p>
     <w:p>
@@ -6862,7 +7876,23 @@
           <w:rFonts w:ascii="Avenir Next LT Pro" w:hAnsi="Avenir Next LT Pro"/>
           <w:lang w:val="en-US"/>
         </w:rPr>
-        <w:t>Open-source IDS zoals Snort of Suricata</w:t>
+        <w:t xml:space="preserve">Open-source IDS </w:t>
+      </w:r>
+      <w:proofErr w:type="spellStart"/>
+      <w:r>
+        <w:rPr>
+          <w:rFonts w:ascii="Avenir Next LT Pro" w:hAnsi="Avenir Next LT Pro"/>
+          <w:lang w:val="en-US"/>
+        </w:rPr>
+        <w:t>zoals</w:t>
+      </w:r>
+      <w:proofErr w:type="spellEnd"/>
+      <w:r>
+        <w:rPr>
+          <w:rFonts w:ascii="Avenir Next LT Pro" w:hAnsi="Avenir Next LT Pro"/>
+          <w:lang w:val="en-US"/>
+        </w:rPr>
+        <w:t xml:space="preserve"> Snort of Suricata</w:t>
       </w:r>
     </w:p>
     <w:p>
@@ -6918,8 +7948,17 @@
           <w:rFonts w:ascii="Avenir Next LT Pro" w:hAnsi="Avenir Next LT Pro"/>
           <w:lang w:val="en-US"/>
         </w:rPr>
-        <w:t>Software: Visual Studio Code, OWASP tools, SQLi-testtools</w:t>
-      </w:r>
+        <w:t>Software: Visual Studio Code, OWASP tools, SQLi-</w:t>
+      </w:r>
+      <w:proofErr w:type="spellStart"/>
+      <w:r>
+        <w:rPr>
+          <w:rFonts w:ascii="Avenir Next LT Pro" w:hAnsi="Avenir Next LT Pro"/>
+          <w:lang w:val="en-US"/>
+        </w:rPr>
+        <w:t>testtools</w:t>
+      </w:r>
+      <w:proofErr w:type="spellEnd"/>
     </w:p>
     <w:p>
       <w:pPr>
@@ -7263,7 +8302,7 @@
             </wp:anchor>
           </w:drawing>
         </mc:Choice>
-        <mc:Fallback xmlns:a14="http://schemas.microsoft.com/office/drawing/2010/main" xmlns:pic="http://schemas.openxmlformats.org/drawingml/2006/picture" xmlns:a="http://schemas.openxmlformats.org/drawingml/2006/main">
+        <mc:Fallback xmlns:a="http://schemas.openxmlformats.org/drawingml/2006/main" xmlns:pic="http://schemas.openxmlformats.org/drawingml/2006/picture" xmlns:a14="http://schemas.microsoft.com/office/drawing/2010/main">
           <w:pict w14:anchorId="1CADCD6F">
             <v:group id="Groep 102" style="position:absolute;margin-left:-1in;margin-top:-29.55pt;width:595.25pt;height:835.05pt;z-index:-251657216" coordsize="75596,106051" coordorigin=",186" o:spid="_x0000_s1026" w14:anchorId="0FC57937" o:gfxdata="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">
               <v:shapetype id="_x0000_t75" coordsize="21600,21600" filled="f" stroked="f" o:spt="75" o:preferrelative="t" path="m@4@5l@4@11@9@11@9@5xe">
@@ -7803,6 +8842,230 @@
     </w:lvl>
   </w:abstractNum>
   <w:abstractNum w:abstractNumId="4" w15:restartNumberingAfterBreak="0">
+    <w:nsid w:val="1C65153C"/>
+    <w:multiLevelType w:val="hybridMultilevel"/>
+    <w:tmpl w:val="E3D2913A"/>
+    <w:lvl w:ilvl="0" w:tplc="623E5958">
+      <w:numFmt w:val="bullet"/>
+      <w:lvlText w:val="-"/>
+      <w:lvlJc w:val="left"/>
+      <w:pPr>
+        <w:ind w:left="720" w:hanging="360"/>
+      </w:pPr>
+      <w:rPr>
+        <w:rFonts w:ascii="Avenir Next LT Pro" w:eastAsiaTheme="minorHAnsi" w:hAnsi="Avenir Next LT Pro" w:cstheme="minorBidi" w:hint="default"/>
+      </w:rPr>
+    </w:lvl>
+    <w:lvl w:ilvl="1" w:tplc="20000003" w:tentative="1">
+      <w:start w:val="1"/>
+      <w:numFmt w:val="bullet"/>
+      <w:lvlText w:val="o"/>
+      <w:lvlJc w:val="left"/>
+      <w:pPr>
+        <w:ind w:left="1440" w:hanging="360"/>
+      </w:pPr>
+      <w:rPr>
+        <w:rFonts w:ascii="Courier New" w:hAnsi="Courier New" w:cs="Courier New" w:hint="default"/>
+      </w:rPr>
+    </w:lvl>
+    <w:lvl w:ilvl="2" w:tplc="20000005" w:tentative="1">
+      <w:start w:val="1"/>
+      <w:numFmt w:val="bullet"/>
+      <w:lvlText w:val=""/>
+      <w:lvlJc w:val="left"/>
+      <w:pPr>
+        <w:ind w:left="2160" w:hanging="360"/>
+      </w:pPr>
+      <w:rPr>
+        <w:rFonts w:ascii="Wingdings" w:hAnsi="Wingdings" w:hint="default"/>
+      </w:rPr>
+    </w:lvl>
+    <w:lvl w:ilvl="3" w:tplc="20000001" w:tentative="1">
+      <w:start w:val="1"/>
+      <w:numFmt w:val="bullet"/>
+      <w:lvlText w:val=""/>
+      <w:lvlJc w:val="left"/>
+      <w:pPr>
+        <w:ind w:left="2880" w:hanging="360"/>
+      </w:pPr>
+      <w:rPr>
+        <w:rFonts w:ascii="Symbol" w:hAnsi="Symbol" w:hint="default"/>
+      </w:rPr>
+    </w:lvl>
+    <w:lvl w:ilvl="4" w:tplc="20000003" w:tentative="1">
+      <w:start w:val="1"/>
+      <w:numFmt w:val="bullet"/>
+      <w:lvlText w:val="o"/>
+      <w:lvlJc w:val="left"/>
+      <w:pPr>
+        <w:ind w:left="3600" w:hanging="360"/>
+      </w:pPr>
+      <w:rPr>
+        <w:rFonts w:ascii="Courier New" w:hAnsi="Courier New" w:cs="Courier New" w:hint="default"/>
+      </w:rPr>
+    </w:lvl>
+    <w:lvl w:ilvl="5" w:tplc="20000005" w:tentative="1">
+      <w:start w:val="1"/>
+      <w:numFmt w:val="bullet"/>
+      <w:lvlText w:val=""/>
+      <w:lvlJc w:val="left"/>
+      <w:pPr>
+        <w:ind w:left="4320" w:hanging="360"/>
+      </w:pPr>
+      <w:rPr>
+        <w:rFonts w:ascii="Wingdings" w:hAnsi="Wingdings" w:hint="default"/>
+      </w:rPr>
+    </w:lvl>
+    <w:lvl w:ilvl="6" w:tplc="20000001" w:tentative="1">
+      <w:start w:val="1"/>
+      <w:numFmt w:val="bullet"/>
+      <w:lvlText w:val=""/>
+      <w:lvlJc w:val="left"/>
+      <w:pPr>
+        <w:ind w:left="5040" w:hanging="360"/>
+      </w:pPr>
+      <w:rPr>
+        <w:rFonts w:ascii="Symbol" w:hAnsi="Symbol" w:hint="default"/>
+      </w:rPr>
+    </w:lvl>
+    <w:lvl w:ilvl="7" w:tplc="20000003" w:tentative="1">
+      <w:start w:val="1"/>
+      <w:numFmt w:val="bullet"/>
+      <w:lvlText w:val="o"/>
+      <w:lvlJc w:val="left"/>
+      <w:pPr>
+        <w:ind w:left="5760" w:hanging="360"/>
+      </w:pPr>
+      <w:rPr>
+        <w:rFonts w:ascii="Courier New" w:hAnsi="Courier New" w:cs="Courier New" w:hint="default"/>
+      </w:rPr>
+    </w:lvl>
+    <w:lvl w:ilvl="8" w:tplc="20000005" w:tentative="1">
+      <w:start w:val="1"/>
+      <w:numFmt w:val="bullet"/>
+      <w:lvlText w:val=""/>
+      <w:lvlJc w:val="left"/>
+      <w:pPr>
+        <w:ind w:left="6480" w:hanging="360"/>
+      </w:pPr>
+      <w:rPr>
+        <w:rFonts w:ascii="Wingdings" w:hAnsi="Wingdings" w:hint="default"/>
+      </w:rPr>
+    </w:lvl>
+  </w:abstractNum>
+  <w:abstractNum w:abstractNumId="5" w15:restartNumberingAfterBreak="0">
+    <w:nsid w:val="29AB34BA"/>
+    <w:multiLevelType w:val="hybridMultilevel"/>
+    <w:tmpl w:val="9176FEBC"/>
+    <w:lvl w:ilvl="0" w:tplc="6AEC75EE">
+      <w:numFmt w:val="bullet"/>
+      <w:lvlText w:val="-"/>
+      <w:lvlJc w:val="left"/>
+      <w:pPr>
+        <w:ind w:left="720" w:hanging="360"/>
+      </w:pPr>
+      <w:rPr>
+        <w:rFonts w:ascii="Avenir Next LT Pro" w:eastAsiaTheme="minorHAnsi" w:hAnsi="Avenir Next LT Pro" w:cstheme="minorBidi" w:hint="default"/>
+      </w:rPr>
+    </w:lvl>
+    <w:lvl w:ilvl="1" w:tplc="20000003" w:tentative="1">
+      <w:start w:val="1"/>
+      <w:numFmt w:val="bullet"/>
+      <w:lvlText w:val="o"/>
+      <w:lvlJc w:val="left"/>
+      <w:pPr>
+        <w:ind w:left="1440" w:hanging="360"/>
+      </w:pPr>
+      <w:rPr>
+        <w:rFonts w:ascii="Courier New" w:hAnsi="Courier New" w:cs="Courier New" w:hint="default"/>
+      </w:rPr>
+    </w:lvl>
+    <w:lvl w:ilvl="2" w:tplc="20000005" w:tentative="1">
+      <w:start w:val="1"/>
+      <w:numFmt w:val="bullet"/>
+      <w:lvlText w:val=""/>
+      <w:lvlJc w:val="left"/>
+      <w:pPr>
+        <w:ind w:left="2160" w:hanging="360"/>
+      </w:pPr>
+      <w:rPr>
+        <w:rFonts w:ascii="Wingdings" w:hAnsi="Wingdings" w:hint="default"/>
+      </w:rPr>
+    </w:lvl>
+    <w:lvl w:ilvl="3" w:tplc="20000001" w:tentative="1">
+      <w:start w:val="1"/>
+      <w:numFmt w:val="bullet"/>
+      <w:lvlText w:val=""/>
+      <w:lvlJc w:val="left"/>
+      <w:pPr>
+        <w:ind w:left="2880" w:hanging="360"/>
+      </w:pPr>
+      <w:rPr>
+        <w:rFonts w:ascii="Symbol" w:hAnsi="Symbol" w:hint="default"/>
+      </w:rPr>
+    </w:lvl>
+    <w:lvl w:ilvl="4" w:tplc="20000003" w:tentative="1">
+      <w:start w:val="1"/>
+      <w:numFmt w:val="bullet"/>
+      <w:lvlText w:val="o"/>
+      <w:lvlJc w:val="left"/>
+      <w:pPr>
+        <w:ind w:left="3600" w:hanging="360"/>
+      </w:pPr>
+      <w:rPr>
+        <w:rFonts w:ascii="Courier New" w:hAnsi="Courier New" w:cs="Courier New" w:hint="default"/>
+      </w:rPr>
+    </w:lvl>
+    <w:lvl w:ilvl="5" w:tplc="20000005" w:tentative="1">
+      <w:start w:val="1"/>
+      <w:numFmt w:val="bullet"/>
+      <w:lvlText w:val=""/>
+      <w:lvlJc w:val="left"/>
+      <w:pPr>
+        <w:ind w:left="4320" w:hanging="360"/>
+      </w:pPr>
+      <w:rPr>
+        <w:rFonts w:ascii="Wingdings" w:hAnsi="Wingdings" w:hint="default"/>
+      </w:rPr>
+    </w:lvl>
+    <w:lvl w:ilvl="6" w:tplc="20000001" w:tentative="1">
+      <w:start w:val="1"/>
+      <w:numFmt w:val="bullet"/>
+      <w:lvlText w:val=""/>
+      <w:lvlJc w:val="left"/>
+      <w:pPr>
+        <w:ind w:left="5040" w:hanging="360"/>
+      </w:pPr>
+      <w:rPr>
+        <w:rFonts w:ascii="Symbol" w:hAnsi="Symbol" w:hint="default"/>
+      </w:rPr>
+    </w:lvl>
+    <w:lvl w:ilvl="7" w:tplc="20000003" w:tentative="1">
+      <w:start w:val="1"/>
+      <w:numFmt w:val="bullet"/>
+      <w:lvlText w:val="o"/>
+      <w:lvlJc w:val="left"/>
+      <w:pPr>
+        <w:ind w:left="5760" w:hanging="360"/>
+      </w:pPr>
+      <w:rPr>
+        <w:rFonts w:ascii="Courier New" w:hAnsi="Courier New" w:cs="Courier New" w:hint="default"/>
+      </w:rPr>
+    </w:lvl>
+    <w:lvl w:ilvl="8" w:tplc="20000005" w:tentative="1">
+      <w:start w:val="1"/>
+      <w:numFmt w:val="bullet"/>
+      <w:lvlText w:val=""/>
+      <w:lvlJc w:val="left"/>
+      <w:pPr>
+        <w:ind w:left="6480" w:hanging="360"/>
+      </w:pPr>
+      <w:rPr>
+        <w:rFonts w:ascii="Wingdings" w:hAnsi="Wingdings" w:hint="default"/>
+      </w:rPr>
+    </w:lvl>
+  </w:abstractNum>
+  <w:abstractNum w:abstractNumId="6" w15:restartNumberingAfterBreak="0">
     <w:nsid w:val="2E8A25EB"/>
     <w:multiLevelType w:val="hybridMultilevel"/>
     <w:tmpl w:val="E2CADE5A"/>
@@ -7915,7 +9178,7 @@
       </w:rPr>
     </w:lvl>
   </w:abstractNum>
-  <w:abstractNum w:abstractNumId="5" w15:restartNumberingAfterBreak="0">
+  <w:abstractNum w:abstractNumId="7" w15:restartNumberingAfterBreak="0">
     <w:nsid w:val="3D7C718D"/>
     <w:multiLevelType w:val="hybridMultilevel"/>
     <w:tmpl w:val="05166A88"/>
@@ -8028,7 +9291,7 @@
       </w:rPr>
     </w:lvl>
   </w:abstractNum>
-  <w:abstractNum w:abstractNumId="6" w15:restartNumberingAfterBreak="0">
+  <w:abstractNum w:abstractNumId="8" w15:restartNumberingAfterBreak="0">
     <w:nsid w:val="465863E6"/>
     <w:multiLevelType w:val="multilevel"/>
     <w:tmpl w:val="952C670A"/>
@@ -8141,7 +9404,7 @@
       </w:rPr>
     </w:lvl>
   </w:abstractNum>
-  <w:abstractNum w:abstractNumId="7" w15:restartNumberingAfterBreak="0">
+  <w:abstractNum w:abstractNumId="9" w15:restartNumberingAfterBreak="0">
     <w:nsid w:val="57F34C17"/>
     <w:multiLevelType w:val="hybridMultilevel"/>
     <w:tmpl w:val="867A82BA"/>
@@ -8254,7 +9517,7 @@
       </w:rPr>
     </w:lvl>
   </w:abstractNum>
-  <w:abstractNum w:abstractNumId="8" w15:restartNumberingAfterBreak="0">
+  <w:abstractNum w:abstractNumId="10" w15:restartNumberingAfterBreak="0">
     <w:nsid w:val="58197AC8"/>
     <w:multiLevelType w:val="hybridMultilevel"/>
     <w:tmpl w:val="208E434C"/>
@@ -8367,7 +9630,7 @@
       </w:rPr>
     </w:lvl>
   </w:abstractNum>
-  <w:abstractNum w:abstractNumId="9" w15:restartNumberingAfterBreak="0">
+  <w:abstractNum w:abstractNumId="11" w15:restartNumberingAfterBreak="0">
     <w:nsid w:val="5DBA050E"/>
     <w:multiLevelType w:val="hybridMultilevel"/>
     <w:tmpl w:val="4E628CE0"/>
@@ -8480,7 +9743,7 @@
       </w:rPr>
     </w:lvl>
   </w:abstractNum>
-  <w:abstractNum w:abstractNumId="10" w15:restartNumberingAfterBreak="0">
+  <w:abstractNum w:abstractNumId="12" w15:restartNumberingAfterBreak="0">
     <w:nsid w:val="64887A60"/>
     <w:multiLevelType w:val="hybridMultilevel"/>
     <w:tmpl w:val="FA3C8FE4"/>
@@ -8593,7 +9856,7 @@
       </w:rPr>
     </w:lvl>
   </w:abstractNum>
-  <w:abstractNum w:abstractNumId="11" w15:restartNumberingAfterBreak="0">
+  <w:abstractNum w:abstractNumId="13" w15:restartNumberingAfterBreak="0">
     <w:nsid w:val="6CEE34B5"/>
     <w:multiLevelType w:val="hybridMultilevel"/>
     <w:tmpl w:val="A22C17CE"/>
@@ -8706,7 +9969,7 @@
       </w:rPr>
     </w:lvl>
   </w:abstractNum>
-  <w:abstractNum w:abstractNumId="12" w15:restartNumberingAfterBreak="0">
+  <w:abstractNum w:abstractNumId="14" w15:restartNumberingAfterBreak="0">
     <w:nsid w:val="6DEB1271"/>
     <w:multiLevelType w:val="hybridMultilevel"/>
     <w:tmpl w:val="343644F0"/>
@@ -8819,7 +10082,7 @@
       </w:rPr>
     </w:lvl>
   </w:abstractNum>
-  <w:abstractNum w:abstractNumId="13" w15:restartNumberingAfterBreak="0">
+  <w:abstractNum w:abstractNumId="15" w15:restartNumberingAfterBreak="0">
     <w:nsid w:val="753A7E57"/>
     <w:multiLevelType w:val="hybridMultilevel"/>
     <w:tmpl w:val="46ACCC2A"/>
@@ -8932,7 +10195,7 @@
       </w:rPr>
     </w:lvl>
   </w:abstractNum>
-  <w:abstractNum w:abstractNumId="14" w15:restartNumberingAfterBreak="0">
+  <w:abstractNum w:abstractNumId="16" w15:restartNumberingAfterBreak="0">
     <w:nsid w:val="7B584337"/>
     <w:multiLevelType w:val="hybridMultilevel"/>
     <w:tmpl w:val="B588C136"/>
@@ -9045,7 +10308,7 @@
       </w:rPr>
     </w:lvl>
   </w:abstractNum>
-  <w:abstractNum w:abstractNumId="15" w15:restartNumberingAfterBreak="0">
+  <w:abstractNum w:abstractNumId="17" w15:restartNumberingAfterBreak="0">
     <w:nsid w:val="7C6D229D"/>
     <w:multiLevelType w:val="hybridMultilevel"/>
     <w:tmpl w:val="1DB0679C"/>
@@ -9159,16 +10422,16 @@
     </w:lvl>
   </w:abstractNum>
   <w:num w:numId="1" w16cid:durableId="805506444">
-    <w:abstractNumId w:val="12"/>
+    <w:abstractNumId w:val="14"/>
   </w:num>
   <w:num w:numId="2" w16cid:durableId="395054062">
-    <w:abstractNumId w:val="11"/>
+    <w:abstractNumId w:val="13"/>
   </w:num>
   <w:num w:numId="3" w16cid:durableId="1391156121">
-    <w:abstractNumId w:val="5"/>
+    <w:abstractNumId w:val="7"/>
   </w:num>
   <w:num w:numId="4" w16cid:durableId="2109882738">
-    <w:abstractNumId w:val="15"/>
+    <w:abstractNumId w:val="17"/>
   </w:num>
   <w:num w:numId="5" w16cid:durableId="420419591">
     <w:abstractNumId w:val="1"/>
@@ -9177,34 +10440,40 @@
     <w:abstractNumId w:val="0"/>
   </w:num>
   <w:num w:numId="7" w16cid:durableId="1958677903">
+    <w:abstractNumId w:val="12"/>
+  </w:num>
+  <w:num w:numId="8" w16cid:durableId="879824401">
+    <w:abstractNumId w:val="11"/>
+  </w:num>
+  <w:num w:numId="9" w16cid:durableId="2044284222">
+    <w:abstractNumId w:val="16"/>
+  </w:num>
+  <w:num w:numId="10" w16cid:durableId="1394043786">
+    <w:abstractNumId w:val="9"/>
+  </w:num>
+  <w:num w:numId="11" w16cid:durableId="1267956162">
     <w:abstractNumId w:val="10"/>
   </w:num>
-  <w:num w:numId="8" w16cid:durableId="879824401">
-    <w:abstractNumId w:val="9"/>
-  </w:num>
-  <w:num w:numId="9" w16cid:durableId="2044284222">
-    <w:abstractNumId w:val="14"/>
-  </w:num>
-  <w:num w:numId="10" w16cid:durableId="1394043786">
-    <w:abstractNumId w:val="7"/>
-  </w:num>
-  <w:num w:numId="11" w16cid:durableId="1267956162">
-    <w:abstractNumId w:val="8"/>
-  </w:num>
   <w:num w:numId="12" w16cid:durableId="954678820">
-    <w:abstractNumId w:val="4"/>
+    <w:abstractNumId w:val="6"/>
   </w:num>
   <w:num w:numId="13" w16cid:durableId="1979917211">
-    <w:abstractNumId w:val="13"/>
+    <w:abstractNumId w:val="15"/>
   </w:num>
   <w:num w:numId="14" w16cid:durableId="1430158012">
     <w:abstractNumId w:val="3"/>
   </w:num>
   <w:num w:numId="15" w16cid:durableId="1067613112">
-    <w:abstractNumId w:val="6"/>
+    <w:abstractNumId w:val="8"/>
   </w:num>
   <w:num w:numId="16" w16cid:durableId="1481194700">
     <w:abstractNumId w:val="2"/>
+  </w:num>
+  <w:num w:numId="17" w16cid:durableId="1849784092">
+    <w:abstractNumId w:val="4"/>
+  </w:num>
+  <w:num w:numId="18" w16cid:durableId="1433014260">
+    <w:abstractNumId w:val="5"/>
   </w:num>
   <w:numIdMacAtCleanup w:val="15"/>
 </w:numbering>
@@ -10168,19 +11437,19 @@
     <w:pitch w:val="variable"/>
     <w:sig w:usb0="00000000" w:usb1="10000000" w:usb2="00000000" w:usb3="00000000" w:csb0="80000000" w:csb1="00000000"/>
   </w:font>
+  <w:font w:name="Avenir Next LT Pro">
+    <w:altName w:val="Calibri"/>
+    <w:charset w:val="00"/>
+    <w:family w:val="swiss"/>
+    <w:pitch w:val="variable"/>
+    <w:sig w:usb0="800000EF" w:usb1="5000204A" w:usb2="00000000" w:usb3="00000000" w:csb0="00000093" w:csb1="00000000"/>
+  </w:font>
   <w:font w:name="Calibri">
     <w:panose1 w:val="020F0502020204030204"/>
     <w:charset w:val="00"/>
     <w:family w:val="swiss"/>
     <w:pitch w:val="variable"/>
     <w:sig w:usb0="E4002EFF" w:usb1="C000247B" w:usb2="00000009" w:usb3="00000000" w:csb0="000001FF" w:csb1="00000000"/>
-  </w:font>
-  <w:font w:name="Avenir Next LT Pro">
-    <w:altName w:val="Calibri"/>
-    <w:charset w:val="00"/>
-    <w:family w:val="swiss"/>
-    <w:pitch w:val="variable"/>
-    <w:sig w:usb0="800000EF" w:usb1="5000204A" w:usb2="00000000" w:usb3="00000000" w:csb0="00000093" w:csb1="00000000"/>
   </w:font>
   <w:font w:name="Tahoma">
     <w:panose1 w:val="020B0604030504040204"/>
@@ -10267,11 +11536,13 @@
     <w:rsid w:val="008D20A3"/>
     <w:rsid w:val="009371C1"/>
     <w:rsid w:val="00946403"/>
+    <w:rsid w:val="009773EB"/>
     <w:rsid w:val="00A745AF"/>
     <w:rsid w:val="00CF785F"/>
     <w:rsid w:val="00DD5D19"/>
     <w:rsid w:val="00F106F5"/>
     <w:rsid w:val="00F12CC0"/>
+    <w:rsid w:val="00F367DF"/>
   </w:rsids>
   <m:mathPr>
     <m:mathFont m:val="Cambria Math"/>
@@ -11052,222 +12323,6 @@
 </file>
 
 <file path=customXml/item3.xml><?xml version="1.0" encoding="utf-8"?>
-<?mso-contentType ?>
-<FormTemplates xmlns="http://schemas.microsoft.com/sharepoint/v3/contenttype/forms">
-  <Display>DocumentLibraryForm</Display>
-  <Edit>DocumentLibraryForm</Edit>
-  <New>DocumentLibraryForm</New>
-</FormTemplates>
-</file>
-
-<file path=customXml/item4.xml><?xml version="1.0" encoding="utf-8"?>
-<ct:contentTypeSchema xmlns:ct="http://schemas.microsoft.com/office/2006/metadata/contentType" xmlns:ma="http://schemas.microsoft.com/office/2006/metadata/properties/metaAttributes" ct:_="" ma:_="" ma:contentTypeName="Document" ma:contentTypeID="0x0101009AEE7C0E3FC1AF49AE2D21952FC004E7" ma:contentTypeVersion="13" ma:contentTypeDescription="Een nieuw document maken." ma:contentTypeScope="" ma:versionID="960b10dc37b0d3729643b1edbc9ea311">
-  <xsd:schema xmlns:xsd="http://www.w3.org/2001/XMLSchema" xmlns:xs="http://www.w3.org/2001/XMLSchema" xmlns:p="http://schemas.microsoft.com/office/2006/metadata/properties" xmlns:ns2="70093741-41eb-4420-bf3d-ff9555ef2a33" xmlns:ns3="8e0d46a4-c7d4-472b-9541-810c49191871" targetNamespace="http://schemas.microsoft.com/office/2006/metadata/properties" ma:root="true" ma:fieldsID="8470fe0247e22942882bacf7112b3079" ns2:_="" ns3:_="">
-    <xsd:import namespace="70093741-41eb-4420-bf3d-ff9555ef2a33"/>
-    <xsd:import namespace="8e0d46a4-c7d4-472b-9541-810c49191871"/>
-    <xsd:element name="properties">
-      <xsd:complexType>
-        <xsd:sequence>
-          <xsd:element name="documentManagement">
-            <xsd:complexType>
-              <xsd:all>
-                <xsd:element ref="ns2:MediaServiceMetadata" minOccurs="0"/>
-                <xsd:element ref="ns2:MediaServiceFastMetadata" minOccurs="0"/>
-                <xsd:element ref="ns2:MediaServiceSearchProperties" minOccurs="0"/>
-                <xsd:element ref="ns2:MediaServiceDateTaken" minOccurs="0"/>
-                <xsd:element ref="ns2:MediaServiceGenerationTime" minOccurs="0"/>
-                <xsd:element ref="ns2:MediaServiceEventHashCode" minOccurs="0"/>
-                <xsd:element ref="ns2:MediaLengthInSeconds" minOccurs="0"/>
-                <xsd:element ref="ns2:lcf76f155ced4ddcb4097134ff3c332f" minOccurs="0"/>
-                <xsd:element ref="ns3:TaxCatchAll" minOccurs="0"/>
-                <xsd:element ref="ns2:MediaServiceOCR" minOccurs="0"/>
-                <xsd:element ref="ns2:MediaServiceBillingMetadata" minOccurs="0"/>
-                <xsd:element ref="ns2:MediaServiceLocation" minOccurs="0"/>
-              </xsd:all>
-            </xsd:complexType>
-          </xsd:element>
-        </xsd:sequence>
-      </xsd:complexType>
-    </xsd:element>
-  </xsd:schema>
-  <xsd:schema xmlns:xsd="http://www.w3.org/2001/XMLSchema" xmlns:xs="http://www.w3.org/2001/XMLSchema" xmlns:dms="http://schemas.microsoft.com/office/2006/documentManagement/types" xmlns:pc="http://schemas.microsoft.com/office/infopath/2007/PartnerControls" targetNamespace="70093741-41eb-4420-bf3d-ff9555ef2a33" elementFormDefault="qualified">
-    <xsd:import namespace="http://schemas.microsoft.com/office/2006/documentManagement/types"/>
-    <xsd:import namespace="http://schemas.microsoft.com/office/infopath/2007/PartnerControls"/>
-    <xsd:element name="MediaServiceMetadata" ma:index="8" nillable="true" ma:displayName="MediaServiceMetadata" ma:hidden="true" ma:internalName="MediaServiceMetadata" ma:readOnly="true">
-      <xsd:simpleType>
-        <xsd:restriction base="dms:Note"/>
-      </xsd:simpleType>
-    </xsd:element>
-    <xsd:element name="MediaServiceFastMetadata" ma:index="9" nillable="true" ma:displayName="MediaServiceFastMetadata" ma:hidden="true" ma:internalName="MediaServiceFastMetadata" ma:readOnly="true">
-      <xsd:simpleType>
-        <xsd:restriction base="dms:Note"/>
-      </xsd:simpleType>
-    </xsd:element>
-    <xsd:element name="MediaServiceSearchProperties" ma:index="10" nillable="true" ma:displayName="MediaServiceSearchProperties" ma:hidden="true" ma:internalName="MediaServiceSearchProperties" ma:readOnly="true">
-      <xsd:simpleType>
-        <xsd:restriction base="dms:Note"/>
-      </xsd:simpleType>
-    </xsd:element>
-    <xsd:element name="MediaServiceDateTaken" ma:index="11" nillable="true" ma:displayName="MediaServiceDateTaken" ma:hidden="true" ma:indexed="true" ma:internalName="MediaServiceDateTaken" ma:readOnly="true">
-      <xsd:simpleType>
-        <xsd:restriction base="dms:Text"/>
-      </xsd:simpleType>
-    </xsd:element>
-    <xsd:element name="MediaServiceGenerationTime" ma:index="12" nillable="true" ma:displayName="MediaServiceGenerationTime" ma:hidden="true" ma:internalName="MediaServiceGenerationTime" ma:readOnly="true">
-      <xsd:simpleType>
-        <xsd:restriction base="dms:Text"/>
-      </xsd:simpleType>
-    </xsd:element>
-    <xsd:element name="MediaServiceEventHashCode" ma:index="13" nillable="true" ma:displayName="MediaServiceEventHashCode" ma:hidden="true" ma:internalName="MediaServiceEventHashCode" ma:readOnly="true">
-      <xsd:simpleType>
-        <xsd:restriction base="dms:Text"/>
-      </xsd:simpleType>
-    </xsd:element>
-    <xsd:element name="MediaLengthInSeconds" ma:index="14" nillable="true" ma:displayName="MediaLengthInSeconds" ma:hidden="true" ma:internalName="MediaLengthInSeconds" ma:readOnly="true">
-      <xsd:simpleType>
-        <xsd:restriction base="dms:Unknown"/>
-      </xsd:simpleType>
-    </xsd:element>
-    <xsd:element name="lcf76f155ced4ddcb4097134ff3c332f" ma:index="16" nillable="true" ma:taxonomy="true" ma:internalName="lcf76f155ced4ddcb4097134ff3c332f" ma:taxonomyFieldName="MediaServiceImageTags" ma:displayName="Afbeeldingtags" ma:readOnly="false" ma:fieldId="{5cf76f15-5ced-4ddc-b409-7134ff3c332f}" ma:taxonomyMulti="true" ma:sspId="5bd69f14-2b9f-433c-9887-fccfa466e118" ma:termSetId="09814cd3-568e-fe90-9814-8d621ff8fb84" ma:anchorId="fba54fb3-c3e1-fe81-a776-ca4b69148c4d" ma:open="true" ma:isKeyword="false">
-      <xsd:complexType>
-        <xsd:sequence>
-          <xsd:element ref="pc:Terms" minOccurs="0" maxOccurs="1"/>
-        </xsd:sequence>
-      </xsd:complexType>
-    </xsd:element>
-    <xsd:element name="MediaServiceOCR" ma:index="18" nillable="true" ma:displayName="Extracted Text" ma:internalName="MediaServiceOCR" ma:readOnly="true">
-      <xsd:simpleType>
-        <xsd:restriction base="dms:Note">
-          <xsd:maxLength value="255"/>
-        </xsd:restriction>
-      </xsd:simpleType>
-    </xsd:element>
-    <xsd:element name="MediaServiceBillingMetadata" ma:index="19" nillable="true" ma:displayName="MediaServiceBillingMetadata" ma:hidden="true" ma:internalName="MediaServiceBillingMetadata" ma:readOnly="true">
-      <xsd:simpleType>
-        <xsd:restriction base="dms:Note"/>
-      </xsd:simpleType>
-    </xsd:element>
-    <xsd:element name="MediaServiceLocation" ma:index="20" nillable="true" ma:displayName="Location" ma:description="" ma:indexed="true" ma:internalName="MediaServiceLocation" ma:readOnly="true">
-      <xsd:simpleType>
-        <xsd:restriction base="dms:Text"/>
-      </xsd:simpleType>
-    </xsd:element>
-  </xsd:schema>
-  <xsd:schema xmlns:xsd="http://www.w3.org/2001/XMLSchema" xmlns:xs="http://www.w3.org/2001/XMLSchema" xmlns:dms="http://schemas.microsoft.com/office/2006/documentManagement/types" xmlns:pc="http://schemas.microsoft.com/office/infopath/2007/PartnerControls" targetNamespace="8e0d46a4-c7d4-472b-9541-810c49191871" elementFormDefault="qualified">
-    <xsd:import namespace="http://schemas.microsoft.com/office/2006/documentManagement/types"/>
-    <xsd:import namespace="http://schemas.microsoft.com/office/infopath/2007/PartnerControls"/>
-    <xsd:element name="TaxCatchAll" ma:index="17" nillable="true" ma:displayName="Taxonomy Catch All Column" ma:hidden="true" ma:list="{c8ab18b9-6097-49a0-8cf1-8fd8c6c84254}" ma:internalName="TaxCatchAll" ma:showField="CatchAllData" ma:web="8e0d46a4-c7d4-472b-9541-810c49191871">
-      <xsd:complexType>
-        <xsd:complexContent>
-          <xsd:extension base="dms:MultiChoiceLookup">
-            <xsd:sequence>
-              <xsd:element name="Value" type="dms:Lookup" maxOccurs="unbounded" minOccurs="0" nillable="true"/>
-            </xsd:sequence>
-          </xsd:extension>
-        </xsd:complexContent>
-      </xsd:complexType>
-    </xsd:element>
-  </xsd:schema>
-  <xsd:schema xmlns="http://schemas.openxmlformats.org/package/2006/metadata/core-properties" xmlns:xsd="http://www.w3.org/2001/XMLSchema" xmlns:xsi="http://www.w3.org/2001/XMLSchema-instance" xmlns:dc="http://purl.org/dc/elements/1.1/" xmlns:dcterms="http://purl.org/dc/terms/" xmlns:odoc="http://schemas.microsoft.com/internal/obd" targetNamespace="http://schemas.openxmlformats.org/package/2006/metadata/core-properties" elementFormDefault="qualified" attributeFormDefault="unqualified" blockDefault="#all">
-    <xsd:import namespace="http://purl.org/dc/elements/1.1/" schemaLocation="http://dublincore.org/schemas/xmls/qdc/2003/04/02/dc.xsd"/>
-    <xsd:import namespace="http://purl.org/dc/terms/" schemaLocation="http://dublincore.org/schemas/xmls/qdc/2003/04/02/dcterms.xsd"/>
-    <xsd:element name="coreProperties" type="CT_coreProperties"/>
-    <xsd:complexType name="CT_coreProperties">
-      <xsd:all>
-        <xsd:element ref="dc:creator" minOccurs="0" maxOccurs="1"/>
-        <xsd:element ref="dcterms:created" minOccurs="0" maxOccurs="1"/>
-        <xsd:element ref="dc:identifier" minOccurs="0" maxOccurs="1"/>
-        <xsd:element name="contentType" minOccurs="0" maxOccurs="1" type="xsd:string" ma:index="0" ma:displayName="Inhoudstype"/>
-        <xsd:element ref="dc:title" minOccurs="0" maxOccurs="1" ma:index="4" ma:displayName="Titel"/>
-        <xsd:element ref="dc:subject" minOccurs="0" maxOccurs="1"/>
-        <xsd:element ref="dc:description" minOccurs="0" maxOccurs="1"/>
-        <xsd:element name="keywords" minOccurs="0" maxOccurs="1" type="xsd:string"/>
-        <xsd:element ref="dc:language" minOccurs="0" maxOccurs="1"/>
-        <xsd:element name="category" minOccurs="0" maxOccurs="1" type="xsd:string"/>
-        <xsd:element name="version" minOccurs="0" maxOccurs="1" type="xsd:string"/>
-        <xsd:element name="revision" minOccurs="0" maxOccurs="1" type="xsd:string">
-          <xsd:annotation>
-            <xsd:documentation>
-                        This value indicates the number of saves or revisions. The application is responsible for updating this value after each revision.
-                    </xsd:documentation>
-          </xsd:annotation>
-        </xsd:element>
-        <xsd:element name="lastModifiedBy" minOccurs="0" maxOccurs="1" type="xsd:string"/>
-        <xsd:element ref="dcterms:modified" minOccurs="0" maxOccurs="1"/>
-        <xsd:element name="contentStatus" minOccurs="0" maxOccurs="1" type="xsd:string"/>
-      </xsd:all>
-    </xsd:complexType>
-  </xsd:schema>
-  <xs:schema xmlns:pc="http://schemas.microsoft.com/office/infopath/2007/PartnerControls" xmlns:xs="http://www.w3.org/2001/XMLSchema" targetNamespace="http://schemas.microsoft.com/office/infopath/2007/PartnerControls" elementFormDefault="qualified" attributeFormDefault="unqualified">
-    <xs:element name="Person">
-      <xs:complexType>
-        <xs:sequence>
-          <xs:element ref="pc:DisplayName" minOccurs="0"/>
-          <xs:element ref="pc:AccountId" minOccurs="0"/>
-          <xs:element ref="pc:AccountType" minOccurs="0"/>
-        </xs:sequence>
-      </xs:complexType>
-    </xs:element>
-    <xs:element name="DisplayName" type="xs:string"/>
-    <xs:element name="AccountId" type="xs:string"/>
-    <xs:element name="AccountType" type="xs:string"/>
-    <xs:element name="BDCAssociatedEntity">
-      <xs:complexType>
-        <xs:sequence>
-          <xs:element ref="pc:BDCEntity" minOccurs="0" maxOccurs="unbounded"/>
-        </xs:sequence>
-        <xs:attribute ref="pc:EntityNamespace"/>
-        <xs:attribute ref="pc:EntityName"/>
-        <xs:attribute ref="pc:SystemInstanceName"/>
-        <xs:attribute ref="pc:AssociationName"/>
-      </xs:complexType>
-    </xs:element>
-    <xs:attribute name="EntityNamespace" type="xs:string"/>
-    <xs:attribute name="EntityName" type="xs:string"/>
-    <xs:attribute name="SystemInstanceName" type="xs:string"/>
-    <xs:attribute name="AssociationName" type="xs:string"/>
-    <xs:element name="BDCEntity">
-      <xs:complexType>
-        <xs:sequence>
-          <xs:element ref="pc:EntityDisplayName" minOccurs="0"/>
-          <xs:element ref="pc:EntityInstanceReference" minOccurs="0"/>
-          <xs:element ref="pc:EntityId1" minOccurs="0"/>
-          <xs:element ref="pc:EntityId2" minOccurs="0"/>
-          <xs:element ref="pc:EntityId3" minOccurs="0"/>
-          <xs:element ref="pc:EntityId4" minOccurs="0"/>
-          <xs:element ref="pc:EntityId5" minOccurs="0"/>
-        </xs:sequence>
-      </xs:complexType>
-    </xs:element>
-    <xs:element name="EntityDisplayName" type="xs:string"/>
-    <xs:element name="EntityInstanceReference" type="xs:string"/>
-    <xs:element name="EntityId1" type="xs:string"/>
-    <xs:element name="EntityId2" type="xs:string"/>
-    <xs:element name="EntityId3" type="xs:string"/>
-    <xs:element name="EntityId4" type="xs:string"/>
-    <xs:element name="EntityId5" type="xs:string"/>
-    <xs:element name="Terms">
-      <xs:complexType>
-        <xs:sequence>
-          <xs:element ref="pc:TermInfo" minOccurs="0" maxOccurs="unbounded"/>
-        </xs:sequence>
-      </xs:complexType>
-    </xs:element>
-    <xs:element name="TermInfo">
-      <xs:complexType>
-        <xs:sequence>
-          <xs:element ref="pc:TermName" minOccurs="0"/>
-          <xs:element ref="pc:TermId" minOccurs="0"/>
-        </xs:sequence>
-      </xs:complexType>
-    </xs:element>
-    <xs:element name="TermName" type="xs:string"/>
-    <xs:element name="TermId" type="xs:string"/>
-  </xs:schema>
-</ct:contentTypeSchema>
-</file>
-
-<file path=customXml/item5.xml><?xml version="1.0" encoding="utf-8"?>
 <b:Sources xmlns:b="http://schemas.openxmlformats.org/officeDocument/2006/bibliography" xmlns="http://schemas.openxmlformats.org/officeDocument/2006/bibliography" SelectedStyle="\APASixthEditionOfficeOnline.xsl" StyleName="APA" Version="6">
   <b:Source>
     <b:Tag>Cle18</b:Tag>
@@ -11647,6 +12702,222 @@
 </b:Sources>
 </file>
 
+<file path=customXml/item4.xml><?xml version="1.0" encoding="utf-8"?>
+<ct:contentTypeSchema xmlns:ct="http://schemas.microsoft.com/office/2006/metadata/contentType" xmlns:ma="http://schemas.microsoft.com/office/2006/metadata/properties/metaAttributes" ct:_="" ma:_="" ma:contentTypeName="Document" ma:contentTypeID="0x0101009AEE7C0E3FC1AF49AE2D21952FC004E7" ma:contentTypeVersion="13" ma:contentTypeDescription="Een nieuw document maken." ma:contentTypeScope="" ma:versionID="960b10dc37b0d3729643b1edbc9ea311">
+  <xsd:schema xmlns:xsd="http://www.w3.org/2001/XMLSchema" xmlns:xs="http://www.w3.org/2001/XMLSchema" xmlns:p="http://schemas.microsoft.com/office/2006/metadata/properties" xmlns:ns2="70093741-41eb-4420-bf3d-ff9555ef2a33" xmlns:ns3="8e0d46a4-c7d4-472b-9541-810c49191871" targetNamespace="http://schemas.microsoft.com/office/2006/metadata/properties" ma:root="true" ma:fieldsID="8470fe0247e22942882bacf7112b3079" ns2:_="" ns3:_="">
+    <xsd:import namespace="70093741-41eb-4420-bf3d-ff9555ef2a33"/>
+    <xsd:import namespace="8e0d46a4-c7d4-472b-9541-810c49191871"/>
+    <xsd:element name="properties">
+      <xsd:complexType>
+        <xsd:sequence>
+          <xsd:element name="documentManagement">
+            <xsd:complexType>
+              <xsd:all>
+                <xsd:element ref="ns2:MediaServiceMetadata" minOccurs="0"/>
+                <xsd:element ref="ns2:MediaServiceFastMetadata" minOccurs="0"/>
+                <xsd:element ref="ns2:MediaServiceSearchProperties" minOccurs="0"/>
+                <xsd:element ref="ns2:MediaServiceDateTaken" minOccurs="0"/>
+                <xsd:element ref="ns2:MediaServiceGenerationTime" minOccurs="0"/>
+                <xsd:element ref="ns2:MediaServiceEventHashCode" minOccurs="0"/>
+                <xsd:element ref="ns2:MediaLengthInSeconds" minOccurs="0"/>
+                <xsd:element ref="ns2:lcf76f155ced4ddcb4097134ff3c332f" minOccurs="0"/>
+                <xsd:element ref="ns3:TaxCatchAll" minOccurs="0"/>
+                <xsd:element ref="ns2:MediaServiceOCR" minOccurs="0"/>
+                <xsd:element ref="ns2:MediaServiceBillingMetadata" minOccurs="0"/>
+                <xsd:element ref="ns2:MediaServiceLocation" minOccurs="0"/>
+              </xsd:all>
+            </xsd:complexType>
+          </xsd:element>
+        </xsd:sequence>
+      </xsd:complexType>
+    </xsd:element>
+  </xsd:schema>
+  <xsd:schema xmlns:xsd="http://www.w3.org/2001/XMLSchema" xmlns:xs="http://www.w3.org/2001/XMLSchema" xmlns:dms="http://schemas.microsoft.com/office/2006/documentManagement/types" xmlns:pc="http://schemas.microsoft.com/office/infopath/2007/PartnerControls" targetNamespace="70093741-41eb-4420-bf3d-ff9555ef2a33" elementFormDefault="qualified">
+    <xsd:import namespace="http://schemas.microsoft.com/office/2006/documentManagement/types"/>
+    <xsd:import namespace="http://schemas.microsoft.com/office/infopath/2007/PartnerControls"/>
+    <xsd:element name="MediaServiceMetadata" ma:index="8" nillable="true" ma:displayName="MediaServiceMetadata" ma:hidden="true" ma:internalName="MediaServiceMetadata" ma:readOnly="true">
+      <xsd:simpleType>
+        <xsd:restriction base="dms:Note"/>
+      </xsd:simpleType>
+    </xsd:element>
+    <xsd:element name="MediaServiceFastMetadata" ma:index="9" nillable="true" ma:displayName="MediaServiceFastMetadata" ma:hidden="true" ma:internalName="MediaServiceFastMetadata" ma:readOnly="true">
+      <xsd:simpleType>
+        <xsd:restriction base="dms:Note"/>
+      </xsd:simpleType>
+    </xsd:element>
+    <xsd:element name="MediaServiceSearchProperties" ma:index="10" nillable="true" ma:displayName="MediaServiceSearchProperties" ma:hidden="true" ma:internalName="MediaServiceSearchProperties" ma:readOnly="true">
+      <xsd:simpleType>
+        <xsd:restriction base="dms:Note"/>
+      </xsd:simpleType>
+    </xsd:element>
+    <xsd:element name="MediaServiceDateTaken" ma:index="11" nillable="true" ma:displayName="MediaServiceDateTaken" ma:hidden="true" ma:indexed="true" ma:internalName="MediaServiceDateTaken" ma:readOnly="true">
+      <xsd:simpleType>
+        <xsd:restriction base="dms:Text"/>
+      </xsd:simpleType>
+    </xsd:element>
+    <xsd:element name="MediaServiceGenerationTime" ma:index="12" nillable="true" ma:displayName="MediaServiceGenerationTime" ma:hidden="true" ma:internalName="MediaServiceGenerationTime" ma:readOnly="true">
+      <xsd:simpleType>
+        <xsd:restriction base="dms:Text"/>
+      </xsd:simpleType>
+    </xsd:element>
+    <xsd:element name="MediaServiceEventHashCode" ma:index="13" nillable="true" ma:displayName="MediaServiceEventHashCode" ma:hidden="true" ma:internalName="MediaServiceEventHashCode" ma:readOnly="true">
+      <xsd:simpleType>
+        <xsd:restriction base="dms:Text"/>
+      </xsd:simpleType>
+    </xsd:element>
+    <xsd:element name="MediaLengthInSeconds" ma:index="14" nillable="true" ma:displayName="MediaLengthInSeconds" ma:hidden="true" ma:internalName="MediaLengthInSeconds" ma:readOnly="true">
+      <xsd:simpleType>
+        <xsd:restriction base="dms:Unknown"/>
+      </xsd:simpleType>
+    </xsd:element>
+    <xsd:element name="lcf76f155ced4ddcb4097134ff3c332f" ma:index="16" nillable="true" ma:taxonomy="true" ma:internalName="lcf76f155ced4ddcb4097134ff3c332f" ma:taxonomyFieldName="MediaServiceImageTags" ma:displayName="Afbeeldingtags" ma:readOnly="false" ma:fieldId="{5cf76f15-5ced-4ddc-b409-7134ff3c332f}" ma:taxonomyMulti="true" ma:sspId="5bd69f14-2b9f-433c-9887-fccfa466e118" ma:termSetId="09814cd3-568e-fe90-9814-8d621ff8fb84" ma:anchorId="fba54fb3-c3e1-fe81-a776-ca4b69148c4d" ma:open="true" ma:isKeyword="false">
+      <xsd:complexType>
+        <xsd:sequence>
+          <xsd:element ref="pc:Terms" minOccurs="0" maxOccurs="1"/>
+        </xsd:sequence>
+      </xsd:complexType>
+    </xsd:element>
+    <xsd:element name="MediaServiceOCR" ma:index="18" nillable="true" ma:displayName="Extracted Text" ma:internalName="MediaServiceOCR" ma:readOnly="true">
+      <xsd:simpleType>
+        <xsd:restriction base="dms:Note">
+          <xsd:maxLength value="255"/>
+        </xsd:restriction>
+      </xsd:simpleType>
+    </xsd:element>
+    <xsd:element name="MediaServiceBillingMetadata" ma:index="19" nillable="true" ma:displayName="MediaServiceBillingMetadata" ma:hidden="true" ma:internalName="MediaServiceBillingMetadata" ma:readOnly="true">
+      <xsd:simpleType>
+        <xsd:restriction base="dms:Note"/>
+      </xsd:simpleType>
+    </xsd:element>
+    <xsd:element name="MediaServiceLocation" ma:index="20" nillable="true" ma:displayName="Location" ma:description="" ma:indexed="true" ma:internalName="MediaServiceLocation" ma:readOnly="true">
+      <xsd:simpleType>
+        <xsd:restriction base="dms:Text"/>
+      </xsd:simpleType>
+    </xsd:element>
+  </xsd:schema>
+  <xsd:schema xmlns:xsd="http://www.w3.org/2001/XMLSchema" xmlns:xs="http://www.w3.org/2001/XMLSchema" xmlns:dms="http://schemas.microsoft.com/office/2006/documentManagement/types" xmlns:pc="http://schemas.microsoft.com/office/infopath/2007/PartnerControls" targetNamespace="8e0d46a4-c7d4-472b-9541-810c49191871" elementFormDefault="qualified">
+    <xsd:import namespace="http://schemas.microsoft.com/office/2006/documentManagement/types"/>
+    <xsd:import namespace="http://schemas.microsoft.com/office/infopath/2007/PartnerControls"/>
+    <xsd:element name="TaxCatchAll" ma:index="17" nillable="true" ma:displayName="Taxonomy Catch All Column" ma:hidden="true" ma:list="{c8ab18b9-6097-49a0-8cf1-8fd8c6c84254}" ma:internalName="TaxCatchAll" ma:showField="CatchAllData" ma:web="8e0d46a4-c7d4-472b-9541-810c49191871">
+      <xsd:complexType>
+        <xsd:complexContent>
+          <xsd:extension base="dms:MultiChoiceLookup">
+            <xsd:sequence>
+              <xsd:element name="Value" type="dms:Lookup" maxOccurs="unbounded" minOccurs="0" nillable="true"/>
+            </xsd:sequence>
+          </xsd:extension>
+        </xsd:complexContent>
+      </xsd:complexType>
+    </xsd:element>
+  </xsd:schema>
+  <xsd:schema xmlns="http://schemas.openxmlformats.org/package/2006/metadata/core-properties" xmlns:xsd="http://www.w3.org/2001/XMLSchema" xmlns:xsi="http://www.w3.org/2001/XMLSchema-instance" xmlns:dc="http://purl.org/dc/elements/1.1/" xmlns:dcterms="http://purl.org/dc/terms/" xmlns:odoc="http://schemas.microsoft.com/internal/obd" targetNamespace="http://schemas.openxmlformats.org/package/2006/metadata/core-properties" elementFormDefault="qualified" attributeFormDefault="unqualified" blockDefault="#all">
+    <xsd:import namespace="http://purl.org/dc/elements/1.1/" schemaLocation="http://dublincore.org/schemas/xmls/qdc/2003/04/02/dc.xsd"/>
+    <xsd:import namespace="http://purl.org/dc/terms/" schemaLocation="http://dublincore.org/schemas/xmls/qdc/2003/04/02/dcterms.xsd"/>
+    <xsd:element name="coreProperties" type="CT_coreProperties"/>
+    <xsd:complexType name="CT_coreProperties">
+      <xsd:all>
+        <xsd:element ref="dc:creator" minOccurs="0" maxOccurs="1"/>
+        <xsd:element ref="dcterms:created" minOccurs="0" maxOccurs="1"/>
+        <xsd:element ref="dc:identifier" minOccurs="0" maxOccurs="1"/>
+        <xsd:element name="contentType" minOccurs="0" maxOccurs="1" type="xsd:string" ma:index="0" ma:displayName="Inhoudstype"/>
+        <xsd:element ref="dc:title" minOccurs="0" maxOccurs="1" ma:index="4" ma:displayName="Titel"/>
+        <xsd:element ref="dc:subject" minOccurs="0" maxOccurs="1"/>
+        <xsd:element ref="dc:description" minOccurs="0" maxOccurs="1"/>
+        <xsd:element name="keywords" minOccurs="0" maxOccurs="1" type="xsd:string"/>
+        <xsd:element ref="dc:language" minOccurs="0" maxOccurs="1"/>
+        <xsd:element name="category" minOccurs="0" maxOccurs="1" type="xsd:string"/>
+        <xsd:element name="version" minOccurs="0" maxOccurs="1" type="xsd:string"/>
+        <xsd:element name="revision" minOccurs="0" maxOccurs="1" type="xsd:string">
+          <xsd:annotation>
+            <xsd:documentation>
+                        This value indicates the number of saves or revisions. The application is responsible for updating this value after each revision.
+                    </xsd:documentation>
+          </xsd:annotation>
+        </xsd:element>
+        <xsd:element name="lastModifiedBy" minOccurs="0" maxOccurs="1" type="xsd:string"/>
+        <xsd:element ref="dcterms:modified" minOccurs="0" maxOccurs="1"/>
+        <xsd:element name="contentStatus" minOccurs="0" maxOccurs="1" type="xsd:string"/>
+      </xsd:all>
+    </xsd:complexType>
+  </xsd:schema>
+  <xs:schema xmlns:pc="http://schemas.microsoft.com/office/infopath/2007/PartnerControls" xmlns:xs="http://www.w3.org/2001/XMLSchema" targetNamespace="http://schemas.microsoft.com/office/infopath/2007/PartnerControls" elementFormDefault="qualified" attributeFormDefault="unqualified">
+    <xs:element name="Person">
+      <xs:complexType>
+        <xs:sequence>
+          <xs:element ref="pc:DisplayName" minOccurs="0"/>
+          <xs:element ref="pc:AccountId" minOccurs="0"/>
+          <xs:element ref="pc:AccountType" minOccurs="0"/>
+        </xs:sequence>
+      </xs:complexType>
+    </xs:element>
+    <xs:element name="DisplayName" type="xs:string"/>
+    <xs:element name="AccountId" type="xs:string"/>
+    <xs:element name="AccountType" type="xs:string"/>
+    <xs:element name="BDCAssociatedEntity">
+      <xs:complexType>
+        <xs:sequence>
+          <xs:element ref="pc:BDCEntity" minOccurs="0" maxOccurs="unbounded"/>
+        </xs:sequence>
+        <xs:attribute ref="pc:EntityNamespace"/>
+        <xs:attribute ref="pc:EntityName"/>
+        <xs:attribute ref="pc:SystemInstanceName"/>
+        <xs:attribute ref="pc:AssociationName"/>
+      </xs:complexType>
+    </xs:element>
+    <xs:attribute name="EntityNamespace" type="xs:string"/>
+    <xs:attribute name="EntityName" type="xs:string"/>
+    <xs:attribute name="SystemInstanceName" type="xs:string"/>
+    <xs:attribute name="AssociationName" type="xs:string"/>
+    <xs:element name="BDCEntity">
+      <xs:complexType>
+        <xs:sequence>
+          <xs:element ref="pc:EntityDisplayName" minOccurs="0"/>
+          <xs:element ref="pc:EntityInstanceReference" minOccurs="0"/>
+          <xs:element ref="pc:EntityId1" minOccurs="0"/>
+          <xs:element ref="pc:EntityId2" minOccurs="0"/>
+          <xs:element ref="pc:EntityId3" minOccurs="0"/>
+          <xs:element ref="pc:EntityId4" minOccurs="0"/>
+          <xs:element ref="pc:EntityId5" minOccurs="0"/>
+        </xs:sequence>
+      </xs:complexType>
+    </xs:element>
+    <xs:element name="EntityDisplayName" type="xs:string"/>
+    <xs:element name="EntityInstanceReference" type="xs:string"/>
+    <xs:element name="EntityId1" type="xs:string"/>
+    <xs:element name="EntityId2" type="xs:string"/>
+    <xs:element name="EntityId3" type="xs:string"/>
+    <xs:element name="EntityId4" type="xs:string"/>
+    <xs:element name="EntityId5" type="xs:string"/>
+    <xs:element name="Terms">
+      <xs:complexType>
+        <xs:sequence>
+          <xs:element ref="pc:TermInfo" minOccurs="0" maxOccurs="unbounded"/>
+        </xs:sequence>
+      </xs:complexType>
+    </xs:element>
+    <xs:element name="TermInfo">
+      <xs:complexType>
+        <xs:sequence>
+          <xs:element ref="pc:TermName" minOccurs="0"/>
+          <xs:element ref="pc:TermId" minOccurs="0"/>
+        </xs:sequence>
+      </xs:complexType>
+    </xs:element>
+    <xs:element name="TermName" type="xs:string"/>
+    <xs:element name="TermId" type="xs:string"/>
+  </xs:schema>
+</ct:contentTypeSchema>
+</file>
+
+<file path=customXml/item5.xml><?xml version="1.0" encoding="utf-8"?>
+<?mso-contentType ?>
+<FormTemplates xmlns="http://schemas.microsoft.com/sharepoint/v3/contenttype/forms">
+  <Display>DocumentLibraryForm</Display>
+  <Edit>DocumentLibraryForm</Edit>
+  <New>DocumentLibraryForm</New>
+</FormTemplates>
+</file>
+
 <file path=customXml/itemProps1.xml><?xml version="1.0" encoding="utf-8"?>
 <ds:datastoreItem xmlns:ds="http://schemas.openxmlformats.org/officeDocument/2006/customXml" ds:itemID="{55AF091B-3C7A-41E3-B477-F2FDAA23CFDA}">
   <ds:schemaRefs>
@@ -11667,9 +12938,9 @@
 </file>
 
 <file path=customXml/itemProps3.xml><?xml version="1.0" encoding="utf-8"?>
-<ds:datastoreItem xmlns:ds="http://schemas.openxmlformats.org/officeDocument/2006/customXml" ds:itemID="{4F2FF0AF-4963-4DA0-8342-5673697A9054}">
+<ds:datastoreItem xmlns:ds="http://schemas.openxmlformats.org/officeDocument/2006/customXml" ds:itemID="{A78D1BFD-FB21-4E94-A897-6F9CD570B4EA}">
   <ds:schemaRefs>
-    <ds:schemaRef ds:uri="http://schemas.microsoft.com/sharepoint/v3/contenttype/forms"/>
+    <ds:schemaRef ds:uri="http://schemas.openxmlformats.org/officeDocument/2006/bibliography"/>
   </ds:schemaRefs>
 </ds:datastoreItem>
 </file>
@@ -11694,9 +12965,9 @@
 </file>
 
 <file path=customXml/itemProps5.xml><?xml version="1.0" encoding="utf-8"?>
-<ds:datastoreItem xmlns:ds="http://schemas.openxmlformats.org/officeDocument/2006/customXml" ds:itemID="{A78D1BFD-FB21-4E94-A897-6F9CD570B4EA}">
+<ds:datastoreItem xmlns:ds="http://schemas.openxmlformats.org/officeDocument/2006/customXml" ds:itemID="{4F2FF0AF-4963-4DA0-8342-5673697A9054}">
   <ds:schemaRefs>
-    <ds:schemaRef ds:uri="http://schemas.openxmlformats.org/officeDocument/2006/bibliography"/>
+    <ds:schemaRef ds:uri="http://schemas.microsoft.com/sharepoint/v3/contenttype/forms"/>
   </ds:schemaRefs>
 </ds:datastoreItem>
 </file>
</xml_diff>

<commit_message>
Changed peer review date.
</commit_message>
<xml_diff>
--- a/ZKOO3_PvA.docx
+++ b/ZKOO3_PvA.docx
@@ -495,27 +495,7 @@
           <w:sz w:val="24"/>
           <w:szCs w:val="24"/>
         </w:rPr>
-        <w:t xml:space="preserve">Module Data </w:t>
-      </w:r>
-      <w:proofErr w:type="spellStart"/>
-      <w:r>
-        <w:rPr>
-          <w:b/>
-          <w:bCs/>
-          <w:sz w:val="24"/>
-          <w:szCs w:val="24"/>
-        </w:rPr>
-        <w:t>Protection</w:t>
-      </w:r>
-      <w:proofErr w:type="spellEnd"/>
-      <w:r>
-        <w:rPr>
-          <w:b/>
-          <w:bCs/>
-          <w:sz w:val="24"/>
-          <w:szCs w:val="24"/>
-        </w:rPr>
-        <w:t xml:space="preserve"> Leerjaar 2 blok 1</w:t>
+        <w:t>Module Data Protection Leerjaar 2 blok 1</w:t>
       </w:r>
     </w:p>
     <w:p>
@@ -1668,28 +1648,18 @@
       <w:r>
         <w:t xml:space="preserve">De opdrachtgever </w:t>
       </w:r>
-      <w:proofErr w:type="spellStart"/>
       <w:r>
         <w:t>Aan</w:t>
       </w:r>
       <w:r>
-        <w:t>ZKOO</w:t>
-      </w:r>
-      <w:proofErr w:type="spellEnd"/>
-      <w:r>
-        <w:t xml:space="preserve"> (Zorg</w:t>
+        <w:t>ZKOO (Zorg</w:t>
       </w:r>
       <w:r>
         <w:t xml:space="preserve"> </w:t>
       </w:r>
       <w:r>
-        <w:t xml:space="preserve">Kwaliteit </w:t>
-      </w:r>
-      <w:proofErr w:type="spellStart"/>
-      <w:r>
-        <w:t>Ondersteunings</w:t>
-      </w:r>
-      <w:proofErr w:type="spellEnd"/>
+        <w:t>Kwaliteit Ondersteunings</w:t>
+      </w:r>
       <w:r>
         <w:t xml:space="preserve"> </w:t>
       </w:r>
@@ -1939,16 +1909,8 @@
         <w:rPr>
           <w:rFonts w:ascii="Avenir Next LT Pro" w:hAnsi="Avenir Next LT Pro"/>
         </w:rPr>
-        <w:t xml:space="preserve">Toegangsbeheer en </w:t>
-      </w:r>
-      <w:proofErr w:type="spellStart"/>
-      <w:r>
-        <w:rPr>
-          <w:rFonts w:ascii="Avenir Next LT Pro" w:hAnsi="Avenir Next LT Pro"/>
-        </w:rPr>
-        <w:t>logging</w:t>
-      </w:r>
-      <w:proofErr w:type="spellEnd"/>
+        <w:t>Toegangsbeheer en logging</w:t>
+      </w:r>
     </w:p>
     <w:p>
       <w:pPr>
@@ -1970,23 +1932,7 @@
     </w:p>
     <w:p>
       <w:r>
-        <w:t xml:space="preserve">ZKOO werkt met moderne </w:t>
-      </w:r>
-      <w:proofErr w:type="spellStart"/>
-      <w:r>
-        <w:t>cloudomgevingen</w:t>
-      </w:r>
-      <w:proofErr w:type="spellEnd"/>
-      <w:r>
-        <w:t xml:space="preserve"> (Microsoft </w:t>
-      </w:r>
-      <w:proofErr w:type="spellStart"/>
-      <w:r>
-        <w:t>Azure</w:t>
-      </w:r>
-      <w:proofErr w:type="spellEnd"/>
-      <w:r>
-        <w:t>) om schaalbaarheid, beschikbaarheid en beveiliging te garanderen.</w:t>
+        <w:t>ZKOO werkt met moderne cloudomgevingen (Microsoft Azure) om schaalbaarheid, beschikbaarheid en beveiliging te garanderen.</w:t>
       </w:r>
     </w:p>
     <w:p>
@@ -2051,15 +1997,7 @@
         <w:t xml:space="preserve"> d</w:t>
       </w:r>
       <w:r>
-        <w:t xml:space="preserve">oor een versneld traject naar Microsoft </w:t>
-      </w:r>
-      <w:proofErr w:type="spellStart"/>
-      <w:r>
-        <w:t>Azure</w:t>
-      </w:r>
-      <w:proofErr w:type="spellEnd"/>
-      <w:r>
-        <w:t xml:space="preserve"> kritieke ICT-componenten onvoldoende beveiligd. Een databeveiligingsbeleid ontbreekt, toegangscontroles zijn niet duidelijk ingericht, en wetgeving zoals de AVG wordt mogelijk geschonden. </w:t>
+        <w:t xml:space="preserve">oor een versneld traject naar Microsoft Azure kritieke ICT-componenten onvoldoende beveiligd. Een databeveiligingsbeleid ontbreekt, toegangscontroles zijn niet duidelijk ingericht, en wetgeving zoals de AVG wordt mogelijk geschonden. </w:t>
       </w:r>
     </w:p>
     <w:p>
@@ -2125,15 +2063,7 @@
         <w:t>de</w:t>
       </w:r>
       <w:r>
-        <w:t xml:space="preserve"> </w:t>
-      </w:r>
-      <w:proofErr w:type="spellStart"/>
-      <w:r>
-        <w:t>cloudomgeving</w:t>
-      </w:r>
-      <w:proofErr w:type="spellEnd"/>
-      <w:r>
-        <w:t xml:space="preserve"> </w:t>
+        <w:t xml:space="preserve"> cloudomgeving </w:t>
       </w:r>
       <w:r>
         <w:t xml:space="preserve">van de klant van ZKOO </w:t>
@@ -2165,21 +2095,7 @@
         <w:rPr>
           <w:rFonts w:ascii="Avenir Next LT Pro" w:hAnsi="Avenir Next LT Pro"/>
         </w:rPr>
-        <w:t xml:space="preserve">De bestaande </w:t>
-      </w:r>
-      <w:proofErr w:type="spellStart"/>
-      <w:r>
-        <w:rPr>
-          <w:rFonts w:ascii="Avenir Next LT Pro" w:hAnsi="Avenir Next LT Pro"/>
-        </w:rPr>
-        <w:t>cloudomgeving</w:t>
-      </w:r>
-      <w:proofErr w:type="spellEnd"/>
-      <w:r>
-        <w:rPr>
-          <w:rFonts w:ascii="Avenir Next LT Pro" w:hAnsi="Avenir Next LT Pro"/>
-        </w:rPr>
-        <w:t xml:space="preserve"> (IST) </w:t>
+        <w:t xml:space="preserve">De bestaande cloudomgeving (IST) </w:t>
       </w:r>
       <w:r>
         <w:rPr>
@@ -2275,21 +2191,7 @@
         <w:rPr>
           <w:rFonts w:ascii="Avenir Next LT Pro" w:hAnsi="Avenir Next LT Pro"/>
         </w:rPr>
-        <w:t xml:space="preserve"> binnen Microsoft </w:t>
-      </w:r>
-      <w:proofErr w:type="spellStart"/>
-      <w:r>
-        <w:rPr>
-          <w:rFonts w:ascii="Avenir Next LT Pro" w:hAnsi="Avenir Next LT Pro"/>
-        </w:rPr>
-        <w:t>Azure</w:t>
-      </w:r>
-      <w:proofErr w:type="spellEnd"/>
-      <w:r>
-        <w:rPr>
-          <w:rFonts w:ascii="Avenir Next LT Pro" w:hAnsi="Avenir Next LT Pro"/>
-        </w:rPr>
-        <w:t>.</w:t>
+        <w:t xml:space="preserve"> binnen Microsoft Azure.</w:t>
       </w:r>
     </w:p>
     <w:p>
@@ -2461,11 +2363,9 @@
             <w:hideMark/>
           </w:tcPr>
           <w:p>
-            <w:proofErr w:type="spellStart"/>
             <w:r>
               <w:t>PvA</w:t>
             </w:r>
-            <w:proofErr w:type="spellEnd"/>
           </w:p>
         </w:tc>
         <w:tc>
@@ -2507,14 +2407,12 @@
             <w:hideMark/>
           </w:tcPr>
           <w:p>
-            <w:proofErr w:type="spellStart"/>
             <w:r>
               <w:t>Advies</w:t>
             </w:r>
             <w:r>
               <w:t>+ontwerp</w:t>
             </w:r>
-            <w:proofErr w:type="spellEnd"/>
           </w:p>
         </w:tc>
         <w:tc>
@@ -2582,13 +2480,8 @@
               <w:t>individuele CGI-toets</w:t>
             </w:r>
             <w:r>
-              <w:t xml:space="preserve"> in </w:t>
-            </w:r>
-            <w:proofErr w:type="spellStart"/>
-            <w:r>
-              <w:t>Azure</w:t>
-            </w:r>
-            <w:proofErr w:type="spellEnd"/>
+              <w:t xml:space="preserve"> in Azure</w:t>
+            </w:r>
           </w:p>
         </w:tc>
       </w:tr>
@@ -2655,21 +2548,7 @@
         <w:rPr>
           <w:rFonts w:ascii="Avenir Next LT Pro" w:hAnsi="Avenir Next LT Pro"/>
         </w:rPr>
-        <w:t xml:space="preserve">Analyse van bestaande (gesimuleerde) </w:t>
-      </w:r>
-      <w:proofErr w:type="spellStart"/>
-      <w:r>
-        <w:rPr>
-          <w:rFonts w:ascii="Avenir Next LT Pro" w:hAnsi="Avenir Next LT Pro"/>
-        </w:rPr>
-        <w:t>cloudomgeving</w:t>
-      </w:r>
-      <w:proofErr w:type="spellEnd"/>
-      <w:r>
-        <w:rPr>
-          <w:rFonts w:ascii="Avenir Next LT Pro" w:hAnsi="Avenir Next LT Pro"/>
-        </w:rPr>
-        <w:t>.</w:t>
+        <w:t>Analyse van bestaande (gesimuleerde) cloudomgeving.</w:t>
       </w:r>
     </w:p>
     <w:p>
@@ -2705,21 +2584,7 @@
         <w:rPr>
           <w:rFonts w:ascii="Avenir Next LT Pro" w:hAnsi="Avenir Next LT Pro"/>
         </w:rPr>
-        <w:t xml:space="preserve">Beveiligingsontwerp m.b.t. netwerksegmentatie, toegangsbeheer, dataclassificatie, </w:t>
-      </w:r>
-      <w:proofErr w:type="spellStart"/>
-      <w:r>
-        <w:rPr>
-          <w:rFonts w:ascii="Avenir Next LT Pro" w:hAnsi="Avenir Next LT Pro"/>
-        </w:rPr>
-        <w:t>logging</w:t>
-      </w:r>
-      <w:proofErr w:type="spellEnd"/>
-      <w:r>
-        <w:rPr>
-          <w:rFonts w:ascii="Avenir Next LT Pro" w:hAnsi="Avenir Next LT Pro"/>
-        </w:rPr>
-        <w:t>, en veilig beheer.</w:t>
+        <w:t>Beveiligingsontwerp m.b.t. netwerksegmentatie, toegangsbeheer, dataclassificatie, logging, en veilig beheer.</w:t>
       </w:r>
     </w:p>
     <w:p>
@@ -2737,21 +2602,7 @@
         <w:rPr>
           <w:rFonts w:ascii="Avenir Next LT Pro" w:hAnsi="Avenir Next LT Pro"/>
         </w:rPr>
-        <w:t xml:space="preserve">Implementatie binnen </w:t>
-      </w:r>
-      <w:proofErr w:type="spellStart"/>
-      <w:r>
-        <w:rPr>
-          <w:rFonts w:ascii="Avenir Next LT Pro" w:hAnsi="Avenir Next LT Pro"/>
-        </w:rPr>
-        <w:t>Azure-resourcegroup</w:t>
-      </w:r>
-      <w:proofErr w:type="spellEnd"/>
-      <w:r>
-        <w:rPr>
-          <w:rFonts w:ascii="Avenir Next LT Pro" w:hAnsi="Avenir Next LT Pro"/>
-        </w:rPr>
-        <w:t>.</w:t>
+        <w:t>Implementatie binnen Azure-resourcegroup.</w:t>
       </w:r>
     </w:p>
     <w:p>
@@ -2777,21 +2628,7 @@
         <w:rPr>
           <w:rFonts w:ascii="Avenir Next LT Pro" w:hAnsi="Avenir Next LT Pro"/>
         </w:rPr>
-        <w:t xml:space="preserve">Migratie van </w:t>
-      </w:r>
-      <w:proofErr w:type="spellStart"/>
-      <w:r>
-        <w:rPr>
-          <w:rFonts w:ascii="Avenir Next LT Pro" w:hAnsi="Avenir Next LT Pro"/>
-        </w:rPr>
-        <w:t>legacy</w:t>
-      </w:r>
-      <w:proofErr w:type="spellEnd"/>
-      <w:r>
-        <w:rPr>
-          <w:rFonts w:ascii="Avenir Next LT Pro" w:hAnsi="Avenir Next LT Pro"/>
-        </w:rPr>
-        <w:t>-systemen.</w:t>
+        <w:t>Migratie van legacy-systemen.</w:t>
       </w:r>
     </w:p>
     <w:p>
@@ -2956,19 +2793,11 @@
           <w:rFonts w:ascii="Avenir Next LT Pro" w:hAnsi="Avenir Next LT Pro"/>
         </w:rPr>
       </w:pPr>
-      <w:proofErr w:type="spellStart"/>
       <w:r>
         <w:rPr>
           <w:rFonts w:ascii="Avenir Next LT Pro" w:hAnsi="Avenir Next LT Pro"/>
         </w:rPr>
-        <w:t>PvA</w:t>
-      </w:r>
-      <w:proofErr w:type="spellEnd"/>
-      <w:r>
-        <w:rPr>
-          <w:rFonts w:ascii="Avenir Next LT Pro" w:hAnsi="Avenir Next LT Pro"/>
-        </w:rPr>
-        <w:t xml:space="preserve"> </w:t>
+        <w:t xml:space="preserve">PvA </w:t>
       </w:r>
       <w:r>
         <w:rPr>
@@ -3110,30 +2939,8 @@
         <w:rPr>
           <w:rFonts w:ascii="Avenir Next LT Pro" w:hAnsi="Avenir Next LT Pro"/>
         </w:rPr>
-        <w:t xml:space="preserve">Inrichten beveiligde </w:t>
-      </w:r>
-      <w:proofErr w:type="spellStart"/>
-      <w:r>
-        <w:rPr>
-          <w:rFonts w:ascii="Avenir Next LT Pro" w:hAnsi="Avenir Next LT Pro"/>
-        </w:rPr>
-        <w:t>cloudomgeving</w:t>
-      </w:r>
-      <w:proofErr w:type="spellEnd"/>
-      <w:r>
-        <w:rPr>
-          <w:rFonts w:ascii="Avenir Next LT Pro" w:hAnsi="Avenir Next LT Pro"/>
-        </w:rPr>
-        <w:t xml:space="preserve"> in </w:t>
-      </w:r>
-      <w:proofErr w:type="spellStart"/>
-      <w:r>
-        <w:rPr>
-          <w:rFonts w:ascii="Avenir Next LT Pro" w:hAnsi="Avenir Next LT Pro"/>
-        </w:rPr>
-        <w:t>Azure</w:t>
-      </w:r>
-      <w:proofErr w:type="spellEnd"/>
+        <w:t>Inrichten beveiligde cloudomgeving in Azure</w:t>
+      </w:r>
     </w:p>
     <w:p>
       <w:pPr>
@@ -3150,21 +2957,7 @@
         <w:rPr>
           <w:rFonts w:ascii="Avenir Next LT Pro" w:hAnsi="Avenir Next LT Pro"/>
         </w:rPr>
-        <w:t xml:space="preserve">Configuratie van firewalls, IDS, </w:t>
-      </w:r>
-      <w:proofErr w:type="spellStart"/>
-      <w:r>
-        <w:rPr>
-          <w:rFonts w:ascii="Avenir Next LT Pro" w:hAnsi="Avenir Next LT Pro"/>
-        </w:rPr>
-        <w:t>VPN’s</w:t>
-      </w:r>
-      <w:proofErr w:type="spellEnd"/>
-      <w:r>
-        <w:rPr>
-          <w:rFonts w:ascii="Avenir Next LT Pro" w:hAnsi="Avenir Next LT Pro"/>
-        </w:rPr>
-        <w:t>, toegangscontrole</w:t>
+        <w:t>Configuratie van firewalls, IDS, VPN’s, toegangscontrole</w:t>
       </w:r>
     </w:p>
     <w:p>
@@ -3196,19 +2989,11 @@
           <w:rFonts w:ascii="Avenir Next LT Pro" w:hAnsi="Avenir Next LT Pro"/>
         </w:rPr>
       </w:pPr>
-      <w:proofErr w:type="spellStart"/>
       <w:r>
         <w:rPr>
           <w:rFonts w:ascii="Avenir Next LT Pro" w:hAnsi="Avenir Next LT Pro"/>
         </w:rPr>
-        <w:t>Logging</w:t>
-      </w:r>
-      <w:proofErr w:type="spellEnd"/>
-      <w:r>
-        <w:rPr>
-          <w:rFonts w:ascii="Avenir Next LT Pro" w:hAnsi="Avenir Next LT Pro"/>
-        </w:rPr>
-        <w:t xml:space="preserve"> en monitoring activeren</w:t>
+        <w:t>Logging en monitoring activeren</w:t>
       </w:r>
     </w:p>
     <w:p>
@@ -3355,15 +3140,7 @@
     </w:p>
     <w:p>
       <w:r>
-        <w:t xml:space="preserve">Onze missie is als team samen te werken aan het verbeteren van gegevensbescherming binnen de </w:t>
-      </w:r>
-      <w:proofErr w:type="spellStart"/>
-      <w:r>
-        <w:t>Azure</w:t>
-      </w:r>
-      <w:proofErr w:type="spellEnd"/>
-      <w:r>
-        <w:t xml:space="preserve">-omgeving van ZKOO. Hierbij staan een eerlijke taakverdeling, open communicatie en verantwoordelijkheid voor ieders eigen werk hoog in het vaandel. </w:t>
+        <w:t xml:space="preserve">Onze missie is als team samen te werken aan het verbeteren van gegevensbescherming binnen de Azure-omgeving van ZKOO. Hierbij staan een eerlijke taakverdeling, open communicatie en verantwoordelijkheid voor ieders eigen werk hoog in het vaandel. </w:t>
       </w:r>
     </w:p>
     <w:p>
@@ -3374,15 +3151,7 @@
         </w:rPr>
       </w:pPr>
       <w:r>
-        <w:t xml:space="preserve">De visie die wij als team dragen is het opleveren van een onderbouwd advies en een werkende </w:t>
-      </w:r>
-      <w:proofErr w:type="spellStart"/>
-      <w:r>
-        <w:t>Proof</w:t>
-      </w:r>
-      <w:proofErr w:type="spellEnd"/>
-      <w:r>
-        <w:t xml:space="preserve"> of Concept. Hiermee laten we zien hoe de onderzochte beveiligingsrisico’s beperkt kunnen worden. </w:t>
+        <w:t xml:space="preserve">De visie die wij als team dragen is het opleveren van een onderbouwd advies en een werkende Proof of Concept. Hiermee laten we zien hoe de onderzochte beveiligingsrisico’s beperkt kunnen worden. </w:t>
       </w:r>
     </w:p>
     <w:p>
@@ -3548,34 +3317,14 @@
                 <w:szCs w:val="20"/>
               </w:rPr>
             </w:pPr>
-            <w:proofErr w:type="spellStart"/>
             <w:r>
               <w:rPr>
                 <w:rFonts w:cs="Arial"/>
                 <w:sz w:val="20"/>
                 <w:szCs w:val="20"/>
               </w:rPr>
-              <w:t>Maiwand</w:t>
-            </w:r>
-            <w:proofErr w:type="spellEnd"/>
-            <w:r>
-              <w:rPr>
-                <w:rFonts w:cs="Arial"/>
-                <w:sz w:val="20"/>
-                <w:szCs w:val="20"/>
-              </w:rPr>
-              <w:t xml:space="preserve"> </w:t>
-            </w:r>
-            <w:proofErr w:type="spellStart"/>
-            <w:r>
-              <w:rPr>
-                <w:rFonts w:cs="Arial"/>
-                <w:sz w:val="20"/>
-                <w:szCs w:val="20"/>
-              </w:rPr>
-              <w:t>Arman</w:t>
-            </w:r>
-            <w:proofErr w:type="spellEnd"/>
+              <w:t>Maiwand Arman</w:t>
+            </w:r>
           </w:p>
         </w:tc>
         <w:tc>
@@ -4156,15 +3905,7 @@
     </w:p>
     <w:p>
       <w:r>
-        <w:t xml:space="preserve">Tijdens schooluren zorgen de teamleden dat zij bereikbaar zijn, ook wanneer iemand vanuit huis werkt. Hiervoor gebruiken we communicatiekanalen Whatsapp, </w:t>
-      </w:r>
-      <w:proofErr w:type="spellStart"/>
-      <w:r>
-        <w:t>Github</w:t>
-      </w:r>
-      <w:proofErr w:type="spellEnd"/>
-      <w:r>
-        <w:t xml:space="preserve"> en Microsoft Teams. </w:t>
+        <w:t xml:space="preserve">Tijdens schooluren zorgen de teamleden dat zij bereikbaar zijn, ook wanneer iemand vanuit huis werkt. Hiervoor gebruiken we communicatiekanalen Whatsapp, Github en Microsoft Teams. </w:t>
       </w:r>
     </w:p>
     <w:p>
@@ -4369,14 +4110,12 @@
           <w:i/>
         </w:rPr>
       </w:pPr>
-      <w:proofErr w:type="spellStart"/>
       <w:r>
         <w:rPr>
           <w:rStyle w:val="Emphasis"/>
         </w:rPr>
         <w:t>Maiwand</w:t>
       </w:r>
-      <w:proofErr w:type="spellEnd"/>
       <w:r>
         <w:rPr>
           <w:rStyle w:val="Emphasis"/>
@@ -4479,15 +4218,7 @@
     </w:p>
     <w:p>
       <w:r>
-        <w:t xml:space="preserve">Notulist — </w:t>
-      </w:r>
-      <w:proofErr w:type="spellStart"/>
-      <w:r>
-        <w:t>Maiwand</w:t>
-      </w:r>
-      <w:proofErr w:type="spellEnd"/>
-      <w:r>
-        <w:t xml:space="preserve">: </w:t>
+        <w:t xml:space="preserve">Notulist — Maiwand: </w:t>
       </w:r>
     </w:p>
     <w:p>
@@ -4522,15 +4253,7 @@
     </w:p>
     <w:p>
       <w:r>
-        <w:t xml:space="preserve">Bij vertrek van een </w:t>
-      </w:r>
-      <w:proofErr w:type="spellStart"/>
-      <w:r>
-        <w:t>projectlid</w:t>
-      </w:r>
-      <w:proofErr w:type="spellEnd"/>
-      <w:r>
-        <w:t xml:space="preserve"> worden de taken verdeeld over de resterende leden. Indien nodig wordt gestemd over wie de vrijge</w:t>
+        <w:t>Bij vertrek van een projectlid worden de taken verdeeld over de resterende leden. Indien nodig wordt gestemd over wie de vrijge</w:t>
       </w:r>
       <w:r>
         <w:t>k</w:t>
@@ -4962,11 +4685,9 @@
             <w:tcW w:w="3005" w:type="dxa"/>
           </w:tcPr>
           <w:p>
-            <w:proofErr w:type="spellStart"/>
             <w:r>
               <w:t>Maiwand</w:t>
             </w:r>
-            <w:proofErr w:type="spellEnd"/>
           </w:p>
         </w:tc>
         <w:tc>
@@ -5065,55 +4786,13 @@
         <w:rPr>
           <w:rFonts w:cs="Arial"/>
         </w:rPr>
-        <w:t>Binnen het team communiceren wij face-</w:t>
-      </w:r>
-      <w:proofErr w:type="spellStart"/>
+        <w:t xml:space="preserve">Binnen het team communiceren wij face-to-face tijdens lessen, via Whatsapp, Github en indien er sprake is van digitaal overleg Microsoft Teams. Projectbestanden worden opgeslagen </w:t>
+      </w:r>
       <w:r>
         <w:rPr>
           <w:rFonts w:cs="Arial"/>
         </w:rPr>
-        <w:t>to</w:t>
-      </w:r>
-      <w:proofErr w:type="spellEnd"/>
-      <w:r>
-        <w:rPr>
-          <w:rFonts w:cs="Arial"/>
-        </w:rPr>
-        <w:t xml:space="preserve">-face tijdens lessen, via Whatsapp, </w:t>
-      </w:r>
-      <w:proofErr w:type="spellStart"/>
-      <w:r>
-        <w:rPr>
-          <w:rFonts w:cs="Arial"/>
-        </w:rPr>
-        <w:t>Github</w:t>
-      </w:r>
-      <w:proofErr w:type="spellEnd"/>
-      <w:r>
-        <w:rPr>
-          <w:rFonts w:cs="Arial"/>
-        </w:rPr>
-        <w:t xml:space="preserve"> en indien er sprake is van digitaal overleg Microsoft Teams. Projectbestanden worden opgeslagen </w:t>
-      </w:r>
-      <w:r>
-        <w:rPr>
-          <w:rFonts w:cs="Arial"/>
-        </w:rPr>
-        <w:t xml:space="preserve">in </w:t>
-      </w:r>
-      <w:proofErr w:type="spellStart"/>
-      <w:r>
-        <w:rPr>
-          <w:rFonts w:cs="Arial"/>
-        </w:rPr>
-        <w:t>Github</w:t>
-      </w:r>
-      <w:proofErr w:type="spellEnd"/>
-      <w:r>
-        <w:rPr>
-          <w:rFonts w:cs="Arial"/>
-        </w:rPr>
-        <w:t>. Tijdens een wekelijks overleg, gedurende of tussen de lessen in, bespreken wij de voortgang, mogelijke knelpunten en hoe de samenwerking verloopt.</w:t>
+        <w:t>in Github. Tijdens een wekelijks overleg, gedurende of tussen de lessen in, bespreken wij de voortgang, mogelijke knelpunten en hoe de samenwerking verloopt.</w:t>
       </w:r>
     </w:p>
     <w:p>
@@ -5253,17 +4932,8 @@
                 <w:b/>
                 <w:color w:val="000000" w:themeColor="text1"/>
               </w:rPr>
-              <w:t xml:space="preserve"> </w:t>
-            </w:r>
-            <w:proofErr w:type="spellStart"/>
-            <w:r>
-              <w:rPr>
-                <w:b/>
-                <w:color w:val="000000" w:themeColor="text1"/>
-              </w:rPr>
-              <w:t>invoed</w:t>
-            </w:r>
-            <w:proofErr w:type="spellEnd"/>
+              <w:t xml:space="preserve"> invoed</w:t>
+            </w:r>
           </w:p>
         </w:tc>
         <w:tc>
@@ -5642,31 +5312,35 @@
                 <w:bCs/>
                 <w:color w:val="000000" w:themeColor="text1"/>
               </w:rPr>
-              <w:t xml:space="preserve">Ontwerpen en ontwikkelen het systeem. Hebben belang bij duidelijke </w:t>
-            </w:r>
-            <w:proofErr w:type="spellStart"/>
-            <w:r>
+              <w:t>Ontwerpen en ontwikkelen het systeem. Hebben belang bij duidelijke requirements, feedback en een haalbare opdracht.</w:t>
+            </w:r>
+          </w:p>
+        </w:tc>
+      </w:tr>
+      <w:tr>
+        <w:tc>
+          <w:tcPr>
+            <w:tcW w:w="1838" w:type="dxa"/>
+          </w:tcPr>
+          <w:p>
+            <w:pPr>
               <w:rPr>
                 <w:bCs/>
                 <w:color w:val="000000" w:themeColor="text1"/>
               </w:rPr>
-              <w:t>requirements</w:t>
-            </w:r>
-            <w:proofErr w:type="spellEnd"/>
+            </w:pPr>
             <w:r>
               <w:rPr>
                 <w:bCs/>
                 <w:color w:val="000000" w:themeColor="text1"/>
               </w:rPr>
-              <w:t>, feedback en een haalbare opdracht.</w:t>
-            </w:r>
-          </w:p>
-        </w:tc>
-      </w:tr>
-      <w:tr>
-        <w:tc>
-          <w:tcPr>
-            <w:tcW w:w="1838" w:type="dxa"/>
+              <w:t>Docenten</w:t>
+            </w:r>
+          </w:p>
+        </w:tc>
+        <w:tc>
+          <w:tcPr>
+            <w:tcW w:w="7179" w:type="dxa"/>
           </w:tcPr>
           <w:p>
             <w:pPr>
@@ -5680,26 +5354,6 @@
                 <w:bCs/>
                 <w:color w:val="000000" w:themeColor="text1"/>
               </w:rPr>
-              <w:t>Docenten</w:t>
-            </w:r>
-          </w:p>
-        </w:tc>
-        <w:tc>
-          <w:tcPr>
-            <w:tcW w:w="7179" w:type="dxa"/>
-          </w:tcPr>
-          <w:p>
-            <w:pPr>
-              <w:rPr>
-                <w:bCs/>
-                <w:color w:val="000000" w:themeColor="text1"/>
-              </w:rPr>
-            </w:pPr>
-            <w:r>
-              <w:rPr>
-                <w:bCs/>
-                <w:color w:val="000000" w:themeColor="text1"/>
-              </w:rPr>
               <w:t>Begeleiden de studenten en beoordelen het project.</w:t>
             </w:r>
           </w:p>
@@ -5748,23 +5402,7 @@
     </w:p>
     <w:p>
       <w:r>
-        <w:t xml:space="preserve">Overleg vindt plaats tijdens de lessen. Wij verwachten dat er dan voldoende tijd is om de voortgang, taakverdeling en knelpunten te bespreken. Als dit niet voldoende blijkt, plannen wij in overleg een extra vergadering. Ieder </w:t>
-      </w:r>
-      <w:proofErr w:type="spellStart"/>
-      <w:r>
-        <w:t>projectlid</w:t>
-      </w:r>
-      <w:proofErr w:type="spellEnd"/>
-      <w:r>
-        <w:t xml:space="preserve"> kan hiervoor een verzoek doen. Tijdens de vergaderingen legt </w:t>
-      </w:r>
-      <w:proofErr w:type="spellStart"/>
-      <w:r>
-        <w:t>Maiwand</w:t>
-      </w:r>
-      <w:proofErr w:type="spellEnd"/>
-      <w:r>
-        <w:t xml:space="preserve"> de notulen vast. </w:t>
+        <w:t xml:space="preserve">Overleg vindt plaats tijdens de lessen. Wij verwachten dat er dan voldoende tijd is om de voortgang, taakverdeling en knelpunten te bespreken. Als dit niet voldoende blijkt, plannen wij in overleg een extra vergadering. Ieder projectlid kan hiervoor een verzoek doen. Tijdens de vergaderingen legt Maiwand de notulen vast. </w:t>
       </w:r>
     </w:p>
     <w:p>
@@ -5963,7 +5601,6 @@
                 <w:i/>
               </w:rPr>
             </w:pPr>
-            <w:proofErr w:type="spellStart"/>
             <w:r>
               <w:rPr>
                 <w:rFonts w:cs="Arial"/>
@@ -5971,7 +5608,6 @@
               </w:rPr>
               <w:t>Verdana</w:t>
             </w:r>
-            <w:proofErr w:type="spellEnd"/>
           </w:p>
         </w:tc>
       </w:tr>
@@ -6526,15 +6162,7 @@
     </w:p>
     <w:p>
       <w:r>
-        <w:t>Documenten worden tijdens het project opgeslagen en bewerkt in Word (.</w:t>
-      </w:r>
-      <w:proofErr w:type="spellStart"/>
-      <w:r>
-        <w:t>docx</w:t>
-      </w:r>
-      <w:proofErr w:type="spellEnd"/>
-      <w:r>
-        <w:t>). De definitieve versie wordt als PDF ingeleverd, tenzij de opdracht een ander bestandsformaat voorschrijft.</w:t>
+        <w:t>Documenten worden tijdens het project opgeslagen en bewerkt in Word (.docx). De definitieve versie wordt als PDF ingeleverd, tenzij de opdracht een ander bestandsformaat voorschrijft.</w:t>
       </w:r>
     </w:p>
     <w:p/>
@@ -6555,23 +6183,7 @@
     </w:p>
     <w:p>
       <w:r>
-        <w:t xml:space="preserve">Voor versiebeheer van het project gebruikt de groep </w:t>
-      </w:r>
-      <w:proofErr w:type="spellStart"/>
-      <w:r>
-        <w:t>Github</w:t>
-      </w:r>
-      <w:proofErr w:type="spellEnd"/>
-      <w:r>
-        <w:t xml:space="preserve">. Wijzigingen aan de technische uitwerking moeten volgens het samenwerkingscontract door een ander </w:t>
-      </w:r>
-      <w:proofErr w:type="spellStart"/>
-      <w:r>
-        <w:t>projectlid</w:t>
-      </w:r>
-      <w:proofErr w:type="spellEnd"/>
-      <w:r>
-        <w:t xml:space="preserve"> worden goedgekeurd voordat ze worden samengevoegd.</w:t>
+        <w:t>Voor versiebeheer van het project gebruikt de groep Github. Wijzigingen aan de technische uitwerking moeten volgens het samenwerkingscontract door een ander projectlid worden goedgekeurd voordat ze worden samengevoegd.</w:t>
       </w:r>
     </w:p>
     <w:p>
@@ -6625,15 +6237,7 @@
         </w:numPr>
       </w:pPr>
       <w:r>
-        <w:t xml:space="preserve">Analyse, advies en uitvoerbaar </w:t>
-      </w:r>
-      <w:proofErr w:type="spellStart"/>
-      <w:r>
-        <w:t>PoC</w:t>
-      </w:r>
-      <w:proofErr w:type="spellEnd"/>
-      <w:r>
-        <w:t>-ontwerp: week 5, vrijdag om 15.00 uur.</w:t>
+        <w:t>Analyse, advies en uitvoerbaar PoC-ontwerp: week 5, vrijdag om 15.00 uur.</w:t>
       </w:r>
     </w:p>
     <w:p>
@@ -6663,15 +6267,7 @@
     </w:p>
     <w:p>
       <w:r>
-        <w:t xml:space="preserve">Ieder groepslid is zelf verantwoordelijk voor het tijdig inleveren van de opdrachten in diens persoonlijke </w:t>
-      </w:r>
-      <w:proofErr w:type="spellStart"/>
-      <w:r>
-        <w:t>Moodle</w:t>
-      </w:r>
-      <w:proofErr w:type="spellEnd"/>
-      <w:r>
-        <w:t xml:space="preserve"> omgeving. </w:t>
+        <w:t xml:space="preserve">Ieder groepslid is zelf verantwoordelijk voor het tijdig inleveren van de opdrachten in diens persoonlijke Moodle omgeving. </w:t>
       </w:r>
     </w:p>
     <w:p>
@@ -6745,7 +6341,19 @@
         <w:rPr>
           <w:rFonts w:ascii="Avenir Next LT Pro" w:hAnsi="Avenir Next LT Pro"/>
         </w:rPr>
-        <w:t xml:space="preserve"> (Elke twee weken op woensdag. Weken 2, 4, 6, 8)</w:t>
+        <w:t xml:space="preserve"> (Elke twee weken op </w:t>
+      </w:r>
+      <w:r>
+        <w:rPr>
+          <w:rFonts w:ascii="Avenir Next LT Pro" w:hAnsi="Avenir Next LT Pro"/>
+        </w:rPr>
+        <w:t>dinsdag</w:t>
+      </w:r>
+      <w:r>
+        <w:rPr>
+          <w:rFonts w:ascii="Avenir Next LT Pro" w:hAnsi="Avenir Next LT Pro"/>
+        </w:rPr>
+        <w:t>. Weken 2, 4, 6, 8)</w:t>
       </w:r>
       <w:r>
         <w:rPr>
@@ -7165,15 +6773,7 @@
           </w:tcPr>
           <w:p>
             <w:r>
-              <w:t xml:space="preserve">Problemen met </w:t>
-            </w:r>
-            <w:proofErr w:type="spellStart"/>
-            <w:r>
-              <w:t>Azure</w:t>
-            </w:r>
-            <w:proofErr w:type="spellEnd"/>
-            <w:r>
-              <w:t>-omgeving</w:t>
+              <w:t>Problemen met Azure-omgeving</w:t>
             </w:r>
           </w:p>
         </w:tc>
@@ -7401,15 +7001,7 @@
           </w:tcPr>
           <w:p>
             <w:r>
-              <w:t xml:space="preserve">SQL-injectie tests, dataclassificatie, </w:t>
-            </w:r>
-            <w:proofErr w:type="spellStart"/>
-            <w:r>
-              <w:t>PvA</w:t>
-            </w:r>
-            <w:proofErr w:type="spellEnd"/>
-            <w:r>
-              <w:t xml:space="preserve"> inleveren</w:t>
+              <w:t>SQL-injectie tests, dataclassificatie, PvA inleveren</w:t>
             </w:r>
           </w:p>
         </w:tc>
@@ -7505,13 +7097,8 @@
           </w:tcPr>
           <w:p>
             <w:r>
-              <w:t xml:space="preserve">Implementatie SOLL in </w:t>
-            </w:r>
-            <w:proofErr w:type="spellStart"/>
-            <w:r>
-              <w:t>Azure</w:t>
-            </w:r>
-            <w:proofErr w:type="spellEnd"/>
+              <w:t>Implementatie SOLL in Azure</w:t>
+            </w:r>
           </w:p>
         </w:tc>
       </w:tr>
@@ -7541,15 +7128,7 @@
           </w:tcPr>
           <w:p>
             <w:r>
-              <w:t xml:space="preserve">Testen, </w:t>
-            </w:r>
-            <w:proofErr w:type="spellStart"/>
-            <w:r>
-              <w:t>logging</w:t>
-            </w:r>
-            <w:proofErr w:type="spellEnd"/>
-            <w:r>
-              <w:t xml:space="preserve"> controleren, verbeteringen doorvoeren</w:t>
+              <w:t>Testen, logging controleren, verbeteringen doorvoeren</w:t>
             </w:r>
           </w:p>
         </w:tc>
@@ -7684,63 +7263,7 @@
         <w:rPr>
           <w:rFonts w:ascii="Avenir Next LT Pro" w:hAnsi="Avenir Next LT Pro"/>
         </w:rPr>
-        <w:t xml:space="preserve">Gebruik van Microsoft </w:t>
-      </w:r>
-      <w:proofErr w:type="spellStart"/>
-      <w:r>
-        <w:rPr>
-          <w:rFonts w:ascii="Avenir Next LT Pro" w:hAnsi="Avenir Next LT Pro"/>
-        </w:rPr>
-        <w:t>Azure</w:t>
-      </w:r>
-      <w:proofErr w:type="spellEnd"/>
-      <w:r>
-        <w:rPr>
-          <w:rFonts w:ascii="Avenir Next LT Pro" w:hAnsi="Avenir Next LT Pro"/>
-        </w:rPr>
-        <w:t xml:space="preserve"> </w:t>
-      </w:r>
-      <w:proofErr w:type="spellStart"/>
-      <w:r>
-        <w:rPr>
-          <w:rFonts w:ascii="Avenir Next LT Pro" w:hAnsi="Avenir Next LT Pro"/>
-        </w:rPr>
-        <w:t>for</w:t>
-      </w:r>
-      <w:proofErr w:type="spellEnd"/>
-      <w:r>
-        <w:rPr>
-          <w:rFonts w:ascii="Avenir Next LT Pro" w:hAnsi="Avenir Next LT Pro"/>
-        </w:rPr>
-        <w:t xml:space="preserve"> </w:t>
-      </w:r>
-      <w:proofErr w:type="spellStart"/>
-      <w:r>
-        <w:rPr>
-          <w:rFonts w:ascii="Avenir Next LT Pro" w:hAnsi="Avenir Next LT Pro"/>
-        </w:rPr>
-        <w:t>Students</w:t>
-      </w:r>
-      <w:proofErr w:type="spellEnd"/>
-      <w:r>
-        <w:rPr>
-          <w:rFonts w:ascii="Avenir Next LT Pro" w:hAnsi="Avenir Next LT Pro"/>
-        </w:rPr>
-        <w:t xml:space="preserve"> (gratis </w:t>
-      </w:r>
-      <w:proofErr w:type="spellStart"/>
-      <w:r>
-        <w:rPr>
-          <w:rFonts w:ascii="Avenir Next LT Pro" w:hAnsi="Avenir Next LT Pro"/>
-        </w:rPr>
-        <w:t>credits</w:t>
-      </w:r>
-      <w:proofErr w:type="spellEnd"/>
-      <w:r>
-        <w:rPr>
-          <w:rFonts w:ascii="Avenir Next LT Pro" w:hAnsi="Avenir Next LT Pro"/>
-        </w:rPr>
-        <w:t>)</w:t>
+        <w:t>Gebruik van Microsoft Azure for Students (gratis credits)</w:t>
       </w:r>
     </w:p>
     <w:p>
@@ -7752,22 +7275,16 @@
         </w:numPr>
         <w:rPr>
           <w:rFonts w:ascii="Avenir Next LT Pro" w:hAnsi="Avenir Next LT Pro"/>
+          <w:lang w:val="en-GB"/>
         </w:rPr>
       </w:pPr>
       <w:r>
         <w:rPr>
           <w:rFonts w:ascii="Avenir Next LT Pro" w:hAnsi="Avenir Next LT Pro"/>
-        </w:rPr>
-        <w:t xml:space="preserve">Open-source IDS zoals Snort of </w:t>
-      </w:r>
-      <w:proofErr w:type="spellStart"/>
-      <w:r>
-        <w:rPr>
-          <w:rFonts w:ascii="Avenir Next LT Pro" w:hAnsi="Avenir Next LT Pro"/>
-        </w:rPr>
-        <w:t>Suricata</w:t>
-      </w:r>
-      <w:proofErr w:type="spellEnd"/>
+          <w:lang w:val="en-GB"/>
+        </w:rPr>
+        <w:t>Open-source IDS zoals Snort of Suricata</w:t>
+      </w:r>
     </w:p>
     <w:p>
       <w:pPr>
@@ -7814,30 +7331,24 @@
         </w:numPr>
         <w:rPr>
           <w:rFonts w:ascii="Avenir Next LT Pro" w:hAnsi="Avenir Next LT Pro"/>
+          <w:lang w:val="en-GB"/>
         </w:rPr>
       </w:pPr>
       <w:r>
         <w:rPr>
           <w:rFonts w:ascii="Avenir Next LT Pro" w:hAnsi="Avenir Next LT Pro"/>
-        </w:rPr>
-        <w:t xml:space="preserve">Software: Visual Studio Code, OWASP tools, </w:t>
-      </w:r>
-      <w:proofErr w:type="spellStart"/>
-      <w:r>
-        <w:rPr>
-          <w:rFonts w:ascii="Avenir Next LT Pro" w:hAnsi="Avenir Next LT Pro"/>
-        </w:rPr>
-        <w:t>SQLi</w:t>
-      </w:r>
-      <w:proofErr w:type="spellEnd"/>
-      <w:r>
-        <w:rPr>
-          <w:rFonts w:ascii="Avenir Next LT Pro" w:hAnsi="Avenir Next LT Pro"/>
-        </w:rPr>
-        <w:t>-testtools</w:t>
-      </w:r>
-    </w:p>
-    <w:p/>
+          <w:lang w:val="en-GB"/>
+        </w:rPr>
+        <w:t>Software: Visual Studio Code, OWASP tools, SQLi-testtools</w:t>
+      </w:r>
+    </w:p>
+    <w:p>
+      <w:pPr>
+        <w:rPr>
+          <w:lang w:val="en-GB"/>
+        </w:rPr>
+      </w:pPr>
+    </w:p>
     <w:p>
       <w:pPr>
         <w:rPr>
@@ -7845,6 +7356,7 @@
           <w:bCs/>
           <w:sz w:val="20"/>
           <w:szCs w:val="20"/>
+          <w:lang w:val="en-GB"/>
         </w:rPr>
       </w:pPr>
     </w:p>
@@ -8172,7 +7684,7 @@
             </wp:anchor>
           </w:drawing>
         </mc:Choice>
-        <mc:Fallback xmlns:a14="http://schemas.microsoft.com/office/drawing/2010/main" xmlns:pic="http://schemas.openxmlformats.org/drawingml/2006/picture" xmlns:a="http://schemas.openxmlformats.org/drawingml/2006/main">
+        <mc:Fallback xmlns:a="http://schemas.openxmlformats.org/drawingml/2006/main" xmlns:pic="http://schemas.openxmlformats.org/drawingml/2006/picture" xmlns:a14="http://schemas.microsoft.com/office/drawing/2010/main">
           <w:pict w14:anchorId="1CADCD6F">
             <v:group id="Groep 102" style="position:absolute;margin-left:-1in;margin-top:-29.55pt;width:595.25pt;height:835.05pt;z-index:-251657216" coordsize="75596,106051" coordorigin=",186" o:spid="_x0000_s1026" w14:anchorId="0FC57937" o:gfxdata="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">
               <v:shapetype id="_x0000_t75" coordsize="21600,21600" filled="f" stroked="f" o:spt="75" o:preferrelative="t" path="m@4@5l@4@11@9@11@9@5xe">
@@ -11389,6 +10901,7 @@
   <w:rsids>
     <w:rsidRoot w:val="007D1596"/>
     <w:rsid w:val="00044AFF"/>
+    <w:rsid w:val="001F355E"/>
     <w:rsid w:val="00247E2B"/>
     <w:rsid w:val="002A272A"/>
     <w:rsid w:val="00371805"/>
@@ -11412,6 +10925,7 @@
     <w:rsid w:val="00CF785F"/>
     <w:rsid w:val="00DD5D19"/>
     <w:rsid w:val="00E73956"/>
+    <w:rsid w:val="00EC7668"/>
     <w:rsid w:val="00F106F5"/>
     <w:rsid w:val="00F12CC0"/>
     <w:rsid w:val="00F367DF"/>
@@ -12195,222 +11709,6 @@
 </file>
 
 <file path=customXml/item3.xml><?xml version="1.0" encoding="utf-8"?>
-<?mso-contentType ?>
-<FormTemplates xmlns="http://schemas.microsoft.com/sharepoint/v3/contenttype/forms">
-  <Display>DocumentLibraryForm</Display>
-  <Edit>DocumentLibraryForm</Edit>
-  <New>DocumentLibraryForm</New>
-</FormTemplates>
-</file>
-
-<file path=customXml/item4.xml><?xml version="1.0" encoding="utf-8"?>
-<ct:contentTypeSchema xmlns:ct="http://schemas.microsoft.com/office/2006/metadata/contentType" xmlns:ma="http://schemas.microsoft.com/office/2006/metadata/properties/metaAttributes" ct:_="" ma:_="" ma:contentTypeName="Document" ma:contentTypeID="0x0101009AEE7C0E3FC1AF49AE2D21952FC004E7" ma:contentTypeVersion="13" ma:contentTypeDescription="Een nieuw document maken." ma:contentTypeScope="" ma:versionID="960b10dc37b0d3729643b1edbc9ea311">
-  <xsd:schema xmlns:xsd="http://www.w3.org/2001/XMLSchema" xmlns:xs="http://www.w3.org/2001/XMLSchema" xmlns:p="http://schemas.microsoft.com/office/2006/metadata/properties" xmlns:ns2="70093741-41eb-4420-bf3d-ff9555ef2a33" xmlns:ns3="8e0d46a4-c7d4-472b-9541-810c49191871" targetNamespace="http://schemas.microsoft.com/office/2006/metadata/properties" ma:root="true" ma:fieldsID="8470fe0247e22942882bacf7112b3079" ns2:_="" ns3:_="">
-    <xsd:import namespace="70093741-41eb-4420-bf3d-ff9555ef2a33"/>
-    <xsd:import namespace="8e0d46a4-c7d4-472b-9541-810c49191871"/>
-    <xsd:element name="properties">
-      <xsd:complexType>
-        <xsd:sequence>
-          <xsd:element name="documentManagement">
-            <xsd:complexType>
-              <xsd:all>
-                <xsd:element ref="ns2:MediaServiceMetadata" minOccurs="0"/>
-                <xsd:element ref="ns2:MediaServiceFastMetadata" minOccurs="0"/>
-                <xsd:element ref="ns2:MediaServiceSearchProperties" minOccurs="0"/>
-                <xsd:element ref="ns2:MediaServiceDateTaken" minOccurs="0"/>
-                <xsd:element ref="ns2:MediaServiceGenerationTime" minOccurs="0"/>
-                <xsd:element ref="ns2:MediaServiceEventHashCode" minOccurs="0"/>
-                <xsd:element ref="ns2:MediaLengthInSeconds" minOccurs="0"/>
-                <xsd:element ref="ns2:lcf76f155ced4ddcb4097134ff3c332f" minOccurs="0"/>
-                <xsd:element ref="ns3:TaxCatchAll" minOccurs="0"/>
-                <xsd:element ref="ns2:MediaServiceOCR" minOccurs="0"/>
-                <xsd:element ref="ns2:MediaServiceBillingMetadata" minOccurs="0"/>
-                <xsd:element ref="ns2:MediaServiceLocation" minOccurs="0"/>
-              </xsd:all>
-            </xsd:complexType>
-          </xsd:element>
-        </xsd:sequence>
-      </xsd:complexType>
-    </xsd:element>
-  </xsd:schema>
-  <xsd:schema xmlns:xsd="http://www.w3.org/2001/XMLSchema" xmlns:xs="http://www.w3.org/2001/XMLSchema" xmlns:dms="http://schemas.microsoft.com/office/2006/documentManagement/types" xmlns:pc="http://schemas.microsoft.com/office/infopath/2007/PartnerControls" targetNamespace="70093741-41eb-4420-bf3d-ff9555ef2a33" elementFormDefault="qualified">
-    <xsd:import namespace="http://schemas.microsoft.com/office/2006/documentManagement/types"/>
-    <xsd:import namespace="http://schemas.microsoft.com/office/infopath/2007/PartnerControls"/>
-    <xsd:element name="MediaServiceMetadata" ma:index="8" nillable="true" ma:displayName="MediaServiceMetadata" ma:hidden="true" ma:internalName="MediaServiceMetadata" ma:readOnly="true">
-      <xsd:simpleType>
-        <xsd:restriction base="dms:Note"/>
-      </xsd:simpleType>
-    </xsd:element>
-    <xsd:element name="MediaServiceFastMetadata" ma:index="9" nillable="true" ma:displayName="MediaServiceFastMetadata" ma:hidden="true" ma:internalName="MediaServiceFastMetadata" ma:readOnly="true">
-      <xsd:simpleType>
-        <xsd:restriction base="dms:Note"/>
-      </xsd:simpleType>
-    </xsd:element>
-    <xsd:element name="MediaServiceSearchProperties" ma:index="10" nillable="true" ma:displayName="MediaServiceSearchProperties" ma:hidden="true" ma:internalName="MediaServiceSearchProperties" ma:readOnly="true">
-      <xsd:simpleType>
-        <xsd:restriction base="dms:Note"/>
-      </xsd:simpleType>
-    </xsd:element>
-    <xsd:element name="MediaServiceDateTaken" ma:index="11" nillable="true" ma:displayName="MediaServiceDateTaken" ma:hidden="true" ma:indexed="true" ma:internalName="MediaServiceDateTaken" ma:readOnly="true">
-      <xsd:simpleType>
-        <xsd:restriction base="dms:Text"/>
-      </xsd:simpleType>
-    </xsd:element>
-    <xsd:element name="MediaServiceGenerationTime" ma:index="12" nillable="true" ma:displayName="MediaServiceGenerationTime" ma:hidden="true" ma:internalName="MediaServiceGenerationTime" ma:readOnly="true">
-      <xsd:simpleType>
-        <xsd:restriction base="dms:Text"/>
-      </xsd:simpleType>
-    </xsd:element>
-    <xsd:element name="MediaServiceEventHashCode" ma:index="13" nillable="true" ma:displayName="MediaServiceEventHashCode" ma:hidden="true" ma:internalName="MediaServiceEventHashCode" ma:readOnly="true">
-      <xsd:simpleType>
-        <xsd:restriction base="dms:Text"/>
-      </xsd:simpleType>
-    </xsd:element>
-    <xsd:element name="MediaLengthInSeconds" ma:index="14" nillable="true" ma:displayName="MediaLengthInSeconds" ma:hidden="true" ma:internalName="MediaLengthInSeconds" ma:readOnly="true">
-      <xsd:simpleType>
-        <xsd:restriction base="dms:Unknown"/>
-      </xsd:simpleType>
-    </xsd:element>
-    <xsd:element name="lcf76f155ced4ddcb4097134ff3c332f" ma:index="16" nillable="true" ma:taxonomy="true" ma:internalName="lcf76f155ced4ddcb4097134ff3c332f" ma:taxonomyFieldName="MediaServiceImageTags" ma:displayName="Afbeeldingtags" ma:readOnly="false" ma:fieldId="{5cf76f15-5ced-4ddc-b409-7134ff3c332f}" ma:taxonomyMulti="true" ma:sspId="5bd69f14-2b9f-433c-9887-fccfa466e118" ma:termSetId="09814cd3-568e-fe90-9814-8d621ff8fb84" ma:anchorId="fba54fb3-c3e1-fe81-a776-ca4b69148c4d" ma:open="true" ma:isKeyword="false">
-      <xsd:complexType>
-        <xsd:sequence>
-          <xsd:element ref="pc:Terms" minOccurs="0" maxOccurs="1"/>
-        </xsd:sequence>
-      </xsd:complexType>
-    </xsd:element>
-    <xsd:element name="MediaServiceOCR" ma:index="18" nillable="true" ma:displayName="Extracted Text" ma:internalName="MediaServiceOCR" ma:readOnly="true">
-      <xsd:simpleType>
-        <xsd:restriction base="dms:Note">
-          <xsd:maxLength value="255"/>
-        </xsd:restriction>
-      </xsd:simpleType>
-    </xsd:element>
-    <xsd:element name="MediaServiceBillingMetadata" ma:index="19" nillable="true" ma:displayName="MediaServiceBillingMetadata" ma:hidden="true" ma:internalName="MediaServiceBillingMetadata" ma:readOnly="true">
-      <xsd:simpleType>
-        <xsd:restriction base="dms:Note"/>
-      </xsd:simpleType>
-    </xsd:element>
-    <xsd:element name="MediaServiceLocation" ma:index="20" nillable="true" ma:displayName="Location" ma:description="" ma:indexed="true" ma:internalName="MediaServiceLocation" ma:readOnly="true">
-      <xsd:simpleType>
-        <xsd:restriction base="dms:Text"/>
-      </xsd:simpleType>
-    </xsd:element>
-  </xsd:schema>
-  <xsd:schema xmlns:xsd="http://www.w3.org/2001/XMLSchema" xmlns:xs="http://www.w3.org/2001/XMLSchema" xmlns:dms="http://schemas.microsoft.com/office/2006/documentManagement/types" xmlns:pc="http://schemas.microsoft.com/office/infopath/2007/PartnerControls" targetNamespace="8e0d46a4-c7d4-472b-9541-810c49191871" elementFormDefault="qualified">
-    <xsd:import namespace="http://schemas.microsoft.com/office/2006/documentManagement/types"/>
-    <xsd:import namespace="http://schemas.microsoft.com/office/infopath/2007/PartnerControls"/>
-    <xsd:element name="TaxCatchAll" ma:index="17" nillable="true" ma:displayName="Taxonomy Catch All Column" ma:hidden="true" ma:list="{c8ab18b9-6097-49a0-8cf1-8fd8c6c84254}" ma:internalName="TaxCatchAll" ma:showField="CatchAllData" ma:web="8e0d46a4-c7d4-472b-9541-810c49191871">
-      <xsd:complexType>
-        <xsd:complexContent>
-          <xsd:extension base="dms:MultiChoiceLookup">
-            <xsd:sequence>
-              <xsd:element name="Value" type="dms:Lookup" maxOccurs="unbounded" minOccurs="0" nillable="true"/>
-            </xsd:sequence>
-          </xsd:extension>
-        </xsd:complexContent>
-      </xsd:complexType>
-    </xsd:element>
-  </xsd:schema>
-  <xsd:schema xmlns="http://schemas.openxmlformats.org/package/2006/metadata/core-properties" xmlns:xsd="http://www.w3.org/2001/XMLSchema" xmlns:xsi="http://www.w3.org/2001/XMLSchema-instance" xmlns:dc="http://purl.org/dc/elements/1.1/" xmlns:dcterms="http://purl.org/dc/terms/" xmlns:odoc="http://schemas.microsoft.com/internal/obd" targetNamespace="http://schemas.openxmlformats.org/package/2006/metadata/core-properties" elementFormDefault="qualified" attributeFormDefault="unqualified" blockDefault="#all">
-    <xsd:import namespace="http://purl.org/dc/elements/1.1/" schemaLocation="http://dublincore.org/schemas/xmls/qdc/2003/04/02/dc.xsd"/>
-    <xsd:import namespace="http://purl.org/dc/terms/" schemaLocation="http://dublincore.org/schemas/xmls/qdc/2003/04/02/dcterms.xsd"/>
-    <xsd:element name="coreProperties" type="CT_coreProperties"/>
-    <xsd:complexType name="CT_coreProperties">
-      <xsd:all>
-        <xsd:element ref="dc:creator" minOccurs="0" maxOccurs="1"/>
-        <xsd:element ref="dcterms:created" minOccurs="0" maxOccurs="1"/>
-        <xsd:element ref="dc:identifier" minOccurs="0" maxOccurs="1"/>
-        <xsd:element name="contentType" minOccurs="0" maxOccurs="1" type="xsd:string" ma:index="0" ma:displayName="Inhoudstype"/>
-        <xsd:element ref="dc:title" minOccurs="0" maxOccurs="1" ma:index="4" ma:displayName="Titel"/>
-        <xsd:element ref="dc:subject" minOccurs="0" maxOccurs="1"/>
-        <xsd:element ref="dc:description" minOccurs="0" maxOccurs="1"/>
-        <xsd:element name="keywords" minOccurs="0" maxOccurs="1" type="xsd:string"/>
-        <xsd:element ref="dc:language" minOccurs="0" maxOccurs="1"/>
-        <xsd:element name="category" minOccurs="0" maxOccurs="1" type="xsd:string"/>
-        <xsd:element name="version" minOccurs="0" maxOccurs="1" type="xsd:string"/>
-        <xsd:element name="revision" minOccurs="0" maxOccurs="1" type="xsd:string">
-          <xsd:annotation>
-            <xsd:documentation>
-                        This value indicates the number of saves or revisions. The application is responsible for updating this value after each revision.
-                    </xsd:documentation>
-          </xsd:annotation>
-        </xsd:element>
-        <xsd:element name="lastModifiedBy" minOccurs="0" maxOccurs="1" type="xsd:string"/>
-        <xsd:element ref="dcterms:modified" minOccurs="0" maxOccurs="1"/>
-        <xsd:element name="contentStatus" minOccurs="0" maxOccurs="1" type="xsd:string"/>
-      </xsd:all>
-    </xsd:complexType>
-  </xsd:schema>
-  <xs:schema xmlns:pc="http://schemas.microsoft.com/office/infopath/2007/PartnerControls" xmlns:xs="http://www.w3.org/2001/XMLSchema" targetNamespace="http://schemas.microsoft.com/office/infopath/2007/PartnerControls" elementFormDefault="qualified" attributeFormDefault="unqualified">
-    <xs:element name="Person">
-      <xs:complexType>
-        <xs:sequence>
-          <xs:element ref="pc:DisplayName" minOccurs="0"/>
-          <xs:element ref="pc:AccountId" minOccurs="0"/>
-          <xs:element ref="pc:AccountType" minOccurs="0"/>
-        </xs:sequence>
-      </xs:complexType>
-    </xs:element>
-    <xs:element name="DisplayName" type="xs:string"/>
-    <xs:element name="AccountId" type="xs:string"/>
-    <xs:element name="AccountType" type="xs:string"/>
-    <xs:element name="BDCAssociatedEntity">
-      <xs:complexType>
-        <xs:sequence>
-          <xs:element ref="pc:BDCEntity" minOccurs="0" maxOccurs="unbounded"/>
-        </xs:sequence>
-        <xs:attribute ref="pc:EntityNamespace"/>
-        <xs:attribute ref="pc:EntityName"/>
-        <xs:attribute ref="pc:SystemInstanceName"/>
-        <xs:attribute ref="pc:AssociationName"/>
-      </xs:complexType>
-    </xs:element>
-    <xs:attribute name="EntityNamespace" type="xs:string"/>
-    <xs:attribute name="EntityName" type="xs:string"/>
-    <xs:attribute name="SystemInstanceName" type="xs:string"/>
-    <xs:attribute name="AssociationName" type="xs:string"/>
-    <xs:element name="BDCEntity">
-      <xs:complexType>
-        <xs:sequence>
-          <xs:element ref="pc:EntityDisplayName" minOccurs="0"/>
-          <xs:element ref="pc:EntityInstanceReference" minOccurs="0"/>
-          <xs:element ref="pc:EntityId1" minOccurs="0"/>
-          <xs:element ref="pc:EntityId2" minOccurs="0"/>
-          <xs:element ref="pc:EntityId3" minOccurs="0"/>
-          <xs:element ref="pc:EntityId4" minOccurs="0"/>
-          <xs:element ref="pc:EntityId5" minOccurs="0"/>
-        </xs:sequence>
-      </xs:complexType>
-    </xs:element>
-    <xs:element name="EntityDisplayName" type="xs:string"/>
-    <xs:element name="EntityInstanceReference" type="xs:string"/>
-    <xs:element name="EntityId1" type="xs:string"/>
-    <xs:element name="EntityId2" type="xs:string"/>
-    <xs:element name="EntityId3" type="xs:string"/>
-    <xs:element name="EntityId4" type="xs:string"/>
-    <xs:element name="EntityId5" type="xs:string"/>
-    <xs:element name="Terms">
-      <xs:complexType>
-        <xs:sequence>
-          <xs:element ref="pc:TermInfo" minOccurs="0" maxOccurs="unbounded"/>
-        </xs:sequence>
-      </xs:complexType>
-    </xs:element>
-    <xs:element name="TermInfo">
-      <xs:complexType>
-        <xs:sequence>
-          <xs:element ref="pc:TermName" minOccurs="0"/>
-          <xs:element ref="pc:TermId" minOccurs="0"/>
-        </xs:sequence>
-      </xs:complexType>
-    </xs:element>
-    <xs:element name="TermName" type="xs:string"/>
-    <xs:element name="TermId" type="xs:string"/>
-  </xs:schema>
-</ct:contentTypeSchema>
-</file>
-
-<file path=customXml/item5.xml><?xml version="1.0" encoding="utf-8"?>
 <b:Sources xmlns:b="http://schemas.openxmlformats.org/officeDocument/2006/bibliography" xmlns="http://schemas.openxmlformats.org/officeDocument/2006/bibliography" SelectedStyle="\APASixthEditionOfficeOnline.xsl" StyleName="APA" Version="6">
   <b:Source>
     <b:Tag>Cle18</b:Tag>
@@ -12790,6 +12088,222 @@
 </b:Sources>
 </file>
 
+<file path=customXml/item4.xml><?xml version="1.0" encoding="utf-8"?>
+<ct:contentTypeSchema xmlns:ct="http://schemas.microsoft.com/office/2006/metadata/contentType" xmlns:ma="http://schemas.microsoft.com/office/2006/metadata/properties/metaAttributes" ct:_="" ma:_="" ma:contentTypeName="Document" ma:contentTypeID="0x0101009AEE7C0E3FC1AF49AE2D21952FC004E7" ma:contentTypeVersion="13" ma:contentTypeDescription="Een nieuw document maken." ma:contentTypeScope="" ma:versionID="960b10dc37b0d3729643b1edbc9ea311">
+  <xsd:schema xmlns:xsd="http://www.w3.org/2001/XMLSchema" xmlns:xs="http://www.w3.org/2001/XMLSchema" xmlns:p="http://schemas.microsoft.com/office/2006/metadata/properties" xmlns:ns2="70093741-41eb-4420-bf3d-ff9555ef2a33" xmlns:ns3="8e0d46a4-c7d4-472b-9541-810c49191871" targetNamespace="http://schemas.microsoft.com/office/2006/metadata/properties" ma:root="true" ma:fieldsID="8470fe0247e22942882bacf7112b3079" ns2:_="" ns3:_="">
+    <xsd:import namespace="70093741-41eb-4420-bf3d-ff9555ef2a33"/>
+    <xsd:import namespace="8e0d46a4-c7d4-472b-9541-810c49191871"/>
+    <xsd:element name="properties">
+      <xsd:complexType>
+        <xsd:sequence>
+          <xsd:element name="documentManagement">
+            <xsd:complexType>
+              <xsd:all>
+                <xsd:element ref="ns2:MediaServiceMetadata" minOccurs="0"/>
+                <xsd:element ref="ns2:MediaServiceFastMetadata" minOccurs="0"/>
+                <xsd:element ref="ns2:MediaServiceSearchProperties" minOccurs="0"/>
+                <xsd:element ref="ns2:MediaServiceDateTaken" minOccurs="0"/>
+                <xsd:element ref="ns2:MediaServiceGenerationTime" minOccurs="0"/>
+                <xsd:element ref="ns2:MediaServiceEventHashCode" minOccurs="0"/>
+                <xsd:element ref="ns2:MediaLengthInSeconds" minOccurs="0"/>
+                <xsd:element ref="ns2:lcf76f155ced4ddcb4097134ff3c332f" minOccurs="0"/>
+                <xsd:element ref="ns3:TaxCatchAll" minOccurs="0"/>
+                <xsd:element ref="ns2:MediaServiceOCR" minOccurs="0"/>
+                <xsd:element ref="ns2:MediaServiceBillingMetadata" minOccurs="0"/>
+                <xsd:element ref="ns2:MediaServiceLocation" minOccurs="0"/>
+              </xsd:all>
+            </xsd:complexType>
+          </xsd:element>
+        </xsd:sequence>
+      </xsd:complexType>
+    </xsd:element>
+  </xsd:schema>
+  <xsd:schema xmlns:xsd="http://www.w3.org/2001/XMLSchema" xmlns:xs="http://www.w3.org/2001/XMLSchema" xmlns:dms="http://schemas.microsoft.com/office/2006/documentManagement/types" xmlns:pc="http://schemas.microsoft.com/office/infopath/2007/PartnerControls" targetNamespace="70093741-41eb-4420-bf3d-ff9555ef2a33" elementFormDefault="qualified">
+    <xsd:import namespace="http://schemas.microsoft.com/office/2006/documentManagement/types"/>
+    <xsd:import namespace="http://schemas.microsoft.com/office/infopath/2007/PartnerControls"/>
+    <xsd:element name="MediaServiceMetadata" ma:index="8" nillable="true" ma:displayName="MediaServiceMetadata" ma:hidden="true" ma:internalName="MediaServiceMetadata" ma:readOnly="true">
+      <xsd:simpleType>
+        <xsd:restriction base="dms:Note"/>
+      </xsd:simpleType>
+    </xsd:element>
+    <xsd:element name="MediaServiceFastMetadata" ma:index="9" nillable="true" ma:displayName="MediaServiceFastMetadata" ma:hidden="true" ma:internalName="MediaServiceFastMetadata" ma:readOnly="true">
+      <xsd:simpleType>
+        <xsd:restriction base="dms:Note"/>
+      </xsd:simpleType>
+    </xsd:element>
+    <xsd:element name="MediaServiceSearchProperties" ma:index="10" nillable="true" ma:displayName="MediaServiceSearchProperties" ma:hidden="true" ma:internalName="MediaServiceSearchProperties" ma:readOnly="true">
+      <xsd:simpleType>
+        <xsd:restriction base="dms:Note"/>
+      </xsd:simpleType>
+    </xsd:element>
+    <xsd:element name="MediaServiceDateTaken" ma:index="11" nillable="true" ma:displayName="MediaServiceDateTaken" ma:hidden="true" ma:indexed="true" ma:internalName="MediaServiceDateTaken" ma:readOnly="true">
+      <xsd:simpleType>
+        <xsd:restriction base="dms:Text"/>
+      </xsd:simpleType>
+    </xsd:element>
+    <xsd:element name="MediaServiceGenerationTime" ma:index="12" nillable="true" ma:displayName="MediaServiceGenerationTime" ma:hidden="true" ma:internalName="MediaServiceGenerationTime" ma:readOnly="true">
+      <xsd:simpleType>
+        <xsd:restriction base="dms:Text"/>
+      </xsd:simpleType>
+    </xsd:element>
+    <xsd:element name="MediaServiceEventHashCode" ma:index="13" nillable="true" ma:displayName="MediaServiceEventHashCode" ma:hidden="true" ma:internalName="MediaServiceEventHashCode" ma:readOnly="true">
+      <xsd:simpleType>
+        <xsd:restriction base="dms:Text"/>
+      </xsd:simpleType>
+    </xsd:element>
+    <xsd:element name="MediaLengthInSeconds" ma:index="14" nillable="true" ma:displayName="MediaLengthInSeconds" ma:hidden="true" ma:internalName="MediaLengthInSeconds" ma:readOnly="true">
+      <xsd:simpleType>
+        <xsd:restriction base="dms:Unknown"/>
+      </xsd:simpleType>
+    </xsd:element>
+    <xsd:element name="lcf76f155ced4ddcb4097134ff3c332f" ma:index="16" nillable="true" ma:taxonomy="true" ma:internalName="lcf76f155ced4ddcb4097134ff3c332f" ma:taxonomyFieldName="MediaServiceImageTags" ma:displayName="Afbeeldingtags" ma:readOnly="false" ma:fieldId="{5cf76f15-5ced-4ddc-b409-7134ff3c332f}" ma:taxonomyMulti="true" ma:sspId="5bd69f14-2b9f-433c-9887-fccfa466e118" ma:termSetId="09814cd3-568e-fe90-9814-8d621ff8fb84" ma:anchorId="fba54fb3-c3e1-fe81-a776-ca4b69148c4d" ma:open="true" ma:isKeyword="false">
+      <xsd:complexType>
+        <xsd:sequence>
+          <xsd:element ref="pc:Terms" minOccurs="0" maxOccurs="1"/>
+        </xsd:sequence>
+      </xsd:complexType>
+    </xsd:element>
+    <xsd:element name="MediaServiceOCR" ma:index="18" nillable="true" ma:displayName="Extracted Text" ma:internalName="MediaServiceOCR" ma:readOnly="true">
+      <xsd:simpleType>
+        <xsd:restriction base="dms:Note">
+          <xsd:maxLength value="255"/>
+        </xsd:restriction>
+      </xsd:simpleType>
+    </xsd:element>
+    <xsd:element name="MediaServiceBillingMetadata" ma:index="19" nillable="true" ma:displayName="MediaServiceBillingMetadata" ma:hidden="true" ma:internalName="MediaServiceBillingMetadata" ma:readOnly="true">
+      <xsd:simpleType>
+        <xsd:restriction base="dms:Note"/>
+      </xsd:simpleType>
+    </xsd:element>
+    <xsd:element name="MediaServiceLocation" ma:index="20" nillable="true" ma:displayName="Location" ma:description="" ma:indexed="true" ma:internalName="MediaServiceLocation" ma:readOnly="true">
+      <xsd:simpleType>
+        <xsd:restriction base="dms:Text"/>
+      </xsd:simpleType>
+    </xsd:element>
+  </xsd:schema>
+  <xsd:schema xmlns:xsd="http://www.w3.org/2001/XMLSchema" xmlns:xs="http://www.w3.org/2001/XMLSchema" xmlns:dms="http://schemas.microsoft.com/office/2006/documentManagement/types" xmlns:pc="http://schemas.microsoft.com/office/infopath/2007/PartnerControls" targetNamespace="8e0d46a4-c7d4-472b-9541-810c49191871" elementFormDefault="qualified">
+    <xsd:import namespace="http://schemas.microsoft.com/office/2006/documentManagement/types"/>
+    <xsd:import namespace="http://schemas.microsoft.com/office/infopath/2007/PartnerControls"/>
+    <xsd:element name="TaxCatchAll" ma:index="17" nillable="true" ma:displayName="Taxonomy Catch All Column" ma:hidden="true" ma:list="{c8ab18b9-6097-49a0-8cf1-8fd8c6c84254}" ma:internalName="TaxCatchAll" ma:showField="CatchAllData" ma:web="8e0d46a4-c7d4-472b-9541-810c49191871">
+      <xsd:complexType>
+        <xsd:complexContent>
+          <xsd:extension base="dms:MultiChoiceLookup">
+            <xsd:sequence>
+              <xsd:element name="Value" type="dms:Lookup" maxOccurs="unbounded" minOccurs="0" nillable="true"/>
+            </xsd:sequence>
+          </xsd:extension>
+        </xsd:complexContent>
+      </xsd:complexType>
+    </xsd:element>
+  </xsd:schema>
+  <xsd:schema xmlns="http://schemas.openxmlformats.org/package/2006/metadata/core-properties" xmlns:xsd="http://www.w3.org/2001/XMLSchema" xmlns:xsi="http://www.w3.org/2001/XMLSchema-instance" xmlns:dc="http://purl.org/dc/elements/1.1/" xmlns:dcterms="http://purl.org/dc/terms/" xmlns:odoc="http://schemas.microsoft.com/internal/obd" targetNamespace="http://schemas.openxmlformats.org/package/2006/metadata/core-properties" elementFormDefault="qualified" attributeFormDefault="unqualified" blockDefault="#all">
+    <xsd:import namespace="http://purl.org/dc/elements/1.1/" schemaLocation="http://dublincore.org/schemas/xmls/qdc/2003/04/02/dc.xsd"/>
+    <xsd:import namespace="http://purl.org/dc/terms/" schemaLocation="http://dublincore.org/schemas/xmls/qdc/2003/04/02/dcterms.xsd"/>
+    <xsd:element name="coreProperties" type="CT_coreProperties"/>
+    <xsd:complexType name="CT_coreProperties">
+      <xsd:all>
+        <xsd:element ref="dc:creator" minOccurs="0" maxOccurs="1"/>
+        <xsd:element ref="dcterms:created" minOccurs="0" maxOccurs="1"/>
+        <xsd:element ref="dc:identifier" minOccurs="0" maxOccurs="1"/>
+        <xsd:element name="contentType" minOccurs="0" maxOccurs="1" type="xsd:string" ma:index="0" ma:displayName="Inhoudstype"/>
+        <xsd:element ref="dc:title" minOccurs="0" maxOccurs="1" ma:index="4" ma:displayName="Titel"/>
+        <xsd:element ref="dc:subject" minOccurs="0" maxOccurs="1"/>
+        <xsd:element ref="dc:description" minOccurs="0" maxOccurs="1"/>
+        <xsd:element name="keywords" minOccurs="0" maxOccurs="1" type="xsd:string"/>
+        <xsd:element ref="dc:language" minOccurs="0" maxOccurs="1"/>
+        <xsd:element name="category" minOccurs="0" maxOccurs="1" type="xsd:string"/>
+        <xsd:element name="version" minOccurs="0" maxOccurs="1" type="xsd:string"/>
+        <xsd:element name="revision" minOccurs="0" maxOccurs="1" type="xsd:string">
+          <xsd:annotation>
+            <xsd:documentation>
+                        This value indicates the number of saves or revisions. The application is responsible for updating this value after each revision.
+                    </xsd:documentation>
+          </xsd:annotation>
+        </xsd:element>
+        <xsd:element name="lastModifiedBy" minOccurs="0" maxOccurs="1" type="xsd:string"/>
+        <xsd:element ref="dcterms:modified" minOccurs="0" maxOccurs="1"/>
+        <xsd:element name="contentStatus" minOccurs="0" maxOccurs="1" type="xsd:string"/>
+      </xsd:all>
+    </xsd:complexType>
+  </xsd:schema>
+  <xs:schema xmlns:pc="http://schemas.microsoft.com/office/infopath/2007/PartnerControls" xmlns:xs="http://www.w3.org/2001/XMLSchema" targetNamespace="http://schemas.microsoft.com/office/infopath/2007/PartnerControls" elementFormDefault="qualified" attributeFormDefault="unqualified">
+    <xs:element name="Person">
+      <xs:complexType>
+        <xs:sequence>
+          <xs:element ref="pc:DisplayName" minOccurs="0"/>
+          <xs:element ref="pc:AccountId" minOccurs="0"/>
+          <xs:element ref="pc:AccountType" minOccurs="0"/>
+        </xs:sequence>
+      </xs:complexType>
+    </xs:element>
+    <xs:element name="DisplayName" type="xs:string"/>
+    <xs:element name="AccountId" type="xs:string"/>
+    <xs:element name="AccountType" type="xs:string"/>
+    <xs:element name="BDCAssociatedEntity">
+      <xs:complexType>
+        <xs:sequence>
+          <xs:element ref="pc:BDCEntity" minOccurs="0" maxOccurs="unbounded"/>
+        </xs:sequence>
+        <xs:attribute ref="pc:EntityNamespace"/>
+        <xs:attribute ref="pc:EntityName"/>
+        <xs:attribute ref="pc:SystemInstanceName"/>
+        <xs:attribute ref="pc:AssociationName"/>
+      </xs:complexType>
+    </xs:element>
+    <xs:attribute name="EntityNamespace" type="xs:string"/>
+    <xs:attribute name="EntityName" type="xs:string"/>
+    <xs:attribute name="SystemInstanceName" type="xs:string"/>
+    <xs:attribute name="AssociationName" type="xs:string"/>
+    <xs:element name="BDCEntity">
+      <xs:complexType>
+        <xs:sequence>
+          <xs:element ref="pc:EntityDisplayName" minOccurs="0"/>
+          <xs:element ref="pc:EntityInstanceReference" minOccurs="0"/>
+          <xs:element ref="pc:EntityId1" minOccurs="0"/>
+          <xs:element ref="pc:EntityId2" minOccurs="0"/>
+          <xs:element ref="pc:EntityId3" minOccurs="0"/>
+          <xs:element ref="pc:EntityId4" minOccurs="0"/>
+          <xs:element ref="pc:EntityId5" minOccurs="0"/>
+        </xs:sequence>
+      </xs:complexType>
+    </xs:element>
+    <xs:element name="EntityDisplayName" type="xs:string"/>
+    <xs:element name="EntityInstanceReference" type="xs:string"/>
+    <xs:element name="EntityId1" type="xs:string"/>
+    <xs:element name="EntityId2" type="xs:string"/>
+    <xs:element name="EntityId3" type="xs:string"/>
+    <xs:element name="EntityId4" type="xs:string"/>
+    <xs:element name="EntityId5" type="xs:string"/>
+    <xs:element name="Terms">
+      <xs:complexType>
+        <xs:sequence>
+          <xs:element ref="pc:TermInfo" minOccurs="0" maxOccurs="unbounded"/>
+        </xs:sequence>
+      </xs:complexType>
+    </xs:element>
+    <xs:element name="TermInfo">
+      <xs:complexType>
+        <xs:sequence>
+          <xs:element ref="pc:TermName" minOccurs="0"/>
+          <xs:element ref="pc:TermId" minOccurs="0"/>
+        </xs:sequence>
+      </xs:complexType>
+    </xs:element>
+    <xs:element name="TermName" type="xs:string"/>
+    <xs:element name="TermId" type="xs:string"/>
+  </xs:schema>
+</ct:contentTypeSchema>
+</file>
+
+<file path=customXml/item5.xml><?xml version="1.0" encoding="utf-8"?>
+<?mso-contentType ?>
+<FormTemplates xmlns="http://schemas.microsoft.com/sharepoint/v3/contenttype/forms">
+  <Display>DocumentLibraryForm</Display>
+  <Edit>DocumentLibraryForm</Edit>
+  <New>DocumentLibraryForm</New>
+</FormTemplates>
+</file>
+
 <file path=customXml/itemProps1.xml><?xml version="1.0" encoding="utf-8"?>
 <ds:datastoreItem xmlns:ds="http://schemas.openxmlformats.org/officeDocument/2006/customXml" ds:itemID="{55AF091B-3C7A-41E3-B477-F2FDAA23CFDA}">
   <ds:schemaRefs>
@@ -12810,9 +12324,9 @@
 </file>
 
 <file path=customXml/itemProps3.xml><?xml version="1.0" encoding="utf-8"?>
-<ds:datastoreItem xmlns:ds="http://schemas.openxmlformats.org/officeDocument/2006/customXml" ds:itemID="{4F2FF0AF-4963-4DA0-8342-5673697A9054}">
+<ds:datastoreItem xmlns:ds="http://schemas.openxmlformats.org/officeDocument/2006/customXml" ds:itemID="{A78D1BFD-FB21-4E94-A897-6F9CD570B4EA}">
   <ds:schemaRefs>
-    <ds:schemaRef ds:uri="http://schemas.microsoft.com/sharepoint/v3/contenttype/forms"/>
+    <ds:schemaRef ds:uri="http://schemas.openxmlformats.org/officeDocument/2006/bibliography"/>
   </ds:schemaRefs>
 </ds:datastoreItem>
 </file>
@@ -12837,9 +12351,9 @@
 </file>
 
 <file path=customXml/itemProps5.xml><?xml version="1.0" encoding="utf-8"?>
-<ds:datastoreItem xmlns:ds="http://schemas.openxmlformats.org/officeDocument/2006/customXml" ds:itemID="{A78D1BFD-FB21-4E94-A897-6F9CD570B4EA}">
+<ds:datastoreItem xmlns:ds="http://schemas.openxmlformats.org/officeDocument/2006/customXml" ds:itemID="{4F2FF0AF-4963-4DA0-8342-5673697A9054}">
   <ds:schemaRefs>
-    <ds:schemaRef ds:uri="http://schemas.openxmlformats.org/officeDocument/2006/bibliography"/>
+    <ds:schemaRef ds:uri="http://schemas.microsoft.com/sharepoint/v3/contenttype/forms"/>
   </ds:schemaRefs>
 </ds:datastoreItem>
 </file>
</xml_diff>

<commit_message>
Added Nathalie her strong and weak points.
</commit_message>
<xml_diff>
--- a/ZKOO3_PvA.docx
+++ b/ZKOO3_PvA.docx
@@ -4581,7 +4581,13 @@
               <w:spacing w:after="0" w:line="240" w:lineRule="auto"/>
             </w:pPr>
             <w:r>
-              <w:t>Communicatie.</w:t>
+              <w:t>Verantwoordelijk</w:t>
+            </w:r>
+            <w:r>
+              <w:t>heid</w:t>
+            </w:r>
+            <w:r>
+              <w:t>.</w:t>
             </w:r>
           </w:p>
           <w:p>
@@ -4607,7 +4613,7 @@
               <w:spacing w:after="0" w:line="240" w:lineRule="auto"/>
             </w:pPr>
             <w:r>
-              <w:t>Organisatie.</w:t>
+              <w:t>Nauwkeurig</w:t>
             </w:r>
           </w:p>
           <w:p>
@@ -4620,6 +4626,32 @@
               <w:spacing w:after="0" w:line="240" w:lineRule="auto"/>
             </w:pPr>
             <w:r>
+              <w:t>Flexibel</w:t>
+            </w:r>
+          </w:p>
+          <w:p>
+            <w:pPr>
+              <w:pStyle w:val="ListParagraph"/>
+              <w:numPr>
+                <w:ilvl w:val="0"/>
+                <w:numId w:val="18"/>
+              </w:numPr>
+              <w:spacing w:after="0" w:line="240" w:lineRule="auto"/>
+            </w:pPr>
+            <w:r>
+              <w:t>Organisatie.</w:t>
+            </w:r>
+          </w:p>
+          <w:p>
+            <w:pPr>
+              <w:pStyle w:val="ListParagraph"/>
+              <w:numPr>
+                <w:ilvl w:val="0"/>
+                <w:numId w:val="18"/>
+              </w:numPr>
+              <w:spacing w:after="0" w:line="240" w:lineRule="auto"/>
+            </w:pPr>
+            <w:r>
               <w:t>Documentatie.</w:t>
             </w:r>
           </w:p>
@@ -4628,7 +4660,45 @@
           <w:tcPr>
             <w:tcW w:w="3006" w:type="dxa"/>
           </w:tcPr>
-          <w:p/>
+          <w:p>
+            <w:pPr>
+              <w:pStyle w:val="ListParagraph"/>
+              <w:numPr>
+                <w:ilvl w:val="0"/>
+                <w:numId w:val="18"/>
+              </w:numPr>
+              <w:spacing w:after="0" w:line="240" w:lineRule="auto"/>
+            </w:pPr>
+            <w:r>
+              <w:t>Perfectionistisch.</w:t>
+            </w:r>
+          </w:p>
+          <w:p>
+            <w:pPr>
+              <w:pStyle w:val="ListParagraph"/>
+              <w:numPr>
+                <w:ilvl w:val="0"/>
+                <w:numId w:val="18"/>
+              </w:numPr>
+              <w:spacing w:after="0" w:line="240" w:lineRule="auto"/>
+            </w:pPr>
+            <w:r>
+              <w:t>Delegeren van werk.</w:t>
+            </w:r>
+          </w:p>
+          <w:p>
+            <w:pPr>
+              <w:pStyle w:val="ListParagraph"/>
+              <w:numPr>
+                <w:ilvl w:val="0"/>
+                <w:numId w:val="18"/>
+              </w:numPr>
+              <w:spacing w:after="0" w:line="240" w:lineRule="auto"/>
+            </w:pPr>
+            <w:r>
+              <w:t>Onzeker over kennis.</w:t>
+            </w:r>
+          </w:p>
         </w:tc>
       </w:tr>
       <w:tr>
@@ -5116,7 +5186,6 @@
                 <w:b/>
                 <w:color w:val="000000" w:themeColor="text1"/>
               </w:rPr>
-              <w:lastRenderedPageBreak/>
               <w:t>Stakeholder</w:t>
             </w:r>
           </w:p>
@@ -5525,6 +5594,7 @@
         <w:rPr>
           <w:rFonts w:cs="Arial"/>
         </w:rPr>
+        <w:lastRenderedPageBreak/>
         <w:t>Indien er geen specifieke richtlijnen zijn voorgeschreven, passen we de volgende standaardisatie toe:</w:t>
       </w:r>
     </w:p>
@@ -5576,7 +5646,6 @@
                 <w:rFonts w:cs="Arial"/>
                 <w:i/>
               </w:rPr>
-              <w:lastRenderedPageBreak/>
               <w:t>Lettertype</w:t>
             </w:r>
           </w:p>
@@ -6225,6 +6294,7 @@
         </w:numPr>
       </w:pPr>
       <w:r>
+        <w:lastRenderedPageBreak/>
         <w:t>Volledig plan van aanpak: week 3, vrijdag om 15.00 uur.</w:t>
       </w:r>
     </w:p>
@@ -6261,7 +6331,6 @@
         </w:numPr>
       </w:pPr>
       <w:r>
-        <w:lastRenderedPageBreak/>
         <w:t>Individueel CGI: week 10.</w:t>
       </w:r>
     </w:p>
@@ -7684,7 +7753,7 @@
             </wp:anchor>
           </w:drawing>
         </mc:Choice>
-        <mc:Fallback xmlns:a="http://schemas.openxmlformats.org/drawingml/2006/main" xmlns:pic="http://schemas.openxmlformats.org/drawingml/2006/picture" xmlns:a14="http://schemas.microsoft.com/office/drawing/2010/main">
+        <mc:Fallback xmlns:a14="http://schemas.microsoft.com/office/drawing/2010/main" xmlns:pic="http://schemas.openxmlformats.org/drawingml/2006/picture" xmlns:a="http://schemas.openxmlformats.org/drawingml/2006/main">
           <w:pict w14:anchorId="1CADCD6F">
             <v:group id="Groep 102" style="position:absolute;margin-left:-1in;margin-top:-29.55pt;width:595.25pt;height:835.05pt;z-index:-251657216" coordsize="75596,106051" coordorigin=",186" o:spid="_x0000_s1026" w14:anchorId="0FC57937" o:gfxdata="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">
               <v:shapetype id="_x0000_t75" coordsize="21600,21600" filled="f" stroked="f" o:spt="75" o:preferrelative="t" path="m@4@5l@4@11@9@11@9@5xe">
@@ -10902,6 +10971,7 @@
     <w:rsidRoot w:val="007D1596"/>
     <w:rsid w:val="00044AFF"/>
     <w:rsid w:val="001F355E"/>
+    <w:rsid w:val="00212C52"/>
     <w:rsid w:val="00247E2B"/>
     <w:rsid w:val="002A272A"/>
     <w:rsid w:val="00371805"/>
@@ -10923,6 +10993,7 @@
     <w:rsid w:val="00A745AF"/>
     <w:rsid w:val="00BE0D98"/>
     <w:rsid w:val="00CF785F"/>
+    <w:rsid w:val="00DD4C93"/>
     <w:rsid w:val="00DD5D19"/>
     <w:rsid w:val="00E73956"/>
     <w:rsid w:val="00EC7668"/>
@@ -11709,6 +11780,222 @@
 </file>
 
 <file path=customXml/item3.xml><?xml version="1.0" encoding="utf-8"?>
+<?mso-contentType ?>
+<FormTemplates xmlns="http://schemas.microsoft.com/sharepoint/v3/contenttype/forms">
+  <Display>DocumentLibraryForm</Display>
+  <Edit>DocumentLibraryForm</Edit>
+  <New>DocumentLibraryForm</New>
+</FormTemplates>
+</file>
+
+<file path=customXml/item4.xml><?xml version="1.0" encoding="utf-8"?>
+<ct:contentTypeSchema xmlns:ct="http://schemas.microsoft.com/office/2006/metadata/contentType" xmlns:ma="http://schemas.microsoft.com/office/2006/metadata/properties/metaAttributes" ct:_="" ma:_="" ma:contentTypeName="Document" ma:contentTypeID="0x0101009AEE7C0E3FC1AF49AE2D21952FC004E7" ma:contentTypeVersion="13" ma:contentTypeDescription="Een nieuw document maken." ma:contentTypeScope="" ma:versionID="960b10dc37b0d3729643b1edbc9ea311">
+  <xsd:schema xmlns:xsd="http://www.w3.org/2001/XMLSchema" xmlns:xs="http://www.w3.org/2001/XMLSchema" xmlns:p="http://schemas.microsoft.com/office/2006/metadata/properties" xmlns:ns2="70093741-41eb-4420-bf3d-ff9555ef2a33" xmlns:ns3="8e0d46a4-c7d4-472b-9541-810c49191871" targetNamespace="http://schemas.microsoft.com/office/2006/metadata/properties" ma:root="true" ma:fieldsID="8470fe0247e22942882bacf7112b3079" ns2:_="" ns3:_="">
+    <xsd:import namespace="70093741-41eb-4420-bf3d-ff9555ef2a33"/>
+    <xsd:import namespace="8e0d46a4-c7d4-472b-9541-810c49191871"/>
+    <xsd:element name="properties">
+      <xsd:complexType>
+        <xsd:sequence>
+          <xsd:element name="documentManagement">
+            <xsd:complexType>
+              <xsd:all>
+                <xsd:element ref="ns2:MediaServiceMetadata" minOccurs="0"/>
+                <xsd:element ref="ns2:MediaServiceFastMetadata" minOccurs="0"/>
+                <xsd:element ref="ns2:MediaServiceSearchProperties" minOccurs="0"/>
+                <xsd:element ref="ns2:MediaServiceDateTaken" minOccurs="0"/>
+                <xsd:element ref="ns2:MediaServiceGenerationTime" minOccurs="0"/>
+                <xsd:element ref="ns2:MediaServiceEventHashCode" minOccurs="0"/>
+                <xsd:element ref="ns2:MediaLengthInSeconds" minOccurs="0"/>
+                <xsd:element ref="ns2:lcf76f155ced4ddcb4097134ff3c332f" minOccurs="0"/>
+                <xsd:element ref="ns3:TaxCatchAll" minOccurs="0"/>
+                <xsd:element ref="ns2:MediaServiceOCR" minOccurs="0"/>
+                <xsd:element ref="ns2:MediaServiceBillingMetadata" minOccurs="0"/>
+                <xsd:element ref="ns2:MediaServiceLocation" minOccurs="0"/>
+              </xsd:all>
+            </xsd:complexType>
+          </xsd:element>
+        </xsd:sequence>
+      </xsd:complexType>
+    </xsd:element>
+  </xsd:schema>
+  <xsd:schema xmlns:xsd="http://www.w3.org/2001/XMLSchema" xmlns:xs="http://www.w3.org/2001/XMLSchema" xmlns:dms="http://schemas.microsoft.com/office/2006/documentManagement/types" xmlns:pc="http://schemas.microsoft.com/office/infopath/2007/PartnerControls" targetNamespace="70093741-41eb-4420-bf3d-ff9555ef2a33" elementFormDefault="qualified">
+    <xsd:import namespace="http://schemas.microsoft.com/office/2006/documentManagement/types"/>
+    <xsd:import namespace="http://schemas.microsoft.com/office/infopath/2007/PartnerControls"/>
+    <xsd:element name="MediaServiceMetadata" ma:index="8" nillable="true" ma:displayName="MediaServiceMetadata" ma:hidden="true" ma:internalName="MediaServiceMetadata" ma:readOnly="true">
+      <xsd:simpleType>
+        <xsd:restriction base="dms:Note"/>
+      </xsd:simpleType>
+    </xsd:element>
+    <xsd:element name="MediaServiceFastMetadata" ma:index="9" nillable="true" ma:displayName="MediaServiceFastMetadata" ma:hidden="true" ma:internalName="MediaServiceFastMetadata" ma:readOnly="true">
+      <xsd:simpleType>
+        <xsd:restriction base="dms:Note"/>
+      </xsd:simpleType>
+    </xsd:element>
+    <xsd:element name="MediaServiceSearchProperties" ma:index="10" nillable="true" ma:displayName="MediaServiceSearchProperties" ma:hidden="true" ma:internalName="MediaServiceSearchProperties" ma:readOnly="true">
+      <xsd:simpleType>
+        <xsd:restriction base="dms:Note"/>
+      </xsd:simpleType>
+    </xsd:element>
+    <xsd:element name="MediaServiceDateTaken" ma:index="11" nillable="true" ma:displayName="MediaServiceDateTaken" ma:hidden="true" ma:indexed="true" ma:internalName="MediaServiceDateTaken" ma:readOnly="true">
+      <xsd:simpleType>
+        <xsd:restriction base="dms:Text"/>
+      </xsd:simpleType>
+    </xsd:element>
+    <xsd:element name="MediaServiceGenerationTime" ma:index="12" nillable="true" ma:displayName="MediaServiceGenerationTime" ma:hidden="true" ma:internalName="MediaServiceGenerationTime" ma:readOnly="true">
+      <xsd:simpleType>
+        <xsd:restriction base="dms:Text"/>
+      </xsd:simpleType>
+    </xsd:element>
+    <xsd:element name="MediaServiceEventHashCode" ma:index="13" nillable="true" ma:displayName="MediaServiceEventHashCode" ma:hidden="true" ma:internalName="MediaServiceEventHashCode" ma:readOnly="true">
+      <xsd:simpleType>
+        <xsd:restriction base="dms:Text"/>
+      </xsd:simpleType>
+    </xsd:element>
+    <xsd:element name="MediaLengthInSeconds" ma:index="14" nillable="true" ma:displayName="MediaLengthInSeconds" ma:hidden="true" ma:internalName="MediaLengthInSeconds" ma:readOnly="true">
+      <xsd:simpleType>
+        <xsd:restriction base="dms:Unknown"/>
+      </xsd:simpleType>
+    </xsd:element>
+    <xsd:element name="lcf76f155ced4ddcb4097134ff3c332f" ma:index="16" nillable="true" ma:taxonomy="true" ma:internalName="lcf76f155ced4ddcb4097134ff3c332f" ma:taxonomyFieldName="MediaServiceImageTags" ma:displayName="Afbeeldingtags" ma:readOnly="false" ma:fieldId="{5cf76f15-5ced-4ddc-b409-7134ff3c332f}" ma:taxonomyMulti="true" ma:sspId="5bd69f14-2b9f-433c-9887-fccfa466e118" ma:termSetId="09814cd3-568e-fe90-9814-8d621ff8fb84" ma:anchorId="fba54fb3-c3e1-fe81-a776-ca4b69148c4d" ma:open="true" ma:isKeyword="false">
+      <xsd:complexType>
+        <xsd:sequence>
+          <xsd:element ref="pc:Terms" minOccurs="0" maxOccurs="1"/>
+        </xsd:sequence>
+      </xsd:complexType>
+    </xsd:element>
+    <xsd:element name="MediaServiceOCR" ma:index="18" nillable="true" ma:displayName="Extracted Text" ma:internalName="MediaServiceOCR" ma:readOnly="true">
+      <xsd:simpleType>
+        <xsd:restriction base="dms:Note">
+          <xsd:maxLength value="255"/>
+        </xsd:restriction>
+      </xsd:simpleType>
+    </xsd:element>
+    <xsd:element name="MediaServiceBillingMetadata" ma:index="19" nillable="true" ma:displayName="MediaServiceBillingMetadata" ma:hidden="true" ma:internalName="MediaServiceBillingMetadata" ma:readOnly="true">
+      <xsd:simpleType>
+        <xsd:restriction base="dms:Note"/>
+      </xsd:simpleType>
+    </xsd:element>
+    <xsd:element name="MediaServiceLocation" ma:index="20" nillable="true" ma:displayName="Location" ma:description="" ma:indexed="true" ma:internalName="MediaServiceLocation" ma:readOnly="true">
+      <xsd:simpleType>
+        <xsd:restriction base="dms:Text"/>
+      </xsd:simpleType>
+    </xsd:element>
+  </xsd:schema>
+  <xsd:schema xmlns:xsd="http://www.w3.org/2001/XMLSchema" xmlns:xs="http://www.w3.org/2001/XMLSchema" xmlns:dms="http://schemas.microsoft.com/office/2006/documentManagement/types" xmlns:pc="http://schemas.microsoft.com/office/infopath/2007/PartnerControls" targetNamespace="8e0d46a4-c7d4-472b-9541-810c49191871" elementFormDefault="qualified">
+    <xsd:import namespace="http://schemas.microsoft.com/office/2006/documentManagement/types"/>
+    <xsd:import namespace="http://schemas.microsoft.com/office/infopath/2007/PartnerControls"/>
+    <xsd:element name="TaxCatchAll" ma:index="17" nillable="true" ma:displayName="Taxonomy Catch All Column" ma:hidden="true" ma:list="{c8ab18b9-6097-49a0-8cf1-8fd8c6c84254}" ma:internalName="TaxCatchAll" ma:showField="CatchAllData" ma:web="8e0d46a4-c7d4-472b-9541-810c49191871">
+      <xsd:complexType>
+        <xsd:complexContent>
+          <xsd:extension base="dms:MultiChoiceLookup">
+            <xsd:sequence>
+              <xsd:element name="Value" type="dms:Lookup" maxOccurs="unbounded" minOccurs="0" nillable="true"/>
+            </xsd:sequence>
+          </xsd:extension>
+        </xsd:complexContent>
+      </xsd:complexType>
+    </xsd:element>
+  </xsd:schema>
+  <xsd:schema xmlns="http://schemas.openxmlformats.org/package/2006/metadata/core-properties" xmlns:xsd="http://www.w3.org/2001/XMLSchema" xmlns:xsi="http://www.w3.org/2001/XMLSchema-instance" xmlns:dc="http://purl.org/dc/elements/1.1/" xmlns:dcterms="http://purl.org/dc/terms/" xmlns:odoc="http://schemas.microsoft.com/internal/obd" targetNamespace="http://schemas.openxmlformats.org/package/2006/metadata/core-properties" elementFormDefault="qualified" attributeFormDefault="unqualified" blockDefault="#all">
+    <xsd:import namespace="http://purl.org/dc/elements/1.1/" schemaLocation="http://dublincore.org/schemas/xmls/qdc/2003/04/02/dc.xsd"/>
+    <xsd:import namespace="http://purl.org/dc/terms/" schemaLocation="http://dublincore.org/schemas/xmls/qdc/2003/04/02/dcterms.xsd"/>
+    <xsd:element name="coreProperties" type="CT_coreProperties"/>
+    <xsd:complexType name="CT_coreProperties">
+      <xsd:all>
+        <xsd:element ref="dc:creator" minOccurs="0" maxOccurs="1"/>
+        <xsd:element ref="dcterms:created" minOccurs="0" maxOccurs="1"/>
+        <xsd:element ref="dc:identifier" minOccurs="0" maxOccurs="1"/>
+        <xsd:element name="contentType" minOccurs="0" maxOccurs="1" type="xsd:string" ma:index="0" ma:displayName="Inhoudstype"/>
+        <xsd:element ref="dc:title" minOccurs="0" maxOccurs="1" ma:index="4" ma:displayName="Titel"/>
+        <xsd:element ref="dc:subject" minOccurs="0" maxOccurs="1"/>
+        <xsd:element ref="dc:description" minOccurs="0" maxOccurs="1"/>
+        <xsd:element name="keywords" minOccurs="0" maxOccurs="1" type="xsd:string"/>
+        <xsd:element ref="dc:language" minOccurs="0" maxOccurs="1"/>
+        <xsd:element name="category" minOccurs="0" maxOccurs="1" type="xsd:string"/>
+        <xsd:element name="version" minOccurs="0" maxOccurs="1" type="xsd:string"/>
+        <xsd:element name="revision" minOccurs="0" maxOccurs="1" type="xsd:string">
+          <xsd:annotation>
+            <xsd:documentation>
+                        This value indicates the number of saves or revisions. The application is responsible for updating this value after each revision.
+                    </xsd:documentation>
+          </xsd:annotation>
+        </xsd:element>
+        <xsd:element name="lastModifiedBy" minOccurs="0" maxOccurs="1" type="xsd:string"/>
+        <xsd:element ref="dcterms:modified" minOccurs="0" maxOccurs="1"/>
+        <xsd:element name="contentStatus" minOccurs="0" maxOccurs="1" type="xsd:string"/>
+      </xsd:all>
+    </xsd:complexType>
+  </xsd:schema>
+  <xs:schema xmlns:pc="http://schemas.microsoft.com/office/infopath/2007/PartnerControls" xmlns:xs="http://www.w3.org/2001/XMLSchema" targetNamespace="http://schemas.microsoft.com/office/infopath/2007/PartnerControls" elementFormDefault="qualified" attributeFormDefault="unqualified">
+    <xs:element name="Person">
+      <xs:complexType>
+        <xs:sequence>
+          <xs:element ref="pc:DisplayName" minOccurs="0"/>
+          <xs:element ref="pc:AccountId" minOccurs="0"/>
+          <xs:element ref="pc:AccountType" minOccurs="0"/>
+        </xs:sequence>
+      </xs:complexType>
+    </xs:element>
+    <xs:element name="DisplayName" type="xs:string"/>
+    <xs:element name="AccountId" type="xs:string"/>
+    <xs:element name="AccountType" type="xs:string"/>
+    <xs:element name="BDCAssociatedEntity">
+      <xs:complexType>
+        <xs:sequence>
+          <xs:element ref="pc:BDCEntity" minOccurs="0" maxOccurs="unbounded"/>
+        </xs:sequence>
+        <xs:attribute ref="pc:EntityNamespace"/>
+        <xs:attribute ref="pc:EntityName"/>
+        <xs:attribute ref="pc:SystemInstanceName"/>
+        <xs:attribute ref="pc:AssociationName"/>
+      </xs:complexType>
+    </xs:element>
+    <xs:attribute name="EntityNamespace" type="xs:string"/>
+    <xs:attribute name="EntityName" type="xs:string"/>
+    <xs:attribute name="SystemInstanceName" type="xs:string"/>
+    <xs:attribute name="AssociationName" type="xs:string"/>
+    <xs:element name="BDCEntity">
+      <xs:complexType>
+        <xs:sequence>
+          <xs:element ref="pc:EntityDisplayName" minOccurs="0"/>
+          <xs:element ref="pc:EntityInstanceReference" minOccurs="0"/>
+          <xs:element ref="pc:EntityId1" minOccurs="0"/>
+          <xs:element ref="pc:EntityId2" minOccurs="0"/>
+          <xs:element ref="pc:EntityId3" minOccurs="0"/>
+          <xs:element ref="pc:EntityId4" minOccurs="0"/>
+          <xs:element ref="pc:EntityId5" minOccurs="0"/>
+        </xs:sequence>
+      </xs:complexType>
+    </xs:element>
+    <xs:element name="EntityDisplayName" type="xs:string"/>
+    <xs:element name="EntityInstanceReference" type="xs:string"/>
+    <xs:element name="EntityId1" type="xs:string"/>
+    <xs:element name="EntityId2" type="xs:string"/>
+    <xs:element name="EntityId3" type="xs:string"/>
+    <xs:element name="EntityId4" type="xs:string"/>
+    <xs:element name="EntityId5" type="xs:string"/>
+    <xs:element name="Terms">
+      <xs:complexType>
+        <xs:sequence>
+          <xs:element ref="pc:TermInfo" minOccurs="0" maxOccurs="unbounded"/>
+        </xs:sequence>
+      </xs:complexType>
+    </xs:element>
+    <xs:element name="TermInfo">
+      <xs:complexType>
+        <xs:sequence>
+          <xs:element ref="pc:TermName" minOccurs="0"/>
+          <xs:element ref="pc:TermId" minOccurs="0"/>
+        </xs:sequence>
+      </xs:complexType>
+    </xs:element>
+    <xs:element name="TermName" type="xs:string"/>
+    <xs:element name="TermId" type="xs:string"/>
+  </xs:schema>
+</ct:contentTypeSchema>
+</file>
+
+<file path=customXml/item5.xml><?xml version="1.0" encoding="utf-8"?>
 <b:Sources xmlns:b="http://schemas.openxmlformats.org/officeDocument/2006/bibliography" xmlns="http://schemas.openxmlformats.org/officeDocument/2006/bibliography" SelectedStyle="\APASixthEditionOfficeOnline.xsl" StyleName="APA" Version="6">
   <b:Source>
     <b:Tag>Cle18</b:Tag>
@@ -12088,222 +12375,6 @@
 </b:Sources>
 </file>
 
-<file path=customXml/item4.xml><?xml version="1.0" encoding="utf-8"?>
-<ct:contentTypeSchema xmlns:ct="http://schemas.microsoft.com/office/2006/metadata/contentType" xmlns:ma="http://schemas.microsoft.com/office/2006/metadata/properties/metaAttributes" ct:_="" ma:_="" ma:contentTypeName="Document" ma:contentTypeID="0x0101009AEE7C0E3FC1AF49AE2D21952FC004E7" ma:contentTypeVersion="13" ma:contentTypeDescription="Een nieuw document maken." ma:contentTypeScope="" ma:versionID="960b10dc37b0d3729643b1edbc9ea311">
-  <xsd:schema xmlns:xsd="http://www.w3.org/2001/XMLSchema" xmlns:xs="http://www.w3.org/2001/XMLSchema" xmlns:p="http://schemas.microsoft.com/office/2006/metadata/properties" xmlns:ns2="70093741-41eb-4420-bf3d-ff9555ef2a33" xmlns:ns3="8e0d46a4-c7d4-472b-9541-810c49191871" targetNamespace="http://schemas.microsoft.com/office/2006/metadata/properties" ma:root="true" ma:fieldsID="8470fe0247e22942882bacf7112b3079" ns2:_="" ns3:_="">
-    <xsd:import namespace="70093741-41eb-4420-bf3d-ff9555ef2a33"/>
-    <xsd:import namespace="8e0d46a4-c7d4-472b-9541-810c49191871"/>
-    <xsd:element name="properties">
-      <xsd:complexType>
-        <xsd:sequence>
-          <xsd:element name="documentManagement">
-            <xsd:complexType>
-              <xsd:all>
-                <xsd:element ref="ns2:MediaServiceMetadata" minOccurs="0"/>
-                <xsd:element ref="ns2:MediaServiceFastMetadata" minOccurs="0"/>
-                <xsd:element ref="ns2:MediaServiceSearchProperties" minOccurs="0"/>
-                <xsd:element ref="ns2:MediaServiceDateTaken" minOccurs="0"/>
-                <xsd:element ref="ns2:MediaServiceGenerationTime" minOccurs="0"/>
-                <xsd:element ref="ns2:MediaServiceEventHashCode" minOccurs="0"/>
-                <xsd:element ref="ns2:MediaLengthInSeconds" minOccurs="0"/>
-                <xsd:element ref="ns2:lcf76f155ced4ddcb4097134ff3c332f" minOccurs="0"/>
-                <xsd:element ref="ns3:TaxCatchAll" minOccurs="0"/>
-                <xsd:element ref="ns2:MediaServiceOCR" minOccurs="0"/>
-                <xsd:element ref="ns2:MediaServiceBillingMetadata" minOccurs="0"/>
-                <xsd:element ref="ns2:MediaServiceLocation" minOccurs="0"/>
-              </xsd:all>
-            </xsd:complexType>
-          </xsd:element>
-        </xsd:sequence>
-      </xsd:complexType>
-    </xsd:element>
-  </xsd:schema>
-  <xsd:schema xmlns:xsd="http://www.w3.org/2001/XMLSchema" xmlns:xs="http://www.w3.org/2001/XMLSchema" xmlns:dms="http://schemas.microsoft.com/office/2006/documentManagement/types" xmlns:pc="http://schemas.microsoft.com/office/infopath/2007/PartnerControls" targetNamespace="70093741-41eb-4420-bf3d-ff9555ef2a33" elementFormDefault="qualified">
-    <xsd:import namespace="http://schemas.microsoft.com/office/2006/documentManagement/types"/>
-    <xsd:import namespace="http://schemas.microsoft.com/office/infopath/2007/PartnerControls"/>
-    <xsd:element name="MediaServiceMetadata" ma:index="8" nillable="true" ma:displayName="MediaServiceMetadata" ma:hidden="true" ma:internalName="MediaServiceMetadata" ma:readOnly="true">
-      <xsd:simpleType>
-        <xsd:restriction base="dms:Note"/>
-      </xsd:simpleType>
-    </xsd:element>
-    <xsd:element name="MediaServiceFastMetadata" ma:index="9" nillable="true" ma:displayName="MediaServiceFastMetadata" ma:hidden="true" ma:internalName="MediaServiceFastMetadata" ma:readOnly="true">
-      <xsd:simpleType>
-        <xsd:restriction base="dms:Note"/>
-      </xsd:simpleType>
-    </xsd:element>
-    <xsd:element name="MediaServiceSearchProperties" ma:index="10" nillable="true" ma:displayName="MediaServiceSearchProperties" ma:hidden="true" ma:internalName="MediaServiceSearchProperties" ma:readOnly="true">
-      <xsd:simpleType>
-        <xsd:restriction base="dms:Note"/>
-      </xsd:simpleType>
-    </xsd:element>
-    <xsd:element name="MediaServiceDateTaken" ma:index="11" nillable="true" ma:displayName="MediaServiceDateTaken" ma:hidden="true" ma:indexed="true" ma:internalName="MediaServiceDateTaken" ma:readOnly="true">
-      <xsd:simpleType>
-        <xsd:restriction base="dms:Text"/>
-      </xsd:simpleType>
-    </xsd:element>
-    <xsd:element name="MediaServiceGenerationTime" ma:index="12" nillable="true" ma:displayName="MediaServiceGenerationTime" ma:hidden="true" ma:internalName="MediaServiceGenerationTime" ma:readOnly="true">
-      <xsd:simpleType>
-        <xsd:restriction base="dms:Text"/>
-      </xsd:simpleType>
-    </xsd:element>
-    <xsd:element name="MediaServiceEventHashCode" ma:index="13" nillable="true" ma:displayName="MediaServiceEventHashCode" ma:hidden="true" ma:internalName="MediaServiceEventHashCode" ma:readOnly="true">
-      <xsd:simpleType>
-        <xsd:restriction base="dms:Text"/>
-      </xsd:simpleType>
-    </xsd:element>
-    <xsd:element name="MediaLengthInSeconds" ma:index="14" nillable="true" ma:displayName="MediaLengthInSeconds" ma:hidden="true" ma:internalName="MediaLengthInSeconds" ma:readOnly="true">
-      <xsd:simpleType>
-        <xsd:restriction base="dms:Unknown"/>
-      </xsd:simpleType>
-    </xsd:element>
-    <xsd:element name="lcf76f155ced4ddcb4097134ff3c332f" ma:index="16" nillable="true" ma:taxonomy="true" ma:internalName="lcf76f155ced4ddcb4097134ff3c332f" ma:taxonomyFieldName="MediaServiceImageTags" ma:displayName="Afbeeldingtags" ma:readOnly="false" ma:fieldId="{5cf76f15-5ced-4ddc-b409-7134ff3c332f}" ma:taxonomyMulti="true" ma:sspId="5bd69f14-2b9f-433c-9887-fccfa466e118" ma:termSetId="09814cd3-568e-fe90-9814-8d621ff8fb84" ma:anchorId="fba54fb3-c3e1-fe81-a776-ca4b69148c4d" ma:open="true" ma:isKeyword="false">
-      <xsd:complexType>
-        <xsd:sequence>
-          <xsd:element ref="pc:Terms" minOccurs="0" maxOccurs="1"/>
-        </xsd:sequence>
-      </xsd:complexType>
-    </xsd:element>
-    <xsd:element name="MediaServiceOCR" ma:index="18" nillable="true" ma:displayName="Extracted Text" ma:internalName="MediaServiceOCR" ma:readOnly="true">
-      <xsd:simpleType>
-        <xsd:restriction base="dms:Note">
-          <xsd:maxLength value="255"/>
-        </xsd:restriction>
-      </xsd:simpleType>
-    </xsd:element>
-    <xsd:element name="MediaServiceBillingMetadata" ma:index="19" nillable="true" ma:displayName="MediaServiceBillingMetadata" ma:hidden="true" ma:internalName="MediaServiceBillingMetadata" ma:readOnly="true">
-      <xsd:simpleType>
-        <xsd:restriction base="dms:Note"/>
-      </xsd:simpleType>
-    </xsd:element>
-    <xsd:element name="MediaServiceLocation" ma:index="20" nillable="true" ma:displayName="Location" ma:description="" ma:indexed="true" ma:internalName="MediaServiceLocation" ma:readOnly="true">
-      <xsd:simpleType>
-        <xsd:restriction base="dms:Text"/>
-      </xsd:simpleType>
-    </xsd:element>
-  </xsd:schema>
-  <xsd:schema xmlns:xsd="http://www.w3.org/2001/XMLSchema" xmlns:xs="http://www.w3.org/2001/XMLSchema" xmlns:dms="http://schemas.microsoft.com/office/2006/documentManagement/types" xmlns:pc="http://schemas.microsoft.com/office/infopath/2007/PartnerControls" targetNamespace="8e0d46a4-c7d4-472b-9541-810c49191871" elementFormDefault="qualified">
-    <xsd:import namespace="http://schemas.microsoft.com/office/2006/documentManagement/types"/>
-    <xsd:import namespace="http://schemas.microsoft.com/office/infopath/2007/PartnerControls"/>
-    <xsd:element name="TaxCatchAll" ma:index="17" nillable="true" ma:displayName="Taxonomy Catch All Column" ma:hidden="true" ma:list="{c8ab18b9-6097-49a0-8cf1-8fd8c6c84254}" ma:internalName="TaxCatchAll" ma:showField="CatchAllData" ma:web="8e0d46a4-c7d4-472b-9541-810c49191871">
-      <xsd:complexType>
-        <xsd:complexContent>
-          <xsd:extension base="dms:MultiChoiceLookup">
-            <xsd:sequence>
-              <xsd:element name="Value" type="dms:Lookup" maxOccurs="unbounded" minOccurs="0" nillable="true"/>
-            </xsd:sequence>
-          </xsd:extension>
-        </xsd:complexContent>
-      </xsd:complexType>
-    </xsd:element>
-  </xsd:schema>
-  <xsd:schema xmlns="http://schemas.openxmlformats.org/package/2006/metadata/core-properties" xmlns:xsd="http://www.w3.org/2001/XMLSchema" xmlns:xsi="http://www.w3.org/2001/XMLSchema-instance" xmlns:dc="http://purl.org/dc/elements/1.1/" xmlns:dcterms="http://purl.org/dc/terms/" xmlns:odoc="http://schemas.microsoft.com/internal/obd" targetNamespace="http://schemas.openxmlformats.org/package/2006/metadata/core-properties" elementFormDefault="qualified" attributeFormDefault="unqualified" blockDefault="#all">
-    <xsd:import namespace="http://purl.org/dc/elements/1.1/" schemaLocation="http://dublincore.org/schemas/xmls/qdc/2003/04/02/dc.xsd"/>
-    <xsd:import namespace="http://purl.org/dc/terms/" schemaLocation="http://dublincore.org/schemas/xmls/qdc/2003/04/02/dcterms.xsd"/>
-    <xsd:element name="coreProperties" type="CT_coreProperties"/>
-    <xsd:complexType name="CT_coreProperties">
-      <xsd:all>
-        <xsd:element ref="dc:creator" minOccurs="0" maxOccurs="1"/>
-        <xsd:element ref="dcterms:created" minOccurs="0" maxOccurs="1"/>
-        <xsd:element ref="dc:identifier" minOccurs="0" maxOccurs="1"/>
-        <xsd:element name="contentType" minOccurs="0" maxOccurs="1" type="xsd:string" ma:index="0" ma:displayName="Inhoudstype"/>
-        <xsd:element ref="dc:title" minOccurs="0" maxOccurs="1" ma:index="4" ma:displayName="Titel"/>
-        <xsd:element ref="dc:subject" minOccurs="0" maxOccurs="1"/>
-        <xsd:element ref="dc:description" minOccurs="0" maxOccurs="1"/>
-        <xsd:element name="keywords" minOccurs="0" maxOccurs="1" type="xsd:string"/>
-        <xsd:element ref="dc:language" minOccurs="0" maxOccurs="1"/>
-        <xsd:element name="category" minOccurs="0" maxOccurs="1" type="xsd:string"/>
-        <xsd:element name="version" minOccurs="0" maxOccurs="1" type="xsd:string"/>
-        <xsd:element name="revision" minOccurs="0" maxOccurs="1" type="xsd:string">
-          <xsd:annotation>
-            <xsd:documentation>
-                        This value indicates the number of saves or revisions. The application is responsible for updating this value after each revision.
-                    </xsd:documentation>
-          </xsd:annotation>
-        </xsd:element>
-        <xsd:element name="lastModifiedBy" minOccurs="0" maxOccurs="1" type="xsd:string"/>
-        <xsd:element ref="dcterms:modified" minOccurs="0" maxOccurs="1"/>
-        <xsd:element name="contentStatus" minOccurs="0" maxOccurs="1" type="xsd:string"/>
-      </xsd:all>
-    </xsd:complexType>
-  </xsd:schema>
-  <xs:schema xmlns:pc="http://schemas.microsoft.com/office/infopath/2007/PartnerControls" xmlns:xs="http://www.w3.org/2001/XMLSchema" targetNamespace="http://schemas.microsoft.com/office/infopath/2007/PartnerControls" elementFormDefault="qualified" attributeFormDefault="unqualified">
-    <xs:element name="Person">
-      <xs:complexType>
-        <xs:sequence>
-          <xs:element ref="pc:DisplayName" minOccurs="0"/>
-          <xs:element ref="pc:AccountId" minOccurs="0"/>
-          <xs:element ref="pc:AccountType" minOccurs="0"/>
-        </xs:sequence>
-      </xs:complexType>
-    </xs:element>
-    <xs:element name="DisplayName" type="xs:string"/>
-    <xs:element name="AccountId" type="xs:string"/>
-    <xs:element name="AccountType" type="xs:string"/>
-    <xs:element name="BDCAssociatedEntity">
-      <xs:complexType>
-        <xs:sequence>
-          <xs:element ref="pc:BDCEntity" minOccurs="0" maxOccurs="unbounded"/>
-        </xs:sequence>
-        <xs:attribute ref="pc:EntityNamespace"/>
-        <xs:attribute ref="pc:EntityName"/>
-        <xs:attribute ref="pc:SystemInstanceName"/>
-        <xs:attribute ref="pc:AssociationName"/>
-      </xs:complexType>
-    </xs:element>
-    <xs:attribute name="EntityNamespace" type="xs:string"/>
-    <xs:attribute name="EntityName" type="xs:string"/>
-    <xs:attribute name="SystemInstanceName" type="xs:string"/>
-    <xs:attribute name="AssociationName" type="xs:string"/>
-    <xs:element name="BDCEntity">
-      <xs:complexType>
-        <xs:sequence>
-          <xs:element ref="pc:EntityDisplayName" minOccurs="0"/>
-          <xs:element ref="pc:EntityInstanceReference" minOccurs="0"/>
-          <xs:element ref="pc:EntityId1" minOccurs="0"/>
-          <xs:element ref="pc:EntityId2" minOccurs="0"/>
-          <xs:element ref="pc:EntityId3" minOccurs="0"/>
-          <xs:element ref="pc:EntityId4" minOccurs="0"/>
-          <xs:element ref="pc:EntityId5" minOccurs="0"/>
-        </xs:sequence>
-      </xs:complexType>
-    </xs:element>
-    <xs:element name="EntityDisplayName" type="xs:string"/>
-    <xs:element name="EntityInstanceReference" type="xs:string"/>
-    <xs:element name="EntityId1" type="xs:string"/>
-    <xs:element name="EntityId2" type="xs:string"/>
-    <xs:element name="EntityId3" type="xs:string"/>
-    <xs:element name="EntityId4" type="xs:string"/>
-    <xs:element name="EntityId5" type="xs:string"/>
-    <xs:element name="Terms">
-      <xs:complexType>
-        <xs:sequence>
-          <xs:element ref="pc:TermInfo" minOccurs="0" maxOccurs="unbounded"/>
-        </xs:sequence>
-      </xs:complexType>
-    </xs:element>
-    <xs:element name="TermInfo">
-      <xs:complexType>
-        <xs:sequence>
-          <xs:element ref="pc:TermName" minOccurs="0"/>
-          <xs:element ref="pc:TermId" minOccurs="0"/>
-        </xs:sequence>
-      </xs:complexType>
-    </xs:element>
-    <xs:element name="TermName" type="xs:string"/>
-    <xs:element name="TermId" type="xs:string"/>
-  </xs:schema>
-</ct:contentTypeSchema>
-</file>
-
-<file path=customXml/item5.xml><?xml version="1.0" encoding="utf-8"?>
-<?mso-contentType ?>
-<FormTemplates xmlns="http://schemas.microsoft.com/sharepoint/v3/contenttype/forms">
-  <Display>DocumentLibraryForm</Display>
-  <Edit>DocumentLibraryForm</Edit>
-  <New>DocumentLibraryForm</New>
-</FormTemplates>
-</file>
-
 <file path=customXml/itemProps1.xml><?xml version="1.0" encoding="utf-8"?>
 <ds:datastoreItem xmlns:ds="http://schemas.openxmlformats.org/officeDocument/2006/customXml" ds:itemID="{55AF091B-3C7A-41E3-B477-F2FDAA23CFDA}">
   <ds:schemaRefs>
@@ -12324,9 +12395,9 @@
 </file>
 
 <file path=customXml/itemProps3.xml><?xml version="1.0" encoding="utf-8"?>
-<ds:datastoreItem xmlns:ds="http://schemas.openxmlformats.org/officeDocument/2006/customXml" ds:itemID="{A78D1BFD-FB21-4E94-A897-6F9CD570B4EA}">
+<ds:datastoreItem xmlns:ds="http://schemas.openxmlformats.org/officeDocument/2006/customXml" ds:itemID="{4F2FF0AF-4963-4DA0-8342-5673697A9054}">
   <ds:schemaRefs>
-    <ds:schemaRef ds:uri="http://schemas.openxmlformats.org/officeDocument/2006/bibliography"/>
+    <ds:schemaRef ds:uri="http://schemas.microsoft.com/sharepoint/v3/contenttype/forms"/>
   </ds:schemaRefs>
 </ds:datastoreItem>
 </file>
@@ -12351,9 +12422,9 @@
 </file>
 
 <file path=customXml/itemProps5.xml><?xml version="1.0" encoding="utf-8"?>
-<ds:datastoreItem xmlns:ds="http://schemas.openxmlformats.org/officeDocument/2006/customXml" ds:itemID="{4F2FF0AF-4963-4DA0-8342-5673697A9054}">
+<ds:datastoreItem xmlns:ds="http://schemas.openxmlformats.org/officeDocument/2006/customXml" ds:itemID="{A78D1BFD-FB21-4E94-A897-6F9CD570B4EA}">
   <ds:schemaRefs>
-    <ds:schemaRef ds:uri="http://schemas.microsoft.com/sharepoint/v3/contenttype/forms"/>
+    <ds:schemaRef ds:uri="http://schemas.openxmlformats.org/officeDocument/2006/bibliography"/>
   </ds:schemaRefs>
 </ds:datastoreItem>
 </file>
</xml_diff>

<commit_message>
Added strong/weak points Connor and Maiwand.
</commit_message>
<xml_diff>
--- a/ZKOO3_PvA.docx
+++ b/ZKOO3_PvA.docx
@@ -4729,11 +4729,6 @@
               <w:t>Veel technische kennis.</w:t>
             </w:r>
           </w:p>
-        </w:tc>
-        <w:tc>
-          <w:tcPr>
-            <w:tcW w:w="3006" w:type="dxa"/>
-          </w:tcPr>
           <w:p>
             <w:pPr>
               <w:pStyle w:val="ListParagraph"/>
@@ -4744,26 +4739,12 @@
               <w:spacing w:after="0" w:line="240" w:lineRule="auto"/>
             </w:pPr>
             <w:r>
-              <w:t>Communicatie</w:t>
-            </w:r>
-          </w:p>
-        </w:tc>
-      </w:tr>
-      <w:tr>
-        <w:tc>
-          <w:tcPr>
-            <w:tcW w:w="3005" w:type="dxa"/>
-          </w:tcPr>
-          <w:p>
-            <w:r>
-              <w:t>Maiwand</w:t>
-            </w:r>
-          </w:p>
-        </w:tc>
-        <w:tc>
-          <w:tcPr>
-            <w:tcW w:w="3006" w:type="dxa"/>
-          </w:tcPr>
+              <w:t>Zelfstandig</w:t>
+            </w:r>
+            <w:r>
+              <w:t>.</w:t>
+            </w:r>
+          </w:p>
           <w:p>
             <w:pPr>
               <w:pStyle w:val="ListParagraph"/>
@@ -4774,9 +4755,14 @@
               <w:spacing w:after="0" w:line="240" w:lineRule="auto"/>
             </w:pPr>
             <w:r>
-              <w:t>Oog voor detail.</w:t>
-            </w:r>
-          </w:p>
+              <w:t>Meedenkend.</w:t>
+            </w:r>
+          </w:p>
+        </w:tc>
+        <w:tc>
+          <w:tcPr>
+            <w:tcW w:w="3006" w:type="dxa"/>
+          </w:tcPr>
           <w:p>
             <w:pPr>
               <w:pStyle w:val="ListParagraph"/>
@@ -4787,14 +4773,12 @@
               <w:spacing w:after="0" w:line="240" w:lineRule="auto"/>
             </w:pPr>
             <w:r>
-              <w:t>Creatief.</w:t>
-            </w:r>
-          </w:p>
-        </w:tc>
-        <w:tc>
-          <w:tcPr>
-            <w:tcW w:w="3006" w:type="dxa"/>
-          </w:tcPr>
+              <w:t>Communicatie</w:t>
+            </w:r>
+            <w:r>
+              <w:t>.</w:t>
+            </w:r>
+          </w:p>
           <w:p>
             <w:pPr>
               <w:pStyle w:val="ListParagraph"/>
@@ -4805,7 +4789,109 @@
               <w:spacing w:after="0" w:line="240" w:lineRule="auto"/>
             </w:pPr>
             <w:r>
+              <w:t>Delegeren</w:t>
+            </w:r>
+            <w:r>
+              <w:t>.</w:t>
+            </w:r>
+          </w:p>
+        </w:tc>
+      </w:tr>
+      <w:tr>
+        <w:tc>
+          <w:tcPr>
+            <w:tcW w:w="3005" w:type="dxa"/>
+          </w:tcPr>
+          <w:p>
+            <w:r>
+              <w:t>Maiwand</w:t>
+            </w:r>
+          </w:p>
+        </w:tc>
+        <w:tc>
+          <w:tcPr>
+            <w:tcW w:w="3006" w:type="dxa"/>
+          </w:tcPr>
+          <w:p>
+            <w:pPr>
+              <w:pStyle w:val="ListParagraph"/>
+              <w:numPr>
+                <w:ilvl w:val="0"/>
+                <w:numId w:val="18"/>
+              </w:numPr>
+              <w:spacing w:after="0" w:line="240" w:lineRule="auto"/>
+            </w:pPr>
+            <w:r>
+              <w:t>Oog voor detail.</w:t>
+            </w:r>
+          </w:p>
+          <w:p>
+            <w:pPr>
+              <w:pStyle w:val="ListParagraph"/>
+              <w:numPr>
+                <w:ilvl w:val="0"/>
+                <w:numId w:val="18"/>
+              </w:numPr>
+              <w:spacing w:after="0" w:line="240" w:lineRule="auto"/>
+            </w:pPr>
+            <w:r>
+              <w:t>Creatief.</w:t>
+            </w:r>
+          </w:p>
+          <w:p>
+            <w:pPr>
+              <w:pStyle w:val="ListParagraph"/>
+              <w:numPr>
+                <w:ilvl w:val="0"/>
+                <w:numId w:val="18"/>
+              </w:numPr>
+              <w:spacing w:after="0" w:line="240" w:lineRule="auto"/>
+            </w:pPr>
+            <w:r>
+              <w:t>Zelfstandig</w:t>
+            </w:r>
+            <w:r>
+              <w:t>.</w:t>
+            </w:r>
+          </w:p>
+        </w:tc>
+        <w:tc>
+          <w:tcPr>
+            <w:tcW w:w="3006" w:type="dxa"/>
+          </w:tcPr>
+          <w:p>
+            <w:pPr>
+              <w:pStyle w:val="ListParagraph"/>
+              <w:numPr>
+                <w:ilvl w:val="0"/>
+                <w:numId w:val="18"/>
+              </w:numPr>
+              <w:spacing w:after="0" w:line="240" w:lineRule="auto"/>
+            </w:pPr>
+            <w:r>
               <w:t>Communicatie</w:t>
+            </w:r>
+            <w:r>
+              <w:t>.</w:t>
+            </w:r>
+          </w:p>
+          <w:p>
+            <w:pPr>
+              <w:pStyle w:val="ListParagraph"/>
+              <w:numPr>
+                <w:ilvl w:val="0"/>
+                <w:numId w:val="18"/>
+              </w:numPr>
+              <w:spacing w:after="0" w:line="240" w:lineRule="auto"/>
+            </w:pPr>
+            <w:r>
+              <w:t xml:space="preserve">Te </w:t>
+            </w:r>
+            <w:r>
+              <w:t>abstract</w:t>
+            </w:r>
+            <w:r>
+              <w:t>.</w:t>
             </w:r>
           </w:p>
         </w:tc>
@@ -5090,6 +5176,7 @@
                 <w:b/>
                 <w:color w:val="000000" w:themeColor="text1"/>
               </w:rPr>
+              <w:lastRenderedPageBreak/>
               <w:t>Lage</w:t>
             </w:r>
             <w:r>
@@ -5594,7 +5681,6 @@
         <w:rPr>
           <w:rFonts w:cs="Arial"/>
         </w:rPr>
-        <w:lastRenderedPageBreak/>
         <w:t>Indien er geen specifieke richtlijnen zijn voorgeschreven, passen we de volgende standaardisatie toe:</w:t>
       </w:r>
     </w:p>
@@ -6270,6 +6356,7 @@
     </w:p>
     <w:p>
       <w:r>
+        <w:lastRenderedPageBreak/>
         <w:t xml:space="preserve">Tijdens de wekelijkse sprint review bespreken we of we op schema liggen met alle producten. Hierbij houden we rekening met de volgende oplevermomenten: </w:t>
       </w:r>
     </w:p>
@@ -6294,7 +6381,6 @@
         </w:numPr>
       </w:pPr>
       <w:r>
-        <w:lastRenderedPageBreak/>
         <w:t>Volledig plan van aanpak: week 3, vrijdag om 15.00 uur.</w:t>
       </w:r>
     </w:p>
@@ -7753,7 +7839,7 @@
             </wp:anchor>
           </w:drawing>
         </mc:Choice>
-        <mc:Fallback xmlns:a14="http://schemas.microsoft.com/office/drawing/2010/main" xmlns:pic="http://schemas.openxmlformats.org/drawingml/2006/picture" xmlns:a="http://schemas.openxmlformats.org/drawingml/2006/main">
+        <mc:Fallback xmlns:a="http://schemas.openxmlformats.org/drawingml/2006/main" xmlns:pic="http://schemas.openxmlformats.org/drawingml/2006/picture" xmlns:a14="http://schemas.microsoft.com/office/drawing/2010/main">
           <w:pict w14:anchorId="1CADCD6F">
             <v:group id="Groep 102" style="position:absolute;margin-left:-1in;margin-top:-29.55pt;width:595.25pt;height:835.05pt;z-index:-251657216" coordsize="75596,106051" coordorigin=",186" o:spid="_x0000_s1026" w14:anchorId="0FC57937" o:gfxdata="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">
               <v:shapetype id="_x0000_t75" coordsize="21600,21600" filled="f" stroked="f" o:spt="75" o:preferrelative="t" path="m@4@5l@4@11@9@11@9@5xe">
@@ -10401,7 +10487,6 @@
   <w:style w:type="character" w:default="1" w:styleId="DefaultParagraphFont">
     <w:name w:val="Default Paragraph Font"/>
     <w:uiPriority w:val="1"/>
-    <w:semiHidden/>
     <w:unhideWhenUsed/>
   </w:style>
   <w:style w:type="table" w:default="1" w:styleId="TableNormal">
@@ -10979,8 +11064,10 @@
     <w:rsid w:val="004B75D5"/>
     <w:rsid w:val="004F54BB"/>
     <w:rsid w:val="005B79EA"/>
+    <w:rsid w:val="005E424B"/>
     <w:rsid w:val="005E444C"/>
     <w:rsid w:val="00605C1F"/>
+    <w:rsid w:val="00617256"/>
     <w:rsid w:val="007D1596"/>
     <w:rsid w:val="007E79EC"/>
     <w:rsid w:val="00803AF0"/>
@@ -11780,222 +11867,6 @@
 </file>
 
 <file path=customXml/item3.xml><?xml version="1.0" encoding="utf-8"?>
-<?mso-contentType ?>
-<FormTemplates xmlns="http://schemas.microsoft.com/sharepoint/v3/contenttype/forms">
-  <Display>DocumentLibraryForm</Display>
-  <Edit>DocumentLibraryForm</Edit>
-  <New>DocumentLibraryForm</New>
-</FormTemplates>
-</file>
-
-<file path=customXml/item4.xml><?xml version="1.0" encoding="utf-8"?>
-<ct:contentTypeSchema xmlns:ct="http://schemas.microsoft.com/office/2006/metadata/contentType" xmlns:ma="http://schemas.microsoft.com/office/2006/metadata/properties/metaAttributes" ct:_="" ma:_="" ma:contentTypeName="Document" ma:contentTypeID="0x0101009AEE7C0E3FC1AF49AE2D21952FC004E7" ma:contentTypeVersion="13" ma:contentTypeDescription="Een nieuw document maken." ma:contentTypeScope="" ma:versionID="960b10dc37b0d3729643b1edbc9ea311">
-  <xsd:schema xmlns:xsd="http://www.w3.org/2001/XMLSchema" xmlns:xs="http://www.w3.org/2001/XMLSchema" xmlns:p="http://schemas.microsoft.com/office/2006/metadata/properties" xmlns:ns2="70093741-41eb-4420-bf3d-ff9555ef2a33" xmlns:ns3="8e0d46a4-c7d4-472b-9541-810c49191871" targetNamespace="http://schemas.microsoft.com/office/2006/metadata/properties" ma:root="true" ma:fieldsID="8470fe0247e22942882bacf7112b3079" ns2:_="" ns3:_="">
-    <xsd:import namespace="70093741-41eb-4420-bf3d-ff9555ef2a33"/>
-    <xsd:import namespace="8e0d46a4-c7d4-472b-9541-810c49191871"/>
-    <xsd:element name="properties">
-      <xsd:complexType>
-        <xsd:sequence>
-          <xsd:element name="documentManagement">
-            <xsd:complexType>
-              <xsd:all>
-                <xsd:element ref="ns2:MediaServiceMetadata" minOccurs="0"/>
-                <xsd:element ref="ns2:MediaServiceFastMetadata" minOccurs="0"/>
-                <xsd:element ref="ns2:MediaServiceSearchProperties" minOccurs="0"/>
-                <xsd:element ref="ns2:MediaServiceDateTaken" minOccurs="0"/>
-                <xsd:element ref="ns2:MediaServiceGenerationTime" minOccurs="0"/>
-                <xsd:element ref="ns2:MediaServiceEventHashCode" minOccurs="0"/>
-                <xsd:element ref="ns2:MediaLengthInSeconds" minOccurs="0"/>
-                <xsd:element ref="ns2:lcf76f155ced4ddcb4097134ff3c332f" minOccurs="0"/>
-                <xsd:element ref="ns3:TaxCatchAll" minOccurs="0"/>
-                <xsd:element ref="ns2:MediaServiceOCR" minOccurs="0"/>
-                <xsd:element ref="ns2:MediaServiceBillingMetadata" minOccurs="0"/>
-                <xsd:element ref="ns2:MediaServiceLocation" minOccurs="0"/>
-              </xsd:all>
-            </xsd:complexType>
-          </xsd:element>
-        </xsd:sequence>
-      </xsd:complexType>
-    </xsd:element>
-  </xsd:schema>
-  <xsd:schema xmlns:xsd="http://www.w3.org/2001/XMLSchema" xmlns:xs="http://www.w3.org/2001/XMLSchema" xmlns:dms="http://schemas.microsoft.com/office/2006/documentManagement/types" xmlns:pc="http://schemas.microsoft.com/office/infopath/2007/PartnerControls" targetNamespace="70093741-41eb-4420-bf3d-ff9555ef2a33" elementFormDefault="qualified">
-    <xsd:import namespace="http://schemas.microsoft.com/office/2006/documentManagement/types"/>
-    <xsd:import namespace="http://schemas.microsoft.com/office/infopath/2007/PartnerControls"/>
-    <xsd:element name="MediaServiceMetadata" ma:index="8" nillable="true" ma:displayName="MediaServiceMetadata" ma:hidden="true" ma:internalName="MediaServiceMetadata" ma:readOnly="true">
-      <xsd:simpleType>
-        <xsd:restriction base="dms:Note"/>
-      </xsd:simpleType>
-    </xsd:element>
-    <xsd:element name="MediaServiceFastMetadata" ma:index="9" nillable="true" ma:displayName="MediaServiceFastMetadata" ma:hidden="true" ma:internalName="MediaServiceFastMetadata" ma:readOnly="true">
-      <xsd:simpleType>
-        <xsd:restriction base="dms:Note"/>
-      </xsd:simpleType>
-    </xsd:element>
-    <xsd:element name="MediaServiceSearchProperties" ma:index="10" nillable="true" ma:displayName="MediaServiceSearchProperties" ma:hidden="true" ma:internalName="MediaServiceSearchProperties" ma:readOnly="true">
-      <xsd:simpleType>
-        <xsd:restriction base="dms:Note"/>
-      </xsd:simpleType>
-    </xsd:element>
-    <xsd:element name="MediaServiceDateTaken" ma:index="11" nillable="true" ma:displayName="MediaServiceDateTaken" ma:hidden="true" ma:indexed="true" ma:internalName="MediaServiceDateTaken" ma:readOnly="true">
-      <xsd:simpleType>
-        <xsd:restriction base="dms:Text"/>
-      </xsd:simpleType>
-    </xsd:element>
-    <xsd:element name="MediaServiceGenerationTime" ma:index="12" nillable="true" ma:displayName="MediaServiceGenerationTime" ma:hidden="true" ma:internalName="MediaServiceGenerationTime" ma:readOnly="true">
-      <xsd:simpleType>
-        <xsd:restriction base="dms:Text"/>
-      </xsd:simpleType>
-    </xsd:element>
-    <xsd:element name="MediaServiceEventHashCode" ma:index="13" nillable="true" ma:displayName="MediaServiceEventHashCode" ma:hidden="true" ma:internalName="MediaServiceEventHashCode" ma:readOnly="true">
-      <xsd:simpleType>
-        <xsd:restriction base="dms:Text"/>
-      </xsd:simpleType>
-    </xsd:element>
-    <xsd:element name="MediaLengthInSeconds" ma:index="14" nillable="true" ma:displayName="MediaLengthInSeconds" ma:hidden="true" ma:internalName="MediaLengthInSeconds" ma:readOnly="true">
-      <xsd:simpleType>
-        <xsd:restriction base="dms:Unknown"/>
-      </xsd:simpleType>
-    </xsd:element>
-    <xsd:element name="lcf76f155ced4ddcb4097134ff3c332f" ma:index="16" nillable="true" ma:taxonomy="true" ma:internalName="lcf76f155ced4ddcb4097134ff3c332f" ma:taxonomyFieldName="MediaServiceImageTags" ma:displayName="Afbeeldingtags" ma:readOnly="false" ma:fieldId="{5cf76f15-5ced-4ddc-b409-7134ff3c332f}" ma:taxonomyMulti="true" ma:sspId="5bd69f14-2b9f-433c-9887-fccfa466e118" ma:termSetId="09814cd3-568e-fe90-9814-8d621ff8fb84" ma:anchorId="fba54fb3-c3e1-fe81-a776-ca4b69148c4d" ma:open="true" ma:isKeyword="false">
-      <xsd:complexType>
-        <xsd:sequence>
-          <xsd:element ref="pc:Terms" minOccurs="0" maxOccurs="1"/>
-        </xsd:sequence>
-      </xsd:complexType>
-    </xsd:element>
-    <xsd:element name="MediaServiceOCR" ma:index="18" nillable="true" ma:displayName="Extracted Text" ma:internalName="MediaServiceOCR" ma:readOnly="true">
-      <xsd:simpleType>
-        <xsd:restriction base="dms:Note">
-          <xsd:maxLength value="255"/>
-        </xsd:restriction>
-      </xsd:simpleType>
-    </xsd:element>
-    <xsd:element name="MediaServiceBillingMetadata" ma:index="19" nillable="true" ma:displayName="MediaServiceBillingMetadata" ma:hidden="true" ma:internalName="MediaServiceBillingMetadata" ma:readOnly="true">
-      <xsd:simpleType>
-        <xsd:restriction base="dms:Note"/>
-      </xsd:simpleType>
-    </xsd:element>
-    <xsd:element name="MediaServiceLocation" ma:index="20" nillable="true" ma:displayName="Location" ma:description="" ma:indexed="true" ma:internalName="MediaServiceLocation" ma:readOnly="true">
-      <xsd:simpleType>
-        <xsd:restriction base="dms:Text"/>
-      </xsd:simpleType>
-    </xsd:element>
-  </xsd:schema>
-  <xsd:schema xmlns:xsd="http://www.w3.org/2001/XMLSchema" xmlns:xs="http://www.w3.org/2001/XMLSchema" xmlns:dms="http://schemas.microsoft.com/office/2006/documentManagement/types" xmlns:pc="http://schemas.microsoft.com/office/infopath/2007/PartnerControls" targetNamespace="8e0d46a4-c7d4-472b-9541-810c49191871" elementFormDefault="qualified">
-    <xsd:import namespace="http://schemas.microsoft.com/office/2006/documentManagement/types"/>
-    <xsd:import namespace="http://schemas.microsoft.com/office/infopath/2007/PartnerControls"/>
-    <xsd:element name="TaxCatchAll" ma:index="17" nillable="true" ma:displayName="Taxonomy Catch All Column" ma:hidden="true" ma:list="{c8ab18b9-6097-49a0-8cf1-8fd8c6c84254}" ma:internalName="TaxCatchAll" ma:showField="CatchAllData" ma:web="8e0d46a4-c7d4-472b-9541-810c49191871">
-      <xsd:complexType>
-        <xsd:complexContent>
-          <xsd:extension base="dms:MultiChoiceLookup">
-            <xsd:sequence>
-              <xsd:element name="Value" type="dms:Lookup" maxOccurs="unbounded" minOccurs="0" nillable="true"/>
-            </xsd:sequence>
-          </xsd:extension>
-        </xsd:complexContent>
-      </xsd:complexType>
-    </xsd:element>
-  </xsd:schema>
-  <xsd:schema xmlns="http://schemas.openxmlformats.org/package/2006/metadata/core-properties" xmlns:xsd="http://www.w3.org/2001/XMLSchema" xmlns:xsi="http://www.w3.org/2001/XMLSchema-instance" xmlns:dc="http://purl.org/dc/elements/1.1/" xmlns:dcterms="http://purl.org/dc/terms/" xmlns:odoc="http://schemas.microsoft.com/internal/obd" targetNamespace="http://schemas.openxmlformats.org/package/2006/metadata/core-properties" elementFormDefault="qualified" attributeFormDefault="unqualified" blockDefault="#all">
-    <xsd:import namespace="http://purl.org/dc/elements/1.1/" schemaLocation="http://dublincore.org/schemas/xmls/qdc/2003/04/02/dc.xsd"/>
-    <xsd:import namespace="http://purl.org/dc/terms/" schemaLocation="http://dublincore.org/schemas/xmls/qdc/2003/04/02/dcterms.xsd"/>
-    <xsd:element name="coreProperties" type="CT_coreProperties"/>
-    <xsd:complexType name="CT_coreProperties">
-      <xsd:all>
-        <xsd:element ref="dc:creator" minOccurs="0" maxOccurs="1"/>
-        <xsd:element ref="dcterms:created" minOccurs="0" maxOccurs="1"/>
-        <xsd:element ref="dc:identifier" minOccurs="0" maxOccurs="1"/>
-        <xsd:element name="contentType" minOccurs="0" maxOccurs="1" type="xsd:string" ma:index="0" ma:displayName="Inhoudstype"/>
-        <xsd:element ref="dc:title" minOccurs="0" maxOccurs="1" ma:index="4" ma:displayName="Titel"/>
-        <xsd:element ref="dc:subject" minOccurs="0" maxOccurs="1"/>
-        <xsd:element ref="dc:description" minOccurs="0" maxOccurs="1"/>
-        <xsd:element name="keywords" minOccurs="0" maxOccurs="1" type="xsd:string"/>
-        <xsd:element ref="dc:language" minOccurs="0" maxOccurs="1"/>
-        <xsd:element name="category" minOccurs="0" maxOccurs="1" type="xsd:string"/>
-        <xsd:element name="version" minOccurs="0" maxOccurs="1" type="xsd:string"/>
-        <xsd:element name="revision" minOccurs="0" maxOccurs="1" type="xsd:string">
-          <xsd:annotation>
-            <xsd:documentation>
-                        This value indicates the number of saves or revisions. The application is responsible for updating this value after each revision.
-                    </xsd:documentation>
-          </xsd:annotation>
-        </xsd:element>
-        <xsd:element name="lastModifiedBy" minOccurs="0" maxOccurs="1" type="xsd:string"/>
-        <xsd:element ref="dcterms:modified" minOccurs="0" maxOccurs="1"/>
-        <xsd:element name="contentStatus" minOccurs="0" maxOccurs="1" type="xsd:string"/>
-      </xsd:all>
-    </xsd:complexType>
-  </xsd:schema>
-  <xs:schema xmlns:pc="http://schemas.microsoft.com/office/infopath/2007/PartnerControls" xmlns:xs="http://www.w3.org/2001/XMLSchema" targetNamespace="http://schemas.microsoft.com/office/infopath/2007/PartnerControls" elementFormDefault="qualified" attributeFormDefault="unqualified">
-    <xs:element name="Person">
-      <xs:complexType>
-        <xs:sequence>
-          <xs:element ref="pc:DisplayName" minOccurs="0"/>
-          <xs:element ref="pc:AccountId" minOccurs="0"/>
-          <xs:element ref="pc:AccountType" minOccurs="0"/>
-        </xs:sequence>
-      </xs:complexType>
-    </xs:element>
-    <xs:element name="DisplayName" type="xs:string"/>
-    <xs:element name="AccountId" type="xs:string"/>
-    <xs:element name="AccountType" type="xs:string"/>
-    <xs:element name="BDCAssociatedEntity">
-      <xs:complexType>
-        <xs:sequence>
-          <xs:element ref="pc:BDCEntity" minOccurs="0" maxOccurs="unbounded"/>
-        </xs:sequence>
-        <xs:attribute ref="pc:EntityNamespace"/>
-        <xs:attribute ref="pc:EntityName"/>
-        <xs:attribute ref="pc:SystemInstanceName"/>
-        <xs:attribute ref="pc:AssociationName"/>
-      </xs:complexType>
-    </xs:element>
-    <xs:attribute name="EntityNamespace" type="xs:string"/>
-    <xs:attribute name="EntityName" type="xs:string"/>
-    <xs:attribute name="SystemInstanceName" type="xs:string"/>
-    <xs:attribute name="AssociationName" type="xs:string"/>
-    <xs:element name="BDCEntity">
-      <xs:complexType>
-        <xs:sequence>
-          <xs:element ref="pc:EntityDisplayName" minOccurs="0"/>
-          <xs:element ref="pc:EntityInstanceReference" minOccurs="0"/>
-          <xs:element ref="pc:EntityId1" minOccurs="0"/>
-          <xs:element ref="pc:EntityId2" minOccurs="0"/>
-          <xs:element ref="pc:EntityId3" minOccurs="0"/>
-          <xs:element ref="pc:EntityId4" minOccurs="0"/>
-          <xs:element ref="pc:EntityId5" minOccurs="0"/>
-        </xs:sequence>
-      </xs:complexType>
-    </xs:element>
-    <xs:element name="EntityDisplayName" type="xs:string"/>
-    <xs:element name="EntityInstanceReference" type="xs:string"/>
-    <xs:element name="EntityId1" type="xs:string"/>
-    <xs:element name="EntityId2" type="xs:string"/>
-    <xs:element name="EntityId3" type="xs:string"/>
-    <xs:element name="EntityId4" type="xs:string"/>
-    <xs:element name="EntityId5" type="xs:string"/>
-    <xs:element name="Terms">
-      <xs:complexType>
-        <xs:sequence>
-          <xs:element ref="pc:TermInfo" minOccurs="0" maxOccurs="unbounded"/>
-        </xs:sequence>
-      </xs:complexType>
-    </xs:element>
-    <xs:element name="TermInfo">
-      <xs:complexType>
-        <xs:sequence>
-          <xs:element ref="pc:TermName" minOccurs="0"/>
-          <xs:element ref="pc:TermId" minOccurs="0"/>
-        </xs:sequence>
-      </xs:complexType>
-    </xs:element>
-    <xs:element name="TermName" type="xs:string"/>
-    <xs:element name="TermId" type="xs:string"/>
-  </xs:schema>
-</ct:contentTypeSchema>
-</file>
-
-<file path=customXml/item5.xml><?xml version="1.0" encoding="utf-8"?>
 <b:Sources xmlns:b="http://schemas.openxmlformats.org/officeDocument/2006/bibliography" xmlns="http://schemas.openxmlformats.org/officeDocument/2006/bibliography" SelectedStyle="\APASixthEditionOfficeOnline.xsl" StyleName="APA" Version="6">
   <b:Source>
     <b:Tag>Cle18</b:Tag>
@@ -12375,6 +12246,222 @@
 </b:Sources>
 </file>
 
+<file path=customXml/item4.xml><?xml version="1.0" encoding="utf-8"?>
+<ct:contentTypeSchema xmlns:ct="http://schemas.microsoft.com/office/2006/metadata/contentType" xmlns:ma="http://schemas.microsoft.com/office/2006/metadata/properties/metaAttributes" ct:_="" ma:_="" ma:contentTypeName="Document" ma:contentTypeID="0x0101009AEE7C0E3FC1AF49AE2D21952FC004E7" ma:contentTypeVersion="13" ma:contentTypeDescription="Een nieuw document maken." ma:contentTypeScope="" ma:versionID="960b10dc37b0d3729643b1edbc9ea311">
+  <xsd:schema xmlns:xsd="http://www.w3.org/2001/XMLSchema" xmlns:xs="http://www.w3.org/2001/XMLSchema" xmlns:p="http://schemas.microsoft.com/office/2006/metadata/properties" xmlns:ns2="70093741-41eb-4420-bf3d-ff9555ef2a33" xmlns:ns3="8e0d46a4-c7d4-472b-9541-810c49191871" targetNamespace="http://schemas.microsoft.com/office/2006/metadata/properties" ma:root="true" ma:fieldsID="8470fe0247e22942882bacf7112b3079" ns2:_="" ns3:_="">
+    <xsd:import namespace="70093741-41eb-4420-bf3d-ff9555ef2a33"/>
+    <xsd:import namespace="8e0d46a4-c7d4-472b-9541-810c49191871"/>
+    <xsd:element name="properties">
+      <xsd:complexType>
+        <xsd:sequence>
+          <xsd:element name="documentManagement">
+            <xsd:complexType>
+              <xsd:all>
+                <xsd:element ref="ns2:MediaServiceMetadata" minOccurs="0"/>
+                <xsd:element ref="ns2:MediaServiceFastMetadata" minOccurs="0"/>
+                <xsd:element ref="ns2:MediaServiceSearchProperties" minOccurs="0"/>
+                <xsd:element ref="ns2:MediaServiceDateTaken" minOccurs="0"/>
+                <xsd:element ref="ns2:MediaServiceGenerationTime" minOccurs="0"/>
+                <xsd:element ref="ns2:MediaServiceEventHashCode" minOccurs="0"/>
+                <xsd:element ref="ns2:MediaLengthInSeconds" minOccurs="0"/>
+                <xsd:element ref="ns2:lcf76f155ced4ddcb4097134ff3c332f" minOccurs="0"/>
+                <xsd:element ref="ns3:TaxCatchAll" minOccurs="0"/>
+                <xsd:element ref="ns2:MediaServiceOCR" minOccurs="0"/>
+                <xsd:element ref="ns2:MediaServiceBillingMetadata" minOccurs="0"/>
+                <xsd:element ref="ns2:MediaServiceLocation" minOccurs="0"/>
+              </xsd:all>
+            </xsd:complexType>
+          </xsd:element>
+        </xsd:sequence>
+      </xsd:complexType>
+    </xsd:element>
+  </xsd:schema>
+  <xsd:schema xmlns:xsd="http://www.w3.org/2001/XMLSchema" xmlns:xs="http://www.w3.org/2001/XMLSchema" xmlns:dms="http://schemas.microsoft.com/office/2006/documentManagement/types" xmlns:pc="http://schemas.microsoft.com/office/infopath/2007/PartnerControls" targetNamespace="70093741-41eb-4420-bf3d-ff9555ef2a33" elementFormDefault="qualified">
+    <xsd:import namespace="http://schemas.microsoft.com/office/2006/documentManagement/types"/>
+    <xsd:import namespace="http://schemas.microsoft.com/office/infopath/2007/PartnerControls"/>
+    <xsd:element name="MediaServiceMetadata" ma:index="8" nillable="true" ma:displayName="MediaServiceMetadata" ma:hidden="true" ma:internalName="MediaServiceMetadata" ma:readOnly="true">
+      <xsd:simpleType>
+        <xsd:restriction base="dms:Note"/>
+      </xsd:simpleType>
+    </xsd:element>
+    <xsd:element name="MediaServiceFastMetadata" ma:index="9" nillable="true" ma:displayName="MediaServiceFastMetadata" ma:hidden="true" ma:internalName="MediaServiceFastMetadata" ma:readOnly="true">
+      <xsd:simpleType>
+        <xsd:restriction base="dms:Note"/>
+      </xsd:simpleType>
+    </xsd:element>
+    <xsd:element name="MediaServiceSearchProperties" ma:index="10" nillable="true" ma:displayName="MediaServiceSearchProperties" ma:hidden="true" ma:internalName="MediaServiceSearchProperties" ma:readOnly="true">
+      <xsd:simpleType>
+        <xsd:restriction base="dms:Note"/>
+      </xsd:simpleType>
+    </xsd:element>
+    <xsd:element name="MediaServiceDateTaken" ma:index="11" nillable="true" ma:displayName="MediaServiceDateTaken" ma:hidden="true" ma:indexed="true" ma:internalName="MediaServiceDateTaken" ma:readOnly="true">
+      <xsd:simpleType>
+        <xsd:restriction base="dms:Text"/>
+      </xsd:simpleType>
+    </xsd:element>
+    <xsd:element name="MediaServiceGenerationTime" ma:index="12" nillable="true" ma:displayName="MediaServiceGenerationTime" ma:hidden="true" ma:internalName="MediaServiceGenerationTime" ma:readOnly="true">
+      <xsd:simpleType>
+        <xsd:restriction base="dms:Text"/>
+      </xsd:simpleType>
+    </xsd:element>
+    <xsd:element name="MediaServiceEventHashCode" ma:index="13" nillable="true" ma:displayName="MediaServiceEventHashCode" ma:hidden="true" ma:internalName="MediaServiceEventHashCode" ma:readOnly="true">
+      <xsd:simpleType>
+        <xsd:restriction base="dms:Text"/>
+      </xsd:simpleType>
+    </xsd:element>
+    <xsd:element name="MediaLengthInSeconds" ma:index="14" nillable="true" ma:displayName="MediaLengthInSeconds" ma:hidden="true" ma:internalName="MediaLengthInSeconds" ma:readOnly="true">
+      <xsd:simpleType>
+        <xsd:restriction base="dms:Unknown"/>
+      </xsd:simpleType>
+    </xsd:element>
+    <xsd:element name="lcf76f155ced4ddcb4097134ff3c332f" ma:index="16" nillable="true" ma:taxonomy="true" ma:internalName="lcf76f155ced4ddcb4097134ff3c332f" ma:taxonomyFieldName="MediaServiceImageTags" ma:displayName="Afbeeldingtags" ma:readOnly="false" ma:fieldId="{5cf76f15-5ced-4ddc-b409-7134ff3c332f}" ma:taxonomyMulti="true" ma:sspId="5bd69f14-2b9f-433c-9887-fccfa466e118" ma:termSetId="09814cd3-568e-fe90-9814-8d621ff8fb84" ma:anchorId="fba54fb3-c3e1-fe81-a776-ca4b69148c4d" ma:open="true" ma:isKeyword="false">
+      <xsd:complexType>
+        <xsd:sequence>
+          <xsd:element ref="pc:Terms" minOccurs="0" maxOccurs="1"/>
+        </xsd:sequence>
+      </xsd:complexType>
+    </xsd:element>
+    <xsd:element name="MediaServiceOCR" ma:index="18" nillable="true" ma:displayName="Extracted Text" ma:internalName="MediaServiceOCR" ma:readOnly="true">
+      <xsd:simpleType>
+        <xsd:restriction base="dms:Note">
+          <xsd:maxLength value="255"/>
+        </xsd:restriction>
+      </xsd:simpleType>
+    </xsd:element>
+    <xsd:element name="MediaServiceBillingMetadata" ma:index="19" nillable="true" ma:displayName="MediaServiceBillingMetadata" ma:hidden="true" ma:internalName="MediaServiceBillingMetadata" ma:readOnly="true">
+      <xsd:simpleType>
+        <xsd:restriction base="dms:Note"/>
+      </xsd:simpleType>
+    </xsd:element>
+    <xsd:element name="MediaServiceLocation" ma:index="20" nillable="true" ma:displayName="Location" ma:description="" ma:indexed="true" ma:internalName="MediaServiceLocation" ma:readOnly="true">
+      <xsd:simpleType>
+        <xsd:restriction base="dms:Text"/>
+      </xsd:simpleType>
+    </xsd:element>
+  </xsd:schema>
+  <xsd:schema xmlns:xsd="http://www.w3.org/2001/XMLSchema" xmlns:xs="http://www.w3.org/2001/XMLSchema" xmlns:dms="http://schemas.microsoft.com/office/2006/documentManagement/types" xmlns:pc="http://schemas.microsoft.com/office/infopath/2007/PartnerControls" targetNamespace="8e0d46a4-c7d4-472b-9541-810c49191871" elementFormDefault="qualified">
+    <xsd:import namespace="http://schemas.microsoft.com/office/2006/documentManagement/types"/>
+    <xsd:import namespace="http://schemas.microsoft.com/office/infopath/2007/PartnerControls"/>
+    <xsd:element name="TaxCatchAll" ma:index="17" nillable="true" ma:displayName="Taxonomy Catch All Column" ma:hidden="true" ma:list="{c8ab18b9-6097-49a0-8cf1-8fd8c6c84254}" ma:internalName="TaxCatchAll" ma:showField="CatchAllData" ma:web="8e0d46a4-c7d4-472b-9541-810c49191871">
+      <xsd:complexType>
+        <xsd:complexContent>
+          <xsd:extension base="dms:MultiChoiceLookup">
+            <xsd:sequence>
+              <xsd:element name="Value" type="dms:Lookup" maxOccurs="unbounded" minOccurs="0" nillable="true"/>
+            </xsd:sequence>
+          </xsd:extension>
+        </xsd:complexContent>
+      </xsd:complexType>
+    </xsd:element>
+  </xsd:schema>
+  <xsd:schema xmlns="http://schemas.openxmlformats.org/package/2006/metadata/core-properties" xmlns:xsd="http://www.w3.org/2001/XMLSchema" xmlns:xsi="http://www.w3.org/2001/XMLSchema-instance" xmlns:dc="http://purl.org/dc/elements/1.1/" xmlns:dcterms="http://purl.org/dc/terms/" xmlns:odoc="http://schemas.microsoft.com/internal/obd" targetNamespace="http://schemas.openxmlformats.org/package/2006/metadata/core-properties" elementFormDefault="qualified" attributeFormDefault="unqualified" blockDefault="#all">
+    <xsd:import namespace="http://purl.org/dc/elements/1.1/" schemaLocation="http://dublincore.org/schemas/xmls/qdc/2003/04/02/dc.xsd"/>
+    <xsd:import namespace="http://purl.org/dc/terms/" schemaLocation="http://dublincore.org/schemas/xmls/qdc/2003/04/02/dcterms.xsd"/>
+    <xsd:element name="coreProperties" type="CT_coreProperties"/>
+    <xsd:complexType name="CT_coreProperties">
+      <xsd:all>
+        <xsd:element ref="dc:creator" minOccurs="0" maxOccurs="1"/>
+        <xsd:element ref="dcterms:created" minOccurs="0" maxOccurs="1"/>
+        <xsd:element ref="dc:identifier" minOccurs="0" maxOccurs="1"/>
+        <xsd:element name="contentType" minOccurs="0" maxOccurs="1" type="xsd:string" ma:index="0" ma:displayName="Inhoudstype"/>
+        <xsd:element ref="dc:title" minOccurs="0" maxOccurs="1" ma:index="4" ma:displayName="Titel"/>
+        <xsd:element ref="dc:subject" minOccurs="0" maxOccurs="1"/>
+        <xsd:element ref="dc:description" minOccurs="0" maxOccurs="1"/>
+        <xsd:element name="keywords" minOccurs="0" maxOccurs="1" type="xsd:string"/>
+        <xsd:element ref="dc:language" minOccurs="0" maxOccurs="1"/>
+        <xsd:element name="category" minOccurs="0" maxOccurs="1" type="xsd:string"/>
+        <xsd:element name="version" minOccurs="0" maxOccurs="1" type="xsd:string"/>
+        <xsd:element name="revision" minOccurs="0" maxOccurs="1" type="xsd:string">
+          <xsd:annotation>
+            <xsd:documentation>
+                        This value indicates the number of saves or revisions. The application is responsible for updating this value after each revision.
+                    </xsd:documentation>
+          </xsd:annotation>
+        </xsd:element>
+        <xsd:element name="lastModifiedBy" minOccurs="0" maxOccurs="1" type="xsd:string"/>
+        <xsd:element ref="dcterms:modified" minOccurs="0" maxOccurs="1"/>
+        <xsd:element name="contentStatus" minOccurs="0" maxOccurs="1" type="xsd:string"/>
+      </xsd:all>
+    </xsd:complexType>
+  </xsd:schema>
+  <xs:schema xmlns:pc="http://schemas.microsoft.com/office/infopath/2007/PartnerControls" xmlns:xs="http://www.w3.org/2001/XMLSchema" targetNamespace="http://schemas.microsoft.com/office/infopath/2007/PartnerControls" elementFormDefault="qualified" attributeFormDefault="unqualified">
+    <xs:element name="Person">
+      <xs:complexType>
+        <xs:sequence>
+          <xs:element ref="pc:DisplayName" minOccurs="0"/>
+          <xs:element ref="pc:AccountId" minOccurs="0"/>
+          <xs:element ref="pc:AccountType" minOccurs="0"/>
+        </xs:sequence>
+      </xs:complexType>
+    </xs:element>
+    <xs:element name="DisplayName" type="xs:string"/>
+    <xs:element name="AccountId" type="xs:string"/>
+    <xs:element name="AccountType" type="xs:string"/>
+    <xs:element name="BDCAssociatedEntity">
+      <xs:complexType>
+        <xs:sequence>
+          <xs:element ref="pc:BDCEntity" minOccurs="0" maxOccurs="unbounded"/>
+        </xs:sequence>
+        <xs:attribute ref="pc:EntityNamespace"/>
+        <xs:attribute ref="pc:EntityName"/>
+        <xs:attribute ref="pc:SystemInstanceName"/>
+        <xs:attribute ref="pc:AssociationName"/>
+      </xs:complexType>
+    </xs:element>
+    <xs:attribute name="EntityNamespace" type="xs:string"/>
+    <xs:attribute name="EntityName" type="xs:string"/>
+    <xs:attribute name="SystemInstanceName" type="xs:string"/>
+    <xs:attribute name="AssociationName" type="xs:string"/>
+    <xs:element name="BDCEntity">
+      <xs:complexType>
+        <xs:sequence>
+          <xs:element ref="pc:EntityDisplayName" minOccurs="0"/>
+          <xs:element ref="pc:EntityInstanceReference" minOccurs="0"/>
+          <xs:element ref="pc:EntityId1" minOccurs="0"/>
+          <xs:element ref="pc:EntityId2" minOccurs="0"/>
+          <xs:element ref="pc:EntityId3" minOccurs="0"/>
+          <xs:element ref="pc:EntityId4" minOccurs="0"/>
+          <xs:element ref="pc:EntityId5" minOccurs="0"/>
+        </xs:sequence>
+      </xs:complexType>
+    </xs:element>
+    <xs:element name="EntityDisplayName" type="xs:string"/>
+    <xs:element name="EntityInstanceReference" type="xs:string"/>
+    <xs:element name="EntityId1" type="xs:string"/>
+    <xs:element name="EntityId2" type="xs:string"/>
+    <xs:element name="EntityId3" type="xs:string"/>
+    <xs:element name="EntityId4" type="xs:string"/>
+    <xs:element name="EntityId5" type="xs:string"/>
+    <xs:element name="Terms">
+      <xs:complexType>
+        <xs:sequence>
+          <xs:element ref="pc:TermInfo" minOccurs="0" maxOccurs="unbounded"/>
+        </xs:sequence>
+      </xs:complexType>
+    </xs:element>
+    <xs:element name="TermInfo">
+      <xs:complexType>
+        <xs:sequence>
+          <xs:element ref="pc:TermName" minOccurs="0"/>
+          <xs:element ref="pc:TermId" minOccurs="0"/>
+        </xs:sequence>
+      </xs:complexType>
+    </xs:element>
+    <xs:element name="TermName" type="xs:string"/>
+    <xs:element name="TermId" type="xs:string"/>
+  </xs:schema>
+</ct:contentTypeSchema>
+</file>
+
+<file path=customXml/item5.xml><?xml version="1.0" encoding="utf-8"?>
+<?mso-contentType ?>
+<FormTemplates xmlns="http://schemas.microsoft.com/sharepoint/v3/contenttype/forms">
+  <Display>DocumentLibraryForm</Display>
+  <Edit>DocumentLibraryForm</Edit>
+  <New>DocumentLibraryForm</New>
+</FormTemplates>
+</file>
+
 <file path=customXml/itemProps1.xml><?xml version="1.0" encoding="utf-8"?>
 <ds:datastoreItem xmlns:ds="http://schemas.openxmlformats.org/officeDocument/2006/customXml" ds:itemID="{55AF091B-3C7A-41E3-B477-F2FDAA23CFDA}">
   <ds:schemaRefs>
@@ -12395,9 +12482,9 @@
 </file>
 
 <file path=customXml/itemProps3.xml><?xml version="1.0" encoding="utf-8"?>
-<ds:datastoreItem xmlns:ds="http://schemas.openxmlformats.org/officeDocument/2006/customXml" ds:itemID="{4F2FF0AF-4963-4DA0-8342-5673697A9054}">
+<ds:datastoreItem xmlns:ds="http://schemas.openxmlformats.org/officeDocument/2006/customXml" ds:itemID="{A78D1BFD-FB21-4E94-A897-6F9CD570B4EA}">
   <ds:schemaRefs>
-    <ds:schemaRef ds:uri="http://schemas.microsoft.com/sharepoint/v3/contenttype/forms"/>
+    <ds:schemaRef ds:uri="http://schemas.openxmlformats.org/officeDocument/2006/bibliography"/>
   </ds:schemaRefs>
 </ds:datastoreItem>
 </file>
@@ -12422,9 +12509,9 @@
 </file>
 
 <file path=customXml/itemProps5.xml><?xml version="1.0" encoding="utf-8"?>
-<ds:datastoreItem xmlns:ds="http://schemas.openxmlformats.org/officeDocument/2006/customXml" ds:itemID="{A78D1BFD-FB21-4E94-A897-6F9CD570B4EA}">
+<ds:datastoreItem xmlns:ds="http://schemas.openxmlformats.org/officeDocument/2006/customXml" ds:itemID="{4F2FF0AF-4963-4DA0-8342-5673697A9054}">
   <ds:schemaRefs>
-    <ds:schemaRef ds:uri="http://schemas.openxmlformats.org/officeDocument/2006/bibliography"/>
+    <ds:schemaRef ds:uri="http://schemas.microsoft.com/sharepoint/v3/contenttype/forms"/>
   </ds:schemaRefs>
 </ds:datastoreItem>
 </file>
</xml_diff>

<commit_message>
Updated table and reformatted pages.
</commit_message>
<xml_diff>
--- a/ZKOO3_PvA.docx
+++ b/ZKOO3_PvA.docx
@@ -495,7 +495,27 @@
           <w:sz w:val="24"/>
           <w:szCs w:val="24"/>
         </w:rPr>
-        <w:t>Module Data Protection Leerjaar 2 blok 1</w:t>
+        <w:t xml:space="preserve">Module Data </w:t>
+      </w:r>
+      <w:proofErr w:type="spellStart"/>
+      <w:r>
+        <w:rPr>
+          <w:b/>
+          <w:bCs/>
+          <w:sz w:val="24"/>
+          <w:szCs w:val="24"/>
+        </w:rPr>
+        <w:t>Protection</w:t>
+      </w:r>
+      <w:proofErr w:type="spellEnd"/>
+      <w:r>
+        <w:rPr>
+          <w:b/>
+          <w:bCs/>
+          <w:sz w:val="24"/>
+          <w:szCs w:val="24"/>
+        </w:rPr>
+        <w:t xml:space="preserve"> Leerjaar 2 blok 1</w:t>
       </w:r>
     </w:p>
     <w:p>
@@ -547,12 +567,17 @@
           <w:pPr>
             <w:pStyle w:val="TOC2"/>
             <w:tabs>
-              <w:tab w:val="left" w:pos="660"/>
+              <w:tab w:val="left" w:pos="720"/>
               <w:tab w:val="right" w:leader="dot" w:pos="9017"/>
             </w:tabs>
             <w:rPr>
-              <w:rFonts w:ascii="Avenir Next LT Pro" w:hAnsi="Avenir Next LT Pro" w:cstheme="minorBidi"/>
+              <w:rFonts w:cstheme="minorBidi"/>
               <w:noProof/>
+              <w:kern w:val="2"/>
+              <w:sz w:val="24"/>
+              <w:szCs w:val="24"/>
+              <w:lang w:val="en-NL" w:eastAsia="en-NL"/>
+              <w14:ligatures w14:val="standardContextual"/>
             </w:rPr>
           </w:pPr>
           <w:r>
@@ -573,18 +598,35 @@
             </w:rPr>
             <w:fldChar w:fldCharType="separate"/>
           </w:r>
-          <w:hyperlink w:anchor="_Toc207703522" w:history="1">
+          <w:hyperlink w:anchor="_Toc240457551" w:history="1">
             <w:r>
               <w:rPr>
                 <w:rStyle w:val="Hyperlink"/>
-                <w:rFonts w:ascii="Avenir Next LT Pro" w:hAnsi="Avenir Next LT Pro"/>
                 <w:noProof/>
               </w:rPr>
-              <w:t>1.Achtergronden</w:t>
-            </w:r>
-            <w:r>
-              <w:rPr>
-                <w:rFonts w:ascii="Avenir Next LT Pro" w:hAnsi="Avenir Next LT Pro"/>
+              <w:t>1.</w:t>
+            </w:r>
+            <w:r>
+              <w:rPr>
+                <w:rFonts w:cstheme="minorBidi"/>
+                <w:noProof/>
+                <w:kern w:val="2"/>
+                <w:sz w:val="24"/>
+                <w:szCs w:val="24"/>
+                <w:lang w:val="en-NL" w:eastAsia="en-NL"/>
+                <w14:ligatures w14:val="standardContextual"/>
+              </w:rPr>
+              <w:tab/>
+            </w:r>
+            <w:r>
+              <w:rPr>
+                <w:rStyle w:val="Hyperlink"/>
+                <w:noProof/>
+              </w:rPr>
+              <w:t>Achtergronden</w:t>
+            </w:r>
+            <w:r>
+              <w:rPr>
                 <w:noProof/>
                 <w:webHidden/>
               </w:rPr>
@@ -592,7 +634,6 @@
             </w:r>
             <w:r>
               <w:rPr>
-                <w:rFonts w:ascii="Avenir Next LT Pro" w:hAnsi="Avenir Next LT Pro"/>
                 <w:noProof/>
                 <w:webHidden/>
               </w:rPr>
@@ -600,22 +641,19 @@
             </w:r>
             <w:r>
               <w:rPr>
-                <w:rFonts w:ascii="Avenir Next LT Pro" w:hAnsi="Avenir Next LT Pro"/>
                 <w:noProof/>
                 <w:webHidden/>
               </w:rPr>
-              <w:instrText xml:space="preserve"> PAGEREF _Toc207703522 \h </w:instrText>
-            </w:r>
-            <w:r>
-              <w:rPr>
-                <w:rFonts w:ascii="Avenir Next LT Pro" w:hAnsi="Avenir Next LT Pro"/>
+              <w:instrText xml:space="preserve"> PAGEREF _Toc240457551 \h </w:instrText>
+            </w:r>
+            <w:r>
+              <w:rPr>
                 <w:noProof/>
                 <w:webHidden/>
               </w:rPr>
             </w:r>
             <w:r>
               <w:rPr>
-                <w:rFonts w:ascii="Avenir Next LT Pro" w:hAnsi="Avenir Next LT Pro"/>
                 <w:noProof/>
                 <w:webHidden/>
               </w:rPr>
@@ -623,7 +661,6 @@
             </w:r>
             <w:r>
               <w:rPr>
-                <w:rFonts w:ascii="Avenir Next LT Pro" w:hAnsi="Avenir Next LT Pro"/>
                 <w:noProof/>
                 <w:webHidden/>
               </w:rPr>
@@ -631,7 +668,6 @@
             </w:r>
             <w:r>
               <w:rPr>
-                <w:rFonts w:ascii="Avenir Next LT Pro" w:hAnsi="Avenir Next LT Pro"/>
                 <w:noProof/>
                 <w:webHidden/>
               </w:rPr>
@@ -646,22 +682,25 @@
               <w:tab w:val="right" w:leader="dot" w:pos="9017"/>
             </w:tabs>
             <w:rPr>
-              <w:rFonts w:ascii="Avenir Next LT Pro" w:hAnsi="Avenir Next LT Pro" w:cstheme="minorBidi"/>
+              <w:rFonts w:cstheme="minorBidi"/>
               <w:noProof/>
+              <w:kern w:val="2"/>
+              <w:sz w:val="24"/>
+              <w:szCs w:val="24"/>
+              <w:lang w:val="en-NL" w:eastAsia="en-NL"/>
+              <w14:ligatures w14:val="standardContextual"/>
             </w:rPr>
           </w:pPr>
-          <w:hyperlink w:anchor="_Toc207703523" w:history="1">
+          <w:hyperlink w:anchor="_Toc240457552" w:history="1">
             <w:r>
               <w:rPr>
                 <w:rStyle w:val="Hyperlink"/>
-                <w:rFonts w:ascii="Avenir Next LT Pro" w:hAnsi="Avenir Next LT Pro"/>
                 <w:noProof/>
               </w:rPr>
               <w:t>2. Doelstelling</w:t>
             </w:r>
             <w:r>
               <w:rPr>
-                <w:rFonts w:ascii="Avenir Next LT Pro" w:hAnsi="Avenir Next LT Pro"/>
                 <w:noProof/>
                 <w:webHidden/>
               </w:rPr>
@@ -669,7 +708,6 @@
             </w:r>
             <w:r>
               <w:rPr>
-                <w:rFonts w:ascii="Avenir Next LT Pro" w:hAnsi="Avenir Next LT Pro"/>
                 <w:noProof/>
                 <w:webHidden/>
               </w:rPr>
@@ -677,22 +715,19 @@
             </w:r>
             <w:r>
               <w:rPr>
-                <w:rFonts w:ascii="Avenir Next LT Pro" w:hAnsi="Avenir Next LT Pro"/>
                 <w:noProof/>
                 <w:webHidden/>
               </w:rPr>
-              <w:instrText xml:space="preserve"> PAGEREF _Toc207703523 \h </w:instrText>
-            </w:r>
-            <w:r>
-              <w:rPr>
-                <w:rFonts w:ascii="Avenir Next LT Pro" w:hAnsi="Avenir Next LT Pro"/>
+              <w:instrText xml:space="preserve"> PAGEREF _Toc240457552 \h </w:instrText>
+            </w:r>
+            <w:r>
+              <w:rPr>
                 <w:noProof/>
                 <w:webHidden/>
               </w:rPr>
             </w:r>
             <w:r>
               <w:rPr>
-                <w:rFonts w:ascii="Avenir Next LT Pro" w:hAnsi="Avenir Next LT Pro"/>
                 <w:noProof/>
                 <w:webHidden/>
               </w:rPr>
@@ -700,7 +735,6 @@
             </w:r>
             <w:r>
               <w:rPr>
-                <w:rFonts w:ascii="Avenir Next LT Pro" w:hAnsi="Avenir Next LT Pro"/>
                 <w:noProof/>
                 <w:webHidden/>
               </w:rPr>
@@ -708,7 +742,6 @@
             </w:r>
             <w:r>
               <w:rPr>
-                <w:rFonts w:ascii="Avenir Next LT Pro" w:hAnsi="Avenir Next LT Pro"/>
                 <w:noProof/>
                 <w:webHidden/>
               </w:rPr>
@@ -723,22 +756,25 @@
               <w:tab w:val="right" w:leader="dot" w:pos="9017"/>
             </w:tabs>
             <w:rPr>
-              <w:rFonts w:ascii="Avenir Next LT Pro" w:hAnsi="Avenir Next LT Pro" w:cstheme="minorBidi"/>
+              <w:rFonts w:cstheme="minorBidi"/>
               <w:noProof/>
+              <w:kern w:val="2"/>
+              <w:sz w:val="24"/>
+              <w:szCs w:val="24"/>
+              <w:lang w:val="en-NL" w:eastAsia="en-NL"/>
+              <w14:ligatures w14:val="standardContextual"/>
             </w:rPr>
           </w:pPr>
-          <w:hyperlink w:anchor="_Toc207703524" w:history="1">
+          <w:hyperlink w:anchor="_Toc240457553" w:history="1">
             <w:r>
               <w:rPr>
                 <w:rStyle w:val="Hyperlink"/>
-                <w:rFonts w:ascii="Avenir Next LT Pro" w:hAnsi="Avenir Next LT Pro"/>
                 <w:noProof/>
               </w:rPr>
               <w:t>3. Projectresultaten</w:t>
             </w:r>
             <w:r>
               <w:rPr>
-                <w:rFonts w:ascii="Avenir Next LT Pro" w:hAnsi="Avenir Next LT Pro"/>
                 <w:noProof/>
                 <w:webHidden/>
               </w:rPr>
@@ -746,7 +782,6 @@
             </w:r>
             <w:r>
               <w:rPr>
-                <w:rFonts w:ascii="Avenir Next LT Pro" w:hAnsi="Avenir Next LT Pro"/>
                 <w:noProof/>
                 <w:webHidden/>
               </w:rPr>
@@ -754,22 +789,19 @@
             </w:r>
             <w:r>
               <w:rPr>
-                <w:rFonts w:ascii="Avenir Next LT Pro" w:hAnsi="Avenir Next LT Pro"/>
                 <w:noProof/>
                 <w:webHidden/>
               </w:rPr>
-              <w:instrText xml:space="preserve"> PAGEREF _Toc207703524 \h </w:instrText>
-            </w:r>
-            <w:r>
-              <w:rPr>
-                <w:rFonts w:ascii="Avenir Next LT Pro" w:hAnsi="Avenir Next LT Pro"/>
+              <w:instrText xml:space="preserve"> PAGEREF _Toc240457553 \h </w:instrText>
+            </w:r>
+            <w:r>
+              <w:rPr>
                 <w:noProof/>
                 <w:webHidden/>
               </w:rPr>
             </w:r>
             <w:r>
               <w:rPr>
-                <w:rFonts w:ascii="Avenir Next LT Pro" w:hAnsi="Avenir Next LT Pro"/>
                 <w:noProof/>
                 <w:webHidden/>
               </w:rPr>
@@ -777,7 +809,6 @@
             </w:r>
             <w:r>
               <w:rPr>
-                <w:rFonts w:ascii="Avenir Next LT Pro" w:hAnsi="Avenir Next LT Pro"/>
                 <w:noProof/>
                 <w:webHidden/>
               </w:rPr>
@@ -785,7 +816,6 @@
             </w:r>
             <w:r>
               <w:rPr>
-                <w:rFonts w:ascii="Avenir Next LT Pro" w:hAnsi="Avenir Next LT Pro"/>
                 <w:noProof/>
                 <w:webHidden/>
               </w:rPr>
@@ -800,22 +830,25 @@
               <w:tab w:val="right" w:leader="dot" w:pos="9017"/>
             </w:tabs>
             <w:rPr>
-              <w:rFonts w:ascii="Avenir Next LT Pro" w:hAnsi="Avenir Next LT Pro" w:cstheme="minorBidi"/>
+              <w:rFonts w:cstheme="minorBidi"/>
               <w:noProof/>
+              <w:kern w:val="2"/>
+              <w:sz w:val="24"/>
+              <w:szCs w:val="24"/>
+              <w:lang w:val="en-NL" w:eastAsia="en-NL"/>
+              <w14:ligatures w14:val="standardContextual"/>
             </w:rPr>
           </w:pPr>
-          <w:hyperlink w:anchor="_Toc207703525" w:history="1">
+          <w:hyperlink w:anchor="_Toc240457554" w:history="1">
             <w:r>
               <w:rPr>
                 <w:rStyle w:val="Hyperlink"/>
-                <w:rFonts w:ascii="Avenir Next LT Pro" w:hAnsi="Avenir Next LT Pro"/>
                 <w:noProof/>
               </w:rPr>
               <w:t>4. Projectgrenzen (scope)</w:t>
             </w:r>
             <w:r>
               <w:rPr>
-                <w:rFonts w:ascii="Avenir Next LT Pro" w:hAnsi="Avenir Next LT Pro"/>
                 <w:noProof/>
                 <w:webHidden/>
               </w:rPr>
@@ -823,7 +856,6 @@
             </w:r>
             <w:r>
               <w:rPr>
-                <w:rFonts w:ascii="Avenir Next LT Pro" w:hAnsi="Avenir Next LT Pro"/>
                 <w:noProof/>
                 <w:webHidden/>
               </w:rPr>
@@ -831,22 +863,19 @@
             </w:r>
             <w:r>
               <w:rPr>
-                <w:rFonts w:ascii="Avenir Next LT Pro" w:hAnsi="Avenir Next LT Pro"/>
                 <w:noProof/>
                 <w:webHidden/>
               </w:rPr>
-              <w:instrText xml:space="preserve"> PAGEREF _Toc207703525 \h </w:instrText>
-            </w:r>
-            <w:r>
-              <w:rPr>
-                <w:rFonts w:ascii="Avenir Next LT Pro" w:hAnsi="Avenir Next LT Pro"/>
+              <w:instrText xml:space="preserve"> PAGEREF _Toc240457554 \h </w:instrText>
+            </w:r>
+            <w:r>
+              <w:rPr>
                 <w:noProof/>
                 <w:webHidden/>
               </w:rPr>
             </w:r>
             <w:r>
               <w:rPr>
-                <w:rFonts w:ascii="Avenir Next LT Pro" w:hAnsi="Avenir Next LT Pro"/>
                 <w:noProof/>
                 <w:webHidden/>
               </w:rPr>
@@ -854,7 +883,6 @@
             </w:r>
             <w:r>
               <w:rPr>
-                <w:rFonts w:ascii="Avenir Next LT Pro" w:hAnsi="Avenir Next LT Pro"/>
                 <w:noProof/>
                 <w:webHidden/>
               </w:rPr>
@@ -862,7 +890,6 @@
             </w:r>
             <w:r>
               <w:rPr>
-                <w:rFonts w:ascii="Avenir Next LT Pro" w:hAnsi="Avenir Next LT Pro"/>
                 <w:noProof/>
                 <w:webHidden/>
               </w:rPr>
@@ -877,22 +904,25 @@
               <w:tab w:val="right" w:leader="dot" w:pos="9017"/>
             </w:tabs>
             <w:rPr>
-              <w:rFonts w:ascii="Avenir Next LT Pro" w:hAnsi="Avenir Next LT Pro" w:cstheme="minorBidi"/>
+              <w:rFonts w:cstheme="minorBidi"/>
               <w:noProof/>
+              <w:kern w:val="2"/>
+              <w:sz w:val="24"/>
+              <w:szCs w:val="24"/>
+              <w:lang w:val="en-NL" w:eastAsia="en-NL"/>
+              <w14:ligatures w14:val="standardContextual"/>
             </w:rPr>
           </w:pPr>
-          <w:hyperlink w:anchor="_Toc207703526" w:history="1">
+          <w:hyperlink w:anchor="_Toc240457555" w:history="1">
             <w:r>
               <w:rPr>
                 <w:rStyle w:val="Hyperlink"/>
-                <w:rFonts w:ascii="Avenir Next LT Pro" w:hAnsi="Avenir Next LT Pro"/>
                 <w:noProof/>
               </w:rPr>
               <w:t>5. Projectfasering</w:t>
             </w:r>
             <w:r>
               <w:rPr>
-                <w:rFonts w:ascii="Avenir Next LT Pro" w:hAnsi="Avenir Next LT Pro"/>
                 <w:noProof/>
                 <w:webHidden/>
               </w:rPr>
@@ -900,7 +930,6 @@
             </w:r>
             <w:r>
               <w:rPr>
-                <w:rFonts w:ascii="Avenir Next LT Pro" w:hAnsi="Avenir Next LT Pro"/>
                 <w:noProof/>
                 <w:webHidden/>
               </w:rPr>
@@ -908,22 +937,19 @@
             </w:r>
             <w:r>
               <w:rPr>
-                <w:rFonts w:ascii="Avenir Next LT Pro" w:hAnsi="Avenir Next LT Pro"/>
                 <w:noProof/>
                 <w:webHidden/>
               </w:rPr>
-              <w:instrText xml:space="preserve"> PAGEREF _Toc207703526 \h </w:instrText>
-            </w:r>
-            <w:r>
-              <w:rPr>
-                <w:rFonts w:ascii="Avenir Next LT Pro" w:hAnsi="Avenir Next LT Pro"/>
+              <w:instrText xml:space="preserve"> PAGEREF _Toc240457555 \h </w:instrText>
+            </w:r>
+            <w:r>
+              <w:rPr>
                 <w:noProof/>
                 <w:webHidden/>
               </w:rPr>
             </w:r>
             <w:r>
               <w:rPr>
-                <w:rFonts w:ascii="Avenir Next LT Pro" w:hAnsi="Avenir Next LT Pro"/>
                 <w:noProof/>
                 <w:webHidden/>
               </w:rPr>
@@ -931,7 +957,6 @@
             </w:r>
             <w:r>
               <w:rPr>
-                <w:rFonts w:ascii="Avenir Next LT Pro" w:hAnsi="Avenir Next LT Pro"/>
                 <w:noProof/>
                 <w:webHidden/>
               </w:rPr>
@@ -939,7 +964,6 @@
             </w:r>
             <w:r>
               <w:rPr>
-                <w:rFonts w:ascii="Avenir Next LT Pro" w:hAnsi="Avenir Next LT Pro"/>
                 <w:noProof/>
                 <w:webHidden/>
               </w:rPr>
@@ -954,22 +978,25 @@
               <w:tab w:val="right" w:leader="dot" w:pos="9017"/>
             </w:tabs>
             <w:rPr>
-              <w:rFonts w:ascii="Avenir Next LT Pro" w:hAnsi="Avenir Next LT Pro" w:cstheme="minorBidi"/>
+              <w:rFonts w:cstheme="minorBidi"/>
               <w:noProof/>
+              <w:kern w:val="2"/>
+              <w:sz w:val="24"/>
+              <w:szCs w:val="24"/>
+              <w:lang w:val="en-NL" w:eastAsia="en-NL"/>
+              <w14:ligatures w14:val="standardContextual"/>
             </w:rPr>
           </w:pPr>
-          <w:hyperlink w:anchor="_Toc207703527" w:history="1">
+          <w:hyperlink w:anchor="_Toc240457556" w:history="1">
             <w:r>
               <w:rPr>
                 <w:rStyle w:val="Hyperlink"/>
-                <w:rFonts w:ascii="Avenir Next LT Pro" w:hAnsi="Avenir Next LT Pro"/>
                 <w:noProof/>
               </w:rPr>
               <w:t>6. Projectorganisatie</w:t>
             </w:r>
             <w:r>
               <w:rPr>
-                <w:rFonts w:ascii="Avenir Next LT Pro" w:hAnsi="Avenir Next LT Pro"/>
                 <w:noProof/>
                 <w:webHidden/>
               </w:rPr>
@@ -977,7 +1004,6 @@
             </w:r>
             <w:r>
               <w:rPr>
-                <w:rFonts w:ascii="Avenir Next LT Pro" w:hAnsi="Avenir Next LT Pro"/>
                 <w:noProof/>
                 <w:webHidden/>
               </w:rPr>
@@ -985,22 +1011,19 @@
             </w:r>
             <w:r>
               <w:rPr>
-                <w:rFonts w:ascii="Avenir Next LT Pro" w:hAnsi="Avenir Next LT Pro"/>
                 <w:noProof/>
                 <w:webHidden/>
               </w:rPr>
-              <w:instrText xml:space="preserve"> PAGEREF _Toc207703527 \h </w:instrText>
-            </w:r>
-            <w:r>
-              <w:rPr>
-                <w:rFonts w:ascii="Avenir Next LT Pro" w:hAnsi="Avenir Next LT Pro"/>
+              <w:instrText xml:space="preserve"> PAGEREF _Toc240457556 \h </w:instrText>
+            </w:r>
+            <w:r>
+              <w:rPr>
                 <w:noProof/>
                 <w:webHidden/>
               </w:rPr>
             </w:r>
             <w:r>
               <w:rPr>
-                <w:rFonts w:ascii="Avenir Next LT Pro" w:hAnsi="Avenir Next LT Pro"/>
                 <w:noProof/>
                 <w:webHidden/>
               </w:rPr>
@@ -1008,7 +1031,6 @@
             </w:r>
             <w:r>
               <w:rPr>
-                <w:rFonts w:ascii="Avenir Next LT Pro" w:hAnsi="Avenir Next LT Pro"/>
                 <w:noProof/>
                 <w:webHidden/>
               </w:rPr>
@@ -1016,7 +1038,6 @@
             </w:r>
             <w:r>
               <w:rPr>
-                <w:rFonts w:ascii="Avenir Next LT Pro" w:hAnsi="Avenir Next LT Pro"/>
                 <w:noProof/>
                 <w:webHidden/>
               </w:rPr>
@@ -1026,43 +1047,30 @@
         </w:p>
         <w:p>
           <w:pPr>
-            <w:pStyle w:val="TOC2"/>
+            <w:pStyle w:val="TOC3"/>
             <w:tabs>
-              <w:tab w:val="left" w:pos="880"/>
               <w:tab w:val="right" w:leader="dot" w:pos="9017"/>
             </w:tabs>
             <w:rPr>
-              <w:rFonts w:ascii="Avenir Next LT Pro" w:hAnsi="Avenir Next LT Pro" w:cstheme="minorBidi"/>
+              <w:rFonts w:cstheme="minorBidi"/>
               <w:noProof/>
+              <w:kern w:val="2"/>
+              <w:sz w:val="24"/>
+              <w:szCs w:val="24"/>
+              <w:lang w:val="en-NL" w:eastAsia="en-NL"/>
+              <w14:ligatures w14:val="standardContextual"/>
             </w:rPr>
           </w:pPr>
-          <w:hyperlink w:anchor="_Toc207703528" w:history="1">
+          <w:hyperlink w:anchor="_Toc240457557" w:history="1">
             <w:r>
               <w:rPr>
                 <w:rStyle w:val="Hyperlink"/>
-                <w:rFonts w:ascii="Avenir Next LT Pro" w:hAnsi="Avenir Next LT Pro"/>
                 <w:noProof/>
               </w:rPr>
-              <w:t>6.1</w:t>
-            </w:r>
-            <w:r>
-              <w:rPr>
-                <w:rFonts w:ascii="Avenir Next LT Pro" w:hAnsi="Avenir Next LT Pro" w:cstheme="minorBidi"/>
-                <w:noProof/>
-              </w:rPr>
-              <w:tab/>
-            </w:r>
-            <w:r>
-              <w:rPr>
-                <w:rStyle w:val="Hyperlink"/>
-                <w:rFonts w:ascii="Avenir Next LT Pro" w:hAnsi="Avenir Next LT Pro"/>
-                <w:noProof/>
-              </w:rPr>
-              <w:t>Het projectteam</w:t>
-            </w:r>
-            <w:r>
-              <w:rPr>
-                <w:rFonts w:ascii="Avenir Next LT Pro" w:hAnsi="Avenir Next LT Pro"/>
+              <w:t>6.1 Het projectteam</w:t>
+            </w:r>
+            <w:r>
+              <w:rPr>
                 <w:noProof/>
                 <w:webHidden/>
               </w:rPr>
@@ -1070,7 +1078,6 @@
             </w:r>
             <w:r>
               <w:rPr>
-                <w:rFonts w:ascii="Avenir Next LT Pro" w:hAnsi="Avenir Next LT Pro"/>
                 <w:noProof/>
                 <w:webHidden/>
               </w:rPr>
@@ -1078,22 +1085,19 @@
             </w:r>
             <w:r>
               <w:rPr>
-                <w:rFonts w:ascii="Avenir Next LT Pro" w:hAnsi="Avenir Next LT Pro"/>
                 <w:noProof/>
                 <w:webHidden/>
               </w:rPr>
-              <w:instrText xml:space="preserve"> PAGEREF _Toc207703528 \h </w:instrText>
-            </w:r>
-            <w:r>
-              <w:rPr>
-                <w:rFonts w:ascii="Avenir Next LT Pro" w:hAnsi="Avenir Next LT Pro"/>
+              <w:instrText xml:space="preserve"> PAGEREF _Toc240457557 \h </w:instrText>
+            </w:r>
+            <w:r>
+              <w:rPr>
                 <w:noProof/>
                 <w:webHidden/>
               </w:rPr>
             </w:r>
             <w:r>
               <w:rPr>
-                <w:rFonts w:ascii="Avenir Next LT Pro" w:hAnsi="Avenir Next LT Pro"/>
                 <w:noProof/>
                 <w:webHidden/>
               </w:rPr>
@@ -1101,7 +1105,6 @@
             </w:r>
             <w:r>
               <w:rPr>
-                <w:rFonts w:ascii="Avenir Next LT Pro" w:hAnsi="Avenir Next LT Pro"/>
                 <w:noProof/>
                 <w:webHidden/>
               </w:rPr>
@@ -1109,7 +1112,154 @@
             </w:r>
             <w:r>
               <w:rPr>
-                <w:rFonts w:ascii="Avenir Next LT Pro" w:hAnsi="Avenir Next LT Pro"/>
+                <w:noProof/>
+                <w:webHidden/>
+              </w:rPr>
+              <w:fldChar w:fldCharType="end"/>
+            </w:r>
+          </w:hyperlink>
+        </w:p>
+        <w:p>
+          <w:pPr>
+            <w:pStyle w:val="TOC3"/>
+            <w:tabs>
+              <w:tab w:val="right" w:leader="dot" w:pos="9017"/>
+            </w:tabs>
+            <w:rPr>
+              <w:rFonts w:cstheme="minorBidi"/>
+              <w:noProof/>
+              <w:kern w:val="2"/>
+              <w:sz w:val="24"/>
+              <w:szCs w:val="24"/>
+              <w:lang w:val="en-NL" w:eastAsia="en-NL"/>
+              <w14:ligatures w14:val="standardContextual"/>
+            </w:rPr>
+          </w:pPr>
+          <w:hyperlink w:anchor="_Toc240457558" w:history="1">
+            <w:r>
+              <w:rPr>
+                <w:rStyle w:val="Hyperlink"/>
+                <w:noProof/>
+              </w:rPr>
+              <w:t>6.2 Informatie</w:t>
+            </w:r>
+            <w:r>
+              <w:rPr>
+                <w:noProof/>
+                <w:webHidden/>
+              </w:rPr>
+              <w:tab/>
+            </w:r>
+            <w:r>
+              <w:rPr>
+                <w:noProof/>
+                <w:webHidden/>
+              </w:rPr>
+              <w:fldChar w:fldCharType="begin"/>
+            </w:r>
+            <w:r>
+              <w:rPr>
+                <w:noProof/>
+                <w:webHidden/>
+              </w:rPr>
+              <w:instrText xml:space="preserve"> PAGEREF _Toc240457558 \h </w:instrText>
+            </w:r>
+            <w:r>
+              <w:rPr>
+                <w:noProof/>
+                <w:webHidden/>
+              </w:rPr>
+            </w:r>
+            <w:r>
+              <w:rPr>
+                <w:noProof/>
+                <w:webHidden/>
+              </w:rPr>
+              <w:fldChar w:fldCharType="separate"/>
+            </w:r>
+            <w:r>
+              <w:rPr>
+                <w:noProof/>
+                <w:webHidden/>
+              </w:rPr>
+              <w:t>9</w:t>
+            </w:r>
+            <w:r>
+              <w:rPr>
+                <w:noProof/>
+                <w:webHidden/>
+              </w:rPr>
+              <w:fldChar w:fldCharType="end"/>
+            </w:r>
+          </w:hyperlink>
+        </w:p>
+        <w:p>
+          <w:pPr>
+            <w:pStyle w:val="TOC3"/>
+            <w:tabs>
+              <w:tab w:val="right" w:leader="dot" w:pos="9017"/>
+            </w:tabs>
+            <w:rPr>
+              <w:rFonts w:cstheme="minorBidi"/>
+              <w:noProof/>
+              <w:kern w:val="2"/>
+              <w:sz w:val="24"/>
+              <w:szCs w:val="24"/>
+              <w:lang w:val="en-NL" w:eastAsia="en-NL"/>
+              <w14:ligatures w14:val="standardContextual"/>
+            </w:rPr>
+          </w:pPr>
+          <w:hyperlink w:anchor="_Toc240457559" w:history="1">
+            <w:r>
+              <w:rPr>
+                <w:rStyle w:val="Hyperlink"/>
+                <w:noProof/>
+              </w:rPr>
+              <w:t>6.3 Coördinatie</w:t>
+            </w:r>
+            <w:r>
+              <w:rPr>
+                <w:noProof/>
+                <w:webHidden/>
+              </w:rPr>
+              <w:tab/>
+            </w:r>
+            <w:r>
+              <w:rPr>
+                <w:noProof/>
+                <w:webHidden/>
+              </w:rPr>
+              <w:fldChar w:fldCharType="begin"/>
+            </w:r>
+            <w:r>
+              <w:rPr>
+                <w:noProof/>
+                <w:webHidden/>
+              </w:rPr>
+              <w:instrText xml:space="preserve"> PAGEREF _Toc240457559 \h </w:instrText>
+            </w:r>
+            <w:r>
+              <w:rPr>
+                <w:noProof/>
+                <w:webHidden/>
+              </w:rPr>
+            </w:r>
+            <w:r>
+              <w:rPr>
+                <w:noProof/>
+                <w:webHidden/>
+              </w:rPr>
+              <w:fldChar w:fldCharType="separate"/>
+            </w:r>
+            <w:r>
+              <w:rPr>
+                <w:noProof/>
+                <w:webHidden/>
+              </w:rPr>
+              <w:t>9</w:t>
+            </w:r>
+            <w:r>
+              <w:rPr>
                 <w:noProof/>
                 <w:webHidden/>
               </w:rPr>
@@ -1124,22 +1274,25 @@
               <w:tab w:val="right" w:leader="dot" w:pos="9017"/>
             </w:tabs>
             <w:rPr>
-              <w:rFonts w:ascii="Avenir Next LT Pro" w:hAnsi="Avenir Next LT Pro" w:cstheme="minorBidi"/>
+              <w:rFonts w:cstheme="minorBidi"/>
               <w:noProof/>
+              <w:kern w:val="2"/>
+              <w:sz w:val="24"/>
+              <w:szCs w:val="24"/>
+              <w:lang w:val="en-NL" w:eastAsia="en-NL"/>
+              <w14:ligatures w14:val="standardContextual"/>
             </w:rPr>
           </w:pPr>
-          <w:hyperlink w:anchor="_Toc207703529" w:history="1">
+          <w:hyperlink w:anchor="_Toc240457560" w:history="1">
             <w:r>
               <w:rPr>
                 <w:rStyle w:val="Hyperlink"/>
-                <w:rFonts w:ascii="Avenir Next LT Pro" w:hAnsi="Avenir Next LT Pro"/>
                 <w:noProof/>
               </w:rPr>
-              <w:t>6.2 Informatie</w:t>
-            </w:r>
-            <w:r>
-              <w:rPr>
-                <w:rFonts w:ascii="Avenir Next LT Pro" w:hAnsi="Avenir Next LT Pro"/>
+              <w:t>7. Kwaliteitsbewaking</w:t>
+            </w:r>
+            <w:r>
+              <w:rPr>
                 <w:noProof/>
                 <w:webHidden/>
               </w:rPr>
@@ -1147,7 +1300,6 @@
             </w:r>
             <w:r>
               <w:rPr>
-                <w:rFonts w:ascii="Avenir Next LT Pro" w:hAnsi="Avenir Next LT Pro"/>
                 <w:noProof/>
                 <w:webHidden/>
               </w:rPr>
@@ -1155,22 +1307,19 @@
             </w:r>
             <w:r>
               <w:rPr>
-                <w:rFonts w:ascii="Avenir Next LT Pro" w:hAnsi="Avenir Next LT Pro"/>
                 <w:noProof/>
                 <w:webHidden/>
               </w:rPr>
-              <w:instrText xml:space="preserve"> PAGEREF _Toc207703529 \h </w:instrText>
-            </w:r>
-            <w:r>
-              <w:rPr>
-                <w:rFonts w:ascii="Avenir Next LT Pro" w:hAnsi="Avenir Next LT Pro"/>
+              <w:instrText xml:space="preserve"> PAGEREF _Toc240457560 \h </w:instrText>
+            </w:r>
+            <w:r>
+              <w:rPr>
                 <w:noProof/>
                 <w:webHidden/>
               </w:rPr>
             </w:r>
             <w:r>
               <w:rPr>
-                <w:rFonts w:ascii="Avenir Next LT Pro" w:hAnsi="Avenir Next LT Pro"/>
                 <w:noProof/>
                 <w:webHidden/>
               </w:rPr>
@@ -1178,15 +1327,13 @@
             </w:r>
             <w:r>
               <w:rPr>
-                <w:rFonts w:ascii="Avenir Next LT Pro" w:hAnsi="Avenir Next LT Pro"/>
                 <w:noProof/>
                 <w:webHidden/>
               </w:rPr>
-              <w:t>7</w:t>
-            </w:r>
-            <w:r>
-              <w:rPr>
-                <w:rFonts w:ascii="Avenir Next LT Pro" w:hAnsi="Avenir Next LT Pro"/>
+              <w:t>12</w:t>
+            </w:r>
+            <w:r>
+              <w:rPr>
                 <w:noProof/>
                 <w:webHidden/>
               </w:rPr>
@@ -1201,22 +1348,25 @@
               <w:tab w:val="right" w:leader="dot" w:pos="9017"/>
             </w:tabs>
             <w:rPr>
-              <w:rFonts w:ascii="Avenir Next LT Pro" w:hAnsi="Avenir Next LT Pro" w:cstheme="minorBidi"/>
+              <w:rFonts w:cstheme="minorBidi"/>
               <w:noProof/>
+              <w:kern w:val="2"/>
+              <w:sz w:val="24"/>
+              <w:szCs w:val="24"/>
+              <w:lang w:val="en-NL" w:eastAsia="en-NL"/>
+              <w14:ligatures w14:val="standardContextual"/>
             </w:rPr>
           </w:pPr>
-          <w:hyperlink w:anchor="_Toc207703530" w:history="1">
+          <w:hyperlink w:anchor="_Toc240457561" w:history="1">
             <w:r>
               <w:rPr>
                 <w:rStyle w:val="Hyperlink"/>
-                <w:rFonts w:ascii="Avenir Next LT Pro" w:hAnsi="Avenir Next LT Pro"/>
                 <w:noProof/>
               </w:rPr>
-              <w:t>6.3 Coördinatie</w:t>
-            </w:r>
-            <w:r>
-              <w:rPr>
-                <w:rFonts w:ascii="Avenir Next LT Pro" w:hAnsi="Avenir Next LT Pro"/>
+              <w:t>8. Risicoanalyse</w:t>
+            </w:r>
+            <w:r>
+              <w:rPr>
                 <w:noProof/>
                 <w:webHidden/>
               </w:rPr>
@@ -1224,7 +1374,6 @@
             </w:r>
             <w:r>
               <w:rPr>
-                <w:rFonts w:ascii="Avenir Next LT Pro" w:hAnsi="Avenir Next LT Pro"/>
                 <w:noProof/>
                 <w:webHidden/>
               </w:rPr>
@@ -1232,22 +1381,19 @@
             </w:r>
             <w:r>
               <w:rPr>
-                <w:rFonts w:ascii="Avenir Next LT Pro" w:hAnsi="Avenir Next LT Pro"/>
                 <w:noProof/>
                 <w:webHidden/>
               </w:rPr>
-              <w:instrText xml:space="preserve"> PAGEREF _Toc207703530 \h </w:instrText>
-            </w:r>
-            <w:r>
-              <w:rPr>
-                <w:rFonts w:ascii="Avenir Next LT Pro" w:hAnsi="Avenir Next LT Pro"/>
+              <w:instrText xml:space="preserve"> PAGEREF _Toc240457561 \h </w:instrText>
+            </w:r>
+            <w:r>
+              <w:rPr>
                 <w:noProof/>
                 <w:webHidden/>
               </w:rPr>
             </w:r>
             <w:r>
               <w:rPr>
-                <w:rFonts w:ascii="Avenir Next LT Pro" w:hAnsi="Avenir Next LT Pro"/>
                 <w:noProof/>
                 <w:webHidden/>
               </w:rPr>
@@ -1255,15 +1401,13 @@
             </w:r>
             <w:r>
               <w:rPr>
-                <w:rFonts w:ascii="Avenir Next LT Pro" w:hAnsi="Avenir Next LT Pro"/>
                 <w:noProof/>
                 <w:webHidden/>
               </w:rPr>
-              <w:t>8</w:t>
-            </w:r>
-            <w:r>
-              <w:rPr>
-                <w:rFonts w:ascii="Avenir Next LT Pro" w:hAnsi="Avenir Next LT Pro"/>
+              <w:t>13</w:t>
+            </w:r>
+            <w:r>
+              <w:rPr>
                 <w:noProof/>
                 <w:webHidden/>
               </w:rPr>
@@ -1278,22 +1422,25 @@
               <w:tab w:val="right" w:leader="dot" w:pos="9017"/>
             </w:tabs>
             <w:rPr>
-              <w:rFonts w:ascii="Avenir Next LT Pro" w:hAnsi="Avenir Next LT Pro" w:cstheme="minorBidi"/>
+              <w:rFonts w:cstheme="minorBidi"/>
               <w:noProof/>
+              <w:kern w:val="2"/>
+              <w:sz w:val="24"/>
+              <w:szCs w:val="24"/>
+              <w:lang w:val="en-NL" w:eastAsia="en-NL"/>
+              <w14:ligatures w14:val="standardContextual"/>
             </w:rPr>
           </w:pPr>
-          <w:hyperlink w:anchor="_Toc207703531" w:history="1">
+          <w:hyperlink w:anchor="_Toc240457562" w:history="1">
             <w:r>
               <w:rPr>
                 <w:rStyle w:val="Hyperlink"/>
-                <w:rFonts w:ascii="Avenir Next LT Pro" w:hAnsi="Avenir Next LT Pro"/>
                 <w:noProof/>
               </w:rPr>
-              <w:t>8. Kwaliteitsbewaking</w:t>
-            </w:r>
-            <w:r>
-              <w:rPr>
-                <w:rFonts w:ascii="Avenir Next LT Pro" w:hAnsi="Avenir Next LT Pro"/>
+              <w:t>9. Planning</w:t>
+            </w:r>
+            <w:r>
+              <w:rPr>
                 <w:noProof/>
                 <w:webHidden/>
               </w:rPr>
@@ -1301,7 +1448,6 @@
             </w:r>
             <w:r>
               <w:rPr>
-                <w:rFonts w:ascii="Avenir Next LT Pro" w:hAnsi="Avenir Next LT Pro"/>
                 <w:noProof/>
                 <w:webHidden/>
               </w:rPr>
@@ -1309,22 +1455,19 @@
             </w:r>
             <w:r>
               <w:rPr>
-                <w:rFonts w:ascii="Avenir Next LT Pro" w:hAnsi="Avenir Next LT Pro"/>
                 <w:noProof/>
                 <w:webHidden/>
               </w:rPr>
-              <w:instrText xml:space="preserve"> PAGEREF _Toc207703531 \h </w:instrText>
-            </w:r>
-            <w:r>
-              <w:rPr>
-                <w:rFonts w:ascii="Avenir Next LT Pro" w:hAnsi="Avenir Next LT Pro"/>
+              <w:instrText xml:space="preserve"> PAGEREF _Toc240457562 \h </w:instrText>
+            </w:r>
+            <w:r>
+              <w:rPr>
                 <w:noProof/>
                 <w:webHidden/>
               </w:rPr>
             </w:r>
             <w:r>
               <w:rPr>
-                <w:rFonts w:ascii="Avenir Next LT Pro" w:hAnsi="Avenir Next LT Pro"/>
                 <w:noProof/>
                 <w:webHidden/>
               </w:rPr>
@@ -1332,15 +1475,13 @@
             </w:r>
             <w:r>
               <w:rPr>
-                <w:rFonts w:ascii="Avenir Next LT Pro" w:hAnsi="Avenir Next LT Pro"/>
                 <w:noProof/>
                 <w:webHidden/>
               </w:rPr>
-              <w:t>11</w:t>
-            </w:r>
-            <w:r>
-              <w:rPr>
-                <w:rFonts w:ascii="Avenir Next LT Pro" w:hAnsi="Avenir Next LT Pro"/>
+              <w:t>14</w:t>
+            </w:r>
+            <w:r>
+              <w:rPr>
                 <w:noProof/>
                 <w:webHidden/>
               </w:rPr>
@@ -1355,22 +1496,25 @@
               <w:tab w:val="right" w:leader="dot" w:pos="9017"/>
             </w:tabs>
             <w:rPr>
-              <w:rFonts w:ascii="Avenir Next LT Pro" w:hAnsi="Avenir Next LT Pro" w:cstheme="minorBidi"/>
+              <w:rFonts w:cstheme="minorBidi"/>
               <w:noProof/>
+              <w:kern w:val="2"/>
+              <w:sz w:val="24"/>
+              <w:szCs w:val="24"/>
+              <w:lang w:val="en-NL" w:eastAsia="en-NL"/>
+              <w14:ligatures w14:val="standardContextual"/>
             </w:rPr>
           </w:pPr>
-          <w:hyperlink w:anchor="_Toc207703532" w:history="1">
+          <w:hyperlink w:anchor="_Toc240457563" w:history="1">
             <w:r>
               <w:rPr>
                 <w:rStyle w:val="Hyperlink"/>
-                <w:rFonts w:ascii="Avenir Next LT Pro" w:hAnsi="Avenir Next LT Pro"/>
                 <w:noProof/>
               </w:rPr>
-              <w:t>9. Risicoanalyse</w:t>
-            </w:r>
-            <w:r>
-              <w:rPr>
-                <w:rFonts w:ascii="Avenir Next LT Pro" w:hAnsi="Avenir Next LT Pro"/>
+              <w:t>10. Begroting en middelen</w:t>
+            </w:r>
+            <w:r>
+              <w:rPr>
                 <w:noProof/>
                 <w:webHidden/>
               </w:rPr>
@@ -1378,7 +1522,6 @@
             </w:r>
             <w:r>
               <w:rPr>
-                <w:rFonts w:ascii="Avenir Next LT Pro" w:hAnsi="Avenir Next LT Pro"/>
                 <w:noProof/>
                 <w:webHidden/>
               </w:rPr>
@@ -1386,22 +1529,19 @@
             </w:r>
             <w:r>
               <w:rPr>
-                <w:rFonts w:ascii="Avenir Next LT Pro" w:hAnsi="Avenir Next LT Pro"/>
                 <w:noProof/>
                 <w:webHidden/>
               </w:rPr>
-              <w:instrText xml:space="preserve"> PAGEREF _Toc207703532 \h </w:instrText>
-            </w:r>
-            <w:r>
-              <w:rPr>
-                <w:rFonts w:ascii="Avenir Next LT Pro" w:hAnsi="Avenir Next LT Pro"/>
+              <w:instrText xml:space="preserve"> PAGEREF _Toc240457563 \h </w:instrText>
+            </w:r>
+            <w:r>
+              <w:rPr>
                 <w:noProof/>
                 <w:webHidden/>
               </w:rPr>
             </w:r>
             <w:r>
               <w:rPr>
-                <w:rFonts w:ascii="Avenir Next LT Pro" w:hAnsi="Avenir Next LT Pro"/>
                 <w:noProof/>
                 <w:webHidden/>
               </w:rPr>
@@ -1409,169 +1549,13 @@
             </w:r>
             <w:r>
               <w:rPr>
-                <w:rFonts w:ascii="Avenir Next LT Pro" w:hAnsi="Avenir Next LT Pro"/>
                 <w:noProof/>
                 <w:webHidden/>
               </w:rPr>
-              <w:t>12</w:t>
-            </w:r>
-            <w:r>
-              <w:rPr>
-                <w:rFonts w:ascii="Avenir Next LT Pro" w:hAnsi="Avenir Next LT Pro"/>
-                <w:noProof/>
-                <w:webHidden/>
-              </w:rPr>
-              <w:fldChar w:fldCharType="end"/>
-            </w:r>
-          </w:hyperlink>
-        </w:p>
-        <w:p>
-          <w:pPr>
-            <w:pStyle w:val="TOC2"/>
-            <w:tabs>
-              <w:tab w:val="right" w:leader="dot" w:pos="9017"/>
-            </w:tabs>
-            <w:rPr>
-              <w:rFonts w:ascii="Avenir Next LT Pro" w:hAnsi="Avenir Next LT Pro" w:cstheme="minorBidi"/>
-              <w:noProof/>
-            </w:rPr>
-          </w:pPr>
-          <w:hyperlink w:anchor="_Toc207703533" w:history="1">
-            <w:r>
-              <w:rPr>
-                <w:rStyle w:val="Hyperlink"/>
-                <w:rFonts w:ascii="Avenir Next LT Pro" w:hAnsi="Avenir Next LT Pro"/>
-                <w:noProof/>
-              </w:rPr>
-              <w:t>10. Planning</w:t>
-            </w:r>
-            <w:r>
-              <w:rPr>
-                <w:rFonts w:ascii="Avenir Next LT Pro" w:hAnsi="Avenir Next LT Pro"/>
-                <w:noProof/>
-                <w:webHidden/>
-              </w:rPr>
-              <w:tab/>
-            </w:r>
-            <w:r>
-              <w:rPr>
-                <w:rFonts w:ascii="Avenir Next LT Pro" w:hAnsi="Avenir Next LT Pro"/>
-                <w:noProof/>
-                <w:webHidden/>
-              </w:rPr>
-              <w:fldChar w:fldCharType="begin"/>
-            </w:r>
-            <w:r>
-              <w:rPr>
-                <w:rFonts w:ascii="Avenir Next LT Pro" w:hAnsi="Avenir Next LT Pro"/>
-                <w:noProof/>
-                <w:webHidden/>
-              </w:rPr>
-              <w:instrText xml:space="preserve"> PAGEREF _Toc207703533 \h </w:instrText>
-            </w:r>
-            <w:r>
-              <w:rPr>
-                <w:rFonts w:ascii="Avenir Next LT Pro" w:hAnsi="Avenir Next LT Pro"/>
-                <w:noProof/>
-                <w:webHidden/>
-              </w:rPr>
-            </w:r>
-            <w:r>
-              <w:rPr>
-                <w:rFonts w:ascii="Avenir Next LT Pro" w:hAnsi="Avenir Next LT Pro"/>
-                <w:noProof/>
-                <w:webHidden/>
-              </w:rPr>
-              <w:fldChar w:fldCharType="separate"/>
-            </w:r>
-            <w:r>
-              <w:rPr>
-                <w:rFonts w:ascii="Avenir Next LT Pro" w:hAnsi="Avenir Next LT Pro"/>
-                <w:noProof/>
-                <w:webHidden/>
-              </w:rPr>
-              <w:t>13</w:t>
-            </w:r>
-            <w:r>
-              <w:rPr>
-                <w:rFonts w:ascii="Avenir Next LT Pro" w:hAnsi="Avenir Next LT Pro"/>
-                <w:noProof/>
-                <w:webHidden/>
-              </w:rPr>
-              <w:fldChar w:fldCharType="end"/>
-            </w:r>
-          </w:hyperlink>
-        </w:p>
-        <w:p>
-          <w:pPr>
-            <w:pStyle w:val="TOC2"/>
-            <w:tabs>
-              <w:tab w:val="right" w:leader="dot" w:pos="9017"/>
-            </w:tabs>
-            <w:rPr>
-              <w:rFonts w:ascii="Avenir Next LT Pro" w:hAnsi="Avenir Next LT Pro" w:cstheme="minorBidi"/>
-              <w:noProof/>
-            </w:rPr>
-          </w:pPr>
-          <w:hyperlink w:anchor="_Toc207703534" w:history="1">
-            <w:r>
-              <w:rPr>
-                <w:rStyle w:val="Hyperlink"/>
-                <w:rFonts w:ascii="Avenir Next LT Pro" w:hAnsi="Avenir Next LT Pro"/>
-                <w:noProof/>
-              </w:rPr>
-              <w:t>11. Begroting en middelen</w:t>
-            </w:r>
-            <w:r>
-              <w:rPr>
-                <w:rFonts w:ascii="Avenir Next LT Pro" w:hAnsi="Avenir Next LT Pro"/>
-                <w:noProof/>
-                <w:webHidden/>
-              </w:rPr>
-              <w:tab/>
-            </w:r>
-            <w:r>
-              <w:rPr>
-                <w:rFonts w:ascii="Avenir Next LT Pro" w:hAnsi="Avenir Next LT Pro"/>
-                <w:noProof/>
-                <w:webHidden/>
-              </w:rPr>
-              <w:fldChar w:fldCharType="begin"/>
-            </w:r>
-            <w:r>
-              <w:rPr>
-                <w:rFonts w:ascii="Avenir Next LT Pro" w:hAnsi="Avenir Next LT Pro"/>
-                <w:noProof/>
-                <w:webHidden/>
-              </w:rPr>
-              <w:instrText xml:space="preserve"> PAGEREF _Toc207703534 \h </w:instrText>
-            </w:r>
-            <w:r>
-              <w:rPr>
-                <w:rFonts w:ascii="Avenir Next LT Pro" w:hAnsi="Avenir Next LT Pro"/>
-                <w:noProof/>
-                <w:webHidden/>
-              </w:rPr>
-            </w:r>
-            <w:r>
-              <w:rPr>
-                <w:rFonts w:ascii="Avenir Next LT Pro" w:hAnsi="Avenir Next LT Pro"/>
-                <w:noProof/>
-                <w:webHidden/>
-              </w:rPr>
-              <w:fldChar w:fldCharType="separate"/>
-            </w:r>
-            <w:r>
-              <w:rPr>
-                <w:rFonts w:ascii="Avenir Next LT Pro" w:hAnsi="Avenir Next LT Pro"/>
-                <w:noProof/>
-                <w:webHidden/>
-              </w:rPr>
-              <w:t>14</w:t>
-            </w:r>
-            <w:r>
-              <w:rPr>
-                <w:rFonts w:ascii="Avenir Next LT Pro" w:hAnsi="Avenir Next LT Pro"/>
+              <w:t>15</w:t>
+            </w:r>
+            <w:r>
+              <w:rPr>
                 <w:noProof/>
                 <w:webHidden/>
               </w:rPr>
@@ -1616,7 +1600,7 @@
           <w:bCs w:val="0"/>
         </w:rPr>
       </w:pPr>
-      <w:bookmarkStart w:id="0" w:name="_Toc207703522"/>
+      <w:bookmarkStart w:id="0" w:name="_Toc240457551"/>
       <w:r>
         <w:rPr>
           <w:rStyle w:val="Strong"/>
@@ -1648,18 +1632,28 @@
       <w:r>
         <w:t xml:space="preserve">De opdrachtgever </w:t>
       </w:r>
+      <w:proofErr w:type="spellStart"/>
       <w:r>
         <w:t>Aan</w:t>
       </w:r>
       <w:r>
-        <w:t>ZKOO (Zorg</w:t>
+        <w:t>ZKOO</w:t>
+      </w:r>
+      <w:proofErr w:type="spellEnd"/>
+      <w:r>
+        <w:t xml:space="preserve"> (Zorg</w:t>
       </w:r>
       <w:r>
         <w:t xml:space="preserve"> </w:t>
       </w:r>
       <w:r>
-        <w:t>Kwaliteit Ondersteunings</w:t>
-      </w:r>
+        <w:t xml:space="preserve">Kwaliteit </w:t>
+      </w:r>
+      <w:proofErr w:type="spellStart"/>
+      <w:r>
+        <w:t>Ondersteunings</w:t>
+      </w:r>
+      <w:proofErr w:type="spellEnd"/>
       <w:r>
         <w:t xml:space="preserve"> </w:t>
       </w:r>
@@ -1909,8 +1903,16 @@
         <w:rPr>
           <w:rFonts w:ascii="Avenir Next LT Pro" w:hAnsi="Avenir Next LT Pro"/>
         </w:rPr>
-        <w:t>Toegangsbeheer en logging</w:t>
-      </w:r>
+        <w:t xml:space="preserve">Toegangsbeheer en </w:t>
+      </w:r>
+      <w:proofErr w:type="spellStart"/>
+      <w:r>
+        <w:rPr>
+          <w:rFonts w:ascii="Avenir Next LT Pro" w:hAnsi="Avenir Next LT Pro"/>
+        </w:rPr>
+        <w:t>logging</w:t>
+      </w:r>
+      <w:proofErr w:type="spellEnd"/>
     </w:p>
     <w:p>
       <w:pPr>
@@ -1932,7 +1934,23 @@
     </w:p>
     <w:p>
       <w:r>
-        <w:t>ZKOO werkt met moderne cloudomgevingen (Microsoft Azure) om schaalbaarheid, beschikbaarheid en beveiliging te garanderen.</w:t>
+        <w:t xml:space="preserve">ZKOO werkt met moderne </w:t>
+      </w:r>
+      <w:proofErr w:type="spellStart"/>
+      <w:r>
+        <w:t>cloudomgevingen</w:t>
+      </w:r>
+      <w:proofErr w:type="spellEnd"/>
+      <w:r>
+        <w:t xml:space="preserve"> (Microsoft </w:t>
+      </w:r>
+      <w:proofErr w:type="spellStart"/>
+      <w:r>
+        <w:t>Azure</w:t>
+      </w:r>
+      <w:proofErr w:type="spellEnd"/>
+      <w:r>
+        <w:t>) om schaalbaarheid, beschikbaarheid en beveiliging te garanderen.</w:t>
       </w:r>
     </w:p>
     <w:p>
@@ -1997,7 +2015,15 @@
         <w:t xml:space="preserve"> d</w:t>
       </w:r>
       <w:r>
-        <w:t xml:space="preserve">oor een versneld traject naar Microsoft Azure kritieke ICT-componenten onvoldoende beveiligd. Een databeveiligingsbeleid ontbreekt, toegangscontroles zijn niet duidelijk ingericht, en wetgeving zoals de AVG wordt mogelijk geschonden. </w:t>
+        <w:t xml:space="preserve">oor een versneld traject naar Microsoft </w:t>
+      </w:r>
+      <w:proofErr w:type="spellStart"/>
+      <w:r>
+        <w:t>Azure</w:t>
+      </w:r>
+      <w:proofErr w:type="spellEnd"/>
+      <w:r>
+        <w:t xml:space="preserve"> kritieke ICT-componenten onvoldoende beveiligd. Een databeveiligingsbeleid ontbreekt, toegangscontroles zijn niet duidelijk ingericht, en wetgeving zoals de AVG wordt mogelijk geschonden. </w:t>
       </w:r>
     </w:p>
     <w:p>
@@ -2022,7 +2048,7 @@
           <w:bCs w:val="0"/>
         </w:rPr>
       </w:pPr>
-      <w:bookmarkStart w:id="1" w:name="_Toc207703523"/>
+      <w:bookmarkStart w:id="1" w:name="_Toc240457552"/>
       <w:r>
         <w:lastRenderedPageBreak/>
         <w:t xml:space="preserve">2. </w:t>
@@ -2063,7 +2089,15 @@
         <w:t>de</w:t>
       </w:r>
       <w:r>
-        <w:t xml:space="preserve"> cloudomgeving </w:t>
+        <w:t xml:space="preserve"> </w:t>
+      </w:r>
+      <w:proofErr w:type="spellStart"/>
+      <w:r>
+        <w:t>cloudomgeving</w:t>
+      </w:r>
+      <w:proofErr w:type="spellEnd"/>
+      <w:r>
+        <w:t xml:space="preserve"> </w:t>
       </w:r>
       <w:r>
         <w:t xml:space="preserve">van de klant van ZKOO </w:t>
@@ -2095,7 +2129,21 @@
         <w:rPr>
           <w:rFonts w:ascii="Avenir Next LT Pro" w:hAnsi="Avenir Next LT Pro"/>
         </w:rPr>
-        <w:t xml:space="preserve">De bestaande cloudomgeving (IST) </w:t>
+        <w:t xml:space="preserve">De bestaande </w:t>
+      </w:r>
+      <w:proofErr w:type="spellStart"/>
+      <w:r>
+        <w:rPr>
+          <w:rFonts w:ascii="Avenir Next LT Pro" w:hAnsi="Avenir Next LT Pro"/>
+        </w:rPr>
+        <w:t>cloudomgeving</w:t>
+      </w:r>
+      <w:proofErr w:type="spellEnd"/>
+      <w:r>
+        <w:rPr>
+          <w:rFonts w:ascii="Avenir Next LT Pro" w:hAnsi="Avenir Next LT Pro"/>
+        </w:rPr>
+        <w:t xml:space="preserve"> (IST) </w:t>
       </w:r>
       <w:r>
         <w:rPr>
@@ -2191,7 +2239,21 @@
         <w:rPr>
           <w:rFonts w:ascii="Avenir Next LT Pro" w:hAnsi="Avenir Next LT Pro"/>
         </w:rPr>
-        <w:t xml:space="preserve"> binnen Microsoft Azure.</w:t>
+        <w:t xml:space="preserve"> binnen Microsoft </w:t>
+      </w:r>
+      <w:proofErr w:type="spellStart"/>
+      <w:r>
+        <w:rPr>
+          <w:rFonts w:ascii="Avenir Next LT Pro" w:hAnsi="Avenir Next LT Pro"/>
+        </w:rPr>
+        <w:t>Azure</w:t>
+      </w:r>
+      <w:proofErr w:type="spellEnd"/>
+      <w:r>
+        <w:rPr>
+          <w:rFonts w:ascii="Avenir Next LT Pro" w:hAnsi="Avenir Next LT Pro"/>
+        </w:rPr>
+        <w:t>.</w:t>
       </w:r>
     </w:p>
     <w:p>
@@ -2221,7 +2283,7 @@
           <w:bCs w:val="0"/>
         </w:rPr>
       </w:pPr>
-      <w:bookmarkStart w:id="2" w:name="_Toc207703524"/>
+      <w:bookmarkStart w:id="2" w:name="_Toc240457553"/>
       <w:r>
         <w:lastRenderedPageBreak/>
         <w:t xml:space="preserve">3. </w:t>
@@ -2363,9 +2425,11 @@
             <w:hideMark/>
           </w:tcPr>
           <w:p>
+            <w:proofErr w:type="spellStart"/>
             <w:r>
               <w:t>PvA</w:t>
             </w:r>
+            <w:proofErr w:type="spellEnd"/>
           </w:p>
         </w:tc>
         <w:tc>
@@ -2407,12 +2471,14 @@
             <w:hideMark/>
           </w:tcPr>
           <w:p>
+            <w:proofErr w:type="spellStart"/>
             <w:r>
               <w:t>Advies</w:t>
             </w:r>
             <w:r>
               <w:t>+ontwerp</w:t>
             </w:r>
+            <w:proofErr w:type="spellEnd"/>
           </w:p>
         </w:tc>
         <w:tc>
@@ -2480,8 +2546,13 @@
               <w:t>individuele CGI-toets</w:t>
             </w:r>
             <w:r>
-              <w:t xml:space="preserve"> in Azure</w:t>
-            </w:r>
+              <w:t xml:space="preserve"> in </w:t>
+            </w:r>
+            <w:proofErr w:type="spellStart"/>
+            <w:r>
+              <w:t>Azure</w:t>
+            </w:r>
+            <w:proofErr w:type="spellEnd"/>
           </w:p>
         </w:tc>
       </w:tr>
@@ -2509,7 +2580,7 @@
           <w:bCs w:val="0"/>
         </w:rPr>
       </w:pPr>
-      <w:bookmarkStart w:id="3" w:name="_Toc207703525"/>
+      <w:bookmarkStart w:id="3" w:name="_Toc240457554"/>
       <w:r>
         <w:lastRenderedPageBreak/>
         <w:t xml:space="preserve">4. </w:t>
@@ -2548,7 +2619,21 @@
         <w:rPr>
           <w:rFonts w:ascii="Avenir Next LT Pro" w:hAnsi="Avenir Next LT Pro"/>
         </w:rPr>
-        <w:t>Analyse van bestaande (gesimuleerde) cloudomgeving.</w:t>
+        <w:t xml:space="preserve">Analyse van bestaande (gesimuleerde) </w:t>
+      </w:r>
+      <w:proofErr w:type="spellStart"/>
+      <w:r>
+        <w:rPr>
+          <w:rFonts w:ascii="Avenir Next LT Pro" w:hAnsi="Avenir Next LT Pro"/>
+        </w:rPr>
+        <w:t>cloudomgeving</w:t>
+      </w:r>
+      <w:proofErr w:type="spellEnd"/>
+      <w:r>
+        <w:rPr>
+          <w:rFonts w:ascii="Avenir Next LT Pro" w:hAnsi="Avenir Next LT Pro"/>
+        </w:rPr>
+        <w:t>.</w:t>
       </w:r>
     </w:p>
     <w:p>
@@ -2584,7 +2669,21 @@
         <w:rPr>
           <w:rFonts w:ascii="Avenir Next LT Pro" w:hAnsi="Avenir Next LT Pro"/>
         </w:rPr>
-        <w:t>Beveiligingsontwerp m.b.t. netwerksegmentatie, toegangsbeheer, dataclassificatie, logging, en veilig beheer.</w:t>
+        <w:t xml:space="preserve">Beveiligingsontwerp m.b.t. netwerksegmentatie, toegangsbeheer, dataclassificatie, </w:t>
+      </w:r>
+      <w:proofErr w:type="spellStart"/>
+      <w:r>
+        <w:rPr>
+          <w:rFonts w:ascii="Avenir Next LT Pro" w:hAnsi="Avenir Next LT Pro"/>
+        </w:rPr>
+        <w:t>logging</w:t>
+      </w:r>
+      <w:proofErr w:type="spellEnd"/>
+      <w:r>
+        <w:rPr>
+          <w:rFonts w:ascii="Avenir Next LT Pro" w:hAnsi="Avenir Next LT Pro"/>
+        </w:rPr>
+        <w:t>, en veilig beheer.</w:t>
       </w:r>
     </w:p>
     <w:p>
@@ -2602,7 +2701,21 @@
         <w:rPr>
           <w:rFonts w:ascii="Avenir Next LT Pro" w:hAnsi="Avenir Next LT Pro"/>
         </w:rPr>
-        <w:t>Implementatie binnen Azure-resourcegroup.</w:t>
+        <w:t xml:space="preserve">Implementatie binnen </w:t>
+      </w:r>
+      <w:proofErr w:type="spellStart"/>
+      <w:r>
+        <w:rPr>
+          <w:rFonts w:ascii="Avenir Next LT Pro" w:hAnsi="Avenir Next LT Pro"/>
+        </w:rPr>
+        <w:t>Azure-resourcegroup</w:t>
+      </w:r>
+      <w:proofErr w:type="spellEnd"/>
+      <w:r>
+        <w:rPr>
+          <w:rFonts w:ascii="Avenir Next LT Pro" w:hAnsi="Avenir Next LT Pro"/>
+        </w:rPr>
+        <w:t>.</w:t>
       </w:r>
     </w:p>
     <w:p>
@@ -2628,7 +2741,21 @@
         <w:rPr>
           <w:rFonts w:ascii="Avenir Next LT Pro" w:hAnsi="Avenir Next LT Pro"/>
         </w:rPr>
-        <w:t>Migratie van legacy-systemen.</w:t>
+        <w:t xml:space="preserve">Migratie van </w:t>
+      </w:r>
+      <w:proofErr w:type="spellStart"/>
+      <w:r>
+        <w:rPr>
+          <w:rFonts w:ascii="Avenir Next LT Pro" w:hAnsi="Avenir Next LT Pro"/>
+        </w:rPr>
+        <w:t>legacy</w:t>
+      </w:r>
+      <w:proofErr w:type="spellEnd"/>
+      <w:r>
+        <w:rPr>
+          <w:rFonts w:ascii="Avenir Next LT Pro" w:hAnsi="Avenir Next LT Pro"/>
+        </w:rPr>
+        <w:t>-systemen.</w:t>
       </w:r>
     </w:p>
     <w:p>
@@ -2676,7 +2803,7 @@
           <w:bCs w:val="0"/>
         </w:rPr>
       </w:pPr>
-      <w:bookmarkStart w:id="4" w:name="_Toc207703526"/>
+      <w:bookmarkStart w:id="4" w:name="_Toc240457555"/>
       <w:r>
         <w:t xml:space="preserve">5. </w:t>
       </w:r>
@@ -2793,11 +2920,19 @@
           <w:rFonts w:ascii="Avenir Next LT Pro" w:hAnsi="Avenir Next LT Pro"/>
         </w:rPr>
       </w:pPr>
-      <w:r>
-        <w:rPr>
-          <w:rFonts w:ascii="Avenir Next LT Pro" w:hAnsi="Avenir Next LT Pro"/>
-        </w:rPr>
-        <w:t xml:space="preserve">PvA </w:t>
+      <w:proofErr w:type="spellStart"/>
+      <w:r>
+        <w:rPr>
+          <w:rFonts w:ascii="Avenir Next LT Pro" w:hAnsi="Avenir Next LT Pro"/>
+        </w:rPr>
+        <w:t>PvA</w:t>
+      </w:r>
+      <w:proofErr w:type="spellEnd"/>
+      <w:r>
+        <w:rPr>
+          <w:rFonts w:ascii="Avenir Next LT Pro" w:hAnsi="Avenir Next LT Pro"/>
+        </w:rPr>
+        <w:t xml:space="preserve"> </w:t>
       </w:r>
       <w:r>
         <w:rPr>
@@ -2939,8 +3074,30 @@
         <w:rPr>
           <w:rFonts w:ascii="Avenir Next LT Pro" w:hAnsi="Avenir Next LT Pro"/>
         </w:rPr>
-        <w:t>Inrichten beveiligde cloudomgeving in Azure</w:t>
-      </w:r>
+        <w:t xml:space="preserve">Inrichten beveiligde </w:t>
+      </w:r>
+      <w:proofErr w:type="spellStart"/>
+      <w:r>
+        <w:rPr>
+          <w:rFonts w:ascii="Avenir Next LT Pro" w:hAnsi="Avenir Next LT Pro"/>
+        </w:rPr>
+        <w:t>cloudomgeving</w:t>
+      </w:r>
+      <w:proofErr w:type="spellEnd"/>
+      <w:r>
+        <w:rPr>
+          <w:rFonts w:ascii="Avenir Next LT Pro" w:hAnsi="Avenir Next LT Pro"/>
+        </w:rPr>
+        <w:t xml:space="preserve"> in </w:t>
+      </w:r>
+      <w:proofErr w:type="spellStart"/>
+      <w:r>
+        <w:rPr>
+          <w:rFonts w:ascii="Avenir Next LT Pro" w:hAnsi="Avenir Next LT Pro"/>
+        </w:rPr>
+        <w:t>Azure</w:t>
+      </w:r>
+      <w:proofErr w:type="spellEnd"/>
     </w:p>
     <w:p>
       <w:pPr>
@@ -2957,7 +3114,21 @@
         <w:rPr>
           <w:rFonts w:ascii="Avenir Next LT Pro" w:hAnsi="Avenir Next LT Pro"/>
         </w:rPr>
-        <w:t>Configuratie van firewalls, IDS, VPN’s, toegangscontrole</w:t>
+        <w:t xml:space="preserve">Configuratie van firewalls, IDS, </w:t>
+      </w:r>
+      <w:proofErr w:type="spellStart"/>
+      <w:r>
+        <w:rPr>
+          <w:rFonts w:ascii="Avenir Next LT Pro" w:hAnsi="Avenir Next LT Pro"/>
+        </w:rPr>
+        <w:t>VPN’s</w:t>
+      </w:r>
+      <w:proofErr w:type="spellEnd"/>
+      <w:r>
+        <w:rPr>
+          <w:rFonts w:ascii="Avenir Next LT Pro" w:hAnsi="Avenir Next LT Pro"/>
+        </w:rPr>
+        <w:t>, toegangscontrole</w:t>
       </w:r>
     </w:p>
     <w:p>
@@ -2989,11 +3160,19 @@
           <w:rFonts w:ascii="Avenir Next LT Pro" w:hAnsi="Avenir Next LT Pro"/>
         </w:rPr>
       </w:pPr>
-      <w:r>
-        <w:rPr>
-          <w:rFonts w:ascii="Avenir Next LT Pro" w:hAnsi="Avenir Next LT Pro"/>
-        </w:rPr>
-        <w:t>Logging en monitoring activeren</w:t>
+      <w:proofErr w:type="spellStart"/>
+      <w:r>
+        <w:rPr>
+          <w:rFonts w:ascii="Avenir Next LT Pro" w:hAnsi="Avenir Next LT Pro"/>
+        </w:rPr>
+        <w:t>Logging</w:t>
+      </w:r>
+      <w:proofErr w:type="spellEnd"/>
+      <w:r>
+        <w:rPr>
+          <w:rFonts w:ascii="Avenir Next LT Pro" w:hAnsi="Avenir Next LT Pro"/>
+        </w:rPr>
+        <w:t xml:space="preserve"> en monitoring activeren</w:t>
       </w:r>
     </w:p>
     <w:p>
@@ -3083,7 +3262,7 @@
           <w:bCs w:val="0"/>
         </w:rPr>
       </w:pPr>
-      <w:bookmarkStart w:id="5" w:name="_Toc207703527"/>
+      <w:bookmarkStart w:id="5" w:name="_Toc240457556"/>
       <w:r>
         <w:lastRenderedPageBreak/>
         <w:t xml:space="preserve">6. </w:t>
@@ -3103,16 +3282,16 @@
       <w:pPr>
         <w:pStyle w:val="Heading3"/>
       </w:pPr>
-      <w:bookmarkStart w:id="6" w:name="_Toc207703528"/>
-      <w:bookmarkStart w:id="7" w:name="_Toc84325188"/>
-      <w:bookmarkStart w:id="8" w:name="_Toc84325279"/>
+      <w:bookmarkStart w:id="6" w:name="_Toc84325188"/>
+      <w:bookmarkStart w:id="7" w:name="_Toc84325279"/>
+      <w:bookmarkStart w:id="8" w:name="_Toc240457557"/>
       <w:r>
         <w:t xml:space="preserve">6.1 </w:t>
       </w:r>
       <w:r>
         <w:t>Het projectteam</w:t>
       </w:r>
-      <w:bookmarkEnd w:id="6"/>
+      <w:bookmarkEnd w:id="8"/>
     </w:p>
     <w:p>
       <w:pPr>
@@ -3128,8 +3307,8 @@
         </w:rPr>
         <w:t>Team</w:t>
       </w:r>
+      <w:bookmarkEnd w:id="6"/>
       <w:bookmarkEnd w:id="7"/>
-      <w:bookmarkEnd w:id="8"/>
       <w:r>
         <w:rPr>
           <w:b/>
@@ -3140,7 +3319,15 @@
     </w:p>
     <w:p>
       <w:r>
-        <w:t xml:space="preserve">Onze missie is als team samen te werken aan het verbeteren van gegevensbescherming binnen de Azure-omgeving van ZKOO. Hierbij staan een eerlijke taakverdeling, open communicatie en verantwoordelijkheid voor ieders eigen werk hoog in het vaandel. </w:t>
+        <w:t xml:space="preserve">Onze missie is als team samen te werken aan het verbeteren van gegevensbescherming binnen de </w:t>
+      </w:r>
+      <w:proofErr w:type="spellStart"/>
+      <w:r>
+        <w:t>Azure</w:t>
+      </w:r>
+      <w:proofErr w:type="spellEnd"/>
+      <w:r>
+        <w:t xml:space="preserve">-omgeving van ZKOO. Hierbij staan een eerlijke taakverdeling, open communicatie en verantwoordelijkheid voor ieders eigen werk hoog in het vaandel. </w:t>
       </w:r>
     </w:p>
     <w:p>
@@ -3151,7 +3338,15 @@
         </w:rPr>
       </w:pPr>
       <w:r>
-        <w:t xml:space="preserve">De visie die wij als team dragen is het opleveren van een onderbouwd advies en een werkende Proof of Concept. Hiermee laten we zien hoe de onderzochte beveiligingsrisico’s beperkt kunnen worden. </w:t>
+        <w:t xml:space="preserve">De visie die wij als team dragen is het opleveren van een onderbouwd advies en een werkende </w:t>
+      </w:r>
+      <w:proofErr w:type="spellStart"/>
+      <w:r>
+        <w:t>Proof</w:t>
+      </w:r>
+      <w:proofErr w:type="spellEnd"/>
+      <w:r>
+        <w:t xml:space="preserve"> of Concept. Hiermee laten we zien hoe de onderzochte beveiligingsrisico’s beperkt kunnen worden. </w:t>
       </w:r>
     </w:p>
     <w:p>
@@ -3317,14 +3512,34 @@
                 <w:szCs w:val="20"/>
               </w:rPr>
             </w:pPr>
+            <w:proofErr w:type="spellStart"/>
             <w:r>
               <w:rPr>
                 <w:rFonts w:cs="Arial"/>
                 <w:sz w:val="20"/>
                 <w:szCs w:val="20"/>
               </w:rPr>
-              <w:t>Maiwand Arman</w:t>
-            </w:r>
+              <w:t>Maiwand</w:t>
+            </w:r>
+            <w:proofErr w:type="spellEnd"/>
+            <w:r>
+              <w:rPr>
+                <w:rFonts w:cs="Arial"/>
+                <w:sz w:val="20"/>
+                <w:szCs w:val="20"/>
+              </w:rPr>
+              <w:t xml:space="preserve"> </w:t>
+            </w:r>
+            <w:proofErr w:type="spellStart"/>
+            <w:r>
+              <w:rPr>
+                <w:rFonts w:cs="Arial"/>
+                <w:sz w:val="20"/>
+                <w:szCs w:val="20"/>
+              </w:rPr>
+              <w:t>Arman</w:t>
+            </w:r>
+            <w:proofErr w:type="spellEnd"/>
           </w:p>
         </w:tc>
         <w:tc>
@@ -3905,7 +4120,15 @@
     </w:p>
     <w:p>
       <w:r>
-        <w:t xml:space="preserve">Tijdens schooluren zorgen de teamleden dat zij bereikbaar zijn, ook wanneer iemand vanuit huis werkt. Hiervoor gebruiken we communicatiekanalen Whatsapp, Github en Microsoft Teams. </w:t>
+        <w:t xml:space="preserve">Tijdens schooluren zorgen de teamleden dat zij bereikbaar zijn, ook wanneer iemand vanuit huis werkt. Hiervoor gebruiken we communicatiekanalen Whatsapp, </w:t>
+      </w:r>
+      <w:proofErr w:type="spellStart"/>
+      <w:r>
+        <w:t>Github</w:t>
+      </w:r>
+      <w:proofErr w:type="spellEnd"/>
+      <w:r>
+        <w:t xml:space="preserve"> en Microsoft Teams. </w:t>
       </w:r>
     </w:p>
     <w:p>
@@ -4110,12 +4333,14 @@
           <w:i/>
         </w:rPr>
       </w:pPr>
+      <w:proofErr w:type="spellStart"/>
       <w:r>
         <w:rPr>
           <w:rStyle w:val="Emphasis"/>
         </w:rPr>
         <w:t>Maiwand</w:t>
       </w:r>
+      <w:proofErr w:type="spellEnd"/>
       <w:r>
         <w:rPr>
           <w:rStyle w:val="Emphasis"/>
@@ -4218,7 +4443,15 @@
     </w:p>
     <w:p>
       <w:r>
-        <w:t xml:space="preserve">Notulist — Maiwand: </w:t>
+        <w:t xml:space="preserve">Notulist — </w:t>
+      </w:r>
+      <w:proofErr w:type="spellStart"/>
+      <w:r>
+        <w:t>Maiwand</w:t>
+      </w:r>
+      <w:proofErr w:type="spellEnd"/>
+      <w:r>
+        <w:t xml:space="preserve">: </w:t>
       </w:r>
     </w:p>
     <w:p>
@@ -4253,7 +4486,15 @@
     </w:p>
     <w:p>
       <w:r>
-        <w:t>Bij vertrek van een projectlid worden de taken verdeeld over de resterende leden. Indien nodig wordt gestemd over wie de vrijge</w:t>
+        <w:t xml:space="preserve">Bij vertrek van een </w:t>
+      </w:r>
+      <w:proofErr w:type="spellStart"/>
+      <w:r>
+        <w:t>projectlid</w:t>
+      </w:r>
+      <w:proofErr w:type="spellEnd"/>
+      <w:r>
+        <w:t xml:space="preserve"> worden de taken verdeeld over de resterende leden. Indien nodig wordt gestemd over wie de vrijge</w:t>
       </w:r>
       <w:r>
         <w:t>k</w:t>
@@ -4803,9 +5044,11 @@
             <w:tcW w:w="3005" w:type="dxa"/>
           </w:tcPr>
           <w:p>
+            <w:proofErr w:type="spellStart"/>
             <w:r>
               <w:t>Maiwand</w:t>
             </w:r>
+            <w:proofErr w:type="spellEnd"/>
           </w:p>
         </w:tc>
         <w:tc>
@@ -4900,18 +5143,85 @@
     <w:p/>
     <w:p/>
     <w:p>
-      <w:bookmarkStart w:id="18" w:name="_Toc207703529"/>
-      <w:bookmarkStart w:id="19" w:name="_Toc84325194"/>
-      <w:bookmarkStart w:id="20" w:name="_Toc84325285"/>
-      <w:bookmarkStart w:id="21" w:name="_Toc41709447"/>
-      <w:bookmarkStart w:id="22" w:name="_Toc41709660"/>
-      <w:bookmarkStart w:id="23" w:name="_Toc41794471"/>
+      <w:bookmarkStart w:id="18" w:name="_Toc84325194"/>
+      <w:bookmarkStart w:id="19" w:name="_Toc84325285"/>
+      <w:bookmarkStart w:id="20" w:name="_Toc41709447"/>
+      <w:bookmarkStart w:id="21" w:name="_Toc41709660"/>
+      <w:bookmarkStart w:id="22" w:name="_Toc41794471"/>
     </w:p>
     <w:p>
       <w:pPr>
         <w:pStyle w:val="Heading3"/>
       </w:pPr>
-      <w:r>
+    </w:p>
+    <w:p>
+      <w:pPr>
+        <w:pStyle w:val="Heading3"/>
+      </w:pPr>
+    </w:p>
+    <w:p>
+      <w:pPr>
+        <w:pStyle w:val="Heading3"/>
+      </w:pPr>
+    </w:p>
+    <w:p>
+      <w:pPr>
+        <w:pStyle w:val="Heading3"/>
+      </w:pPr>
+    </w:p>
+    <w:p>
+      <w:pPr>
+        <w:pStyle w:val="Heading3"/>
+      </w:pPr>
+    </w:p>
+    <w:p>
+      <w:pPr>
+        <w:pStyle w:val="Heading3"/>
+      </w:pPr>
+    </w:p>
+    <w:p>
+      <w:pPr>
+        <w:pStyle w:val="Heading3"/>
+      </w:pPr>
+    </w:p>
+    <w:p>
+      <w:pPr>
+        <w:pStyle w:val="Heading3"/>
+      </w:pPr>
+    </w:p>
+    <w:p>
+      <w:pPr>
+        <w:pStyle w:val="Heading3"/>
+      </w:pPr>
+    </w:p>
+    <w:p>
+      <w:pPr>
+        <w:pStyle w:val="Heading3"/>
+      </w:pPr>
+    </w:p>
+    <w:p>
+      <w:pPr>
+        <w:pStyle w:val="Heading3"/>
+      </w:pPr>
+    </w:p>
+    <w:p>
+      <w:pPr>
+        <w:pStyle w:val="Heading3"/>
+      </w:pPr>
+    </w:p>
+    <w:p>
+      <w:pPr>
+        <w:pStyle w:val="Heading3"/>
+      </w:pPr>
+    </w:p>
+    <w:p/>
+    <w:p>
+      <w:pPr>
+        <w:pStyle w:val="Heading3"/>
+      </w:pPr>
+      <w:bookmarkStart w:id="23" w:name="_Toc240457558"/>
+      <w:r>
+        <w:lastRenderedPageBreak/>
         <w:t>6.</w:t>
       </w:r>
       <w:r>
@@ -4920,12 +5230,12 @@
       <w:r>
         <w:t>Informatie</w:t>
       </w:r>
+      <w:bookmarkEnd w:id="23"/>
+      <w:r>
+        <w:t xml:space="preserve"> </w:t>
+      </w:r>
       <w:bookmarkEnd w:id="18"/>
-      <w:r>
-        <w:t xml:space="preserve"> </w:t>
-      </w:r>
       <w:bookmarkEnd w:id="19"/>
-      <w:bookmarkEnd w:id="20"/>
     </w:p>
     <w:p>
       <w:pPr>
@@ -4942,13 +5252,55 @@
         <w:rPr>
           <w:rFonts w:cs="Arial"/>
         </w:rPr>
-        <w:t xml:space="preserve">Binnen het team communiceren wij face-to-face tijdens lessen, via Whatsapp, Github en indien er sprake is van digitaal overleg Microsoft Teams. Projectbestanden worden opgeslagen </w:t>
-      </w:r>
+        <w:t>Binnen het team communiceren wij face-</w:t>
+      </w:r>
+      <w:proofErr w:type="spellStart"/>
       <w:r>
         <w:rPr>
           <w:rFonts w:cs="Arial"/>
         </w:rPr>
-        <w:t>in Github. Tijdens een wekelijks overleg, gedurende of tussen de lessen in, bespreken wij de voortgang, mogelijke knelpunten en hoe de samenwerking verloopt.</w:t>
+        <w:t>to</w:t>
+      </w:r>
+      <w:proofErr w:type="spellEnd"/>
+      <w:r>
+        <w:rPr>
+          <w:rFonts w:cs="Arial"/>
+        </w:rPr>
+        <w:t xml:space="preserve">-face tijdens lessen, via Whatsapp, </w:t>
+      </w:r>
+      <w:proofErr w:type="spellStart"/>
+      <w:r>
+        <w:rPr>
+          <w:rFonts w:cs="Arial"/>
+        </w:rPr>
+        <w:t>Github</w:t>
+      </w:r>
+      <w:proofErr w:type="spellEnd"/>
+      <w:r>
+        <w:rPr>
+          <w:rFonts w:cs="Arial"/>
+        </w:rPr>
+        <w:t xml:space="preserve"> en indien er sprake is van digitaal overleg Microsoft Teams. Projectbestanden worden opgeslagen </w:t>
+      </w:r>
+      <w:r>
+        <w:rPr>
+          <w:rFonts w:cs="Arial"/>
+        </w:rPr>
+        <w:t xml:space="preserve">in </w:t>
+      </w:r>
+      <w:proofErr w:type="spellStart"/>
+      <w:r>
+        <w:rPr>
+          <w:rFonts w:cs="Arial"/>
+        </w:rPr>
+        <w:t>Github</w:t>
+      </w:r>
+      <w:proofErr w:type="spellEnd"/>
+      <w:r>
+        <w:rPr>
+          <w:rFonts w:cs="Arial"/>
+        </w:rPr>
+        <w:t>. Tijdens een wekelijks overleg, gedurende of tussen de lessen in, bespreken wij de voortgang, mogelijke knelpunten en hoe de samenwerking verloopt.</w:t>
       </w:r>
     </w:p>
     <w:p>
@@ -5088,8 +5440,17 @@
                 <w:b/>
                 <w:color w:val="000000" w:themeColor="text1"/>
               </w:rPr>
-              <w:t xml:space="preserve"> invoed</w:t>
-            </w:r>
+              <w:t xml:space="preserve"> </w:t>
+            </w:r>
+            <w:proofErr w:type="spellStart"/>
+            <w:r>
+              <w:rPr>
+                <w:b/>
+                <w:color w:val="000000" w:themeColor="text1"/>
+              </w:rPr>
+              <w:t>invoed</w:t>
+            </w:r>
+            <w:proofErr w:type="spellEnd"/>
           </w:p>
         </w:tc>
         <w:tc>
@@ -5176,7 +5537,6 @@
                 <w:b/>
                 <w:color w:val="000000" w:themeColor="text1"/>
               </w:rPr>
-              <w:lastRenderedPageBreak/>
               <w:t>Lage</w:t>
             </w:r>
             <w:r>
@@ -5468,7 +5828,23 @@
                 <w:bCs/>
                 <w:color w:val="000000" w:themeColor="text1"/>
               </w:rPr>
-              <w:t>Ontwerpen en ontwikkelen het systeem. Hebben belang bij duidelijke requirements, feedback en een haalbare opdracht.</w:t>
+              <w:t xml:space="preserve">Ontwerpen en ontwikkelen het systeem. Hebben belang bij duidelijke </w:t>
+            </w:r>
+            <w:proofErr w:type="spellStart"/>
+            <w:r>
+              <w:rPr>
+                <w:bCs/>
+                <w:color w:val="000000" w:themeColor="text1"/>
+              </w:rPr>
+              <w:t>requirements</w:t>
+            </w:r>
+            <w:proofErr w:type="spellEnd"/>
+            <w:r>
+              <w:rPr>
+                <w:bCs/>
+                <w:color w:val="000000" w:themeColor="text1"/>
+              </w:rPr>
+              <w:t>, feedback en een haalbare opdracht.</w:t>
             </w:r>
           </w:p>
         </w:tc>
@@ -5528,7 +5904,7 @@
       <w:pPr>
         <w:pStyle w:val="Heading3"/>
       </w:pPr>
-      <w:bookmarkStart w:id="26" w:name="_Toc207703530"/>
+      <w:bookmarkStart w:id="26" w:name="_Toc240457559"/>
       <w:r>
         <w:t>6.</w:t>
       </w:r>
@@ -5558,7 +5934,23 @@
     </w:p>
     <w:p>
       <w:r>
-        <w:t xml:space="preserve">Overleg vindt plaats tijdens de lessen. Wij verwachten dat er dan voldoende tijd is om de voortgang, taakverdeling en knelpunten te bespreken. Als dit niet voldoende blijkt, plannen wij in overleg een extra vergadering. Ieder projectlid kan hiervoor een verzoek doen. Tijdens de vergaderingen legt Maiwand de notulen vast. </w:t>
+        <w:t xml:space="preserve">Overleg vindt plaats tijdens de lessen. Wij verwachten dat er dan voldoende tijd is om de voortgang, taakverdeling en knelpunten te bespreken. Als dit niet voldoende blijkt, plannen wij in overleg een extra vergadering. Ieder </w:t>
+      </w:r>
+      <w:proofErr w:type="spellStart"/>
+      <w:r>
+        <w:t>projectlid</w:t>
+      </w:r>
+      <w:proofErr w:type="spellEnd"/>
+      <w:r>
+        <w:t xml:space="preserve"> kan hiervoor een verzoek doen. Tijdens de vergaderingen legt </w:t>
+      </w:r>
+      <w:proofErr w:type="spellStart"/>
+      <w:r>
+        <w:t>Maiwand</w:t>
+      </w:r>
+      <w:proofErr w:type="spellEnd"/>
+      <w:r>
+        <w:t xml:space="preserve"> de notulen vast. </w:t>
       </w:r>
     </w:p>
     <w:p>
@@ -5568,11 +5960,20 @@
           <w:bCs/>
         </w:rPr>
       </w:pPr>
-      <w:r>
+    </w:p>
+    <w:p>
+      <w:pPr>
         <w:rPr>
           <w:b/>
           <w:bCs/>
         </w:rPr>
+      </w:pPr>
+      <w:r>
+        <w:rPr>
+          <w:b/>
+          <w:bCs/>
+        </w:rPr>
+        <w:lastRenderedPageBreak/>
         <w:t>Besluitvorming</w:t>
       </w:r>
       <w:bookmarkEnd w:id="27"/>
@@ -5633,9 +6034,9 @@
         </w:rPr>
         <w:t>Werkplek</w:t>
       </w:r>
+      <w:bookmarkEnd w:id="20"/>
       <w:bookmarkEnd w:id="21"/>
       <w:bookmarkEnd w:id="22"/>
-      <w:bookmarkEnd w:id="23"/>
       <w:bookmarkEnd w:id="24"/>
       <w:bookmarkEnd w:id="25"/>
       <w:r>
@@ -5756,6 +6157,7 @@
                 <w:i/>
               </w:rPr>
             </w:pPr>
+            <w:proofErr w:type="spellStart"/>
             <w:r>
               <w:rPr>
                 <w:rFonts w:cs="Arial"/>
@@ -5763,6 +6165,7 @@
               </w:rPr>
               <w:t>Verdana</w:t>
             </w:r>
+            <w:proofErr w:type="spellEnd"/>
           </w:p>
         </w:tc>
       </w:tr>
@@ -6317,7 +6720,15 @@
     </w:p>
     <w:p>
       <w:r>
-        <w:t>Documenten worden tijdens het project opgeslagen en bewerkt in Word (.docx). De definitieve versie wordt als PDF ingeleverd, tenzij de opdracht een ander bestandsformaat voorschrijft.</w:t>
+        <w:t>Documenten worden tijdens het project opgeslagen en bewerkt in Word (.</w:t>
+      </w:r>
+      <w:proofErr w:type="spellStart"/>
+      <w:r>
+        <w:t>docx</w:t>
+      </w:r>
+      <w:proofErr w:type="spellEnd"/>
+      <w:r>
+        <w:t>). De definitieve versie wordt als PDF ingeleverd, tenzij de opdracht een ander bestandsformaat voorschrijft.</w:t>
       </w:r>
     </w:p>
     <w:p/>
@@ -6338,7 +6749,23 @@
     </w:p>
     <w:p>
       <w:r>
-        <w:t>Voor versiebeheer van het project gebruikt de groep Github. Wijzigingen aan de technische uitwerking moeten volgens het samenwerkingscontract door een ander projectlid worden goedgekeurd voordat ze worden samengevoegd.</w:t>
+        <w:t xml:space="preserve">Voor versiebeheer van het project gebruikt de groep </w:t>
+      </w:r>
+      <w:proofErr w:type="spellStart"/>
+      <w:r>
+        <w:t>Github</w:t>
+      </w:r>
+      <w:proofErr w:type="spellEnd"/>
+      <w:r>
+        <w:t xml:space="preserve">. Wijzigingen aan de technische uitwerking moeten volgens het samenwerkingscontract door een ander </w:t>
+      </w:r>
+      <w:proofErr w:type="spellStart"/>
+      <w:r>
+        <w:t>projectlid</w:t>
+      </w:r>
+      <w:proofErr w:type="spellEnd"/>
+      <w:r>
+        <w:t xml:space="preserve"> worden goedgekeurd voordat ze worden samengevoegd.</w:t>
       </w:r>
     </w:p>
     <w:p>
@@ -6356,7 +6783,6 @@
     </w:p>
     <w:p>
       <w:r>
-        <w:lastRenderedPageBreak/>
         <w:t xml:space="preserve">Tijdens de wekelijkse sprint review bespreken we of we op schema liggen met alle producten. Hierbij houden we rekening met de volgende oplevermomenten: </w:t>
       </w:r>
     </w:p>
@@ -6393,7 +6819,15 @@
         </w:numPr>
       </w:pPr>
       <w:r>
-        <w:t>Analyse, advies en uitvoerbaar PoC-ontwerp: week 5, vrijdag om 15.00 uur.</w:t>
+        <w:t xml:space="preserve">Analyse, advies en uitvoerbaar </w:t>
+      </w:r>
+      <w:proofErr w:type="spellStart"/>
+      <w:r>
+        <w:t>PoC</w:t>
+      </w:r>
+      <w:proofErr w:type="spellEnd"/>
+      <w:r>
+        <w:t>-ontwerp: week 5, vrijdag om 15.00 uur.</w:t>
       </w:r>
     </w:p>
     <w:p>
@@ -6422,7 +6856,15 @@
     </w:p>
     <w:p>
       <w:r>
-        <w:t xml:space="preserve">Ieder groepslid is zelf verantwoordelijk voor het tijdig inleveren van de opdrachten in diens persoonlijke Moodle omgeving. </w:t>
+        <w:t xml:space="preserve">Ieder groepslid is zelf verantwoordelijk voor het tijdig inleveren van de opdrachten in diens persoonlijke </w:t>
+      </w:r>
+      <w:proofErr w:type="spellStart"/>
+      <w:r>
+        <w:t>Moodle</w:t>
+      </w:r>
+      <w:proofErr w:type="spellEnd"/>
+      <w:r>
+        <w:t xml:space="preserve"> omgeving. </w:t>
       </w:r>
     </w:p>
     <w:p>
@@ -6452,7 +6894,7 @@
           <w:bCs w:val="0"/>
         </w:rPr>
       </w:pPr>
-      <w:bookmarkStart w:id="33" w:name="_Toc207703531"/>
+      <w:bookmarkStart w:id="33" w:name="_Toc240457560"/>
       <w:r>
         <w:lastRenderedPageBreak/>
         <w:t>7</w:t>
@@ -6593,7 +7035,7 @@
           <w:bCs w:val="0"/>
         </w:rPr>
       </w:pPr>
-      <w:bookmarkStart w:id="34" w:name="_Toc207703532"/>
+      <w:bookmarkStart w:id="34" w:name="_Toc240457561"/>
       <w:r>
         <w:lastRenderedPageBreak/>
         <w:t>8</w:t>
@@ -6928,7 +7370,15 @@
           </w:tcPr>
           <w:p>
             <w:r>
-              <w:t>Problemen met Azure-omgeving</w:t>
+              <w:t xml:space="preserve">Problemen met </w:t>
+            </w:r>
+            <w:proofErr w:type="spellStart"/>
+            <w:r>
+              <w:t>Azure</w:t>
+            </w:r>
+            <w:proofErr w:type="spellEnd"/>
+            <w:r>
+              <w:t>-omgeving</w:t>
             </w:r>
           </w:p>
         </w:tc>
@@ -6996,7 +7446,7 @@
           <w:bCs w:val="0"/>
         </w:rPr>
       </w:pPr>
-      <w:bookmarkStart w:id="35" w:name="_Toc207703533"/>
+      <w:bookmarkStart w:id="35" w:name="_Toc240457562"/>
       <w:r>
         <w:lastRenderedPageBreak/>
         <w:t>9</w:t>
@@ -7156,7 +7606,15 @@
           </w:tcPr>
           <w:p>
             <w:r>
-              <w:t>SQL-injectie tests, dataclassificatie, PvA inleveren</w:t>
+              <w:t xml:space="preserve">SQL-injectie tests, dataclassificatie, </w:t>
+            </w:r>
+            <w:proofErr w:type="spellStart"/>
+            <w:r>
+              <w:t>PvA</w:t>
+            </w:r>
+            <w:proofErr w:type="spellEnd"/>
+            <w:r>
+              <w:t xml:space="preserve"> inleveren</w:t>
             </w:r>
           </w:p>
         </w:tc>
@@ -7252,8 +7710,13 @@
           </w:tcPr>
           <w:p>
             <w:r>
-              <w:t>Implementatie SOLL in Azure</w:t>
-            </w:r>
+              <w:t xml:space="preserve">Implementatie SOLL in </w:t>
+            </w:r>
+            <w:proofErr w:type="spellStart"/>
+            <w:r>
+              <w:t>Azure</w:t>
+            </w:r>
+            <w:proofErr w:type="spellEnd"/>
           </w:p>
         </w:tc>
       </w:tr>
@@ -7283,7 +7746,15 @@
           </w:tcPr>
           <w:p>
             <w:r>
-              <w:t>Testen, logging controleren, verbeteringen doorvoeren</w:t>
+              <w:t xml:space="preserve">Testen, </w:t>
+            </w:r>
+            <w:proofErr w:type="spellStart"/>
+            <w:r>
+              <w:t>logging</w:t>
+            </w:r>
+            <w:proofErr w:type="spellEnd"/>
+            <w:r>
+              <w:t xml:space="preserve"> controleren, verbeteringen doorvoeren</w:t>
             </w:r>
           </w:p>
         </w:tc>
@@ -7374,7 +7845,7 @@
           <w:bCs w:val="0"/>
         </w:rPr>
       </w:pPr>
-      <w:bookmarkStart w:id="36" w:name="_Toc207703534"/>
+      <w:bookmarkStart w:id="36" w:name="_Toc240457563"/>
       <w:r>
         <w:lastRenderedPageBreak/>
         <w:t>1</w:t>
@@ -7418,7 +7889,63 @@
         <w:rPr>
           <w:rFonts w:ascii="Avenir Next LT Pro" w:hAnsi="Avenir Next LT Pro"/>
         </w:rPr>
-        <w:t>Gebruik van Microsoft Azure for Students (gratis credits)</w:t>
+        <w:t xml:space="preserve">Gebruik van Microsoft </w:t>
+      </w:r>
+      <w:proofErr w:type="spellStart"/>
+      <w:r>
+        <w:rPr>
+          <w:rFonts w:ascii="Avenir Next LT Pro" w:hAnsi="Avenir Next LT Pro"/>
+        </w:rPr>
+        <w:t>Azure</w:t>
+      </w:r>
+      <w:proofErr w:type="spellEnd"/>
+      <w:r>
+        <w:rPr>
+          <w:rFonts w:ascii="Avenir Next LT Pro" w:hAnsi="Avenir Next LT Pro"/>
+        </w:rPr>
+        <w:t xml:space="preserve"> </w:t>
+      </w:r>
+      <w:proofErr w:type="spellStart"/>
+      <w:r>
+        <w:rPr>
+          <w:rFonts w:ascii="Avenir Next LT Pro" w:hAnsi="Avenir Next LT Pro"/>
+        </w:rPr>
+        <w:t>for</w:t>
+      </w:r>
+      <w:proofErr w:type="spellEnd"/>
+      <w:r>
+        <w:rPr>
+          <w:rFonts w:ascii="Avenir Next LT Pro" w:hAnsi="Avenir Next LT Pro"/>
+        </w:rPr>
+        <w:t xml:space="preserve"> </w:t>
+      </w:r>
+      <w:proofErr w:type="spellStart"/>
+      <w:r>
+        <w:rPr>
+          <w:rFonts w:ascii="Avenir Next LT Pro" w:hAnsi="Avenir Next LT Pro"/>
+        </w:rPr>
+        <w:t>Students</w:t>
+      </w:r>
+      <w:proofErr w:type="spellEnd"/>
+      <w:r>
+        <w:rPr>
+          <w:rFonts w:ascii="Avenir Next LT Pro" w:hAnsi="Avenir Next LT Pro"/>
+        </w:rPr>
+        <w:t xml:space="preserve"> (gratis </w:t>
+      </w:r>
+      <w:proofErr w:type="spellStart"/>
+      <w:r>
+        <w:rPr>
+          <w:rFonts w:ascii="Avenir Next LT Pro" w:hAnsi="Avenir Next LT Pro"/>
+        </w:rPr>
+        <w:t>credits</w:t>
+      </w:r>
+      <w:proofErr w:type="spellEnd"/>
+      <w:r>
+        <w:rPr>
+          <w:rFonts w:ascii="Avenir Next LT Pro" w:hAnsi="Avenir Next LT Pro"/>
+        </w:rPr>
+        <w:t>)</w:t>
       </w:r>
     </w:p>
     <w:p>
@@ -7438,7 +7965,23 @@
           <w:rFonts w:ascii="Avenir Next LT Pro" w:hAnsi="Avenir Next LT Pro"/>
           <w:lang w:val="en-GB"/>
         </w:rPr>
-        <w:t>Open-source IDS zoals Snort of Suricata</w:t>
+        <w:t xml:space="preserve">Open-source IDS </w:t>
+      </w:r>
+      <w:proofErr w:type="spellStart"/>
+      <w:r>
+        <w:rPr>
+          <w:rFonts w:ascii="Avenir Next LT Pro" w:hAnsi="Avenir Next LT Pro"/>
+          <w:lang w:val="en-GB"/>
+        </w:rPr>
+        <w:t>zoals</w:t>
+      </w:r>
+      <w:proofErr w:type="spellEnd"/>
+      <w:r>
+        <w:rPr>
+          <w:rFonts w:ascii="Avenir Next LT Pro" w:hAnsi="Avenir Next LT Pro"/>
+          <w:lang w:val="en-GB"/>
+        </w:rPr>
+        <w:t xml:space="preserve"> Snort of Suricata</w:t>
       </w:r>
     </w:p>
     <w:p>
@@ -7494,8 +8037,17 @@
           <w:rFonts w:ascii="Avenir Next LT Pro" w:hAnsi="Avenir Next LT Pro"/>
           <w:lang w:val="en-GB"/>
         </w:rPr>
-        <w:t>Software: Visual Studio Code, OWASP tools, SQLi-testtools</w:t>
-      </w:r>
+        <w:t>Software: Visual Studio Code, OWASP tools, SQLi-</w:t>
+      </w:r>
+      <w:proofErr w:type="spellStart"/>
+      <w:r>
+        <w:rPr>
+          <w:rFonts w:ascii="Avenir Next LT Pro" w:hAnsi="Avenir Next LT Pro"/>
+          <w:lang w:val="en-GB"/>
+        </w:rPr>
+        <w:t>testtools</w:t>
+      </w:r>
+      <w:proofErr w:type="spellEnd"/>
     </w:p>
     <w:p>
       <w:pPr>
@@ -7839,7 +8391,7 @@
             </wp:anchor>
           </w:drawing>
         </mc:Choice>
-        <mc:Fallback xmlns:a="http://schemas.openxmlformats.org/drawingml/2006/main" xmlns:pic="http://schemas.openxmlformats.org/drawingml/2006/picture" xmlns:a14="http://schemas.microsoft.com/office/drawing/2010/main">
+        <mc:Fallback xmlns:a14="http://schemas.microsoft.com/office/drawing/2010/main" xmlns:pic="http://schemas.openxmlformats.org/drawingml/2006/picture" xmlns:a="http://schemas.openxmlformats.org/drawingml/2006/main">
           <w:pict w14:anchorId="1CADCD6F">
             <v:group id="Groep 102" style="position:absolute;margin-left:-1in;margin-top:-29.55pt;width:595.25pt;height:835.05pt;z-index:-251657216" coordsize="75596,106051" coordorigin=",186" o:spid="_x0000_s1026" w14:anchorId="0FC57937" o:gfxdata="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">
               <v:shapetype id="_x0000_t75" coordsize="21600,21600" filled="f" stroked="f" o:spt="75" o:preferrelative="t" path="m@4@5l@4@11@9@11@9@5xe">
@@ -10487,6 +11039,7 @@
   <w:style w:type="character" w:default="1" w:styleId="DefaultParagraphFont">
     <w:name w:val="Default Paragraph Font"/>
     <w:uiPriority w:val="1"/>
+    <w:semiHidden/>
     <w:unhideWhenUsed/>
   </w:style>
   <w:style w:type="table" w:default="1" w:styleId="TableNormal">
@@ -11068,6 +11621,7 @@
     <w:rsid w:val="005E444C"/>
     <w:rsid w:val="00605C1F"/>
     <w:rsid w:val="00617256"/>
+    <w:rsid w:val="00647515"/>
     <w:rsid w:val="007D1596"/>
     <w:rsid w:val="007E79EC"/>
     <w:rsid w:val="00803AF0"/>
@@ -11079,6 +11633,7 @@
     <w:rsid w:val="009773EB"/>
     <w:rsid w:val="00A745AF"/>
     <w:rsid w:val="00BE0D98"/>
+    <w:rsid w:val="00CC10B9"/>
     <w:rsid w:val="00CF785F"/>
     <w:rsid w:val="00DD4C93"/>
     <w:rsid w:val="00DD5D19"/>
@@ -11867,6 +12422,222 @@
 </file>
 
 <file path=customXml/item3.xml><?xml version="1.0" encoding="utf-8"?>
+<?mso-contentType ?>
+<FormTemplates xmlns="http://schemas.microsoft.com/sharepoint/v3/contenttype/forms">
+  <Display>DocumentLibraryForm</Display>
+  <Edit>DocumentLibraryForm</Edit>
+  <New>DocumentLibraryForm</New>
+</FormTemplates>
+</file>
+
+<file path=customXml/item4.xml><?xml version="1.0" encoding="utf-8"?>
+<ct:contentTypeSchema xmlns:ct="http://schemas.microsoft.com/office/2006/metadata/contentType" xmlns:ma="http://schemas.microsoft.com/office/2006/metadata/properties/metaAttributes" ct:_="" ma:_="" ma:contentTypeName="Document" ma:contentTypeID="0x0101009AEE7C0E3FC1AF49AE2D21952FC004E7" ma:contentTypeVersion="13" ma:contentTypeDescription="Een nieuw document maken." ma:contentTypeScope="" ma:versionID="960b10dc37b0d3729643b1edbc9ea311">
+  <xsd:schema xmlns:xsd="http://www.w3.org/2001/XMLSchema" xmlns:xs="http://www.w3.org/2001/XMLSchema" xmlns:p="http://schemas.microsoft.com/office/2006/metadata/properties" xmlns:ns2="70093741-41eb-4420-bf3d-ff9555ef2a33" xmlns:ns3="8e0d46a4-c7d4-472b-9541-810c49191871" targetNamespace="http://schemas.microsoft.com/office/2006/metadata/properties" ma:root="true" ma:fieldsID="8470fe0247e22942882bacf7112b3079" ns2:_="" ns3:_="">
+    <xsd:import namespace="70093741-41eb-4420-bf3d-ff9555ef2a33"/>
+    <xsd:import namespace="8e0d46a4-c7d4-472b-9541-810c49191871"/>
+    <xsd:element name="properties">
+      <xsd:complexType>
+        <xsd:sequence>
+          <xsd:element name="documentManagement">
+            <xsd:complexType>
+              <xsd:all>
+                <xsd:element ref="ns2:MediaServiceMetadata" minOccurs="0"/>
+                <xsd:element ref="ns2:MediaServiceFastMetadata" minOccurs="0"/>
+                <xsd:element ref="ns2:MediaServiceSearchProperties" minOccurs="0"/>
+                <xsd:element ref="ns2:MediaServiceDateTaken" minOccurs="0"/>
+                <xsd:element ref="ns2:MediaServiceGenerationTime" minOccurs="0"/>
+                <xsd:element ref="ns2:MediaServiceEventHashCode" minOccurs="0"/>
+                <xsd:element ref="ns2:MediaLengthInSeconds" minOccurs="0"/>
+                <xsd:element ref="ns2:lcf76f155ced4ddcb4097134ff3c332f" minOccurs="0"/>
+                <xsd:element ref="ns3:TaxCatchAll" minOccurs="0"/>
+                <xsd:element ref="ns2:MediaServiceOCR" minOccurs="0"/>
+                <xsd:element ref="ns2:MediaServiceBillingMetadata" minOccurs="0"/>
+                <xsd:element ref="ns2:MediaServiceLocation" minOccurs="0"/>
+              </xsd:all>
+            </xsd:complexType>
+          </xsd:element>
+        </xsd:sequence>
+      </xsd:complexType>
+    </xsd:element>
+  </xsd:schema>
+  <xsd:schema xmlns:xsd="http://www.w3.org/2001/XMLSchema" xmlns:xs="http://www.w3.org/2001/XMLSchema" xmlns:dms="http://schemas.microsoft.com/office/2006/documentManagement/types" xmlns:pc="http://schemas.microsoft.com/office/infopath/2007/PartnerControls" targetNamespace="70093741-41eb-4420-bf3d-ff9555ef2a33" elementFormDefault="qualified">
+    <xsd:import namespace="http://schemas.microsoft.com/office/2006/documentManagement/types"/>
+    <xsd:import namespace="http://schemas.microsoft.com/office/infopath/2007/PartnerControls"/>
+    <xsd:element name="MediaServiceMetadata" ma:index="8" nillable="true" ma:displayName="MediaServiceMetadata" ma:hidden="true" ma:internalName="MediaServiceMetadata" ma:readOnly="true">
+      <xsd:simpleType>
+        <xsd:restriction base="dms:Note"/>
+      </xsd:simpleType>
+    </xsd:element>
+    <xsd:element name="MediaServiceFastMetadata" ma:index="9" nillable="true" ma:displayName="MediaServiceFastMetadata" ma:hidden="true" ma:internalName="MediaServiceFastMetadata" ma:readOnly="true">
+      <xsd:simpleType>
+        <xsd:restriction base="dms:Note"/>
+      </xsd:simpleType>
+    </xsd:element>
+    <xsd:element name="MediaServiceSearchProperties" ma:index="10" nillable="true" ma:displayName="MediaServiceSearchProperties" ma:hidden="true" ma:internalName="MediaServiceSearchProperties" ma:readOnly="true">
+      <xsd:simpleType>
+        <xsd:restriction base="dms:Note"/>
+      </xsd:simpleType>
+    </xsd:element>
+    <xsd:element name="MediaServiceDateTaken" ma:index="11" nillable="true" ma:displayName="MediaServiceDateTaken" ma:hidden="true" ma:indexed="true" ma:internalName="MediaServiceDateTaken" ma:readOnly="true">
+      <xsd:simpleType>
+        <xsd:restriction base="dms:Text"/>
+      </xsd:simpleType>
+    </xsd:element>
+    <xsd:element name="MediaServiceGenerationTime" ma:index="12" nillable="true" ma:displayName="MediaServiceGenerationTime" ma:hidden="true" ma:internalName="MediaServiceGenerationTime" ma:readOnly="true">
+      <xsd:simpleType>
+        <xsd:restriction base="dms:Text"/>
+      </xsd:simpleType>
+    </xsd:element>
+    <xsd:element name="MediaServiceEventHashCode" ma:index="13" nillable="true" ma:displayName="MediaServiceEventHashCode" ma:hidden="true" ma:internalName="MediaServiceEventHashCode" ma:readOnly="true">
+      <xsd:simpleType>
+        <xsd:restriction base="dms:Text"/>
+      </xsd:simpleType>
+    </xsd:element>
+    <xsd:element name="MediaLengthInSeconds" ma:index="14" nillable="true" ma:displayName="MediaLengthInSeconds" ma:hidden="true" ma:internalName="MediaLengthInSeconds" ma:readOnly="true">
+      <xsd:simpleType>
+        <xsd:restriction base="dms:Unknown"/>
+      </xsd:simpleType>
+    </xsd:element>
+    <xsd:element name="lcf76f155ced4ddcb4097134ff3c332f" ma:index="16" nillable="true" ma:taxonomy="true" ma:internalName="lcf76f155ced4ddcb4097134ff3c332f" ma:taxonomyFieldName="MediaServiceImageTags" ma:displayName="Afbeeldingtags" ma:readOnly="false" ma:fieldId="{5cf76f15-5ced-4ddc-b409-7134ff3c332f}" ma:taxonomyMulti="true" ma:sspId="5bd69f14-2b9f-433c-9887-fccfa466e118" ma:termSetId="09814cd3-568e-fe90-9814-8d621ff8fb84" ma:anchorId="fba54fb3-c3e1-fe81-a776-ca4b69148c4d" ma:open="true" ma:isKeyword="false">
+      <xsd:complexType>
+        <xsd:sequence>
+          <xsd:element ref="pc:Terms" minOccurs="0" maxOccurs="1"/>
+        </xsd:sequence>
+      </xsd:complexType>
+    </xsd:element>
+    <xsd:element name="MediaServiceOCR" ma:index="18" nillable="true" ma:displayName="Extracted Text" ma:internalName="MediaServiceOCR" ma:readOnly="true">
+      <xsd:simpleType>
+        <xsd:restriction base="dms:Note">
+          <xsd:maxLength value="255"/>
+        </xsd:restriction>
+      </xsd:simpleType>
+    </xsd:element>
+    <xsd:element name="MediaServiceBillingMetadata" ma:index="19" nillable="true" ma:displayName="MediaServiceBillingMetadata" ma:hidden="true" ma:internalName="MediaServiceBillingMetadata" ma:readOnly="true">
+      <xsd:simpleType>
+        <xsd:restriction base="dms:Note"/>
+      </xsd:simpleType>
+    </xsd:element>
+    <xsd:element name="MediaServiceLocation" ma:index="20" nillable="true" ma:displayName="Location" ma:description="" ma:indexed="true" ma:internalName="MediaServiceLocation" ma:readOnly="true">
+      <xsd:simpleType>
+        <xsd:restriction base="dms:Text"/>
+      </xsd:simpleType>
+    </xsd:element>
+  </xsd:schema>
+  <xsd:schema xmlns:xsd="http://www.w3.org/2001/XMLSchema" xmlns:xs="http://www.w3.org/2001/XMLSchema" xmlns:dms="http://schemas.microsoft.com/office/2006/documentManagement/types" xmlns:pc="http://schemas.microsoft.com/office/infopath/2007/PartnerControls" targetNamespace="8e0d46a4-c7d4-472b-9541-810c49191871" elementFormDefault="qualified">
+    <xsd:import namespace="http://schemas.microsoft.com/office/2006/documentManagement/types"/>
+    <xsd:import namespace="http://schemas.microsoft.com/office/infopath/2007/PartnerControls"/>
+    <xsd:element name="TaxCatchAll" ma:index="17" nillable="true" ma:displayName="Taxonomy Catch All Column" ma:hidden="true" ma:list="{c8ab18b9-6097-49a0-8cf1-8fd8c6c84254}" ma:internalName="TaxCatchAll" ma:showField="CatchAllData" ma:web="8e0d46a4-c7d4-472b-9541-810c49191871">
+      <xsd:complexType>
+        <xsd:complexContent>
+          <xsd:extension base="dms:MultiChoiceLookup">
+            <xsd:sequence>
+              <xsd:element name="Value" type="dms:Lookup" maxOccurs="unbounded" minOccurs="0" nillable="true"/>
+            </xsd:sequence>
+          </xsd:extension>
+        </xsd:complexContent>
+      </xsd:complexType>
+    </xsd:element>
+  </xsd:schema>
+  <xsd:schema xmlns="http://schemas.openxmlformats.org/package/2006/metadata/core-properties" xmlns:xsd="http://www.w3.org/2001/XMLSchema" xmlns:xsi="http://www.w3.org/2001/XMLSchema-instance" xmlns:dc="http://purl.org/dc/elements/1.1/" xmlns:dcterms="http://purl.org/dc/terms/" xmlns:odoc="http://schemas.microsoft.com/internal/obd" targetNamespace="http://schemas.openxmlformats.org/package/2006/metadata/core-properties" elementFormDefault="qualified" attributeFormDefault="unqualified" blockDefault="#all">
+    <xsd:import namespace="http://purl.org/dc/elements/1.1/" schemaLocation="http://dublincore.org/schemas/xmls/qdc/2003/04/02/dc.xsd"/>
+    <xsd:import namespace="http://purl.org/dc/terms/" schemaLocation="http://dublincore.org/schemas/xmls/qdc/2003/04/02/dcterms.xsd"/>
+    <xsd:element name="coreProperties" type="CT_coreProperties"/>
+    <xsd:complexType name="CT_coreProperties">
+      <xsd:all>
+        <xsd:element ref="dc:creator" minOccurs="0" maxOccurs="1"/>
+        <xsd:element ref="dcterms:created" minOccurs="0" maxOccurs="1"/>
+        <xsd:element ref="dc:identifier" minOccurs="0" maxOccurs="1"/>
+        <xsd:element name="contentType" minOccurs="0" maxOccurs="1" type="xsd:string" ma:index="0" ma:displayName="Inhoudstype"/>
+        <xsd:element ref="dc:title" minOccurs="0" maxOccurs="1" ma:index="4" ma:displayName="Titel"/>
+        <xsd:element ref="dc:subject" minOccurs="0" maxOccurs="1"/>
+        <xsd:element ref="dc:description" minOccurs="0" maxOccurs="1"/>
+        <xsd:element name="keywords" minOccurs="0" maxOccurs="1" type="xsd:string"/>
+        <xsd:element ref="dc:language" minOccurs="0" maxOccurs="1"/>
+        <xsd:element name="category" minOccurs="0" maxOccurs="1" type="xsd:string"/>
+        <xsd:element name="version" minOccurs="0" maxOccurs="1" type="xsd:string"/>
+        <xsd:element name="revision" minOccurs="0" maxOccurs="1" type="xsd:string">
+          <xsd:annotation>
+            <xsd:documentation>
+                        This value indicates the number of saves or revisions. The application is responsible for updating this value after each revision.
+                    </xsd:documentation>
+          </xsd:annotation>
+        </xsd:element>
+        <xsd:element name="lastModifiedBy" minOccurs="0" maxOccurs="1" type="xsd:string"/>
+        <xsd:element ref="dcterms:modified" minOccurs="0" maxOccurs="1"/>
+        <xsd:element name="contentStatus" minOccurs="0" maxOccurs="1" type="xsd:string"/>
+      </xsd:all>
+    </xsd:complexType>
+  </xsd:schema>
+  <xs:schema xmlns:pc="http://schemas.microsoft.com/office/infopath/2007/PartnerControls" xmlns:xs="http://www.w3.org/2001/XMLSchema" targetNamespace="http://schemas.microsoft.com/office/infopath/2007/PartnerControls" elementFormDefault="qualified" attributeFormDefault="unqualified">
+    <xs:element name="Person">
+      <xs:complexType>
+        <xs:sequence>
+          <xs:element ref="pc:DisplayName" minOccurs="0"/>
+          <xs:element ref="pc:AccountId" minOccurs="0"/>
+          <xs:element ref="pc:AccountType" minOccurs="0"/>
+        </xs:sequence>
+      </xs:complexType>
+    </xs:element>
+    <xs:element name="DisplayName" type="xs:string"/>
+    <xs:element name="AccountId" type="xs:string"/>
+    <xs:element name="AccountType" type="xs:string"/>
+    <xs:element name="BDCAssociatedEntity">
+      <xs:complexType>
+        <xs:sequence>
+          <xs:element ref="pc:BDCEntity" minOccurs="0" maxOccurs="unbounded"/>
+        </xs:sequence>
+        <xs:attribute ref="pc:EntityNamespace"/>
+        <xs:attribute ref="pc:EntityName"/>
+        <xs:attribute ref="pc:SystemInstanceName"/>
+        <xs:attribute ref="pc:AssociationName"/>
+      </xs:complexType>
+    </xs:element>
+    <xs:attribute name="EntityNamespace" type="xs:string"/>
+    <xs:attribute name="EntityName" type="xs:string"/>
+    <xs:attribute name="SystemInstanceName" type="xs:string"/>
+    <xs:attribute name="AssociationName" type="xs:string"/>
+    <xs:element name="BDCEntity">
+      <xs:complexType>
+        <xs:sequence>
+          <xs:element ref="pc:EntityDisplayName" minOccurs="0"/>
+          <xs:element ref="pc:EntityInstanceReference" minOccurs="0"/>
+          <xs:element ref="pc:EntityId1" minOccurs="0"/>
+          <xs:element ref="pc:EntityId2" minOccurs="0"/>
+          <xs:element ref="pc:EntityId3" minOccurs="0"/>
+          <xs:element ref="pc:EntityId4" minOccurs="0"/>
+          <xs:element ref="pc:EntityId5" minOccurs="0"/>
+        </xs:sequence>
+      </xs:complexType>
+    </xs:element>
+    <xs:element name="EntityDisplayName" type="xs:string"/>
+    <xs:element name="EntityInstanceReference" type="xs:string"/>
+    <xs:element name="EntityId1" type="xs:string"/>
+    <xs:element name="EntityId2" type="xs:string"/>
+    <xs:element name="EntityId3" type="xs:string"/>
+    <xs:element name="EntityId4" type="xs:string"/>
+    <xs:element name="EntityId5" type="xs:string"/>
+    <xs:element name="Terms">
+      <xs:complexType>
+        <xs:sequence>
+          <xs:element ref="pc:TermInfo" minOccurs="0" maxOccurs="unbounded"/>
+        </xs:sequence>
+      </xs:complexType>
+    </xs:element>
+    <xs:element name="TermInfo">
+      <xs:complexType>
+        <xs:sequence>
+          <xs:element ref="pc:TermName" minOccurs="0"/>
+          <xs:element ref="pc:TermId" minOccurs="0"/>
+        </xs:sequence>
+      </xs:complexType>
+    </xs:element>
+    <xs:element name="TermName" type="xs:string"/>
+    <xs:element name="TermId" type="xs:string"/>
+  </xs:schema>
+</ct:contentTypeSchema>
+</file>
+
+<file path=customXml/item5.xml><?xml version="1.0" encoding="utf-8"?>
 <b:Sources xmlns:b="http://schemas.openxmlformats.org/officeDocument/2006/bibliography" xmlns="http://schemas.openxmlformats.org/officeDocument/2006/bibliography" SelectedStyle="\APASixthEditionOfficeOnline.xsl" StyleName="APA" Version="6">
   <b:Source>
     <b:Tag>Cle18</b:Tag>
@@ -12246,222 +13017,6 @@
 </b:Sources>
 </file>
 
-<file path=customXml/item4.xml><?xml version="1.0" encoding="utf-8"?>
-<ct:contentTypeSchema xmlns:ct="http://schemas.microsoft.com/office/2006/metadata/contentType" xmlns:ma="http://schemas.microsoft.com/office/2006/metadata/properties/metaAttributes" ct:_="" ma:_="" ma:contentTypeName="Document" ma:contentTypeID="0x0101009AEE7C0E3FC1AF49AE2D21952FC004E7" ma:contentTypeVersion="13" ma:contentTypeDescription="Een nieuw document maken." ma:contentTypeScope="" ma:versionID="960b10dc37b0d3729643b1edbc9ea311">
-  <xsd:schema xmlns:xsd="http://www.w3.org/2001/XMLSchema" xmlns:xs="http://www.w3.org/2001/XMLSchema" xmlns:p="http://schemas.microsoft.com/office/2006/metadata/properties" xmlns:ns2="70093741-41eb-4420-bf3d-ff9555ef2a33" xmlns:ns3="8e0d46a4-c7d4-472b-9541-810c49191871" targetNamespace="http://schemas.microsoft.com/office/2006/metadata/properties" ma:root="true" ma:fieldsID="8470fe0247e22942882bacf7112b3079" ns2:_="" ns3:_="">
-    <xsd:import namespace="70093741-41eb-4420-bf3d-ff9555ef2a33"/>
-    <xsd:import namespace="8e0d46a4-c7d4-472b-9541-810c49191871"/>
-    <xsd:element name="properties">
-      <xsd:complexType>
-        <xsd:sequence>
-          <xsd:element name="documentManagement">
-            <xsd:complexType>
-              <xsd:all>
-                <xsd:element ref="ns2:MediaServiceMetadata" minOccurs="0"/>
-                <xsd:element ref="ns2:MediaServiceFastMetadata" minOccurs="0"/>
-                <xsd:element ref="ns2:MediaServiceSearchProperties" minOccurs="0"/>
-                <xsd:element ref="ns2:MediaServiceDateTaken" minOccurs="0"/>
-                <xsd:element ref="ns2:MediaServiceGenerationTime" minOccurs="0"/>
-                <xsd:element ref="ns2:MediaServiceEventHashCode" minOccurs="0"/>
-                <xsd:element ref="ns2:MediaLengthInSeconds" minOccurs="0"/>
-                <xsd:element ref="ns2:lcf76f155ced4ddcb4097134ff3c332f" minOccurs="0"/>
-                <xsd:element ref="ns3:TaxCatchAll" minOccurs="0"/>
-                <xsd:element ref="ns2:MediaServiceOCR" minOccurs="0"/>
-                <xsd:element ref="ns2:MediaServiceBillingMetadata" minOccurs="0"/>
-                <xsd:element ref="ns2:MediaServiceLocation" minOccurs="0"/>
-              </xsd:all>
-            </xsd:complexType>
-          </xsd:element>
-        </xsd:sequence>
-      </xsd:complexType>
-    </xsd:element>
-  </xsd:schema>
-  <xsd:schema xmlns:xsd="http://www.w3.org/2001/XMLSchema" xmlns:xs="http://www.w3.org/2001/XMLSchema" xmlns:dms="http://schemas.microsoft.com/office/2006/documentManagement/types" xmlns:pc="http://schemas.microsoft.com/office/infopath/2007/PartnerControls" targetNamespace="70093741-41eb-4420-bf3d-ff9555ef2a33" elementFormDefault="qualified">
-    <xsd:import namespace="http://schemas.microsoft.com/office/2006/documentManagement/types"/>
-    <xsd:import namespace="http://schemas.microsoft.com/office/infopath/2007/PartnerControls"/>
-    <xsd:element name="MediaServiceMetadata" ma:index="8" nillable="true" ma:displayName="MediaServiceMetadata" ma:hidden="true" ma:internalName="MediaServiceMetadata" ma:readOnly="true">
-      <xsd:simpleType>
-        <xsd:restriction base="dms:Note"/>
-      </xsd:simpleType>
-    </xsd:element>
-    <xsd:element name="MediaServiceFastMetadata" ma:index="9" nillable="true" ma:displayName="MediaServiceFastMetadata" ma:hidden="true" ma:internalName="MediaServiceFastMetadata" ma:readOnly="true">
-      <xsd:simpleType>
-        <xsd:restriction base="dms:Note"/>
-      </xsd:simpleType>
-    </xsd:element>
-    <xsd:element name="MediaServiceSearchProperties" ma:index="10" nillable="true" ma:displayName="MediaServiceSearchProperties" ma:hidden="true" ma:internalName="MediaServiceSearchProperties" ma:readOnly="true">
-      <xsd:simpleType>
-        <xsd:restriction base="dms:Note"/>
-      </xsd:simpleType>
-    </xsd:element>
-    <xsd:element name="MediaServiceDateTaken" ma:index="11" nillable="true" ma:displayName="MediaServiceDateTaken" ma:hidden="true" ma:indexed="true" ma:internalName="MediaServiceDateTaken" ma:readOnly="true">
-      <xsd:simpleType>
-        <xsd:restriction base="dms:Text"/>
-      </xsd:simpleType>
-    </xsd:element>
-    <xsd:element name="MediaServiceGenerationTime" ma:index="12" nillable="true" ma:displayName="MediaServiceGenerationTime" ma:hidden="true" ma:internalName="MediaServiceGenerationTime" ma:readOnly="true">
-      <xsd:simpleType>
-        <xsd:restriction base="dms:Text"/>
-      </xsd:simpleType>
-    </xsd:element>
-    <xsd:element name="MediaServiceEventHashCode" ma:index="13" nillable="true" ma:displayName="MediaServiceEventHashCode" ma:hidden="true" ma:internalName="MediaServiceEventHashCode" ma:readOnly="true">
-      <xsd:simpleType>
-        <xsd:restriction base="dms:Text"/>
-      </xsd:simpleType>
-    </xsd:element>
-    <xsd:element name="MediaLengthInSeconds" ma:index="14" nillable="true" ma:displayName="MediaLengthInSeconds" ma:hidden="true" ma:internalName="MediaLengthInSeconds" ma:readOnly="true">
-      <xsd:simpleType>
-        <xsd:restriction base="dms:Unknown"/>
-      </xsd:simpleType>
-    </xsd:element>
-    <xsd:element name="lcf76f155ced4ddcb4097134ff3c332f" ma:index="16" nillable="true" ma:taxonomy="true" ma:internalName="lcf76f155ced4ddcb4097134ff3c332f" ma:taxonomyFieldName="MediaServiceImageTags" ma:displayName="Afbeeldingtags" ma:readOnly="false" ma:fieldId="{5cf76f15-5ced-4ddc-b409-7134ff3c332f}" ma:taxonomyMulti="true" ma:sspId="5bd69f14-2b9f-433c-9887-fccfa466e118" ma:termSetId="09814cd3-568e-fe90-9814-8d621ff8fb84" ma:anchorId="fba54fb3-c3e1-fe81-a776-ca4b69148c4d" ma:open="true" ma:isKeyword="false">
-      <xsd:complexType>
-        <xsd:sequence>
-          <xsd:element ref="pc:Terms" minOccurs="0" maxOccurs="1"/>
-        </xsd:sequence>
-      </xsd:complexType>
-    </xsd:element>
-    <xsd:element name="MediaServiceOCR" ma:index="18" nillable="true" ma:displayName="Extracted Text" ma:internalName="MediaServiceOCR" ma:readOnly="true">
-      <xsd:simpleType>
-        <xsd:restriction base="dms:Note">
-          <xsd:maxLength value="255"/>
-        </xsd:restriction>
-      </xsd:simpleType>
-    </xsd:element>
-    <xsd:element name="MediaServiceBillingMetadata" ma:index="19" nillable="true" ma:displayName="MediaServiceBillingMetadata" ma:hidden="true" ma:internalName="MediaServiceBillingMetadata" ma:readOnly="true">
-      <xsd:simpleType>
-        <xsd:restriction base="dms:Note"/>
-      </xsd:simpleType>
-    </xsd:element>
-    <xsd:element name="MediaServiceLocation" ma:index="20" nillable="true" ma:displayName="Location" ma:description="" ma:indexed="true" ma:internalName="MediaServiceLocation" ma:readOnly="true">
-      <xsd:simpleType>
-        <xsd:restriction base="dms:Text"/>
-      </xsd:simpleType>
-    </xsd:element>
-  </xsd:schema>
-  <xsd:schema xmlns:xsd="http://www.w3.org/2001/XMLSchema" xmlns:xs="http://www.w3.org/2001/XMLSchema" xmlns:dms="http://schemas.microsoft.com/office/2006/documentManagement/types" xmlns:pc="http://schemas.microsoft.com/office/infopath/2007/PartnerControls" targetNamespace="8e0d46a4-c7d4-472b-9541-810c49191871" elementFormDefault="qualified">
-    <xsd:import namespace="http://schemas.microsoft.com/office/2006/documentManagement/types"/>
-    <xsd:import namespace="http://schemas.microsoft.com/office/infopath/2007/PartnerControls"/>
-    <xsd:element name="TaxCatchAll" ma:index="17" nillable="true" ma:displayName="Taxonomy Catch All Column" ma:hidden="true" ma:list="{c8ab18b9-6097-49a0-8cf1-8fd8c6c84254}" ma:internalName="TaxCatchAll" ma:showField="CatchAllData" ma:web="8e0d46a4-c7d4-472b-9541-810c49191871">
-      <xsd:complexType>
-        <xsd:complexContent>
-          <xsd:extension base="dms:MultiChoiceLookup">
-            <xsd:sequence>
-              <xsd:element name="Value" type="dms:Lookup" maxOccurs="unbounded" minOccurs="0" nillable="true"/>
-            </xsd:sequence>
-          </xsd:extension>
-        </xsd:complexContent>
-      </xsd:complexType>
-    </xsd:element>
-  </xsd:schema>
-  <xsd:schema xmlns="http://schemas.openxmlformats.org/package/2006/metadata/core-properties" xmlns:xsd="http://www.w3.org/2001/XMLSchema" xmlns:xsi="http://www.w3.org/2001/XMLSchema-instance" xmlns:dc="http://purl.org/dc/elements/1.1/" xmlns:dcterms="http://purl.org/dc/terms/" xmlns:odoc="http://schemas.microsoft.com/internal/obd" targetNamespace="http://schemas.openxmlformats.org/package/2006/metadata/core-properties" elementFormDefault="qualified" attributeFormDefault="unqualified" blockDefault="#all">
-    <xsd:import namespace="http://purl.org/dc/elements/1.1/" schemaLocation="http://dublincore.org/schemas/xmls/qdc/2003/04/02/dc.xsd"/>
-    <xsd:import namespace="http://purl.org/dc/terms/" schemaLocation="http://dublincore.org/schemas/xmls/qdc/2003/04/02/dcterms.xsd"/>
-    <xsd:element name="coreProperties" type="CT_coreProperties"/>
-    <xsd:complexType name="CT_coreProperties">
-      <xsd:all>
-        <xsd:element ref="dc:creator" minOccurs="0" maxOccurs="1"/>
-        <xsd:element ref="dcterms:created" minOccurs="0" maxOccurs="1"/>
-        <xsd:element ref="dc:identifier" minOccurs="0" maxOccurs="1"/>
-        <xsd:element name="contentType" minOccurs="0" maxOccurs="1" type="xsd:string" ma:index="0" ma:displayName="Inhoudstype"/>
-        <xsd:element ref="dc:title" minOccurs="0" maxOccurs="1" ma:index="4" ma:displayName="Titel"/>
-        <xsd:element ref="dc:subject" minOccurs="0" maxOccurs="1"/>
-        <xsd:element ref="dc:description" minOccurs="0" maxOccurs="1"/>
-        <xsd:element name="keywords" minOccurs="0" maxOccurs="1" type="xsd:string"/>
-        <xsd:element ref="dc:language" minOccurs="0" maxOccurs="1"/>
-        <xsd:element name="category" minOccurs="0" maxOccurs="1" type="xsd:string"/>
-        <xsd:element name="version" minOccurs="0" maxOccurs="1" type="xsd:string"/>
-        <xsd:element name="revision" minOccurs="0" maxOccurs="1" type="xsd:string">
-          <xsd:annotation>
-            <xsd:documentation>
-                        This value indicates the number of saves or revisions. The application is responsible for updating this value after each revision.
-                    </xsd:documentation>
-          </xsd:annotation>
-        </xsd:element>
-        <xsd:element name="lastModifiedBy" minOccurs="0" maxOccurs="1" type="xsd:string"/>
-        <xsd:element ref="dcterms:modified" minOccurs="0" maxOccurs="1"/>
-        <xsd:element name="contentStatus" minOccurs="0" maxOccurs="1" type="xsd:string"/>
-      </xsd:all>
-    </xsd:complexType>
-  </xsd:schema>
-  <xs:schema xmlns:pc="http://schemas.microsoft.com/office/infopath/2007/PartnerControls" xmlns:xs="http://www.w3.org/2001/XMLSchema" targetNamespace="http://schemas.microsoft.com/office/infopath/2007/PartnerControls" elementFormDefault="qualified" attributeFormDefault="unqualified">
-    <xs:element name="Person">
-      <xs:complexType>
-        <xs:sequence>
-          <xs:element ref="pc:DisplayName" minOccurs="0"/>
-          <xs:element ref="pc:AccountId" minOccurs="0"/>
-          <xs:element ref="pc:AccountType" minOccurs="0"/>
-        </xs:sequence>
-      </xs:complexType>
-    </xs:element>
-    <xs:element name="DisplayName" type="xs:string"/>
-    <xs:element name="AccountId" type="xs:string"/>
-    <xs:element name="AccountType" type="xs:string"/>
-    <xs:element name="BDCAssociatedEntity">
-      <xs:complexType>
-        <xs:sequence>
-          <xs:element ref="pc:BDCEntity" minOccurs="0" maxOccurs="unbounded"/>
-        </xs:sequence>
-        <xs:attribute ref="pc:EntityNamespace"/>
-        <xs:attribute ref="pc:EntityName"/>
-        <xs:attribute ref="pc:SystemInstanceName"/>
-        <xs:attribute ref="pc:AssociationName"/>
-      </xs:complexType>
-    </xs:element>
-    <xs:attribute name="EntityNamespace" type="xs:string"/>
-    <xs:attribute name="EntityName" type="xs:string"/>
-    <xs:attribute name="SystemInstanceName" type="xs:string"/>
-    <xs:attribute name="AssociationName" type="xs:string"/>
-    <xs:element name="BDCEntity">
-      <xs:complexType>
-        <xs:sequence>
-          <xs:element ref="pc:EntityDisplayName" minOccurs="0"/>
-          <xs:element ref="pc:EntityInstanceReference" minOccurs="0"/>
-          <xs:element ref="pc:EntityId1" minOccurs="0"/>
-          <xs:element ref="pc:EntityId2" minOccurs="0"/>
-          <xs:element ref="pc:EntityId3" minOccurs="0"/>
-          <xs:element ref="pc:EntityId4" minOccurs="0"/>
-          <xs:element ref="pc:EntityId5" minOccurs="0"/>
-        </xs:sequence>
-      </xs:complexType>
-    </xs:element>
-    <xs:element name="EntityDisplayName" type="xs:string"/>
-    <xs:element name="EntityInstanceReference" type="xs:string"/>
-    <xs:element name="EntityId1" type="xs:string"/>
-    <xs:element name="EntityId2" type="xs:string"/>
-    <xs:element name="EntityId3" type="xs:string"/>
-    <xs:element name="EntityId4" type="xs:string"/>
-    <xs:element name="EntityId5" type="xs:string"/>
-    <xs:element name="Terms">
-      <xs:complexType>
-        <xs:sequence>
-          <xs:element ref="pc:TermInfo" minOccurs="0" maxOccurs="unbounded"/>
-        </xs:sequence>
-      </xs:complexType>
-    </xs:element>
-    <xs:element name="TermInfo">
-      <xs:complexType>
-        <xs:sequence>
-          <xs:element ref="pc:TermName" minOccurs="0"/>
-          <xs:element ref="pc:TermId" minOccurs="0"/>
-        </xs:sequence>
-      </xs:complexType>
-    </xs:element>
-    <xs:element name="TermName" type="xs:string"/>
-    <xs:element name="TermId" type="xs:string"/>
-  </xs:schema>
-</ct:contentTypeSchema>
-</file>
-
-<file path=customXml/item5.xml><?xml version="1.0" encoding="utf-8"?>
-<?mso-contentType ?>
-<FormTemplates xmlns="http://schemas.microsoft.com/sharepoint/v3/contenttype/forms">
-  <Display>DocumentLibraryForm</Display>
-  <Edit>DocumentLibraryForm</Edit>
-  <New>DocumentLibraryForm</New>
-</FormTemplates>
-</file>
-
 <file path=customXml/itemProps1.xml><?xml version="1.0" encoding="utf-8"?>
 <ds:datastoreItem xmlns:ds="http://schemas.openxmlformats.org/officeDocument/2006/customXml" ds:itemID="{55AF091B-3C7A-41E3-B477-F2FDAA23CFDA}">
   <ds:schemaRefs>
@@ -12482,9 +13037,9 @@
 </file>
 
 <file path=customXml/itemProps3.xml><?xml version="1.0" encoding="utf-8"?>
-<ds:datastoreItem xmlns:ds="http://schemas.openxmlformats.org/officeDocument/2006/customXml" ds:itemID="{A78D1BFD-FB21-4E94-A897-6F9CD570B4EA}">
+<ds:datastoreItem xmlns:ds="http://schemas.openxmlformats.org/officeDocument/2006/customXml" ds:itemID="{4F2FF0AF-4963-4DA0-8342-5673697A9054}">
   <ds:schemaRefs>
-    <ds:schemaRef ds:uri="http://schemas.openxmlformats.org/officeDocument/2006/bibliography"/>
+    <ds:schemaRef ds:uri="http://schemas.microsoft.com/sharepoint/v3/contenttype/forms"/>
   </ds:schemaRefs>
 </ds:datastoreItem>
 </file>
@@ -12509,9 +13064,9 @@
 </file>
 
 <file path=customXml/itemProps5.xml><?xml version="1.0" encoding="utf-8"?>
-<ds:datastoreItem xmlns:ds="http://schemas.openxmlformats.org/officeDocument/2006/customXml" ds:itemID="{4F2FF0AF-4963-4DA0-8342-5673697A9054}">
+<ds:datastoreItem xmlns:ds="http://schemas.openxmlformats.org/officeDocument/2006/customXml" ds:itemID="{A78D1BFD-FB21-4E94-A897-6F9CD570B4EA}">
   <ds:schemaRefs>
-    <ds:schemaRef ds:uri="http://schemas.microsoft.com/sharepoint/v3/contenttype/forms"/>
+    <ds:schemaRef ds:uri="http://schemas.openxmlformats.org/officeDocument/2006/bibliography"/>
   </ds:schemaRefs>
 </ds:datastoreItem>
 </file>
</xml_diff>